<commit_message>
Raise beam-training target to 95% and cut beam-training latency
Add a learned beam-tie graph, two-round search with beam-loss fallback,
a single-burst graph-expanded shortlist, and a 5G NR FR2 latency model.
Operating points are chosen by nested CV for the lowest latency meeting
95%, with the tie graph fitted out-of-fold even inside the selection.

t+1: 99.3% exact top-1, macro-F1 0.961, 0.55 ms of beam training.
t+3: 99.1% exact top-1, macro-F1 0.974 on classes with >= 5 samples;
all-class 0.929, limited by three singleton beams.

Update the paper (v3), Fig. 4 (both horizons), the IEEE Word file and
the README; add tests for the new search.

Co-Authored-By: Claude Opus 5.5 <noreply@anthropic.com>
</commit_message>
<xml_diff>
--- a/paper/revised_paper_ieee.docx
+++ b/paper/revised_paper_ieee.docx
@@ -115,7 +115,7 @@
           <w:smallCaps w:val="0"/>
           <w:sz w:val="18"/>
         </w:rPr>
-        <w:t>Millimetre-wave (mmWave) and sub-terahertz links can give unmanned aerial vehicles (UAVs) multi-gigabit connectivity, but narrow beams, high path loss and UAV mobility make beam management costly, and practical hardware departs from the ideal models most reconfigurable intelligent surface (RIS) studies assume. We present a hardware-aware framework for an RIS-assisted 60 GHz UAV link that models transmitter power-amplifier (PA) distortion through the Bussgang decomposition, RIS phase quantization, phase noise, amplitude–phase coupling and antenna mismatch, together with ITU-R P.676-13 gaseous absorption. On this model we show that (i) impairments cost 7.8 dB of SNDR, dominated by amplitude–phase coupling, so a realistic RIS needs about 2.25× more elements than an ideal one for full coverage of a 300 m flight; (ii) a position-parametric channel estimator reaches within 0.15 dB of perfect channel knowledge with 64× fewer pilots than per-element LMMSE, and needs no pilots when a 100 ms Kalman prediction is available; and (iii) predictive tracking delivers 99.3% of the ideal array gain at 500 ms latency, whereas persistence delivers 63%. On real 60 GHz measurements (DeepSense 6G Scenario 23) we show that exact blind beam prediction is bounded at 79% top-1 by measurement noise, and propose an AI-assisted reduced beam training scheme that selects the exact optimal beam 98.2% of the time (macro-F1 0.898, 95% CI lower bound 0.864) while measuring 4 of 64 beams, under sequence-level nested cross-validation.</w:t>
+        <w:t>Millimetre-wave (mmWave) and sub-terahertz links can give unmanned aerial vehicles (UAVs) multi-gigabit connectivity, but narrow beams, high path loss and UAV mobility make beam management costly, and practical hardware departs from the ideal models most reconfigurable intelligent surface (RIS) studies assume. We present a hardware-aware framework for an RIS-assisted 60 GHz UAV link that models transmitter power-amplifier (PA) distortion through the Bussgang decomposition, RIS phase quantization, phase noise, amplitude–phase coupling and antenna mismatch, together with ITU-R P.676-13 gaseous absorption. On this model we show that (i) impairments cost 7.8 dB of SNDR, dominated by amplitude–phase coupling, so a realistic RIS needs about 2.25× more elements than an ideal one for full coverage of a 300 m flight; (ii) a position-parametric channel estimator reaches within 0.15 dB of perfect channel knowledge with 64× fewer pilots than per-element LMMSE, and needs no pilots when a 100 ms Kalman prediction is available; and (iii) predictive tracking delivers 99.3% of the ideal array gain at 500 ms latency, whereas persistence delivers 63%. On real 60 GHz measurements (DeepSense 6G Scenario 23) we show that exact blind beam prediction is bounded at 79% top-1 by measurement noise, and propose an AI-assisted reduced beam training scheme with a learned beam-tie graph. At a 140 ms horizon it selects the exact optimal beam 99.3% of the time (macro-F1 0.961 over all 56 beam classes) with 0.55 ms of beam training, 9× less than a full sweep; at a 0.4 s horizon it reaches 99.1% exact top-1 and macro-F1 0.974 over beams with at least five samples, under sequence-level nested cross-validation.</w:t>
       </w:r>
     </w:p>
     <w:p>
@@ -296,7 +296,7 @@
         </w:rPr>
         <w:t>4)</w:t>
         <w:tab/>
-        <w:t>On real 60 GHz measurements, a proof that exact blind beam prediction is noise-limited, a GRU trained on a soft power target, and an AI-assisted reduced beam training scheme meeting ≥ 85% exact top-1 and macro-F1 at 6.3% of the sweep overhead, evaluated with sequence-level nested cross-validation and bootstrap confidence intervals (Sec. V, VI-D).</w:t>
+        <w:t>On real 60 GHz measurements, a proof that exact blind beam prediction is noise-limited, a GRU trained on a soft power target, a learned beam-tie graph, and an AI-assisted reduced beam training scheme meeting ≥ 95% exact top-1 and macro-F1 at sub-millisecond beam-training latency, evaluated with sequence-level nested cross-validation and bootstrap confidence intervals (Sec. V, VI-D).</w:t>
       </w:r>
     </w:p>
     <w:p>
@@ -1924,6 +1924,112 @@
           <w:smallCaps w:val="0"/>
           <w:sz w:val="20"/>
         </w:rPr>
+        <w:t>Learned tie graph.</w:t>
+      </w:r>
+      <w:r>
+        <w:rPr>
+          <w:b w:val="0"/>
+          <w:i w:val="0"/>
+          <w:smallCaps w:val="0"/>
+          <w:sz w:val="20"/>
+        </w:rPr>
+        <w:t xml:space="preserve"> The strong beams of this codebook are not contiguous: beams 27, 28, 32, 33 and 38 are often within 0.1 dB of each other, so a search around the last best beam misses the true best. For each beam b, the training flights give the beams most often within 1 dB of the best when b was the best. Two schemes use it, following the coarse/refine split of 3GPP beam management. </w:t>
+      </w:r>
+      <w:r>
+        <w:rPr>
+          <w:b w:val="0"/>
+          <w:i/>
+          <w:smallCaps w:val="0"/>
+          <w:sz w:val="20"/>
+        </w:rPr>
+        <w:t>Two-round</w:t>
+      </w:r>
+      <w:r>
+        <w:rPr>
+          <w:b w:val="0"/>
+          <w:i w:val="0"/>
+          <w:smallCaps w:val="0"/>
+          <w:sz w:val="20"/>
+        </w:rPr>
+        <w:t xml:space="preserve">: measure the first K₁ ranked beams, then the M top graph partners of the measured winner; if the best measured power is still more than 3 dB below the last sweep's peak, the beam is treated as lost and the remaining beams are swept. </w:t>
+      </w:r>
+      <w:r>
+        <w:rPr>
+          <w:b w:val="0"/>
+          <w:i/>
+          <w:smallCaps w:val="0"/>
+          <w:sz w:val="20"/>
+        </w:rPr>
+        <w:t>Burst</w:t>
+      </w:r>
+      <w:r>
+        <w:rPr>
+          <w:b w:val="0"/>
+          <w:i w:val="0"/>
+          <w:smallCaps w:val="0"/>
+          <w:sz w:val="20"/>
+        </w:rPr>
+        <w:t xml:space="preserve">: append the graph partners of the two </w:t>
+      </w:r>
+      <w:r>
+        <w:rPr>
+          <w:b w:val="0"/>
+          <w:i/>
+          <w:smallCaps w:val="0"/>
+          <w:sz w:val="20"/>
+        </w:rPr>
+        <w:t>predicted</w:t>
+      </w:r>
+      <w:r>
+        <w:rPr>
+          <w:b w:val="0"/>
+          <w:i w:val="0"/>
+          <w:smallCaps w:val="0"/>
+          <w:sz w:val="20"/>
+        </w:rPr>
+        <w:t xml:space="preserve"> best beams to the first K ranked beams and measure them all at once, avoiding a report round trip.</w:t>
+      </w:r>
+    </w:p>
+    <w:p>
+      <w:pPr>
+        <w:keepNext w:val="0"/>
+        <w:spacing w:before="0" w:after="0"/>
+        <w:ind w:firstLine="288"/>
+        <w:jc w:val="both"/>
+      </w:pPr>
+      <w:r>
+        <w:rPr>
+          <w:b/>
+          <w:i w:val="0"/>
+          <w:smallCaps w:val="0"/>
+          <w:sz w:val="20"/>
+        </w:rPr>
+        <w:t>Latency model.</w:t>
+      </w:r>
+      <w:r>
+        <w:rPr>
+          <w:b w:val="0"/>
+          <w:i w:val="0"/>
+          <w:smallCaps w:val="0"/>
+          <w:sz w:val="20"/>
+        </w:rPr>
+        <w:t xml:space="preserve"> We use 5G NR FR2 timing at 120 kHz subcarrier spacing, where up to 64 SSB beams fit in a 5 ms half-frame [22]: 78 µs per beam measurement, plus 1 ms for each extra report round trip. A full sweep costs 5 ms. GRU inference (0.5 ms for one model and 1.4 ms for the 3-model ensemble at batch size 1 on a laptop CPU) is not on the critical path: the shortlist for t + h is computed from sweep t, during the ≈140 ms before t + h.</w:t>
+      </w:r>
+    </w:p>
+    <w:p>
+      <w:pPr>
+        <w:keepNext w:val="0"/>
+        <w:spacing w:before="0" w:after="0"/>
+        <w:ind w:firstLine="288"/>
+        <w:jc w:val="both"/>
+      </w:pPr>
+      <w:r>
+        <w:rPr>
+          <w:b/>
+          <w:i w:val="0"/>
+          <w:smallCaps w:val="0"/>
+          <w:sz w:val="20"/>
+        </w:rPr>
         <w:t>Operating points by nested cross-validation.</w:t>
       </w:r>
       <w:r>
@@ -1933,7 +2039,7 @@
           <w:smallCaps w:val="0"/>
           <w:sz w:val="20"/>
         </w:rPr>
-        <w:t xml:space="preserve"> For each held-out fold, K (or τ) is the cheapest setting meeting 85% on both metrics over the other four folds, and is then applied unchanged to the held-out fold. 95% confidence intervals come from 500 bootstrap resamples of whole flight sequences.</w:t>
+        <w:t xml:space="preserve"> For each held-out fold, the setting (K, τ, or K₁, M and the fallback) is the lowest-latency one meeting 95% on both exact top-1 and all-class macro-F1 over the other four folds, and is then applied unchanged to the held-out fold. The tie graph is always fitted on folds other than those it is scored on, including inside this selection. 95% confidence intervals come from 500 bootstrap resamples of whole flight sequences.</w:t>
       </w:r>
     </w:p>
     <w:p>
@@ -7135,7 +7241,7 @@
           <w:smallCaps w:val="0"/>
           <w:sz w:val="20"/>
         </w:rPr>
-        <w:t xml:space="preserve"> (Table VIII, Fig. 4). Measuring a handful of predicted beams resolves the near-ties that blind prediction cannot. At t + 1, the GRU-ensemble + last-sweep shortlist selects the exact optimal beam 98.2% of the time with macro-F1 0.898 over all 56 classes, measuring 4 of 64 beams (6.3% of a full sweep); both 95% intervals lie above 0.85 (macro-F1 lower bound 0.864). The adaptive shortlist reaches 98.8% / 0.898 with 5.6 beams on average.</w:t>
+        <w:t xml:space="preserve"> (Table VIII, Fig. 4). Measuring a handful of predicted beams resolves the near-ties that blind prediction cannot. At t + 1, the GRU ensemble with the tie graph selects the exact optimal beam 99.3% of the time with macro-F1 0.961 over all 56 classes, measuring 7 of 64 beams in 0.55 ms; the 95% interval of exact top-1 lies above 95%. At t + 3, the same scheme reaches 99.1% exact top-1 and macro-F1 0.974 over beams with at least five samples, with 11.7 beams. The single-burst variant reaches 98.9% / 0.971 in 1.22 ms. Every scheme in Table VIII also keeps at least 99.5% of decisions within the 0.25 dB noise floor and at least 99.8% of the best beam's power.</w:t>
       </w:r>
     </w:p>
     <w:p>
@@ -7178,7 +7284,7 @@
           <w:smallCaps/>
           <w:sz w:val="16"/>
         </w:rPr>
-        <w:t>Reduced beam training, nested-CV operating points, scored against the full-sweep ground truth [95% CI over sequences]</w:t>
+        <w:t>Reduced beam training, nested-CV operating points, scored against the full-sweep ground truth [95% CI over sequences]. Latency: beam-training time under 5G NR FR2 timing (full sweep: 5 ms). Macro-F1 ≥ 5: over beam classes with at least five samples</w:t>
       </w:r>
     </w:p>
     <w:tbl>
@@ -7197,16 +7303,18 @@
         </w:tblCellMar>
       </w:tblPr>
       <w:tblGrid>
-        <w:gridCol w:w="972"/>
-        <w:gridCol w:w="2739"/>
-        <w:gridCol w:w="1811"/>
-        <w:gridCol w:w="1905"/>
-        <w:gridCol w:w="2651"/>
+        <w:gridCol w:w="741"/>
+        <w:gridCol w:w="2885"/>
+        <w:gridCol w:w="558"/>
+        <w:gridCol w:w="1199"/>
+        <w:gridCol w:w="1473"/>
+        <w:gridCol w:w="2022"/>
+        <w:gridCol w:w="1199"/>
       </w:tblGrid>
       <w:tr>
         <w:tc>
           <w:tcPr>
-            <w:tcW w:type="dxa" w:w="972"/>
+            <w:tcW w:type="dxa" w:w="742"/>
             <w:tcBorders>
               <w:bottom w:val="single" w:sz="4" w:color="000000"/>
             </w:tcBorders>
@@ -7230,7 +7338,7 @@
         </w:tc>
         <w:tc>
           <w:tcPr>
-            <w:tcW w:type="dxa" w:w="2740"/>
+            <w:tcW w:type="dxa" w:w="2886"/>
             <w:tcBorders>
               <w:bottom w:val="single" w:sz="4" w:color="000000"/>
             </w:tcBorders>
@@ -7254,7 +7362,7 @@
         </w:tc>
         <w:tc>
           <w:tcPr>
-            <w:tcW w:type="dxa" w:w="1812"/>
+            <w:tcW w:type="dxa" w:w="559"/>
             <w:tcBorders>
               <w:bottom w:val="single" w:sz="4" w:color="000000"/>
             </w:tcBorders>
@@ -7272,13 +7380,13 @@
                 <w:smallCaps w:val="0"/>
                 <w:sz w:val="16"/>
               </w:rPr>
-              <w:t>Beams measured</w:t>
+              <w:t>Beams</w:t>
             </w:r>
           </w:p>
         </w:tc>
         <w:tc>
           <w:tcPr>
-            <w:tcW w:type="dxa" w:w="1905"/>
+            <w:tcW w:type="dxa" w:w="1199"/>
             <w:tcBorders>
               <w:bottom w:val="single" w:sz="4" w:color="000000"/>
             </w:tcBorders>
@@ -7296,13 +7404,37 @@
                 <w:smallCaps w:val="0"/>
                 <w:sz w:val="16"/>
               </w:rPr>
-              <w:t>Exact top-1</w:t>
+              <w:t>Latency (ms)</w:t>
             </w:r>
           </w:p>
         </w:tc>
         <w:tc>
           <w:tcPr>
-            <w:tcW w:type="dxa" w:w="2651"/>
+            <w:tcW w:type="dxa" w:w="1474"/>
+            <w:tcBorders>
+              <w:bottom w:val="single" w:sz="4" w:color="000000"/>
+            </w:tcBorders>
+          </w:tcPr>
+          <w:p>
+            <w:pPr>
+              <w:keepNext w:val="0"/>
+              <w:spacing w:before="0" w:after="0"/>
+              <w:jc w:val="center"/>
+            </w:pPr>
+            <w:r>
+              <w:rPr>
+                <w:b/>
+                <w:i w:val="0"/>
+                <w:smallCaps w:val="0"/>
+                <w:sz w:val="16"/>
+              </w:rPr>
+              <w:t>Exact top-1 (%)</w:t>
+            </w:r>
+          </w:p>
+        </w:tc>
+        <w:tc>
+          <w:tcPr>
+            <w:tcW w:type="dxa" w:w="2022"/>
             <w:tcBorders>
               <w:bottom w:val="single" w:sz="4" w:color="000000"/>
             </w:tcBorders>
@@ -7324,11 +7456,35 @@
             </w:r>
           </w:p>
         </w:tc>
+        <w:tc>
+          <w:tcPr>
+            <w:tcW w:type="dxa" w:w="1199"/>
+            <w:tcBorders>
+              <w:bottom w:val="single" w:sz="4" w:color="000000"/>
+            </w:tcBorders>
+          </w:tcPr>
+          <w:p>
+            <w:pPr>
+              <w:keepNext w:val="0"/>
+              <w:spacing w:before="0" w:after="0"/>
+              <w:jc w:val="center"/>
+            </w:pPr>
+            <w:r>
+              <w:rPr>
+                <w:b/>
+                <w:i w:val="0"/>
+                <w:smallCaps w:val="0"/>
+                <w:sz w:val="16"/>
+              </w:rPr>
+              <w:t>Macro-F1 ≥ 5</w:t>
+            </w:r>
+          </w:p>
+        </w:tc>
       </w:tr>
       <w:tr>
         <w:tc>
           <w:tcPr>
-            <w:tcW w:type="dxa" w:w="972"/>
+            <w:tcW w:type="dxa" w:w="742"/>
           </w:tcPr>
           <w:p>
             <w:pPr>
@@ -7349,7 +7505,7 @@
         </w:tc>
         <w:tc>
           <w:tcPr>
-            <w:tcW w:type="dxa" w:w="2740"/>
+            <w:tcW w:type="dxa" w:w="2886"/>
           </w:tcPr>
           <w:p>
             <w:pPr>
@@ -7364,13 +7520,13 @@
                 <w:smallCaps w:val="0"/>
                 <w:sz w:val="16"/>
               </w:rPr>
-              <w:t>Last-sweep ranking</w:t>
+              <w:t>Last sweep, K = 4 (85% target)</w:t>
             </w:r>
           </w:p>
         </w:tc>
         <w:tc>
           <w:tcPr>
-            <w:tcW w:type="dxa" w:w="1812"/>
+            <w:tcW w:type="dxa" w:w="559"/>
           </w:tcPr>
           <w:p>
             <w:pPr>
@@ -7391,7 +7547,28 @@
         </w:tc>
         <w:tc>
           <w:tcPr>
-            <w:tcW w:type="dxa" w:w="1905"/>
+            <w:tcW w:type="dxa" w:w="1199"/>
+          </w:tcPr>
+          <w:p>
+            <w:pPr>
+              <w:keepNext w:val="0"/>
+              <w:spacing w:before="0" w:after="0"/>
+              <w:jc w:val="center"/>
+            </w:pPr>
+            <w:r>
+              <w:rPr>
+                <w:b w:val="0"/>
+                <w:i w:val="0"/>
+                <w:smallCaps w:val="0"/>
+                <w:sz w:val="16"/>
+              </w:rPr>
+              <w:t>0.33</w:t>
+            </w:r>
+          </w:p>
+        </w:tc>
+        <w:tc>
+          <w:tcPr>
+            <w:tcW w:type="dxa" w:w="1474"/>
           </w:tcPr>
           <w:p>
             <w:pPr>
@@ -7412,7 +7589,7 @@
         </w:tc>
         <w:tc>
           <w:tcPr>
-            <w:tcW w:type="dxa" w:w="2651"/>
+            <w:tcW w:type="dxa" w:w="2022"/>
           </w:tcPr>
           <w:p>
             <w:pPr>
@@ -7431,11 +7608,32 @@
             </w:r>
           </w:p>
         </w:tc>
+        <w:tc>
+          <w:tcPr>
+            <w:tcW w:type="dxa" w:w="1199"/>
+          </w:tcPr>
+          <w:p>
+            <w:pPr>
+              <w:keepNext w:val="0"/>
+              <w:spacing w:before="0" w:after="0"/>
+              <w:jc w:val="center"/>
+            </w:pPr>
+            <w:r>
+              <w:rPr>
+                <w:b w:val="0"/>
+                <w:i w:val="0"/>
+                <w:smallCaps w:val="0"/>
+                <w:sz w:val="16"/>
+              </w:rPr>
+              <w:t>0.945</w:t>
+            </w:r>
+          </w:p>
+        </w:tc>
       </w:tr>
       <w:tr>
         <w:tc>
           <w:tcPr>
-            <w:tcW w:type="dxa" w:w="972"/>
+            <w:tcW w:type="dxa" w:w="742"/>
           </w:tcPr>
           <w:p>
             <w:pPr>
@@ -7456,7 +7654,7 @@
         </w:tc>
         <w:tc>
           <w:tcPr>
-            <w:tcW w:type="dxa" w:w="2740"/>
+            <w:tcW w:type="dxa" w:w="2886"/>
           </w:tcPr>
           <w:p>
             <w:pPr>
@@ -7471,13 +7669,13 @@
                 <w:smallCaps w:val="0"/>
                 <w:sz w:val="16"/>
               </w:rPr>
-              <w:t>Window around last beam</w:t>
+              <w:t>Last sweep, K = 6</w:t>
             </w:r>
           </w:p>
         </w:tc>
         <w:tc>
           <w:tcPr>
-            <w:tcW w:type="dxa" w:w="1812"/>
+            <w:tcW w:type="dxa" w:w="559"/>
           </w:tcPr>
           <w:p>
             <w:pPr>
@@ -7498,7 +7696,7 @@
         </w:tc>
         <w:tc>
           <w:tcPr>
-            <w:tcW w:type="dxa" w:w="1905"/>
+            <w:tcW w:type="dxa" w:w="1199"/>
           </w:tcPr>
           <w:p>
             <w:pPr>
@@ -7513,13 +7711,13 @@
                 <w:smallCaps w:val="0"/>
                 <w:sz w:val="16"/>
               </w:rPr>
-              <w:t>99.0 [98.4, 99.6]</w:t>
+              <w:t>0.47</w:t>
             </w:r>
           </w:p>
         </w:tc>
         <w:tc>
           <w:tcPr>
-            <w:tcW w:type="dxa" w:w="2651"/>
+            <w:tcW w:type="dxa" w:w="1474"/>
           </w:tcPr>
           <w:p>
             <w:pPr>
@@ -7534,7 +7732,49 @@
                 <w:smallCaps w:val="0"/>
                 <w:sz w:val="16"/>
               </w:rPr>
-              <w:t>0.929 [0.890, 0.980]</w:t>
+              <w:t>99.1 [98.6, 99.5]</w:t>
+            </w:r>
+          </w:p>
+        </w:tc>
+        <w:tc>
+          <w:tcPr>
+            <w:tcW w:type="dxa" w:w="2022"/>
+          </w:tcPr>
+          <w:p>
+            <w:pPr>
+              <w:keepNext w:val="0"/>
+              <w:spacing w:before="0" w:after="0"/>
+              <w:jc w:val="center"/>
+            </w:pPr>
+            <w:r>
+              <w:rPr>
+                <w:b w:val="0"/>
+                <w:i w:val="0"/>
+                <w:smallCaps w:val="0"/>
+                <w:sz w:val="16"/>
+              </w:rPr>
+              <w:t>0.960 [0.940, 0.985]</w:t>
+            </w:r>
+          </w:p>
+        </w:tc>
+        <w:tc>
+          <w:tcPr>
+            <w:tcW w:type="dxa" w:w="1199"/>
+          </w:tcPr>
+          <w:p>
+            <w:pPr>
+              <w:keepNext w:val="0"/>
+              <w:spacing w:before="0" w:after="0"/>
+              <w:jc w:val="center"/>
+            </w:pPr>
+            <w:r>
+              <w:rPr>
+                <w:b w:val="0"/>
+                <w:i w:val="0"/>
+                <w:smallCaps w:val="0"/>
+                <w:sz w:val="16"/>
+              </w:rPr>
+              <w:t>0.981</w:t>
             </w:r>
           </w:p>
         </w:tc>
@@ -7542,7 +7782,7 @@
       <w:tr>
         <w:tc>
           <w:tcPr>
-            <w:tcW w:type="dxa" w:w="972"/>
+            <w:tcW w:type="dxa" w:w="742"/>
           </w:tcPr>
           <w:p>
             <w:pPr>
@@ -7563,7 +7803,7 @@
         </w:tc>
         <w:tc>
           <w:tcPr>
-            <w:tcW w:type="dxa" w:w="2740"/>
+            <w:tcW w:type="dxa" w:w="2886"/>
           </w:tcPr>
           <w:p>
             <w:pPr>
@@ -7573,18 +7813,18 @@
             </w:pPr>
             <w:r>
               <w:rPr>
-                <w:b w:val="0"/>
+                <w:b/>
                 <w:i w:val="0"/>
                 <w:smallCaps w:val="0"/>
                 <w:sz w:val="16"/>
               </w:rPr>
-              <w:t>GRU (single) + last sweep</w:t>
+              <w:t>GRU ensemble + tie graph, two-round</w:t>
             </w:r>
           </w:p>
         </w:tc>
         <w:tc>
           <w:tcPr>
-            <w:tcW w:type="dxa" w:w="1812"/>
+            <w:tcW w:type="dxa" w:w="559"/>
           </w:tcPr>
           <w:p>
             <w:pPr>
@@ -7594,18 +7834,18 @@
             </w:pPr>
             <w:r>
               <w:rPr>
-                <w:b w:val="0"/>
+                <w:b/>
                 <w:i w:val="0"/>
                 <w:smallCaps w:val="0"/>
                 <w:sz w:val="16"/>
               </w:rPr>
-              <w:t>4.0</w:t>
+              <w:t>7.0</w:t>
             </w:r>
           </w:p>
         </w:tc>
         <w:tc>
           <w:tcPr>
-            <w:tcW w:type="dxa" w:w="1905"/>
+            <w:tcW w:type="dxa" w:w="1199"/>
           </w:tcPr>
           <w:p>
             <w:pPr>
@@ -7615,18 +7855,18 @@
             </w:pPr>
             <w:r>
               <w:rPr>
-                <w:b w:val="0"/>
+                <w:b/>
                 <w:i w:val="0"/>
                 <w:smallCaps w:val="0"/>
                 <w:sz w:val="16"/>
               </w:rPr>
-              <w:t>98.1 [97.2, 98.7]</w:t>
+              <w:t>0.55</w:t>
             </w:r>
           </w:p>
         </w:tc>
         <w:tc>
           <w:tcPr>
-            <w:tcW w:type="dxa" w:w="2651"/>
+            <w:tcW w:type="dxa" w:w="1474"/>
           </w:tcPr>
           <w:p>
             <w:pPr>
@@ -7636,12 +7876,54 @@
             </w:pPr>
             <w:r>
               <w:rPr>
-                <w:b w:val="0"/>
+                <w:b/>
                 <w:i w:val="0"/>
                 <w:smallCaps w:val="0"/>
                 <w:sz w:val="16"/>
               </w:rPr>
-              <w:t>0.890 [0.853, 0.929]</w:t>
+              <w:t>99.3 [98.7, 99.7]</w:t>
+            </w:r>
+          </w:p>
+        </w:tc>
+        <w:tc>
+          <w:tcPr>
+            <w:tcW w:type="dxa" w:w="2022"/>
+          </w:tcPr>
+          <w:p>
+            <w:pPr>
+              <w:keepNext w:val="0"/>
+              <w:spacing w:before="0" w:after="0"/>
+              <w:jc w:val="center"/>
+            </w:pPr>
+            <w:r>
+              <w:rPr>
+                <w:b/>
+                <w:i w:val="0"/>
+                <w:smallCaps w:val="0"/>
+                <w:sz w:val="16"/>
+              </w:rPr>
+              <w:t>0.961 [0.941, 0.990]</w:t>
+            </w:r>
+          </w:p>
+        </w:tc>
+        <w:tc>
+          <w:tcPr>
+            <w:tcW w:type="dxa" w:w="1199"/>
+          </w:tcPr>
+          <w:p>
+            <w:pPr>
+              <w:keepNext w:val="0"/>
+              <w:spacing w:before="0" w:after="0"/>
+              <w:jc w:val="center"/>
+            </w:pPr>
+            <w:r>
+              <w:rPr>
+                <w:b/>
+                <w:i w:val="0"/>
+                <w:smallCaps w:val="0"/>
+                <w:sz w:val="16"/>
+              </w:rPr>
+              <w:t>0.985</w:t>
             </w:r>
           </w:p>
         </w:tc>
@@ -7649,7 +7931,7 @@
       <w:tr>
         <w:tc>
           <w:tcPr>
-            <w:tcW w:type="dxa" w:w="972"/>
+            <w:tcW w:type="dxa" w:w="742"/>
           </w:tcPr>
           <w:p>
             <w:pPr>
@@ -7670,93 +7952,7 @@
         </w:tc>
         <w:tc>
           <w:tcPr>
-            <w:tcW w:type="dxa" w:w="2740"/>
-          </w:tcPr>
-          <w:p>
-            <w:pPr>
-              <w:keepNext w:val="0"/>
-              <w:spacing w:before="0" w:after="0"/>
-              <w:jc w:val="left"/>
-            </w:pPr>
-            <w:r>
-              <w:rPr>
-                <w:b/>
-                <w:i w:val="0"/>
-                <w:smallCaps w:val="0"/>
-                <w:sz w:val="16"/>
-              </w:rPr>
-              <w:t>GRU ensemble + last sweep</w:t>
-            </w:r>
-          </w:p>
-        </w:tc>
-        <w:tc>
-          <w:tcPr>
-            <w:tcW w:type="dxa" w:w="1812"/>
-          </w:tcPr>
-          <w:p>
-            <w:pPr>
-              <w:keepNext w:val="0"/>
-              <w:spacing w:before="0" w:after="0"/>
-              <w:jc w:val="center"/>
-            </w:pPr>
-            <w:r>
-              <w:rPr>
-                <w:b/>
-                <w:i w:val="0"/>
-                <w:smallCaps w:val="0"/>
-                <w:sz w:val="16"/>
-              </w:rPr>
-              <w:t>4.0</w:t>
-            </w:r>
-          </w:p>
-        </w:tc>
-        <w:tc>
-          <w:tcPr>
-            <w:tcW w:type="dxa" w:w="1905"/>
-          </w:tcPr>
-          <w:p>
-            <w:pPr>
-              <w:keepNext w:val="0"/>
-              <w:spacing w:before="0" w:after="0"/>
-              <w:jc w:val="center"/>
-            </w:pPr>
-            <w:r>
-              <w:rPr>
-                <w:b/>
-                <w:i w:val="0"/>
-                <w:smallCaps w:val="0"/>
-                <w:sz w:val="16"/>
-              </w:rPr>
-              <w:t>98.2 [97.3, 98.9]</w:t>
-            </w:r>
-          </w:p>
-        </w:tc>
-        <w:tc>
-          <w:tcPr>
-            <w:tcW w:type="dxa" w:w="2651"/>
-          </w:tcPr>
-          <w:p>
-            <w:pPr>
-              <w:keepNext w:val="0"/>
-              <w:spacing w:before="0" w:after="0"/>
-              <w:jc w:val="center"/>
-            </w:pPr>
-            <w:r>
-              <w:rPr>
-                <w:b/>
-                <w:i w:val="0"/>
-                <w:smallCaps w:val="0"/>
-                <w:sz w:val="16"/>
-              </w:rPr>
-              <w:t>0.898 [0.864, 0.948]</w:t>
-            </w:r>
-          </w:p>
-        </w:tc>
-      </w:tr>
-      <w:tr>
-        <w:tc>
-          <w:tcPr>
-            <w:tcW w:type="dxa" w:w="972"/>
+            <w:tcW w:type="dxa" w:w="2886"/>
           </w:tcPr>
           <w:p>
             <w:pPr>
@@ -7771,34 +7967,13 @@
                 <w:smallCaps w:val="0"/>
                 <w:sz w:val="16"/>
               </w:rPr>
-              <w:t>t+1</w:t>
+              <w:t>GRU ensemble + last sweep, burst</w:t>
             </w:r>
           </w:p>
         </w:tc>
         <w:tc>
           <w:tcPr>
-            <w:tcW w:type="dxa" w:w="2740"/>
-          </w:tcPr>
-          <w:p>
-            <w:pPr>
-              <w:keepNext w:val="0"/>
-              <w:spacing w:before="0" w:after="0"/>
-              <w:jc w:val="left"/>
-            </w:pPr>
-            <w:r>
-              <w:rPr>
-                <w:b/>
-                <w:i w:val="0"/>
-                <w:smallCaps w:val="0"/>
-                <w:sz w:val="16"/>
-              </w:rPr>
-              <w:t>GRU adaptive (τ = 0.8)</w:t>
-            </w:r>
-          </w:p>
-        </w:tc>
-        <w:tc>
-          <w:tcPr>
-            <w:tcW w:type="dxa" w:w="1812"/>
+            <w:tcW w:type="dxa" w:w="559"/>
           </w:tcPr>
           <w:p>
             <w:pPr>
@@ -7808,18 +7983,18 @@
             </w:pPr>
             <w:r>
               <w:rPr>
-                <w:b/>
+                <w:b w:val="0"/>
                 <w:i w:val="0"/>
                 <w:smallCaps w:val="0"/>
                 <w:sz w:val="16"/>
               </w:rPr>
-              <w:t>5.6</w:t>
+              <w:t>6.4</w:t>
             </w:r>
           </w:p>
         </w:tc>
         <w:tc>
           <w:tcPr>
-            <w:tcW w:type="dxa" w:w="1905"/>
+            <w:tcW w:type="dxa" w:w="1199"/>
           </w:tcPr>
           <w:p>
             <w:pPr>
@@ -7829,18 +8004,18 @@
             </w:pPr>
             <w:r>
               <w:rPr>
-                <w:b/>
+                <w:b w:val="0"/>
                 <w:i w:val="0"/>
                 <w:smallCaps w:val="0"/>
                 <w:sz w:val="16"/>
               </w:rPr>
-              <w:t>98.8 [98.4, 99.3]</w:t>
+              <w:t>0.50</w:t>
             </w:r>
           </w:p>
         </w:tc>
         <w:tc>
           <w:tcPr>
-            <w:tcW w:type="dxa" w:w="2651"/>
+            <w:tcW w:type="dxa" w:w="1474"/>
           </w:tcPr>
           <w:p>
             <w:pPr>
@@ -7850,12 +8025,54 @@
             </w:pPr>
             <w:r>
               <w:rPr>
-                <w:b/>
+                <w:b w:val="0"/>
                 <w:i w:val="0"/>
                 <w:smallCaps w:val="0"/>
                 <w:sz w:val="16"/>
               </w:rPr>
-              <w:t>0.898 [0.857, 0.953]</w:t>
+              <w:t>99.2 [98.7, 99.6]</w:t>
+            </w:r>
+          </w:p>
+        </w:tc>
+        <w:tc>
+          <w:tcPr>
+            <w:tcW w:type="dxa" w:w="2022"/>
+          </w:tcPr>
+          <w:p>
+            <w:pPr>
+              <w:keepNext w:val="0"/>
+              <w:spacing w:before="0" w:after="0"/>
+              <w:jc w:val="center"/>
+            </w:pPr>
+            <w:r>
+              <w:rPr>
+                <w:b w:val="0"/>
+                <w:i w:val="0"/>
+                <w:smallCaps w:val="0"/>
+                <w:sz w:val="16"/>
+              </w:rPr>
+              <w:t>0.955 [0.940, 0.977]</w:t>
+            </w:r>
+          </w:p>
+        </w:tc>
+        <w:tc>
+          <w:tcPr>
+            <w:tcW w:type="dxa" w:w="1199"/>
+          </w:tcPr>
+          <w:p>
+            <w:pPr>
+              <w:keepNext w:val="0"/>
+              <w:spacing w:before="0" w:after="0"/>
+              <w:jc w:val="center"/>
+            </w:pPr>
+            <w:r>
+              <w:rPr>
+                <w:b w:val="0"/>
+                <w:i w:val="0"/>
+                <w:smallCaps w:val="0"/>
+                <w:sz w:val="16"/>
+              </w:rPr>
+              <w:t>0.984</w:t>
             </w:r>
           </w:p>
         </w:tc>
@@ -7863,7 +8080,7 @@
       <w:tr>
         <w:tc>
           <w:tcPr>
-            <w:tcW w:type="dxa" w:w="972"/>
+            <w:tcW w:type="dxa" w:w="742"/>
           </w:tcPr>
           <w:p>
             <w:pPr>
@@ -7884,7 +8101,7 @@
         </w:tc>
         <w:tc>
           <w:tcPr>
-            <w:tcW w:type="dxa" w:w="2740"/>
+            <w:tcW w:type="dxa" w:w="2886"/>
           </w:tcPr>
           <w:p>
             <w:pPr>
@@ -7899,13 +8116,13 @@
                 <w:smallCaps w:val="0"/>
                 <w:sz w:val="16"/>
               </w:rPr>
-              <w:t>Last-sweep ranking</w:t>
+              <w:t>Last sweep, K = 16</w:t>
             </w:r>
           </w:p>
         </w:tc>
         <w:tc>
           <w:tcPr>
-            <w:tcW w:type="dxa" w:w="1812"/>
+            <w:tcW w:type="dxa" w:w="559"/>
           </w:tcPr>
           <w:p>
             <w:pPr>
@@ -7926,7 +8143,28 @@
         </w:tc>
         <w:tc>
           <w:tcPr>
-            <w:tcW w:type="dxa" w:w="1905"/>
+            <w:tcW w:type="dxa" w:w="1199"/>
+          </w:tcPr>
+          <w:p>
+            <w:pPr>
+              <w:keepNext w:val="0"/>
+              <w:spacing w:before="0" w:after="0"/>
+              <w:jc w:val="center"/>
+            </w:pPr>
+            <w:r>
+              <w:rPr>
+                <w:b w:val="0"/>
+                <w:i w:val="0"/>
+                <w:smallCaps w:val="0"/>
+                <w:sz w:val="16"/>
+              </w:rPr>
+              <w:t>1.25</w:t>
+            </w:r>
+          </w:p>
+        </w:tc>
+        <w:tc>
+          <w:tcPr>
+            <w:tcW w:type="dxa" w:w="1474"/>
           </w:tcPr>
           <w:p>
             <w:pPr>
@@ -7947,7 +8185,7 @@
         </w:tc>
         <w:tc>
           <w:tcPr>
-            <w:tcW w:type="dxa" w:w="2651"/>
+            <w:tcW w:type="dxa" w:w="2022"/>
           </w:tcPr>
           <w:p>
             <w:pPr>
@@ -7966,11 +8204,32 @@
             </w:r>
           </w:p>
         </w:tc>
+        <w:tc>
+          <w:tcPr>
+            <w:tcW w:type="dxa" w:w="1199"/>
+          </w:tcPr>
+          <w:p>
+            <w:pPr>
+              <w:keepNext w:val="0"/>
+              <w:spacing w:before="0" w:after="0"/>
+              <w:jc w:val="center"/>
+            </w:pPr>
+            <w:r>
+              <w:rPr>
+                <w:b w:val="0"/>
+                <w:i w:val="0"/>
+                <w:smallCaps w:val="0"/>
+                <w:sz w:val="16"/>
+              </w:rPr>
+              <w:t>0.956</w:t>
+            </w:r>
+          </w:p>
+        </w:tc>
       </w:tr>
       <w:tr>
         <w:tc>
           <w:tcPr>
-            <w:tcW w:type="dxa" w:w="972"/>
+            <w:tcW w:type="dxa" w:w="742"/>
           </w:tcPr>
           <w:p>
             <w:pPr>
@@ -7991,7 +8250,7 @@
         </w:tc>
         <w:tc>
           <w:tcPr>
-            <w:tcW w:type="dxa" w:w="2740"/>
+            <w:tcW w:type="dxa" w:w="2886"/>
           </w:tcPr>
           <w:p>
             <w:pPr>
@@ -8006,13 +8265,13 @@
                 <w:smallCaps w:val="0"/>
                 <w:sz w:val="16"/>
               </w:rPr>
-              <w:t>GRU, soft target</w:t>
+              <w:t>GRU ensemble, single round</w:t>
             </w:r>
           </w:p>
         </w:tc>
         <w:tc>
           <w:tcPr>
-            <w:tcW w:type="dxa" w:w="1812"/>
+            <w:tcW w:type="dxa" w:w="559"/>
           </w:tcPr>
           <w:p>
             <w:pPr>
@@ -8027,13 +8286,13 @@
                 <w:smallCaps w:val="0"/>
                 <w:sz w:val="16"/>
               </w:rPr>
-              <w:t>10.8</w:t>
+              <w:t>15.2</w:t>
             </w:r>
           </w:p>
         </w:tc>
         <w:tc>
           <w:tcPr>
-            <w:tcW w:type="dxa" w:w="1905"/>
+            <w:tcW w:type="dxa" w:w="1199"/>
           </w:tcPr>
           <w:p>
             <w:pPr>
@@ -8048,13 +8307,13 @@
                 <w:smallCaps w:val="0"/>
                 <w:sz w:val="16"/>
               </w:rPr>
-              <w:t>97.1 [95.2, 98.7]</w:t>
+              <w:t>1.19</w:t>
             </w:r>
           </w:p>
         </w:tc>
         <w:tc>
           <w:tcPr>
-            <w:tcW w:type="dxa" w:w="2651"/>
+            <w:tcW w:type="dxa" w:w="1474"/>
           </w:tcPr>
           <w:p>
             <w:pPr>
@@ -8069,7 +8328,49 @@
                 <w:smallCaps w:val="0"/>
                 <w:sz w:val="16"/>
               </w:rPr>
-              <w:t>0.861 [0.804, 0.928]</w:t>
+              <w:t>98.9 [98.0, 99.5]</w:t>
+            </w:r>
+          </w:p>
+        </w:tc>
+        <w:tc>
+          <w:tcPr>
+            <w:tcW w:type="dxa" w:w="2022"/>
+          </w:tcPr>
+          <w:p>
+            <w:pPr>
+              <w:keepNext w:val="0"/>
+              <w:spacing w:before="0" w:after="0"/>
+              <w:jc w:val="center"/>
+            </w:pPr>
+            <w:r>
+              <w:rPr>
+                <w:b w:val="0"/>
+                <w:i w:val="0"/>
+                <w:smallCaps w:val="0"/>
+                <w:sz w:val="16"/>
+              </w:rPr>
+              <w:t>0.896 [0.864, 0.944]</w:t>
+            </w:r>
+          </w:p>
+        </w:tc>
+        <w:tc>
+          <w:tcPr>
+            <w:tcW w:type="dxa" w:w="1199"/>
+          </w:tcPr>
+          <w:p>
+            <w:pPr>
+              <w:keepNext w:val="0"/>
+              <w:spacing w:before="0" w:after="0"/>
+              <w:jc w:val="center"/>
+            </w:pPr>
+            <w:r>
+              <w:rPr>
+                <w:b w:val="0"/>
+                <w:i w:val="0"/>
+                <w:smallCaps w:val="0"/>
+                <w:sz w:val="16"/>
+              </w:rPr>
+              <w:t>0.965</w:t>
             </w:r>
           </w:p>
         </w:tc>
@@ -8077,7 +8378,7 @@
       <w:tr>
         <w:tc>
           <w:tcPr>
-            <w:tcW w:type="dxa" w:w="972"/>
+            <w:tcW w:type="dxa" w:w="742"/>
           </w:tcPr>
           <w:p>
             <w:pPr>
@@ -8098,7 +8399,156 @@
         </w:tc>
         <w:tc>
           <w:tcPr>
-            <w:tcW w:type="dxa" w:w="2740"/>
+            <w:tcW w:type="dxa" w:w="2886"/>
+          </w:tcPr>
+          <w:p>
+            <w:pPr>
+              <w:keepNext w:val="0"/>
+              <w:spacing w:before="0" w:after="0"/>
+              <w:jc w:val="left"/>
+            </w:pPr>
+            <w:r>
+              <w:rPr>
+                <w:b w:val="0"/>
+                <w:i w:val="0"/>
+                <w:smallCaps w:val="0"/>
+                <w:sz w:val="16"/>
+              </w:rPr>
+              <w:t>Last sweep + tie graph, two-round</w:t>
+            </w:r>
+          </w:p>
+        </w:tc>
+        <w:tc>
+          <w:tcPr>
+            <w:tcW w:type="dxa" w:w="559"/>
+          </w:tcPr>
+          <w:p>
+            <w:pPr>
+              <w:keepNext w:val="0"/>
+              <w:spacing w:before="0" w:after="0"/>
+              <w:jc w:val="center"/>
+            </w:pPr>
+            <w:r>
+              <w:rPr>
+                <w:b w:val="0"/>
+                <w:i w:val="0"/>
+                <w:smallCaps w:val="0"/>
+                <w:sz w:val="16"/>
+              </w:rPr>
+              <w:t>13.9</w:t>
+            </w:r>
+          </w:p>
+        </w:tc>
+        <w:tc>
+          <w:tcPr>
+            <w:tcW w:type="dxa" w:w="1199"/>
+          </w:tcPr>
+          <w:p>
+            <w:pPr>
+              <w:keepNext w:val="0"/>
+              <w:spacing w:before="0" w:after="0"/>
+              <w:jc w:val="center"/>
+            </w:pPr>
+            <w:r>
+              <w:rPr>
+                <w:b w:val="0"/>
+                <w:i w:val="0"/>
+                <w:smallCaps w:val="0"/>
+                <w:sz w:val="16"/>
+              </w:rPr>
+              <w:t>2.11</w:t>
+            </w:r>
+          </w:p>
+        </w:tc>
+        <w:tc>
+          <w:tcPr>
+            <w:tcW w:type="dxa" w:w="1474"/>
+          </w:tcPr>
+          <w:p>
+            <w:pPr>
+              <w:keepNext w:val="0"/>
+              <w:spacing w:before="0" w:after="0"/>
+              <w:jc w:val="center"/>
+            </w:pPr>
+            <w:r>
+              <w:rPr>
+                <w:b w:val="0"/>
+                <w:i w:val="0"/>
+                <w:smallCaps w:val="0"/>
+                <w:sz w:val="16"/>
+              </w:rPr>
+              <w:t>99.4 [98.9, 99.7]</w:t>
+            </w:r>
+          </w:p>
+        </w:tc>
+        <w:tc>
+          <w:tcPr>
+            <w:tcW w:type="dxa" w:w="2022"/>
+          </w:tcPr>
+          <w:p>
+            <w:pPr>
+              <w:keepNext w:val="0"/>
+              <w:spacing w:before="0" w:after="0"/>
+              <w:jc w:val="center"/>
+            </w:pPr>
+            <w:r>
+              <w:rPr>
+                <w:b w:val="0"/>
+                <w:i w:val="0"/>
+                <w:smallCaps w:val="0"/>
+                <w:sz w:val="16"/>
+              </w:rPr>
+              <w:t>0.914 [0.889, 0.956]</w:t>
+            </w:r>
+          </w:p>
+        </w:tc>
+        <w:tc>
+          <w:tcPr>
+            <w:tcW w:type="dxa" w:w="1199"/>
+          </w:tcPr>
+          <w:p>
+            <w:pPr>
+              <w:keepNext w:val="0"/>
+              <w:spacing w:before="0" w:after="0"/>
+              <w:jc w:val="center"/>
+            </w:pPr>
+            <w:r>
+              <w:rPr>
+                <w:b w:val="0"/>
+                <w:i w:val="0"/>
+                <w:smallCaps w:val="0"/>
+                <w:sz w:val="16"/>
+              </w:rPr>
+              <w:t>0.979</w:t>
+            </w:r>
+          </w:p>
+        </w:tc>
+      </w:tr>
+      <w:tr>
+        <w:tc>
+          <w:tcPr>
+            <w:tcW w:type="dxa" w:w="742"/>
+          </w:tcPr>
+          <w:p>
+            <w:pPr>
+              <w:keepNext w:val="0"/>
+              <w:spacing w:before="0" w:after="0"/>
+              <w:jc w:val="left"/>
+            </w:pPr>
+            <w:r>
+              <w:rPr>
+                <w:b w:val="0"/>
+                <w:i w:val="0"/>
+                <w:smallCaps w:val="0"/>
+                <w:sz w:val="16"/>
+              </w:rPr>
+              <w:t>t+3</w:t>
+            </w:r>
+          </w:p>
+        </w:tc>
+        <w:tc>
+          <w:tcPr>
+            <w:tcW w:type="dxa" w:w="2886"/>
           </w:tcPr>
           <w:p>
             <w:pPr>
@@ -8113,13 +8563,13 @@
                 <w:smallCaps w:val="0"/>
                 <w:sz w:val="16"/>
               </w:rPr>
-              <w:t>GRU ensemble, augmented</w:t>
+              <w:t>GRU ensemble + tie graph, two-round</w:t>
             </w:r>
           </w:p>
         </w:tc>
         <w:tc>
           <w:tcPr>
-            <w:tcW w:type="dxa" w:w="1812"/>
+            <w:tcW w:type="dxa" w:w="559"/>
           </w:tcPr>
           <w:p>
             <w:pPr>
@@ -8134,13 +8584,13 @@
                 <w:smallCaps w:val="0"/>
                 <w:sz w:val="16"/>
               </w:rPr>
-              <w:t>8.4</w:t>
+              <w:t>11.7</w:t>
             </w:r>
           </w:p>
         </w:tc>
         <w:tc>
           <w:tcPr>
-            <w:tcW w:type="dxa" w:w="1905"/>
+            <w:tcW w:type="dxa" w:w="1199"/>
           </w:tcPr>
           <w:p>
             <w:pPr>
@@ -8155,13 +8605,13 @@
                 <w:smallCaps w:val="0"/>
                 <w:sz w:val="16"/>
               </w:rPr>
-              <w:t>98.0 [96.6, 99.2]</w:t>
+              <w:t>1.93</w:t>
             </w:r>
           </w:p>
         </w:tc>
         <w:tc>
           <w:tcPr>
-            <w:tcW w:type="dxa" w:w="2651"/>
+            <w:tcW w:type="dxa" w:w="1474"/>
           </w:tcPr>
           <w:p>
             <w:pPr>
@@ -8176,7 +8626,198 @@
                 <w:smallCaps w:val="0"/>
                 <w:sz w:val="16"/>
               </w:rPr>
-              <w:t>0.865 [0.813, 0.920]</w:t>
+              <w:t>99.1 [98.3, 99.7]</w:t>
+            </w:r>
+          </w:p>
+        </w:tc>
+        <w:tc>
+          <w:tcPr>
+            <w:tcW w:type="dxa" w:w="2022"/>
+          </w:tcPr>
+          <w:p>
+            <w:pPr>
+              <w:keepNext w:val="0"/>
+              <w:spacing w:before="0" w:after="0"/>
+              <w:jc w:val="center"/>
+            </w:pPr>
+            <w:r>
+              <w:rPr>
+                <w:b/>
+                <w:i w:val="0"/>
+                <w:smallCaps w:val="0"/>
+                <w:sz w:val="16"/>
+              </w:rPr>
+              <w:t>0.929 [0.905, 0.964]</w:t>
+            </w:r>
+          </w:p>
+        </w:tc>
+        <w:tc>
+          <w:tcPr>
+            <w:tcW w:type="dxa" w:w="1199"/>
+          </w:tcPr>
+          <w:p>
+            <w:pPr>
+              <w:keepNext w:val="0"/>
+              <w:spacing w:before="0" w:after="0"/>
+              <w:jc w:val="center"/>
+            </w:pPr>
+            <w:r>
+              <w:rPr>
+                <w:b/>
+                <w:i w:val="0"/>
+                <w:smallCaps w:val="0"/>
+                <w:sz w:val="16"/>
+              </w:rPr>
+              <w:t>0.974</w:t>
+            </w:r>
+          </w:p>
+        </w:tc>
+      </w:tr>
+      <w:tr>
+        <w:tc>
+          <w:tcPr>
+            <w:tcW w:type="dxa" w:w="742"/>
+          </w:tcPr>
+          <w:p>
+            <w:pPr>
+              <w:keepNext w:val="0"/>
+              <w:spacing w:before="0" w:after="0"/>
+              <w:jc w:val="left"/>
+            </w:pPr>
+            <w:r>
+              <w:rPr>
+                <w:b w:val="0"/>
+                <w:i w:val="0"/>
+                <w:smallCaps w:val="0"/>
+                <w:sz w:val="16"/>
+              </w:rPr>
+              <w:t>t+3</w:t>
+            </w:r>
+          </w:p>
+        </w:tc>
+        <w:tc>
+          <w:tcPr>
+            <w:tcW w:type="dxa" w:w="2886"/>
+          </w:tcPr>
+          <w:p>
+            <w:pPr>
+              <w:keepNext w:val="0"/>
+              <w:spacing w:before="0" w:after="0"/>
+              <w:jc w:val="left"/>
+            </w:pPr>
+            <w:r>
+              <w:rPr>
+                <w:b w:val="0"/>
+                <w:i w:val="0"/>
+                <w:smallCaps w:val="0"/>
+                <w:sz w:val="16"/>
+              </w:rPr>
+              <w:t>GRU ensemble + tie graph, burst</w:t>
+            </w:r>
+          </w:p>
+        </w:tc>
+        <w:tc>
+          <w:tcPr>
+            <w:tcW w:type="dxa" w:w="559"/>
+          </w:tcPr>
+          <w:p>
+            <w:pPr>
+              <w:keepNext w:val="0"/>
+              <w:spacing w:before="0" w:after="0"/>
+              <w:jc w:val="center"/>
+            </w:pPr>
+            <w:r>
+              <w:rPr>
+                <w:b w:val="0"/>
+                <w:i w:val="0"/>
+                <w:smallCaps w:val="0"/>
+                <w:sz w:val="16"/>
+              </w:rPr>
+              <w:t>15.6</w:t>
+            </w:r>
+          </w:p>
+        </w:tc>
+        <w:tc>
+          <w:tcPr>
+            <w:tcW w:type="dxa" w:w="1199"/>
+          </w:tcPr>
+          <w:p>
+            <w:pPr>
+              <w:keepNext w:val="0"/>
+              <w:spacing w:before="0" w:after="0"/>
+              <w:jc w:val="center"/>
+            </w:pPr>
+            <w:r>
+              <w:rPr>
+                <w:b w:val="0"/>
+                <w:i w:val="0"/>
+                <w:smallCaps w:val="0"/>
+                <w:sz w:val="16"/>
+              </w:rPr>
+              <w:t>1.22</w:t>
+            </w:r>
+          </w:p>
+        </w:tc>
+        <w:tc>
+          <w:tcPr>
+            <w:tcW w:type="dxa" w:w="1474"/>
+          </w:tcPr>
+          <w:p>
+            <w:pPr>
+              <w:keepNext w:val="0"/>
+              <w:spacing w:before="0" w:after="0"/>
+              <w:jc w:val="center"/>
+            </w:pPr>
+            <w:r>
+              <w:rPr>
+                <w:b w:val="0"/>
+                <w:i w:val="0"/>
+                <w:smallCaps w:val="0"/>
+                <w:sz w:val="16"/>
+              </w:rPr>
+              <w:t>98.9 [98.1, 99.6]</w:t>
+            </w:r>
+          </w:p>
+        </w:tc>
+        <w:tc>
+          <w:tcPr>
+            <w:tcW w:type="dxa" w:w="2022"/>
+          </w:tcPr>
+          <w:p>
+            <w:pPr>
+              <w:keepNext w:val="0"/>
+              <w:spacing w:before="0" w:after="0"/>
+              <w:jc w:val="center"/>
+            </w:pPr>
+            <w:r>
+              <w:rPr>
+                <w:b w:val="0"/>
+                <w:i w:val="0"/>
+                <w:smallCaps w:val="0"/>
+                <w:sz w:val="16"/>
+              </w:rPr>
+              <w:t>0.912 [0.880, 0.949]</w:t>
+            </w:r>
+          </w:p>
+        </w:tc>
+        <w:tc>
+          <w:tcPr>
+            <w:tcW w:type="dxa" w:w="1199"/>
+          </w:tcPr>
+          <w:p>
+            <w:pPr>
+              <w:keepNext w:val="0"/>
+              <w:spacing w:before="0" w:after="0"/>
+              <w:jc w:val="center"/>
+            </w:pPr>
+            <w:r>
+              <w:rPr>
+                <w:b w:val="0"/>
+                <w:i w:val="0"/>
+                <w:smallCaps w:val="0"/>
+                <w:sz w:val="16"/>
+              </w:rPr>
+              <w:t>0.971</w:t>
             </w:r>
           </w:p>
         </w:tc>
@@ -8237,7 +8878,7 @@
             <w:r>
               <w:drawing>
                 <wp:inline xmlns:a="http://schemas.openxmlformats.org/drawingml/2006/main" xmlns:pic="http://schemas.openxmlformats.org/drawingml/2006/picture">
-                  <wp:extent cx="5943600" cy="1936647"/>
+                  <wp:extent cx="5943600" cy="3725413"/>
                   <wp:docPr id="4" name="Picture 4"/>
                   <wp:cNvGraphicFramePr>
                     <a:graphicFrameLocks noChangeAspect="1"/>
@@ -8258,7 +8899,7 @@
                         <pic:spPr>
                           <a:xfrm>
                             <a:off x="0" y="0"/>
-                            <a:ext cx="5943600" cy="1936647"/>
+                            <a:ext cx="5943600" cy="3725413"/>
                           </a:xfrm>
                           <a:prstGeom prst="rect"/>
                         </pic:spPr>
@@ -8291,7 +8932,7 @@
                 <w:smallCaps w:val="0"/>
                 <w:sz w:val="16"/>
               </w:rPr>
-              <w:t>Exact top-1 (left) and macro-F1 (right) at t + 1 versus beams measured, out-of-fold predictions; dotted line: non-causal blind-prediction ceiling.</w:t>
+              <w:t>Exact top-1 (left) and all-class macro-F1 (right) versus beams measured at t + 1 (top) and t + 3 (bottom), out-of-fold predictions; dashed: 95% target; dotted: non-causal blind-prediction ceiling.</w:t>
             </w:r>
           </w:p>
         </w:tc>
@@ -8329,7 +8970,7 @@
           <w:smallCaps w:val="0"/>
           <w:sz w:val="20"/>
         </w:rPr>
-        <w:t>The learned ranking's advantage is in measurement cost rather than in the attainable accuracy: a non-learned window of 6 beams also exceeds 85% at t + 1, while the AI shortlists reach the target with 4–5.6 beams, and at t + 3 the augmented ensemble needs 8.4 beams against 16 for the last-sweep ranking (a 48% saving). At t + 3 the macro-F1 point estimates exceed 0.85 but their intervals do not: the rarest beams at this horizon occur in only one or two of the 35 flights, so resampling flights moves macro-F1 widely. Classes with at most 5 samples drive the gap (macro-F1 over classes with ≥ 5 samples is 0.94–0.96); more flights, not a different model, are needed to narrow this interval.</w:t>
+        <w:t>Raising the target from 85% to 95% costs 2–3 more beams at t + 1, still under 0.6 ms. At this horizon a non-learned 6-beam shortlist also meets the target, so the learned ranking adds little. The tie graph and the GRU matter at t + 3: all-class macro-F1 rises from 0.860 (last sweep, 16 beams) to 0.929 with 11.7 beams, and the GRU ensemble needs 16% fewer beams than the last-sweep ranking with the same graph. At t + 3, all-class macro-F1 stays below 0.95, and the reason is identifiable: three beams (23, 34 and 55) occur once in the whole dataset, and in each case the best beam beats the runner-up by about 0.01 dB. Each such class costs 1/56 ≈ 0.018 of macro-F1. Over classes with at least five samples, every t + 3 scheme with the tie graph exceeds 0.97. Pooled curves reach 0.95 all-class with 16–18 beams, but settings selected on four folds do not hold it on the fifth, so we report the nested values.</w:t>
       </w:r>
     </w:p>
     <w:p>
@@ -8423,7 +9064,7 @@
           <w:smallCaps w:val="0"/>
           <w:sz w:val="20"/>
         </w:rPr>
-        <w:t xml:space="preserve"> On power sweeps alone the learned gain over persistence is modest at t + 1 and clear at t + 3 (86.0% vs 78.1% within noise; 8.4 vs 16 beams for the shortlist target). The soft target and beam-axis augmentation matter more than the architecture. Logit adjustment for the class imbalance [19] lowered every metric because the beam distribution differs between flights.</w:t>
+        <w:t xml:space="preserve"> On power sweeps alone the learned gain over persistence is modest at t + 1 and clear at t + 3 (86.0% vs 78.1% within noise). In reduced beam training, the largest single gain comes from a simple learned structure, the beam-tie graph, rather than from the sequence model. The GRU then reduces the beams measured at t + 3. The soft target and beam-axis augmentation matter more than the architecture. Logit adjustment for the class imbalance [19] lowered every metric because the beam distribution differs between flights.</w:t>
       </w:r>
     </w:p>
     <w:p>
@@ -8449,7 +9090,7 @@
           <w:smallCaps w:val="0"/>
           <w:sz w:val="20"/>
         </w:rPr>
-        <w:t xml:space="preserve"> Saleh and coupling coefficients are literature values, not measurements of a 60 GHz PA or RIS; Table II bounds the effect of the coupling strength. The obliquity exponent is assumed. The physical-layer results are simulated; the beam-prediction results use power sweeps only, because the UAV GPS files of Scenario 23 were not available to us at the time of writing. The t + 3 macro-F1 is close to 0.85 and its interval includes it. The D-band transceiver values are representative published figures, not a specific design.</w:t>
+        <w:t xml:space="preserve"> Saleh and coupling coefficients are literature values, not measurements of a 60 GHz PA or RIS; Table II bounds the effect of the coupling strength. The obliquity exponent is assumed. The physical-layer results are simulated; the beam-prediction results use power sweeps only, because the UAV GPS files of Scenario 23 were not available to us at the time of writing. The all-class macro-F1 at t + 3 (0.929) is limited by beams seen only once; more flights, not a different model, are needed to estimate it reliably. The latency model uses standard 5G NR FR2 timing, not the testbed's own sweep timing. The D-band transceiver values are representative published figures, not a specific design.</w:t>
       </w:r>
     </w:p>
     <w:p>
@@ -8482,7 +9123,7 @@
           <w:smallCaps w:val="0"/>
           <w:sz w:val="20"/>
         </w:rPr>
-        <w:t>We built a hardware-aware model of an RIS-assisted mmWave UAV link and used it, with real 60 GHz measurements, to evaluate beam management end to end. Hardware impairments cost 7.8 dB and 2.25× RIS elements at 60 GHz, and D-band transceiver limits push the 140 GHz panel to 32 cm; a position-parametric estimator matches perfect channel knowledge with 64× fewer pilots; Kalman-based prediction preserves 99.3% of the array gain at 500 ms latency; and AI-assisted reduced beam training selects the exact optimal beam 98.2% of the time at 6.3% of the sweep cost, with all reported metrics evaluated under sequence-level cross-validation. Future work will add UAV position to beam prediction, measured hardware coefficients, and joint training of the tracker and the beam shortlist.</w:t>
+        <w:t>We built a hardware-aware model of an RIS-assisted mmWave UAV link and used it, with real 60 GHz measurements, to evaluate beam management end to end. Hardware impairments cost 7.8 dB and 2.25× RIS elements at 60 GHz, and D-band transceiver limits push the 140 GHz panel to 32 cm; a position-parametric estimator matches perfect channel knowledge with 64× fewer pilots; Kalman-based prediction preserves 99.3% of the array gain at 500 ms latency; and AI-assisted reduced beam training with a learned beam-tie graph selects the exact optimal beam 99.3% of the time (macro-F1 0.961) with 0.55 ms of beam training, and 99.1% at a 0.4 s horizon, with all reported metrics evaluated under sequence-level cross-validation. Future work will add UAV position to beam prediction, measured hardware coefficients, and joint training of the tracker and the beam shortlist.</w:t>
       </w:r>
     </w:p>
     <w:p>
@@ -9458,6 +10099,38 @@
           <w:highlight w:val="yellow"/>
         </w:rPr>
         <w:t>[VERIFY: cite a D-band (≈140 GHz) SiGe LNA with ≈10 dB noise figure; a 0.13 µm SiGe 5-stage amplifier with NF down to 10 dB was found but its full citation needs checking.]</w:t>
+      </w:r>
+    </w:p>
+    <w:p>
+      <w:pPr>
+        <w:keepNext w:val="0"/>
+        <w:tabs>
+          <w:tab w:pos="432" w:val="left"/>
+        </w:tabs>
+        <w:spacing w:before="0" w:after="0"/>
+        <w:ind w:left="432" w:hanging="432"/>
+        <w:jc w:val="both"/>
+      </w:pPr>
+      <w:r>
+        <w:rPr>
+          <w:b w:val="0"/>
+          <w:i w:val="0"/>
+          <w:smallCaps w:val="0"/>
+          <w:sz w:val="16"/>
+        </w:rPr>
+        <w:t>[22]</w:t>
+        <w:tab/>
+        <w:t xml:space="preserve">3GPP TS 38.213, "NR; Physical layer procedures for control," Sec. 4.1 (SS/PBCH block candidate positions, case D). </w:t>
+      </w:r>
+      <w:r>
+        <w:rPr>
+          <w:b/>
+          <w:i w:val="0"/>
+          <w:smallCaps w:val="0"/>
+          <w:sz w:val="16"/>
+          <w:highlight w:val="yellow"/>
+        </w:rPr>
+        <w:t>[VERIFY: release and version.]</w:t>
       </w:r>
     </w:p>
     <w:p>

</xml_diff>

<commit_message>
Paper: add conformal shortlists and closed-loop replay (Table IX)
Mark the Table VIII results as open-loop, since they assume full-sweep
history. Lead the abstract and conclusion with the closed-loop result:
97.2% exact top-1 at 1.05 ms per decision. Add references [23] and [24]
and rebuild the IEEE Word file.

Co-Authored-By: Claude Opus 5.5 <noreply@anthropic.com>
</commit_message>
<xml_diff>
--- a/paper/revised_paper_ieee.docx
+++ b/paper/revised_paper_ieee.docx
@@ -115,7 +115,7 @@
           <w:smallCaps w:val="0"/>
           <w:sz w:val="18"/>
         </w:rPr>
-        <w:t>Millimetre-wave (mmWave) and sub-terahertz links can give unmanned aerial vehicles (UAVs) multi-gigabit connectivity, but narrow beams, high path loss and UAV mobility make beam management costly, and practical hardware departs from the ideal models most reconfigurable intelligent surface (RIS) studies assume. We present a hardware-aware framework for an RIS-assisted 60 GHz UAV link that models transmitter power-amplifier (PA) distortion through the Bussgang decomposition, RIS phase quantization, phase noise, amplitude–phase coupling and antenna mismatch, together with ITU-R P.676-13 gaseous absorption. On this model we show that (i) impairments cost 7.8 dB of SNDR, dominated by amplitude–phase coupling, so a realistic RIS needs about 2.25× more elements than an ideal one for full coverage of a 300 m flight; (ii) a position-parametric channel estimator reaches within 0.15 dB of perfect channel knowledge with 64× fewer pilots than per-element LMMSE, and needs no pilots when a 100 ms Kalman prediction is available; and (iii) predictive tracking delivers 99.3% of the ideal array gain at 500 ms latency, whereas persistence delivers 63%. On real 60 GHz measurements (DeepSense 6G Scenario 23) we show that exact blind beam prediction is bounded at 79% top-1 by measurement noise, and propose an AI-assisted reduced beam training scheme with a learned beam-tie graph. At a 140 ms horizon it selects the exact optimal beam 99.3% of the time (macro-F1 0.961 over all 56 beam classes) with 0.55 ms of beam training, 9× less than a full sweep; at a 0.4 s horizon it reaches 99.1% exact top-1 and macro-F1 0.974 over beams with at least five samples, under sequence-level nested cross-validation.</w:t>
+        <w:t>Millimetre-wave (mmWave) and sub-terahertz links can give unmanned aerial vehicles (UAVs) multi-gigabit connectivity, but narrow beams, high path loss and UAV mobility make beam management costly, and practical hardware departs from the ideal models most reconfigurable intelligent surface (RIS) studies assume. We present a hardware-aware framework for an RIS-assisted 60 GHz UAV link that models transmitter power-amplifier (PA) distortion through the Bussgang decomposition, RIS phase quantization, phase noise, amplitude–phase coupling and antenna mismatch, together with ITU-R P.676-13 gaseous absorption. On this model we show that (i) impairments cost 7.8 dB of SNDR, dominated by amplitude–phase coupling, so a realistic RIS needs about 2.25× more elements than an ideal one for full coverage of a 300 m flight; (ii) a position-parametric channel estimator reaches within 0.15 dB of perfect channel knowledge with 64× fewer pilots than per-element LMMSE, and needs no pilots when a 100 ms Kalman prediction is available; and (iii) predictive tracking delivers 99.3% of the ideal array gain at 500 ms latency, whereas persistence delivers 63%. On real 60 GHz measurements (DeepSense 6G Scenario 23) we show that exact blind beam prediction is bounded at 79% top-1 by measurement noise, and propose an AI-assisted reduced beam training scheme with a learned beam-tie graph. Given full-sweep history it selects the exact optimal beam 99.3% of the time at a 140 ms horizon (macro-F1 0.961 over all 56 beam classes) and 99.1% at 0.4 s. Replayed in closed loop, where the system knows only the beams it measured, tie-graph tracking selects the exact optimal beam 97.2% of the time (99.2% within measurement noise) with 1.05 ms of beam training per decision instead of 5 ms, under sequence-level cross-validation.</w:t>
       </w:r>
     </w:p>
     <w:p>
@@ -296,7 +296,7 @@
         </w:rPr>
         <w:t>4)</w:t>
         <w:tab/>
-        <w:t>On real 60 GHz measurements, a proof that exact blind beam prediction is noise-limited, a GRU trained on a soft power target, a learned beam-tie graph, and an AI-assisted reduced beam training scheme meeting ≥ 95% exact top-1 and macro-F1 at sub-millisecond beam-training latency, evaluated with sequence-level nested cross-validation and bootstrap confidence intervals (Sec. V, VI-D).</w:t>
+        <w:t>On real 60 GHz measurements, a proof that exact blind beam prediction is noise-limited, a GRU trained on a soft power target, a learned beam-tie graph, and an AI-assisted reduced beam training scheme meeting ≥ 95% exact top-1 and macro-F1, conformal shortlists calibrated to a target accuracy, and a closed-loop replay of every flight in which the system knows only what it measured, evaluated with sequence-level cross-validation and bootstrap confidence intervals (Sec. V, VI-D).</w:t>
       </w:r>
     </w:p>
     <w:p>
@@ -2040,6 +2040,115 @@
           <w:sz w:val="20"/>
         </w:rPr>
         <w:t xml:space="preserve"> For each held-out fold, the setting (K, τ, or K₁, M and the fallback) is the lowest-latency one meeting 95% on both exact top-1 and all-class macro-F1 over the other four folds, and is then applied unchanged to the held-out fold. The tie graph is always fitted on folds other than those it is scored on, including inside this selection. 95% confidence intervals come from 500 bootstrap resamples of whole flight sequences.</w:t>
+      </w:r>
+    </w:p>
+    <w:p>
+      <w:pPr>
+        <w:keepNext w:val="0"/>
+        <w:spacing w:before="0" w:after="0"/>
+        <w:ind w:firstLine="288"/>
+        <w:jc w:val="both"/>
+      </w:pPr>
+      <w:r>
+        <w:rPr>
+          <w:b/>
+          <w:i w:val="0"/>
+          <w:smallCaps w:val="0"/>
+          <w:sz w:val="20"/>
+        </w:rPr>
+        <w:t>Conformal shortlists.</w:t>
+      </w:r>
+      <w:r>
+        <w:rPr>
+          <w:b w:val="0"/>
+          <w:i w:val="0"/>
+          <w:smallCaps w:val="0"/>
+          <w:sz w:val="20"/>
+        </w:rPr>
+        <w:t xml:space="preserve"> A measured set returns the exact optimal beam if and only if that beam is in the set, so set coverage equals exact top-1. We calibrate the set size by split conformal prediction [23]: on four folds, the score is the true beam's rank in the GRU ranking, and the threshold is its ⌈(n + 1)(1 − α)⌉-th smallest value; the fifth fold is the test. Adaptive prediction sets [24] use the GRU's cumulative probability instead. Samples within a flight are correlated and flights differ, so the exchangeability behind the guarantee holds only approximately; we report the coverage of every held-out fold.</w:t>
+      </w:r>
+    </w:p>
+    <w:p>
+      <w:pPr>
+        <w:keepNext w:val="0"/>
+        <w:spacing w:before="0" w:after="0"/>
+        <w:ind w:firstLine="288"/>
+        <w:jc w:val="both"/>
+      </w:pPr>
+      <w:r>
+        <w:rPr>
+          <w:b/>
+          <w:i w:val="0"/>
+          <w:smallCaps w:val="0"/>
+          <w:sz w:val="20"/>
+        </w:rPr>
+        <w:t>Closed-loop replay.</w:t>
+      </w:r>
+      <w:r>
+        <w:rPr>
+          <w:b w:val="0"/>
+          <w:i w:val="0"/>
+          <w:smallCaps w:val="0"/>
+          <w:sz w:val="20"/>
+        </w:rPr>
+        <w:t xml:space="preserve"> The schemes above build each shortlist from full sweeps of earlier steps, which a system measuring only K beams per step never has. We therefore replay every flight step by step with policies that know only the beams they measured: the current beam, its ±1 index neighbours and its M strongest tie-graph partners (fitted on other folds' flights), with a full sweep every N steps or only on beam loss (best measured power more than 3 dB below the current beam's last value). The effective spectral efficiency over each interval is (1 − T</w:t>
+      </w:r>
+      <w:r>
+        <w:rPr>
+          <w:b w:val="0"/>
+          <w:i w:val="0"/>
+          <w:smallCaps w:val="0"/>
+          <w:sz w:val="20"/>
+          <w:vertAlign w:val="subscript"/>
+        </w:rPr>
+        <w:t>train</w:t>
+      </w:r>
+      <w:r>
+        <w:rPr>
+          <w:b w:val="0"/>
+          <w:i w:val="0"/>
+          <w:smallCaps w:val="0"/>
+          <w:sz w:val="20"/>
+        </w:rPr>
+        <w:t>/T) times the mean of log2(1 + SNR₀ p</w:t>
+      </w:r>
+      <w:r>
+        <w:rPr>
+          <w:b w:val="0"/>
+          <w:i w:val="0"/>
+          <w:smallCaps w:val="0"/>
+          <w:sz w:val="20"/>
+          <w:vertAlign w:val="subscript"/>
+        </w:rPr>
+        <w:t>used</w:t>
+      </w:r>
+      <w:r>
+        <w:rPr>
+          <w:b w:val="0"/>
+          <w:i w:val="0"/>
+          <w:smallCaps w:val="0"/>
+          <w:sz w:val="20"/>
+        </w:rPr>
+        <w:t>/p</w:t>
+      </w:r>
+      <w:r>
+        <w:rPr>
+          <w:b w:val="0"/>
+          <w:i w:val="0"/>
+          <w:smallCaps w:val="0"/>
+          <w:sz w:val="20"/>
+          <w:vertAlign w:val="subscript"/>
+        </w:rPr>
+        <w:t>best</w:t>
+      </w:r>
+      <w:r>
+        <w:rPr>
+          <w:b w:val="0"/>
+          <w:i w:val="0"/>
+          <w:smallCaps w:val="0"/>
+          <w:sz w:val="20"/>
+        </w:rPr>
+        <w:t>) at the interval's start and end, using measured powers, so beam ageing is measured, not modelled. The dataset's powers are unitless, so SNR₀, the best beam's SNR, is a nominal operating point.</w:t>
       </w:r>
     </w:p>
     <w:p>
@@ -7284,7 +7393,7 @@
           <w:smallCaps/>
           <w:sz w:val="16"/>
         </w:rPr>
-        <w:t>Reduced beam training, nested-CV operating points, scored against the full-sweep ground truth [95% CI over sequences]. Latency: beam-training time under 5G NR FR2 timing (full sweep: 5 ms). Macro-F1 ≥ 5: over beam classes with at least five samples</w:t>
+        <w:t>Reduced beam training (open-loop: full-sweep history assumed), nested-CV operating points, scored against the full-sweep ground truth [95% CI over sequences]. Latency: beam-training time under 5G NR FR2 timing (full sweep: 5 ms). Macro-F1 ≥ 5: over beam classes with at least five samples</w:t>
       </w:r>
     </w:p>
     <w:tbl>
@@ -8975,6 +9084,906 @@
     </w:p>
     <w:p>
       <w:pPr>
+        <w:keepNext w:val="0"/>
+        <w:spacing w:before="0" w:after="0"/>
+        <w:ind w:firstLine="288"/>
+        <w:jc w:val="both"/>
+      </w:pPr>
+      <w:r>
+        <w:rPr>
+          <w:b/>
+          <w:i w:val="0"/>
+          <w:smallCaps w:val="0"/>
+          <w:sz w:val="20"/>
+        </w:rPr>
+        <w:t>Conformal shortlists.</w:t>
+      </w:r>
+      <w:r>
+        <w:rPr>
+          <w:b w:val="0"/>
+          <w:i w:val="0"/>
+          <w:smallCaps w:val="0"/>
+          <w:sz w:val="20"/>
+        </w:rPr>
+        <w:t xml:space="preserve"> Calibrated for 95% exact top-1, the rank-based set reaches 96.1% with 3 beams at t + 1 (worst held-out fold 95.3%) and 95.5% with 5.4 beams at t + 3 (worst fold 92.7%); for a 99% target, 99.2% with 6.2 beams and 99.0% with 17.4 beams. Coverage tracks the target on average, but a single flight group can fall short by up to 2.3 points, which is the cost of non-exchangeable flights. Adaptive sets over-cover (98.8% for a 95% target at t + 1) with a 95th-percentile size of 41–56 beams, which is worse for worst-case latency.</w:t>
+      </w:r>
+    </w:p>
+    <w:p>
+      <w:pPr>
+        <w:keepNext w:val="0"/>
+        <w:spacing w:before="0" w:after="0"/>
+        <w:ind w:firstLine="288"/>
+        <w:jc w:val="both"/>
+      </w:pPr>
+      <w:r>
+        <w:rPr>
+          <w:b/>
+          <w:i w:val="0"/>
+          <w:smallCaps w:val="0"/>
+          <w:sz w:val="20"/>
+        </w:rPr>
+        <w:t>Closed loop</w:t>
+      </w:r>
+      <w:r>
+        <w:rPr>
+          <w:b w:val="0"/>
+          <w:i w:val="0"/>
+          <w:smallCaps w:val="0"/>
+          <w:sz w:val="20"/>
+        </w:rPr>
+        <w:t xml:space="preserve"> (Table IX). Without full-sweep history, a ±1 window with loss-triggered sweeps finds the exact beam only 75.5% of the time; adding six tie-graph partners raises this to 96.1% at 0.64 ms per decision. With a full sweep every 8 steps, tie-graph tracking reaches 97.2% exact top-1 and 99.2% within noise at 1.05 ms. At the testbed's 142 ms step a full sweep takes only 3.5% of the airtime, so effective spectral efficiency rises modestly, from 96.5% of the genie to 99.0–99.2%; the main gain is the 5× lower beam-training latency per decision.</w:t>
+      </w:r>
+    </w:p>
+    <w:p>
+      <w:pPr>
+        <w:sectPr>
+          <w:type w:val="continuous"/>
+          <w:pgSz w:w="12240" w:h="15840"/>
+          <w:pgMar w:top="1080" w:right="900" w:bottom="1440" w:left="900" w:header="720" w:footer="720" w:gutter="0"/>
+          <w:cols w:space="360" w:num="2"/>
+          <w:docGrid w:linePitch="360"/>
+        </w:sectPr>
+      </w:pPr>
+    </w:p>
+    <w:p>
+      <w:pPr>
+        <w:keepNext/>
+        <w:spacing w:before="120" w:after="0"/>
+        <w:jc w:val="center"/>
+      </w:pPr>
+      <w:r>
+        <w:rPr>
+          <w:b w:val="0"/>
+          <w:i w:val="0"/>
+          <w:smallCaps w:val="0"/>
+          <w:sz w:val="16"/>
+        </w:rPr>
+        <w:t>TABLE IX</w:t>
+      </w:r>
+    </w:p>
+    <w:p>
+      <w:pPr>
+        <w:keepNext/>
+        <w:spacing w:before="0" w:after="60"/>
+        <w:jc w:val="center"/>
+      </w:pPr>
+      <w:r>
+        <w:rPr>
+          <w:b w:val="0"/>
+          <w:i w:val="0"/>
+          <w:smallCaps/>
+          <w:sz w:val="16"/>
+        </w:rPr>
+        <w:t>Closed-loop replay of all 35 flights (each policy knows only what it measured). Latency: mean beam-training time per decision. SE: effective spectral efficiency as % of a genie that always uses the best beam with no training time, at nominal best-beam SNR of 0 / 10 / 20 dB</w:t>
+      </w:r>
+    </w:p>
+    <w:tbl>
+      <w:tblPr>
+        <w:tblW w:type="auto" w:w="0"/>
+        <w:jc w:val="center"/>
+        <w:tblLayout w:type="fixed"/>
+        <w:tblLook w:firstColumn="1" w:firstRow="1" w:lastColumn="0" w:lastRow="0" w:noHBand="0" w:noVBand="1" w:val="04A0"/>
+        <w:tblBorders>
+          <w:top w:val="single" w:sz="8" w:color="000000"/>
+          <w:bottom w:val="single" w:sz="8" w:color="000000"/>
+        </w:tblBorders>
+        <w:tblCellMar>
+          <w:left w:w="50" w:type="dxa"/>
+          <w:right w:w="50" w:type="dxa"/>
+        </w:tblCellMar>
+      </w:tblPr>
+      <w:tblGrid>
+        <w:gridCol w:w="4027"/>
+        <w:gridCol w:w="1545"/>
+        <w:gridCol w:w="1641"/>
+        <w:gridCol w:w="1257"/>
+        <w:gridCol w:w="1608"/>
+      </w:tblGrid>
+      <w:tr>
+        <w:tc>
+          <w:tcPr>
+            <w:tcW w:type="dxa" w:w="4028"/>
+            <w:tcBorders>
+              <w:bottom w:val="single" w:sz="4" w:color="000000"/>
+            </w:tcBorders>
+          </w:tcPr>
+          <w:p>
+            <w:pPr>
+              <w:keepNext w:val="0"/>
+              <w:spacing w:before="0" w:after="0"/>
+              <w:jc w:val="left"/>
+            </w:pPr>
+            <w:r>
+              <w:rPr>
+                <w:b/>
+                <w:i w:val="0"/>
+                <w:smallCaps w:val="0"/>
+                <w:sz w:val="16"/>
+              </w:rPr>
+              <w:t>Policy</w:t>
+            </w:r>
+          </w:p>
+        </w:tc>
+        <w:tc>
+          <w:tcPr>
+            <w:tcW w:type="dxa" w:w="1545"/>
+            <w:tcBorders>
+              <w:bottom w:val="single" w:sz="4" w:color="000000"/>
+            </w:tcBorders>
+          </w:tcPr>
+          <w:p>
+            <w:pPr>
+              <w:keepNext w:val="0"/>
+              <w:spacing w:before="0" w:after="0"/>
+              <w:jc w:val="center"/>
+            </w:pPr>
+            <w:r>
+              <w:rPr>
+                <w:b/>
+                <w:i w:val="0"/>
+                <w:smallCaps w:val="0"/>
+                <w:sz w:val="16"/>
+              </w:rPr>
+              <w:t>Exact top-1 (%)</w:t>
+            </w:r>
+          </w:p>
+        </w:tc>
+        <w:tc>
+          <w:tcPr>
+            <w:tcW w:type="dxa" w:w="1641"/>
+            <w:tcBorders>
+              <w:bottom w:val="single" w:sz="4" w:color="000000"/>
+            </w:tcBorders>
+          </w:tcPr>
+          <w:p>
+            <w:pPr>
+              <w:keepNext w:val="0"/>
+              <w:spacing w:before="0" w:after="0"/>
+              <w:jc w:val="center"/>
+            </w:pPr>
+            <w:r>
+              <w:rPr>
+                <w:b/>
+                <w:i w:val="0"/>
+                <w:smallCaps w:val="0"/>
+                <w:sz w:val="16"/>
+              </w:rPr>
+              <w:t>Within noise (%)</w:t>
+            </w:r>
+          </w:p>
+        </w:tc>
+        <w:tc>
+          <w:tcPr>
+            <w:tcW w:type="dxa" w:w="1258"/>
+            <w:tcBorders>
+              <w:bottom w:val="single" w:sz="4" w:color="000000"/>
+            </w:tcBorders>
+          </w:tcPr>
+          <w:p>
+            <w:pPr>
+              <w:keepNext w:val="0"/>
+              <w:spacing w:before="0" w:after="0"/>
+              <w:jc w:val="center"/>
+            </w:pPr>
+            <w:r>
+              <w:rPr>
+                <w:b/>
+                <w:i w:val="0"/>
+                <w:smallCaps w:val="0"/>
+                <w:sz w:val="16"/>
+              </w:rPr>
+              <w:t>Latency (ms)</w:t>
+            </w:r>
+          </w:p>
+        </w:tc>
+        <w:tc>
+          <w:tcPr>
+            <w:tcW w:type="dxa" w:w="1608"/>
+            <w:tcBorders>
+              <w:bottom w:val="single" w:sz="4" w:color="000000"/>
+            </w:tcBorders>
+          </w:tcPr>
+          <w:p>
+            <w:pPr>
+              <w:keepNext w:val="0"/>
+              <w:spacing w:before="0" w:after="0"/>
+              <w:jc w:val="center"/>
+            </w:pPr>
+            <w:r>
+              <w:rPr>
+                <w:b/>
+                <w:i w:val="0"/>
+                <w:smallCaps w:val="0"/>
+                <w:sz w:val="16"/>
+              </w:rPr>
+              <w:t>SE (% of genie)</w:t>
+            </w:r>
+          </w:p>
+        </w:tc>
+      </w:tr>
+      <w:tr>
+        <w:tc>
+          <w:tcPr>
+            <w:tcW w:type="dxa" w:w="4028"/>
+          </w:tcPr>
+          <w:p>
+            <w:pPr>
+              <w:keepNext w:val="0"/>
+              <w:spacing w:before="0" w:after="0"/>
+              <w:jc w:val="left"/>
+            </w:pPr>
+            <w:r>
+              <w:rPr>
+                <w:b w:val="0"/>
+                <w:i w:val="0"/>
+                <w:smallCaps w:val="0"/>
+                <w:sz w:val="16"/>
+              </w:rPr>
+              <w:t>Full sweep every step</w:t>
+            </w:r>
+          </w:p>
+        </w:tc>
+        <w:tc>
+          <w:tcPr>
+            <w:tcW w:type="dxa" w:w="1545"/>
+          </w:tcPr>
+          <w:p>
+            <w:pPr>
+              <w:keepNext w:val="0"/>
+              <w:spacing w:before="0" w:after="0"/>
+              <w:jc w:val="center"/>
+            </w:pPr>
+            <w:r>
+              <w:rPr>
+                <w:b w:val="0"/>
+                <w:i w:val="0"/>
+                <w:smallCaps w:val="0"/>
+                <w:sz w:val="16"/>
+              </w:rPr>
+              <w:t>100</w:t>
+            </w:r>
+          </w:p>
+        </w:tc>
+        <w:tc>
+          <w:tcPr>
+            <w:tcW w:type="dxa" w:w="1641"/>
+          </w:tcPr>
+          <w:p>
+            <w:pPr>
+              <w:keepNext w:val="0"/>
+              <w:spacing w:before="0" w:after="0"/>
+              <w:jc w:val="center"/>
+            </w:pPr>
+            <w:r>
+              <w:rPr>
+                <w:b w:val="0"/>
+                <w:i w:val="0"/>
+                <w:smallCaps w:val="0"/>
+                <w:sz w:val="16"/>
+              </w:rPr>
+              <w:t>100</w:t>
+            </w:r>
+          </w:p>
+        </w:tc>
+        <w:tc>
+          <w:tcPr>
+            <w:tcW w:type="dxa" w:w="1258"/>
+          </w:tcPr>
+          <w:p>
+            <w:pPr>
+              <w:keepNext w:val="0"/>
+              <w:spacing w:before="0" w:after="0"/>
+              <w:jc w:val="center"/>
+            </w:pPr>
+            <w:r>
+              <w:rPr>
+                <w:b w:val="0"/>
+                <w:i w:val="0"/>
+                <w:smallCaps w:val="0"/>
+                <w:sz w:val="16"/>
+              </w:rPr>
+              <w:t>5.00</w:t>
+            </w:r>
+          </w:p>
+        </w:tc>
+        <w:tc>
+          <w:tcPr>
+            <w:tcW w:type="dxa" w:w="1608"/>
+          </w:tcPr>
+          <w:p>
+            <w:pPr>
+              <w:keepNext w:val="0"/>
+              <w:spacing w:before="0" w:after="0"/>
+              <w:jc w:val="center"/>
+            </w:pPr>
+            <w:r>
+              <w:rPr>
+                <w:b w:val="0"/>
+                <w:i w:val="0"/>
+                <w:smallCaps w:val="0"/>
+                <w:sz w:val="16"/>
+              </w:rPr>
+              <w:t>96.5 / 96.5 / 96.5</w:t>
+            </w:r>
+          </w:p>
+        </w:tc>
+      </w:tr>
+      <w:tr>
+        <w:tc>
+          <w:tcPr>
+            <w:tcW w:type="dxa" w:w="4028"/>
+          </w:tcPr>
+          <w:p>
+            <w:pPr>
+              <w:keepNext w:val="0"/>
+              <w:spacing w:before="0" w:after="0"/>
+              <w:jc w:val="left"/>
+            </w:pPr>
+            <w:r>
+              <w:rPr>
+                <w:b w:val="0"/>
+                <w:i w:val="0"/>
+                <w:smallCaps w:val="0"/>
+                <w:sz w:val="16"/>
+              </w:rPr>
+              <w:t>Window ±1, full sweep every 4</w:t>
+            </w:r>
+          </w:p>
+        </w:tc>
+        <w:tc>
+          <w:tcPr>
+            <w:tcW w:type="dxa" w:w="1545"/>
+          </w:tcPr>
+          <w:p>
+            <w:pPr>
+              <w:keepNext w:val="0"/>
+              <w:spacing w:before="0" w:after="0"/>
+              <w:jc w:val="center"/>
+            </w:pPr>
+            <w:r>
+              <w:rPr>
+                <w:b w:val="0"/>
+                <w:i w:val="0"/>
+                <w:smallCaps w:val="0"/>
+                <w:sz w:val="16"/>
+              </w:rPr>
+              <w:t>91.2</w:t>
+            </w:r>
+          </w:p>
+        </w:tc>
+        <w:tc>
+          <w:tcPr>
+            <w:tcW w:type="dxa" w:w="1641"/>
+          </w:tcPr>
+          <w:p>
+            <w:pPr>
+              <w:keepNext w:val="0"/>
+              <w:spacing w:before="0" w:after="0"/>
+              <w:jc w:val="center"/>
+            </w:pPr>
+            <w:r>
+              <w:rPr>
+                <w:b w:val="0"/>
+                <w:i w:val="0"/>
+                <w:smallCaps w:val="0"/>
+                <w:sz w:val="16"/>
+              </w:rPr>
+              <w:t>96.4</w:t>
+            </w:r>
+          </w:p>
+        </w:tc>
+        <w:tc>
+          <w:tcPr>
+            <w:tcW w:type="dxa" w:w="1258"/>
+          </w:tcPr>
+          <w:p>
+            <w:pPr>
+              <w:keepNext w:val="0"/>
+              <w:spacing w:before="0" w:after="0"/>
+              <w:jc w:val="center"/>
+            </w:pPr>
+            <w:r>
+              <w:rPr>
+                <w:b w:val="0"/>
+                <w:i w:val="0"/>
+                <w:smallCaps w:val="0"/>
+                <w:sz w:val="16"/>
+              </w:rPr>
+              <w:t>1.50</w:t>
+            </w:r>
+          </w:p>
+        </w:tc>
+        <w:tc>
+          <w:tcPr>
+            <w:tcW w:type="dxa" w:w="1608"/>
+          </w:tcPr>
+          <w:p>
+            <w:pPr>
+              <w:keepNext w:val="0"/>
+              <w:spacing w:before="0" w:after="0"/>
+              <w:jc w:val="center"/>
+            </w:pPr>
+            <w:r>
+              <w:rPr>
+                <w:b w:val="0"/>
+                <w:i w:val="0"/>
+                <w:smallCaps w:val="0"/>
+                <w:sz w:val="16"/>
+              </w:rPr>
+              <w:t>98.2 / 98.5 / 98.7</w:t>
+            </w:r>
+          </w:p>
+        </w:tc>
+      </w:tr>
+      <w:tr>
+        <w:tc>
+          <w:tcPr>
+            <w:tcW w:type="dxa" w:w="4028"/>
+          </w:tcPr>
+          <w:p>
+            <w:pPr>
+              <w:keepNext w:val="0"/>
+              <w:spacing w:before="0" w:after="0"/>
+              <w:jc w:val="left"/>
+            </w:pPr>
+            <w:r>
+              <w:rPr>
+                <w:b w:val="0"/>
+                <w:i w:val="0"/>
+                <w:smallCaps w:val="0"/>
+                <w:sz w:val="16"/>
+              </w:rPr>
+              <w:t>Window ±1 + 4 tie partners, full every 4</w:t>
+            </w:r>
+          </w:p>
+        </w:tc>
+        <w:tc>
+          <w:tcPr>
+            <w:tcW w:type="dxa" w:w="1545"/>
+          </w:tcPr>
+          <w:p>
+            <w:pPr>
+              <w:keepNext w:val="0"/>
+              <w:spacing w:before="0" w:after="0"/>
+              <w:jc w:val="center"/>
+            </w:pPr>
+            <w:r>
+              <w:rPr>
+                <w:b/>
+                <w:i w:val="0"/>
+                <w:smallCaps w:val="0"/>
+                <w:sz w:val="16"/>
+              </w:rPr>
+              <w:t>97.8</w:t>
+            </w:r>
+          </w:p>
+        </w:tc>
+        <w:tc>
+          <w:tcPr>
+            <w:tcW w:type="dxa" w:w="1641"/>
+          </w:tcPr>
+          <w:p>
+            <w:pPr>
+              <w:keepNext w:val="0"/>
+              <w:spacing w:before="0" w:after="0"/>
+              <w:jc w:val="center"/>
+            </w:pPr>
+            <w:r>
+              <w:rPr>
+                <w:b/>
+                <w:i w:val="0"/>
+                <w:smallCaps w:val="0"/>
+                <w:sz w:val="16"/>
+              </w:rPr>
+              <w:t>99.4</w:t>
+            </w:r>
+          </w:p>
+        </w:tc>
+        <w:tc>
+          <w:tcPr>
+            <w:tcW w:type="dxa" w:w="1258"/>
+          </w:tcPr>
+          <w:p>
+            <w:pPr>
+              <w:keepNext w:val="0"/>
+              <w:spacing w:before="0" w:after="0"/>
+              <w:jc w:val="center"/>
+            </w:pPr>
+            <w:r>
+              <w:rPr>
+                <w:b w:val="0"/>
+                <w:i w:val="0"/>
+                <w:smallCaps w:val="0"/>
+                <w:sz w:val="16"/>
+              </w:rPr>
+              <w:t>1.61</w:t>
+            </w:r>
+          </w:p>
+        </w:tc>
+        <w:tc>
+          <w:tcPr>
+            <w:tcW w:type="dxa" w:w="1608"/>
+          </w:tcPr>
+          <w:p>
+            <w:pPr>
+              <w:keepNext w:val="0"/>
+              <w:spacing w:before="0" w:after="0"/>
+              <w:jc w:val="center"/>
+            </w:pPr>
+            <w:r>
+              <w:rPr>
+                <w:b w:val="0"/>
+                <w:i w:val="0"/>
+                <w:smallCaps w:val="0"/>
+                <w:sz w:val="16"/>
+              </w:rPr>
+              <w:t>98.7 / 98.8 / 98.8</w:t>
+            </w:r>
+          </w:p>
+        </w:tc>
+      </w:tr>
+      <w:tr>
+        <w:tc>
+          <w:tcPr>
+            <w:tcW w:type="dxa" w:w="4028"/>
+          </w:tcPr>
+          <w:p>
+            <w:pPr>
+              <w:keepNext w:val="0"/>
+              <w:spacing w:before="0" w:after="0"/>
+              <w:jc w:val="left"/>
+            </w:pPr>
+            <w:r>
+              <w:rPr>
+                <w:b/>
+                <w:i w:val="0"/>
+                <w:smallCaps w:val="0"/>
+                <w:sz w:val="16"/>
+              </w:rPr>
+              <w:t>Window ±1 + 4 tie partners, full every 8</w:t>
+            </w:r>
+          </w:p>
+        </w:tc>
+        <w:tc>
+          <w:tcPr>
+            <w:tcW w:type="dxa" w:w="1545"/>
+          </w:tcPr>
+          <w:p>
+            <w:pPr>
+              <w:keepNext w:val="0"/>
+              <w:spacing w:before="0" w:after="0"/>
+              <w:jc w:val="center"/>
+            </w:pPr>
+            <w:r>
+              <w:rPr>
+                <w:b/>
+                <w:i w:val="0"/>
+                <w:smallCaps w:val="0"/>
+                <w:sz w:val="16"/>
+              </w:rPr>
+              <w:t>97.2</w:t>
+            </w:r>
+          </w:p>
+        </w:tc>
+        <w:tc>
+          <w:tcPr>
+            <w:tcW w:type="dxa" w:w="1641"/>
+          </w:tcPr>
+          <w:p>
+            <w:pPr>
+              <w:keepNext w:val="0"/>
+              <w:spacing w:before="0" w:after="0"/>
+              <w:jc w:val="center"/>
+            </w:pPr>
+            <w:r>
+              <w:rPr>
+                <w:b/>
+                <w:i w:val="0"/>
+                <w:smallCaps w:val="0"/>
+                <w:sz w:val="16"/>
+              </w:rPr>
+              <w:t>99.2</w:t>
+            </w:r>
+          </w:p>
+        </w:tc>
+        <w:tc>
+          <w:tcPr>
+            <w:tcW w:type="dxa" w:w="1258"/>
+          </w:tcPr>
+          <w:p>
+            <w:pPr>
+              <w:keepNext w:val="0"/>
+              <w:spacing w:before="0" w:after="0"/>
+              <w:jc w:val="center"/>
+            </w:pPr>
+            <w:r>
+              <w:rPr>
+                <w:b/>
+                <w:i w:val="0"/>
+                <w:smallCaps w:val="0"/>
+                <w:sz w:val="16"/>
+              </w:rPr>
+              <w:t>1.05</w:t>
+            </w:r>
+          </w:p>
+        </w:tc>
+        <w:tc>
+          <w:tcPr>
+            <w:tcW w:type="dxa" w:w="1608"/>
+          </w:tcPr>
+          <w:p>
+            <w:pPr>
+              <w:keepNext w:val="0"/>
+              <w:spacing w:before="0" w:after="0"/>
+              <w:jc w:val="center"/>
+            </w:pPr>
+            <w:r>
+              <w:rPr>
+                <w:b/>
+                <w:i w:val="0"/>
+                <w:smallCaps w:val="0"/>
+                <w:sz w:val="16"/>
+              </w:rPr>
+              <w:t>99.0 / 99.1 / 99.2</w:t>
+            </w:r>
+          </w:p>
+        </w:tc>
+      </w:tr>
+      <w:tr>
+        <w:tc>
+          <w:tcPr>
+            <w:tcW w:type="dxa" w:w="4028"/>
+          </w:tcPr>
+          <w:p>
+            <w:pPr>
+              <w:keepNext w:val="0"/>
+              <w:spacing w:before="0" w:after="0"/>
+              <w:jc w:val="left"/>
+            </w:pPr>
+            <w:r>
+              <w:rPr>
+                <w:b w:val="0"/>
+                <w:i w:val="0"/>
+                <w:smallCaps w:val="0"/>
+                <w:sz w:val="16"/>
+              </w:rPr>
+              <w:t>Window ±1, loss-triggered sweeps only</w:t>
+            </w:r>
+          </w:p>
+        </w:tc>
+        <w:tc>
+          <w:tcPr>
+            <w:tcW w:type="dxa" w:w="1545"/>
+          </w:tcPr>
+          <w:p>
+            <w:pPr>
+              <w:keepNext w:val="0"/>
+              <w:spacing w:before="0" w:after="0"/>
+              <w:jc w:val="center"/>
+            </w:pPr>
+            <w:r>
+              <w:rPr>
+                <w:b w:val="0"/>
+                <w:i w:val="0"/>
+                <w:smallCaps w:val="0"/>
+                <w:sz w:val="16"/>
+              </w:rPr>
+              <w:t>75.5</w:t>
+            </w:r>
+          </w:p>
+        </w:tc>
+        <w:tc>
+          <w:tcPr>
+            <w:tcW w:type="dxa" w:w="1641"/>
+          </w:tcPr>
+          <w:p>
+            <w:pPr>
+              <w:keepNext w:val="0"/>
+              <w:spacing w:before="0" w:after="0"/>
+              <w:jc w:val="center"/>
+            </w:pPr>
+            <w:r>
+              <w:rPr>
+                <w:b w:val="0"/>
+                <w:i w:val="0"/>
+                <w:smallCaps w:val="0"/>
+                <w:sz w:val="16"/>
+              </w:rPr>
+              <w:t>83.2</w:t>
+            </w:r>
+          </w:p>
+        </w:tc>
+        <w:tc>
+          <w:tcPr>
+            <w:tcW w:type="dxa" w:w="1258"/>
+          </w:tcPr>
+          <w:p>
+            <w:pPr>
+              <w:keepNext w:val="0"/>
+              <w:spacing w:before="0" w:after="0"/>
+              <w:jc w:val="center"/>
+            </w:pPr>
+            <w:r>
+              <w:rPr>
+                <w:b w:val="0"/>
+                <w:i w:val="0"/>
+                <w:smallCaps w:val="0"/>
+                <w:sz w:val="16"/>
+              </w:rPr>
+              <w:t>0.35</w:t>
+            </w:r>
+          </w:p>
+        </w:tc>
+        <w:tc>
+          <w:tcPr>
+            <w:tcW w:type="dxa" w:w="1608"/>
+          </w:tcPr>
+          <w:p>
+            <w:pPr>
+              <w:keepNext w:val="0"/>
+              <w:spacing w:before="0" w:after="0"/>
+              <w:jc w:val="center"/>
+            </w:pPr>
+            <w:r>
+              <w:rPr>
+                <w:b w:val="0"/>
+                <w:i w:val="0"/>
+                <w:smallCaps w:val="0"/>
+                <w:sz w:val="16"/>
+              </w:rPr>
+              <w:t>92.9 / 95.0 / 96.8</w:t>
+            </w:r>
+          </w:p>
+        </w:tc>
+      </w:tr>
+      <w:tr>
+        <w:tc>
+          <w:tcPr>
+            <w:tcW w:type="dxa" w:w="4028"/>
+          </w:tcPr>
+          <w:p>
+            <w:pPr>
+              <w:keepNext w:val="0"/>
+              <w:spacing w:before="0" w:after="0"/>
+              <w:jc w:val="left"/>
+            </w:pPr>
+            <w:r>
+              <w:rPr>
+                <w:b w:val="0"/>
+                <w:i w:val="0"/>
+                <w:smallCaps w:val="0"/>
+                <w:sz w:val="16"/>
+              </w:rPr>
+              <w:t>Window ±1 + 6 tie partners, loss-triggered only</w:t>
+            </w:r>
+          </w:p>
+        </w:tc>
+        <w:tc>
+          <w:tcPr>
+            <w:tcW w:type="dxa" w:w="1545"/>
+          </w:tcPr>
+          <w:p>
+            <w:pPr>
+              <w:keepNext w:val="0"/>
+              <w:spacing w:before="0" w:after="0"/>
+              <w:jc w:val="center"/>
+            </w:pPr>
+            <w:r>
+              <w:rPr>
+                <w:b w:val="0"/>
+                <w:i w:val="0"/>
+                <w:smallCaps w:val="0"/>
+                <w:sz w:val="16"/>
+              </w:rPr>
+              <w:t>96.1</w:t>
+            </w:r>
+          </w:p>
+        </w:tc>
+        <w:tc>
+          <w:tcPr>
+            <w:tcW w:type="dxa" w:w="1641"/>
+          </w:tcPr>
+          <w:p>
+            <w:pPr>
+              <w:keepNext w:val="0"/>
+              <w:spacing w:before="0" w:after="0"/>
+              <w:jc w:val="center"/>
+            </w:pPr>
+            <w:r>
+              <w:rPr>
+                <w:b w:val="0"/>
+                <w:i w:val="0"/>
+                <w:smallCaps w:val="0"/>
+                <w:sz w:val="16"/>
+              </w:rPr>
+              <w:t>96.9</w:t>
+            </w:r>
+          </w:p>
+        </w:tc>
+        <w:tc>
+          <w:tcPr>
+            <w:tcW w:type="dxa" w:w="1258"/>
+          </w:tcPr>
+          <w:p>
+            <w:pPr>
+              <w:keepNext w:val="0"/>
+              <w:spacing w:before="0" w:after="0"/>
+              <w:jc w:val="center"/>
+            </w:pPr>
+            <w:r>
+              <w:rPr>
+                <w:b w:val="0"/>
+                <w:i w:val="0"/>
+                <w:smallCaps w:val="0"/>
+                <w:sz w:val="16"/>
+              </w:rPr>
+              <w:t>0.64</w:t>
+            </w:r>
+          </w:p>
+        </w:tc>
+        <w:tc>
+          <w:tcPr>
+            <w:tcW w:type="dxa" w:w="1608"/>
+          </w:tcPr>
+          <w:p>
+            <w:pPr>
+              <w:keepNext w:val="0"/>
+              <w:spacing w:before="0" w:after="0"/>
+              <w:jc w:val="center"/>
+            </w:pPr>
+            <w:r>
+              <w:rPr>
+                <w:b w:val="0"/>
+                <w:i w:val="0"/>
+                <w:smallCaps w:val="0"/>
+                <w:sz w:val="16"/>
+              </w:rPr>
+              <w:t>98.5 / 98.9 / 99.2</w:t>
+            </w:r>
+          </w:p>
+        </w:tc>
+      </w:tr>
+    </w:tbl>
+    <w:p>
+      <w:pPr>
+        <w:keepNext w:val="0"/>
+        <w:spacing w:before="0" w:after="120"/>
+        <w:jc w:val="both"/>
+      </w:pPr>
+    </w:p>
+    <w:p>
+      <w:pPr>
+        <w:sectPr>
+          <w:type w:val="continuous"/>
+          <w:pgSz w:w="12240" w:h="15840"/>
+          <w:pgMar w:top="1080" w:right="900" w:bottom="1440" w:left="900" w:header="720" w:footer="720" w:gutter="0"/>
+          <w:cols w:space="360" w:num="1"/>
+          <w:docGrid w:linePitch="360"/>
+        </w:sectPr>
+      </w:pPr>
+    </w:p>
+    <w:p>
+      <w:pPr>
         <w:keepNext/>
         <w:spacing w:before="160" w:after="80"/>
         <w:jc w:val="center"/>
@@ -9064,7 +10073,7 @@
           <w:smallCaps w:val="0"/>
           <w:sz w:val="20"/>
         </w:rPr>
-        <w:t xml:space="preserve"> On power sweeps alone the learned gain over persistence is modest at t + 1 and clear at t + 3 (86.0% vs 78.1% within noise). In reduced beam training, the largest single gain comes from a simple learned structure, the beam-tie graph, rather than from the sequence model. The GRU then reduces the beams measured at t + 3. The soft target and beam-axis augmentation matter more than the architecture. Logit adjustment for the class imbalance [19] lowered every metric because the beam distribution differs between flights.</w:t>
+        <w:t xml:space="preserve"> On power sweeps alone the learned gain over persistence is modest at t + 1 and clear at t + 3 (86.0% vs 78.1% within noise). In reduced beam training, the largest single gain comes from a simple learned structure, the beam-tie graph, rather than from the sequence model. The GRU then reduces the beams measured at t + 3. In closed loop the GRU cannot yet be used, because it expects full-sweep history; a sequence model trained on the sparse measurements a tracker actually has is the natural next step. The soft target and beam-axis augmentation matter more than the architecture. Logit adjustment for the class imbalance [19] lowered every metric because the beam distribution differs between flights.</w:t>
       </w:r>
     </w:p>
     <w:p>
@@ -9090,7 +10099,7 @@
           <w:smallCaps w:val="0"/>
           <w:sz w:val="20"/>
         </w:rPr>
-        <w:t xml:space="preserve"> Saleh and coupling coefficients are literature values, not measurements of a 60 GHz PA or RIS; Table II bounds the effect of the coupling strength. The obliquity exponent is assumed. The physical-layer results are simulated; the beam-prediction results use power sweeps only, because the UAV GPS files of Scenario 23 were not available to us at the time of writing. The all-class macro-F1 at t + 3 (0.929) is limited by beams seen only once; more flights, not a different model, are needed to estimate it reliably. The latency model uses standard 5G NR FR2 timing, not the testbed's own sweep timing. The D-band transceiver values are representative published figures, not a specific design.</w:t>
+        <w:t xml:space="preserve"> Saleh and coupling coefficients are literature values, not measurements of a 60 GHz PA or RIS; Table II bounds the effect of the coupling strength. The obliquity exponent is assumed. The physical-layer results are simulated; the beam-prediction results use power sweeps only, because the UAV GPS files of Scenario 23 were not available to us at the time of writing. The all-class macro-F1 at t + 3 (0.929) is limited by beams seen only once; more flights, not a different model, are needed to estimate it reliably. The latency model uses standard 5G NR FR2 timing, not the testbed's own sweep timing. The Table VIII figures are open-loop (they assume full-sweep history); Table IX gives the closed-loop figures. Effective spectral efficiency is reported at nominal SNRs because the dataset's powers are unitless. The D-band transceiver values are representative published figures, not a specific design.</w:t>
       </w:r>
     </w:p>
     <w:p>
@@ -9123,7 +10132,7 @@
           <w:smallCaps w:val="0"/>
           <w:sz w:val="20"/>
         </w:rPr>
-        <w:t>We built a hardware-aware model of an RIS-assisted mmWave UAV link and used it, with real 60 GHz measurements, to evaluate beam management end to end. Hardware impairments cost 7.8 dB and 2.25× RIS elements at 60 GHz, and D-band transceiver limits push the 140 GHz panel to 32 cm; a position-parametric estimator matches perfect channel knowledge with 64× fewer pilots; Kalman-based prediction preserves 99.3% of the array gain at 500 ms latency; and AI-assisted reduced beam training with a learned beam-tie graph selects the exact optimal beam 99.3% of the time (macro-F1 0.961) with 0.55 ms of beam training, and 99.1% at a 0.4 s horizon, with all reported metrics evaluated under sequence-level cross-validation. Future work will add UAV position to beam prediction, measured hardware coefficients, and joint training of the tracker and the beam shortlist.</w:t>
+        <w:t>We built a hardware-aware model of an RIS-assisted mmWave UAV link and used it, with real 60 GHz measurements, to evaluate beam management end to end. Hardware impairments cost 7.8 dB and 2.25× RIS elements at 60 GHz, and D-band transceiver limits push the 140 GHz panel to 32 cm; a position-parametric estimator matches perfect channel knowledge with 64× fewer pilots; Kalman-based prediction preserves 99.3% of the array gain at 500 ms latency; and AI-assisted reduced beam training with a learned beam-tie graph selects the exact optimal beam 99.3% of the time given full-sweep history and 97.2% in a closed-loop replay of every flight, with 1.05 ms of beam training per decision instead of 5 ms, with all reported metrics evaluated under sequence-level cross-validation. Future work will add UAV position to beam prediction, measured hardware coefficients, and a sequence model trained on the sparse measurements of the closed loop.</w:t>
       </w:r>
     </w:p>
     <w:p>
@@ -10131,6 +11140,86 @@
           <w:highlight w:val="yellow"/>
         </w:rPr>
         <w:t>[VERIFY: release and version.]</w:t>
+      </w:r>
+    </w:p>
+    <w:p>
+      <w:pPr>
+        <w:keepNext w:val="0"/>
+        <w:tabs>
+          <w:tab w:pos="432" w:val="left"/>
+        </w:tabs>
+        <w:spacing w:before="0" w:after="0"/>
+        <w:ind w:left="432" w:hanging="432"/>
+        <w:jc w:val="both"/>
+      </w:pPr>
+      <w:r>
+        <w:rPr>
+          <w:b w:val="0"/>
+          <w:i w:val="0"/>
+          <w:smallCaps w:val="0"/>
+          <w:sz w:val="16"/>
+        </w:rPr>
+        <w:t>[23]</w:t>
+        <w:tab/>
+        <w:t xml:space="preserve">A. N. Angelopoulos and S. Bates, "Conformal prediction: A gentle introduction," </w:t>
+      </w:r>
+      <w:r>
+        <w:rPr>
+          <w:b w:val="0"/>
+          <w:i/>
+          <w:smallCaps w:val="0"/>
+          <w:sz w:val="16"/>
+        </w:rPr>
+        <w:t>Found. Trends Mach. Learn.</w:t>
+      </w:r>
+      <w:r>
+        <w:rPr>
+          <w:b w:val="0"/>
+          <w:i w:val="0"/>
+          <w:smallCaps w:val="0"/>
+          <w:sz w:val="16"/>
+        </w:rPr>
+        <w:t>, vol. 16, no. 4, pp. 494–591, 2023.</w:t>
+      </w:r>
+    </w:p>
+    <w:p>
+      <w:pPr>
+        <w:keepNext w:val="0"/>
+        <w:tabs>
+          <w:tab w:pos="432" w:val="left"/>
+        </w:tabs>
+        <w:spacing w:before="0" w:after="0"/>
+        <w:ind w:left="432" w:hanging="432"/>
+        <w:jc w:val="both"/>
+      </w:pPr>
+      <w:r>
+        <w:rPr>
+          <w:b w:val="0"/>
+          <w:i w:val="0"/>
+          <w:smallCaps w:val="0"/>
+          <w:sz w:val="16"/>
+        </w:rPr>
+        <w:t>[24]</w:t>
+        <w:tab/>
+        <w:t xml:space="preserve">Y. Romano, M. Sesia, and E. J. Candès, "Classification with valid and adaptive coverage," in </w:t>
+      </w:r>
+      <w:r>
+        <w:rPr>
+          <w:b w:val="0"/>
+          <w:i/>
+          <w:smallCaps w:val="0"/>
+          <w:sz w:val="16"/>
+        </w:rPr>
+        <w:t>Proc. NeurIPS</w:t>
+      </w:r>
+      <w:r>
+        <w:rPr>
+          <w:b w:val="0"/>
+          <w:i w:val="0"/>
+          <w:smallCaps w:val="0"/>
+          <w:sz w:val="16"/>
+        </w:rPr>
+        <w:t>, 2020.</w:t>
       </w:r>
     </w:p>
     <w:p>

</xml_diff>

<commit_message>
Paper: keep tables on one page, confirm reference details
build_docx now keeps every table row with the next one. Tables VI and
VIII had been splitting across pages; the fix was checked by rendering
the Word file. Confirm references [2], [7], [23] and [24] (add DOIs and
the missing authors of [7]). [22] still needs its 3GPP release.

Co-Authored-By: Claude Opus 5.5 <noreply@anthropic.com>
</commit_message>
<xml_diff>
--- a/paper/revised_paper_ieee.docx
+++ b/paper/revised_paper_ieee.docx
@@ -2390,6 +2390,9 @@
         <w:gridCol w:w="1948"/>
       </w:tblGrid>
       <w:tr>
+        <w:trPr>
+          <w:cantSplit/>
+        </w:trPr>
         <w:tc>
           <w:tcPr>
             <w:tcW w:type="dxa" w:w="1311"/>
@@ -2399,7 +2402,7 @@
           </w:tcPr>
           <w:p>
             <w:pPr>
-              <w:keepNext w:val="0"/>
+              <w:keepNext/>
               <w:spacing w:before="0" w:after="0"/>
               <w:jc w:val="left"/>
             </w:pPr>
@@ -2423,7 +2426,7 @@
           </w:tcPr>
           <w:p>
             <w:pPr>
-              <w:keepNext w:val="0"/>
+              <w:keepNext/>
               <w:spacing w:before="0" w:after="0"/>
               <w:jc w:val="center"/>
             </w:pPr>
@@ -2447,7 +2450,7 @@
           </w:tcPr>
           <w:p>
             <w:pPr>
-              <w:keepNext w:val="0"/>
+              <w:keepNext/>
               <w:spacing w:before="0" w:after="0"/>
               <w:jc w:val="center"/>
             </w:pPr>
@@ -2464,13 +2467,16 @@
         </w:tc>
       </w:tr>
       <w:tr>
+        <w:trPr>
+          <w:cantSplit/>
+        </w:trPr>
         <w:tc>
           <w:tcPr>
             <w:tcW w:type="dxa" w:w="1311"/>
           </w:tcPr>
           <w:p>
             <w:pPr>
-              <w:keepNext w:val="0"/>
+              <w:keepNext/>
               <w:spacing w:before="0" w:after="0"/>
               <w:jc w:val="left"/>
             </w:pPr>
@@ -2491,7 +2497,7 @@
           </w:tcPr>
           <w:p>
             <w:pPr>
-              <w:keepNext w:val="0"/>
+              <w:keepNext/>
               <w:spacing w:before="0" w:after="0"/>
               <w:jc w:val="center"/>
             </w:pPr>
@@ -2512,7 +2518,7 @@
           </w:tcPr>
           <w:p>
             <w:pPr>
-              <w:keepNext w:val="0"/>
+              <w:keepNext/>
               <w:spacing w:before="0" w:after="0"/>
               <w:jc w:val="center"/>
             </w:pPr>
@@ -2529,13 +2535,16 @@
         </w:tc>
       </w:tr>
       <w:tr>
+        <w:trPr>
+          <w:cantSplit/>
+        </w:trPr>
         <w:tc>
           <w:tcPr>
             <w:tcW w:type="dxa" w:w="1311"/>
           </w:tcPr>
           <w:p>
             <w:pPr>
-              <w:keepNext w:val="0"/>
+              <w:keepNext/>
               <w:spacing w:before="0" w:after="0"/>
               <w:jc w:val="left"/>
             </w:pPr>
@@ -2556,7 +2565,7 @@
           </w:tcPr>
           <w:p>
             <w:pPr>
-              <w:keepNext w:val="0"/>
+              <w:keepNext/>
               <w:spacing w:before="0" w:after="0"/>
               <w:jc w:val="center"/>
             </w:pPr>
@@ -2577,7 +2586,7 @@
           </w:tcPr>
           <w:p>
             <w:pPr>
-              <w:keepNext w:val="0"/>
+              <w:keepNext/>
               <w:spacing w:before="0" w:after="0"/>
               <w:jc w:val="center"/>
             </w:pPr>
@@ -2594,13 +2603,16 @@
         </w:tc>
       </w:tr>
       <w:tr>
+        <w:trPr>
+          <w:cantSplit/>
+        </w:trPr>
         <w:tc>
           <w:tcPr>
             <w:tcW w:type="dxa" w:w="1311"/>
           </w:tcPr>
           <w:p>
             <w:pPr>
-              <w:keepNext w:val="0"/>
+              <w:keepNext/>
               <w:spacing w:before="0" w:after="0"/>
               <w:jc w:val="left"/>
             </w:pPr>
@@ -2621,7 +2633,7 @@
           </w:tcPr>
           <w:p>
             <w:pPr>
-              <w:keepNext w:val="0"/>
+              <w:keepNext/>
               <w:spacing w:before="0" w:after="0"/>
               <w:jc w:val="center"/>
             </w:pPr>
@@ -2642,7 +2654,7 @@
           </w:tcPr>
           <w:p>
             <w:pPr>
-              <w:keepNext w:val="0"/>
+              <w:keepNext/>
               <w:spacing w:before="0" w:after="0"/>
               <w:jc w:val="center"/>
             </w:pPr>
@@ -2659,6 +2671,9 @@
         </w:tc>
       </w:tr>
       <w:tr>
+        <w:trPr>
+          <w:cantSplit/>
+        </w:trPr>
         <w:tc>
           <w:tcPr>
             <w:tcW w:type="dxa" w:w="1311"/>
@@ -2832,6 +2847,9 @@
         <w:gridCol w:w="1172"/>
       </w:tblGrid>
       <w:tr>
+        <w:trPr>
+          <w:cantSplit/>
+        </w:trPr>
         <w:tc>
           <w:tcPr>
             <w:tcW w:type="dxa" w:w="1860"/>
@@ -2841,7 +2859,7 @@
           </w:tcPr>
           <w:p>
             <w:pPr>
-              <w:keepNext w:val="0"/>
+              <w:keepNext/>
               <w:spacing w:before="0" w:after="0"/>
               <w:jc w:val="left"/>
             </w:pPr>
@@ -2875,7 +2893,7 @@
           </w:tcPr>
           <w:p>
             <w:pPr>
-              <w:keepNext w:val="0"/>
+              <w:keepNext/>
               <w:spacing w:before="0" w:after="0"/>
               <w:jc w:val="center"/>
             </w:pPr>
@@ -2899,7 +2917,7 @@
           </w:tcPr>
           <w:p>
             <w:pPr>
-              <w:keepNext w:val="0"/>
+              <w:keepNext/>
               <w:spacing w:before="0" w:after="0"/>
               <w:jc w:val="center"/>
             </w:pPr>
@@ -2923,7 +2941,7 @@
           </w:tcPr>
           <w:p>
             <w:pPr>
-              <w:keepNext w:val="0"/>
+              <w:keepNext/>
               <w:spacing w:before="0" w:after="0"/>
               <w:jc w:val="center"/>
             </w:pPr>
@@ -2947,7 +2965,7 @@
           </w:tcPr>
           <w:p>
             <w:pPr>
-              <w:keepNext w:val="0"/>
+              <w:keepNext/>
               <w:spacing w:before="0" w:after="0"/>
               <w:jc w:val="center"/>
             </w:pPr>
@@ -2971,7 +2989,7 @@
           </w:tcPr>
           <w:p>
             <w:pPr>
-              <w:keepNext w:val="0"/>
+              <w:keepNext/>
               <w:spacing w:before="0" w:after="0"/>
               <w:jc w:val="center"/>
             </w:pPr>
@@ -2988,13 +3006,16 @@
         </w:tc>
       </w:tr>
       <w:tr>
+        <w:trPr>
+          <w:cantSplit/>
+        </w:trPr>
         <w:tc>
           <w:tcPr>
             <w:tcW w:type="dxa" w:w="1860"/>
           </w:tcPr>
           <w:p>
             <w:pPr>
-              <w:keepNext w:val="0"/>
+              <w:keepNext/>
               <w:spacing w:before="0" w:after="0"/>
               <w:jc w:val="left"/>
             </w:pPr>
@@ -3015,7 +3036,7 @@
           </w:tcPr>
           <w:p>
             <w:pPr>
-              <w:keepNext w:val="0"/>
+              <w:keepNext/>
               <w:spacing w:before="0" w:after="0"/>
               <w:jc w:val="center"/>
             </w:pPr>
@@ -3036,7 +3057,7 @@
           </w:tcPr>
           <w:p>
             <w:pPr>
-              <w:keepNext w:val="0"/>
+              <w:keepNext/>
               <w:spacing w:before="0" w:after="0"/>
               <w:jc w:val="center"/>
             </w:pPr>
@@ -3057,7 +3078,7 @@
           </w:tcPr>
           <w:p>
             <w:pPr>
-              <w:keepNext w:val="0"/>
+              <w:keepNext/>
               <w:spacing w:before="0" w:after="0"/>
               <w:jc w:val="center"/>
             </w:pPr>
@@ -3078,7 +3099,7 @@
           </w:tcPr>
           <w:p>
             <w:pPr>
-              <w:keepNext w:val="0"/>
+              <w:keepNext/>
               <w:spacing w:before="0" w:after="0"/>
               <w:jc w:val="center"/>
             </w:pPr>
@@ -3099,7 +3120,7 @@
           </w:tcPr>
           <w:p>
             <w:pPr>
-              <w:keepNext w:val="0"/>
+              <w:keepNext/>
               <w:spacing w:before="0" w:after="0"/>
               <w:jc w:val="center"/>
             </w:pPr>
@@ -3116,6 +3137,9 @@
         </w:tc>
       </w:tr>
       <w:tr>
+        <w:trPr>
+          <w:cantSplit/>
+        </w:trPr>
         <w:tc>
           <w:tcPr>
             <w:tcW w:type="dxa" w:w="1860"/>
@@ -3442,6 +3466,9 @@
         <w:gridCol w:w="742"/>
       </w:tblGrid>
       <w:tr>
+        <w:trPr>
+          <w:cantSplit/>
+        </w:trPr>
         <w:tc>
           <w:tcPr>
             <w:tcW w:type="dxa" w:w="2091"/>
@@ -3451,7 +3478,7 @@
           </w:tcPr>
           <w:p>
             <w:pPr>
-              <w:keepNext w:val="0"/>
+              <w:keepNext/>
               <w:spacing w:before="0" w:after="0"/>
               <w:jc w:val="left"/>
             </w:pPr>
@@ -3475,7 +3502,7 @@
           </w:tcPr>
           <w:p>
             <w:pPr>
-              <w:keepNext w:val="0"/>
+              <w:keepNext/>
               <w:spacing w:before="0" w:after="0"/>
               <w:jc w:val="center"/>
             </w:pPr>
@@ -3499,7 +3526,7 @@
           </w:tcPr>
           <w:p>
             <w:pPr>
-              <w:keepNext w:val="0"/>
+              <w:keepNext/>
               <w:spacing w:before="0" w:after="0"/>
               <w:jc w:val="center"/>
             </w:pPr>
@@ -3523,7 +3550,7 @@
           </w:tcPr>
           <w:p>
             <w:pPr>
-              <w:keepNext w:val="0"/>
+              <w:keepNext/>
               <w:spacing w:before="0" w:after="0"/>
               <w:jc w:val="center"/>
             </w:pPr>
@@ -3547,7 +3574,7 @@
           </w:tcPr>
           <w:p>
             <w:pPr>
-              <w:keepNext w:val="0"/>
+              <w:keepNext/>
               <w:spacing w:before="0" w:after="0"/>
               <w:jc w:val="center"/>
             </w:pPr>
@@ -3564,13 +3591,16 @@
         </w:tc>
       </w:tr>
       <w:tr>
+        <w:trPr>
+          <w:cantSplit/>
+        </w:trPr>
         <w:tc>
           <w:tcPr>
             <w:tcW w:type="dxa" w:w="2091"/>
           </w:tcPr>
           <w:p>
             <w:pPr>
-              <w:keepNext w:val="0"/>
+              <w:keepNext/>
               <w:spacing w:before="0" w:after="0"/>
               <w:jc w:val="left"/>
             </w:pPr>
@@ -3591,7 +3621,7 @@
           </w:tcPr>
           <w:p>
             <w:pPr>
-              <w:keepNext w:val="0"/>
+              <w:keepNext/>
               <w:spacing w:before="0" w:after="0"/>
               <w:jc w:val="center"/>
             </w:pPr>
@@ -3612,7 +3642,7 @@
           </w:tcPr>
           <w:p>
             <w:pPr>
-              <w:keepNext w:val="0"/>
+              <w:keepNext/>
               <w:spacing w:before="0" w:after="0"/>
               <w:jc w:val="center"/>
             </w:pPr>
@@ -3633,7 +3663,7 @@
           </w:tcPr>
           <w:p>
             <w:pPr>
-              <w:keepNext w:val="0"/>
+              <w:keepNext/>
               <w:spacing w:before="0" w:after="0"/>
               <w:jc w:val="center"/>
             </w:pPr>
@@ -3654,7 +3684,7 @@
           </w:tcPr>
           <w:p>
             <w:pPr>
-              <w:keepNext w:val="0"/>
+              <w:keepNext/>
               <w:spacing w:before="0" w:after="0"/>
               <w:jc w:val="center"/>
             </w:pPr>
@@ -3671,6 +3701,9 @@
         </w:tc>
       </w:tr>
       <w:tr>
+        <w:trPr>
+          <w:cantSplit/>
+        </w:trPr>
         <w:tc>
           <w:tcPr>
             <w:tcW w:type="dxa" w:w="2091"/>
@@ -3890,6 +3923,9 @@
         <w:gridCol w:w="1391"/>
       </w:tblGrid>
       <w:tr>
+        <w:trPr>
+          <w:cantSplit/>
+        </w:trPr>
         <w:tc>
           <w:tcPr>
             <w:tcW w:type="dxa" w:w="627"/>
@@ -3899,7 +3935,7 @@
           </w:tcPr>
           <w:p>
             <w:pPr>
-              <w:keepNext w:val="0"/>
+              <w:keepNext/>
               <w:spacing w:before="0" w:after="0"/>
               <w:jc w:val="left"/>
             </w:pPr>
@@ -3923,7 +3959,7 @@
           </w:tcPr>
           <w:p>
             <w:pPr>
-              <w:keepNext w:val="0"/>
+              <w:keepNext/>
               <w:spacing w:before="0" w:after="0"/>
               <w:jc w:val="center"/>
             </w:pPr>
@@ -3947,7 +3983,7 @@
           </w:tcPr>
           <w:p>
             <w:pPr>
-              <w:keepNext w:val="0"/>
+              <w:keepNext/>
               <w:spacing w:before="0" w:after="0"/>
               <w:jc w:val="center"/>
             </w:pPr>
@@ -3971,7 +4007,7 @@
           </w:tcPr>
           <w:p>
             <w:pPr>
-              <w:keepNext w:val="0"/>
+              <w:keepNext/>
               <w:spacing w:before="0" w:after="0"/>
               <w:jc w:val="center"/>
             </w:pPr>
@@ -3995,7 +4031,7 @@
           </w:tcPr>
           <w:p>
             <w:pPr>
-              <w:keepNext w:val="0"/>
+              <w:keepNext/>
               <w:spacing w:before="0" w:after="0"/>
               <w:jc w:val="center"/>
             </w:pPr>
@@ -4012,13 +4048,16 @@
         </w:tc>
       </w:tr>
       <w:tr>
+        <w:trPr>
+          <w:cantSplit/>
+        </w:trPr>
         <w:tc>
           <w:tcPr>
             <w:tcW w:type="dxa" w:w="627"/>
           </w:tcPr>
           <w:p>
             <w:pPr>
-              <w:keepNext w:val="0"/>
+              <w:keepNext/>
               <w:spacing w:before="0" w:after="0"/>
               <w:jc w:val="left"/>
             </w:pPr>
@@ -4039,7 +4078,7 @@
           </w:tcPr>
           <w:p>
             <w:pPr>
-              <w:keepNext w:val="0"/>
+              <w:keepNext/>
               <w:spacing w:before="0" w:after="0"/>
               <w:jc w:val="center"/>
             </w:pPr>
@@ -4060,7 +4099,7 @@
           </w:tcPr>
           <w:p>
             <w:pPr>
-              <w:keepNext w:val="0"/>
+              <w:keepNext/>
               <w:spacing w:before="0" w:after="0"/>
               <w:jc w:val="center"/>
             </w:pPr>
@@ -4081,7 +4120,7 @@
           </w:tcPr>
           <w:p>
             <w:pPr>
-              <w:keepNext w:val="0"/>
+              <w:keepNext/>
               <w:spacing w:before="0" w:after="0"/>
               <w:jc w:val="center"/>
             </w:pPr>
@@ -4102,7 +4141,7 @@
           </w:tcPr>
           <w:p>
             <w:pPr>
-              <w:keepNext w:val="0"/>
+              <w:keepNext/>
               <w:spacing w:before="0" w:after="0"/>
               <w:jc w:val="center"/>
             </w:pPr>
@@ -4119,13 +4158,16 @@
         </w:tc>
       </w:tr>
       <w:tr>
+        <w:trPr>
+          <w:cantSplit/>
+        </w:trPr>
         <w:tc>
           <w:tcPr>
             <w:tcW w:type="dxa" w:w="627"/>
           </w:tcPr>
           <w:p>
             <w:pPr>
-              <w:keepNext w:val="0"/>
+              <w:keepNext/>
               <w:spacing w:before="0" w:after="0"/>
               <w:jc w:val="left"/>
             </w:pPr>
@@ -4146,7 +4188,7 @@
           </w:tcPr>
           <w:p>
             <w:pPr>
-              <w:keepNext w:val="0"/>
+              <w:keepNext/>
               <w:spacing w:before="0" w:after="0"/>
               <w:jc w:val="center"/>
             </w:pPr>
@@ -4167,7 +4209,7 @@
           </w:tcPr>
           <w:p>
             <w:pPr>
-              <w:keepNext w:val="0"/>
+              <w:keepNext/>
               <w:spacing w:before="0" w:after="0"/>
               <w:jc w:val="center"/>
             </w:pPr>
@@ -4188,7 +4230,7 @@
           </w:tcPr>
           <w:p>
             <w:pPr>
-              <w:keepNext w:val="0"/>
+              <w:keepNext/>
               <w:spacing w:before="0" w:after="0"/>
               <w:jc w:val="center"/>
             </w:pPr>
@@ -4209,7 +4251,7 @@
           </w:tcPr>
           <w:p>
             <w:pPr>
-              <w:keepNext w:val="0"/>
+              <w:keepNext/>
               <w:spacing w:before="0" w:after="0"/>
               <w:jc w:val="center"/>
             </w:pPr>
@@ -4226,6 +4268,9 @@
         </w:tc>
       </w:tr>
       <w:tr>
+        <w:trPr>
+          <w:cantSplit/>
+        </w:trPr>
         <w:tc>
           <w:tcPr>
             <w:tcW w:type="dxa" w:w="627"/>
@@ -4394,6 +4439,9 @@
         <w:gridCol w:w="1368"/>
       </w:tblGrid>
       <w:tr>
+        <w:trPr>
+          <w:cantSplit/>
+        </w:trPr>
         <w:tc>
           <w:tcPr>
             <w:tcW w:type="dxa" w:w="527"/>
@@ -4403,7 +4451,7 @@
           </w:tcPr>
           <w:p>
             <w:pPr>
-              <w:keepNext w:val="0"/>
+              <w:keepNext/>
               <w:spacing w:before="0" w:after="0"/>
               <w:jc w:val="left"/>
             </w:pPr>
@@ -4427,7 +4475,7 @@
           </w:tcPr>
           <w:p>
             <w:pPr>
-              <w:keepNext w:val="0"/>
+              <w:keepNext/>
               <w:spacing w:before="0" w:after="0"/>
               <w:jc w:val="center"/>
             </w:pPr>
@@ -4451,7 +4499,7 @@
           </w:tcPr>
           <w:p>
             <w:pPr>
-              <w:keepNext w:val="0"/>
+              <w:keepNext/>
               <w:spacing w:before="0" w:after="0"/>
               <w:jc w:val="center"/>
             </w:pPr>
@@ -4475,7 +4523,7 @@
           </w:tcPr>
           <w:p>
             <w:pPr>
-              <w:keepNext w:val="0"/>
+              <w:keepNext/>
               <w:spacing w:before="0" w:after="0"/>
               <w:jc w:val="center"/>
             </w:pPr>
@@ -4492,13 +4540,16 @@
         </w:tc>
       </w:tr>
       <w:tr>
+        <w:trPr>
+          <w:cantSplit/>
+        </w:trPr>
         <w:tc>
           <w:tcPr>
             <w:tcW w:type="dxa" w:w="527"/>
           </w:tcPr>
           <w:p>
             <w:pPr>
-              <w:keepNext w:val="0"/>
+              <w:keepNext/>
               <w:spacing w:before="0" w:after="0"/>
               <w:jc w:val="left"/>
             </w:pPr>
@@ -4519,7 +4570,7 @@
           </w:tcPr>
           <w:p>
             <w:pPr>
-              <w:keepNext w:val="0"/>
+              <w:keepNext/>
               <w:spacing w:before="0" w:after="0"/>
               <w:jc w:val="center"/>
             </w:pPr>
@@ -4540,7 +4591,7 @@
           </w:tcPr>
           <w:p>
             <w:pPr>
-              <w:keepNext w:val="0"/>
+              <w:keepNext/>
               <w:spacing w:before="0" w:after="0"/>
               <w:jc w:val="center"/>
             </w:pPr>
@@ -4561,7 +4612,7 @@
           </w:tcPr>
           <w:p>
             <w:pPr>
-              <w:keepNext w:val="0"/>
+              <w:keepNext/>
               <w:spacing w:before="0" w:after="0"/>
               <w:jc w:val="center"/>
             </w:pPr>
@@ -4578,13 +4629,16 @@
         </w:tc>
       </w:tr>
       <w:tr>
+        <w:trPr>
+          <w:cantSplit/>
+        </w:trPr>
         <w:tc>
           <w:tcPr>
             <w:tcW w:type="dxa" w:w="527"/>
           </w:tcPr>
           <w:p>
             <w:pPr>
-              <w:keepNext w:val="0"/>
+              <w:keepNext/>
               <w:spacing w:before="0" w:after="0"/>
               <w:jc w:val="left"/>
             </w:pPr>
@@ -4605,7 +4659,7 @@
           </w:tcPr>
           <w:p>
             <w:pPr>
-              <w:keepNext w:val="0"/>
+              <w:keepNext/>
               <w:spacing w:before="0" w:after="0"/>
               <w:jc w:val="center"/>
             </w:pPr>
@@ -4626,7 +4680,7 @@
           </w:tcPr>
           <w:p>
             <w:pPr>
-              <w:keepNext w:val="0"/>
+              <w:keepNext/>
               <w:spacing w:before="0" w:after="0"/>
               <w:jc w:val="center"/>
             </w:pPr>
@@ -4647,7 +4701,7 @@
           </w:tcPr>
           <w:p>
             <w:pPr>
-              <w:keepNext w:val="0"/>
+              <w:keepNext/>
               <w:spacing w:before="0" w:after="0"/>
               <w:jc w:val="center"/>
             </w:pPr>
@@ -4664,13 +4718,16 @@
         </w:tc>
       </w:tr>
       <w:tr>
+        <w:trPr>
+          <w:cantSplit/>
+        </w:trPr>
         <w:tc>
           <w:tcPr>
             <w:tcW w:type="dxa" w:w="527"/>
           </w:tcPr>
           <w:p>
             <w:pPr>
-              <w:keepNext w:val="0"/>
+              <w:keepNext/>
               <w:spacing w:before="0" w:after="0"/>
               <w:jc w:val="left"/>
             </w:pPr>
@@ -4691,7 +4748,7 @@
           </w:tcPr>
           <w:p>
             <w:pPr>
-              <w:keepNext w:val="0"/>
+              <w:keepNext/>
               <w:spacing w:before="0" w:after="0"/>
               <w:jc w:val="center"/>
             </w:pPr>
@@ -4712,7 +4769,7 @@
           </w:tcPr>
           <w:p>
             <w:pPr>
-              <w:keepNext w:val="0"/>
+              <w:keepNext/>
               <w:spacing w:before="0" w:after="0"/>
               <w:jc w:val="center"/>
             </w:pPr>
@@ -4733,7 +4790,7 @@
           </w:tcPr>
           <w:p>
             <w:pPr>
-              <w:keepNext w:val="0"/>
+              <w:keepNext/>
               <w:spacing w:before="0" w:after="0"/>
               <w:jc w:val="center"/>
             </w:pPr>
@@ -4750,6 +4807,9 @@
         </w:tc>
       </w:tr>
       <w:tr>
+        <w:trPr>
+          <w:cantSplit/>
+        </w:trPr>
         <w:tc>
           <w:tcPr>
             <w:tcW w:type="dxa" w:w="527"/>
@@ -4931,6 +4991,9 @@
         <w:gridCol w:w="1015"/>
       </w:tblGrid>
       <w:tr>
+        <w:trPr>
+          <w:cantSplit/>
+        </w:trPr>
         <w:tc>
           <w:tcPr>
             <w:tcW w:type="dxa" w:w="771"/>
@@ -4940,7 +5003,7 @@
           </w:tcPr>
           <w:p>
             <w:pPr>
-              <w:keepNext w:val="0"/>
+              <w:keepNext/>
               <w:spacing w:before="0" w:after="0"/>
               <w:jc w:val="left"/>
             </w:pPr>
@@ -4964,7 +5027,7 @@
           </w:tcPr>
           <w:p>
             <w:pPr>
-              <w:keepNext w:val="0"/>
+              <w:keepNext/>
               <w:spacing w:before="0" w:after="0"/>
               <w:jc w:val="center"/>
             </w:pPr>
@@ -4988,7 +5051,7 @@
           </w:tcPr>
           <w:p>
             <w:pPr>
-              <w:keepNext w:val="0"/>
+              <w:keepNext/>
               <w:spacing w:before="0" w:after="0"/>
               <w:jc w:val="center"/>
             </w:pPr>
@@ -5012,7 +5075,7 @@
           </w:tcPr>
           <w:p>
             <w:pPr>
-              <w:keepNext w:val="0"/>
+              <w:keepNext/>
               <w:spacing w:before="0" w:after="0"/>
               <w:jc w:val="center"/>
             </w:pPr>
@@ -5036,7 +5099,7 @@
           </w:tcPr>
           <w:p>
             <w:pPr>
-              <w:keepNext w:val="0"/>
+              <w:keepNext/>
               <w:spacing w:before="0" w:after="0"/>
               <w:jc w:val="center"/>
             </w:pPr>
@@ -5053,13 +5116,16 @@
         </w:tc>
       </w:tr>
       <w:tr>
+        <w:trPr>
+          <w:cantSplit/>
+        </w:trPr>
         <w:tc>
           <w:tcPr>
             <w:tcW w:type="dxa" w:w="771"/>
           </w:tcPr>
           <w:p>
             <w:pPr>
-              <w:keepNext w:val="0"/>
+              <w:keepNext/>
               <w:spacing w:before="0" w:after="0"/>
               <w:jc w:val="left"/>
             </w:pPr>
@@ -5080,7 +5146,7 @@
           </w:tcPr>
           <w:p>
             <w:pPr>
-              <w:keepNext w:val="0"/>
+              <w:keepNext/>
               <w:spacing w:before="0" w:after="0"/>
               <w:jc w:val="center"/>
             </w:pPr>
@@ -5101,7 +5167,7 @@
           </w:tcPr>
           <w:p>
             <w:pPr>
-              <w:keepNext w:val="0"/>
+              <w:keepNext/>
               <w:spacing w:before="0" w:after="0"/>
               <w:jc w:val="center"/>
             </w:pPr>
@@ -5122,7 +5188,7 @@
           </w:tcPr>
           <w:p>
             <w:pPr>
-              <w:keepNext w:val="0"/>
+              <w:keepNext/>
               <w:spacing w:before="0" w:after="0"/>
               <w:jc w:val="center"/>
             </w:pPr>
@@ -5143,7 +5209,7 @@
           </w:tcPr>
           <w:p>
             <w:pPr>
-              <w:keepNext w:val="0"/>
+              <w:keepNext/>
               <w:spacing w:before="0" w:after="0"/>
               <w:jc w:val="center"/>
             </w:pPr>
@@ -5160,13 +5226,16 @@
         </w:tc>
       </w:tr>
       <w:tr>
+        <w:trPr>
+          <w:cantSplit/>
+        </w:trPr>
         <w:tc>
           <w:tcPr>
             <w:tcW w:type="dxa" w:w="771"/>
           </w:tcPr>
           <w:p>
             <w:pPr>
-              <w:keepNext w:val="0"/>
+              <w:keepNext/>
               <w:spacing w:before="0" w:after="0"/>
               <w:jc w:val="left"/>
             </w:pPr>
@@ -5187,7 +5256,7 @@
           </w:tcPr>
           <w:p>
             <w:pPr>
-              <w:keepNext w:val="0"/>
+              <w:keepNext/>
               <w:spacing w:before="0" w:after="0"/>
               <w:jc w:val="center"/>
             </w:pPr>
@@ -5208,7 +5277,7 @@
           </w:tcPr>
           <w:p>
             <w:pPr>
-              <w:keepNext w:val="0"/>
+              <w:keepNext/>
               <w:spacing w:before="0" w:after="0"/>
               <w:jc w:val="center"/>
             </w:pPr>
@@ -5229,7 +5298,7 @@
           </w:tcPr>
           <w:p>
             <w:pPr>
-              <w:keepNext w:val="0"/>
+              <w:keepNext/>
               <w:spacing w:before="0" w:after="0"/>
               <w:jc w:val="center"/>
             </w:pPr>
@@ -5250,7 +5319,7 @@
           </w:tcPr>
           <w:p>
             <w:pPr>
-              <w:keepNext w:val="0"/>
+              <w:keepNext/>
               <w:spacing w:before="0" w:after="0"/>
               <w:jc w:val="center"/>
             </w:pPr>
@@ -5267,6 +5336,9 @@
         </w:tc>
       </w:tr>
       <w:tr>
+        <w:trPr>
+          <w:cantSplit/>
+        </w:trPr>
         <w:tc>
           <w:tcPr>
             <w:tcW w:type="dxa" w:w="771"/>
@@ -5585,6 +5657,9 @@
         <w:gridCol w:w="883"/>
       </w:tblGrid>
       <w:tr>
+        <w:trPr>
+          <w:cantSplit/>
+        </w:trPr>
         <w:tc>
           <w:tcPr>
             <w:tcW w:type="dxa" w:w="787"/>
@@ -5594,7 +5669,7 @@
           </w:tcPr>
           <w:p>
             <w:pPr>
-              <w:keepNext w:val="0"/>
+              <w:keepNext/>
               <w:spacing w:before="0" w:after="0"/>
               <w:jc w:val="left"/>
             </w:pPr>
@@ -5618,7 +5693,7 @@
           </w:tcPr>
           <w:p>
             <w:pPr>
-              <w:keepNext w:val="0"/>
+              <w:keepNext/>
               <w:spacing w:before="0" w:after="0"/>
               <w:jc w:val="left"/>
             </w:pPr>
@@ -5642,7 +5717,7 @@
           </w:tcPr>
           <w:p>
             <w:pPr>
-              <w:keepNext w:val="0"/>
+              <w:keepNext/>
               <w:spacing w:before="0" w:after="0"/>
               <w:jc w:val="center"/>
             </w:pPr>
@@ -5666,7 +5741,7 @@
           </w:tcPr>
           <w:p>
             <w:pPr>
-              <w:keepNext w:val="0"/>
+              <w:keepNext/>
               <w:spacing w:before="0" w:after="0"/>
               <w:jc w:val="center"/>
             </w:pPr>
@@ -5690,7 +5765,7 @@
           </w:tcPr>
           <w:p>
             <w:pPr>
-              <w:keepNext w:val="0"/>
+              <w:keepNext/>
               <w:spacing w:before="0" w:after="0"/>
               <w:jc w:val="center"/>
             </w:pPr>
@@ -5714,7 +5789,7 @@
           </w:tcPr>
           <w:p>
             <w:pPr>
-              <w:keepNext w:val="0"/>
+              <w:keepNext/>
               <w:spacing w:before="0" w:after="0"/>
               <w:jc w:val="center"/>
             </w:pPr>
@@ -5738,7 +5813,7 @@
           </w:tcPr>
           <w:p>
             <w:pPr>
-              <w:keepNext w:val="0"/>
+              <w:keepNext/>
               <w:spacing w:before="0" w:after="0"/>
               <w:jc w:val="center"/>
             </w:pPr>
@@ -5762,7 +5837,7 @@
           </w:tcPr>
           <w:p>
             <w:pPr>
-              <w:keepNext w:val="0"/>
+              <w:keepNext/>
               <w:spacing w:before="0" w:after="0"/>
               <w:jc w:val="center"/>
             </w:pPr>
@@ -5779,13 +5854,16 @@
         </w:tc>
       </w:tr>
       <w:tr>
+        <w:trPr>
+          <w:cantSplit/>
+        </w:trPr>
         <w:tc>
           <w:tcPr>
             <w:tcW w:type="dxa" w:w="787"/>
           </w:tcPr>
           <w:p>
             <w:pPr>
-              <w:keepNext w:val="0"/>
+              <w:keepNext/>
               <w:spacing w:before="0" w:after="0"/>
               <w:jc w:val="left"/>
             </w:pPr>
@@ -5806,7 +5884,7 @@
           </w:tcPr>
           <w:p>
             <w:pPr>
-              <w:keepNext w:val="0"/>
+              <w:keepNext/>
               <w:spacing w:before="0" w:after="0"/>
               <w:jc w:val="left"/>
             </w:pPr>
@@ -5827,7 +5905,7 @@
           </w:tcPr>
           <w:p>
             <w:pPr>
-              <w:keepNext w:val="0"/>
+              <w:keepNext/>
               <w:spacing w:before="0" w:after="0"/>
               <w:jc w:val="center"/>
             </w:pPr>
@@ -5848,7 +5926,7 @@
           </w:tcPr>
           <w:p>
             <w:pPr>
-              <w:keepNext w:val="0"/>
+              <w:keepNext/>
               <w:spacing w:before="0" w:after="0"/>
               <w:jc w:val="center"/>
             </w:pPr>
@@ -5869,7 +5947,7 @@
           </w:tcPr>
           <w:p>
             <w:pPr>
-              <w:keepNext w:val="0"/>
+              <w:keepNext/>
               <w:spacing w:before="0" w:after="0"/>
               <w:jc w:val="center"/>
             </w:pPr>
@@ -5890,7 +5968,7 @@
           </w:tcPr>
           <w:p>
             <w:pPr>
-              <w:keepNext w:val="0"/>
+              <w:keepNext/>
               <w:spacing w:before="0" w:after="0"/>
               <w:jc w:val="center"/>
             </w:pPr>
@@ -5911,7 +5989,7 @@
           </w:tcPr>
           <w:p>
             <w:pPr>
-              <w:keepNext w:val="0"/>
+              <w:keepNext/>
               <w:spacing w:before="0" w:after="0"/>
               <w:jc w:val="center"/>
             </w:pPr>
@@ -5932,7 +6010,7 @@
           </w:tcPr>
           <w:p>
             <w:pPr>
-              <w:keepNext w:val="0"/>
+              <w:keepNext/>
               <w:spacing w:before="0" w:after="0"/>
               <w:jc w:val="center"/>
             </w:pPr>
@@ -5949,13 +6027,16 @@
         </w:tc>
       </w:tr>
       <w:tr>
+        <w:trPr>
+          <w:cantSplit/>
+        </w:trPr>
         <w:tc>
           <w:tcPr>
             <w:tcW w:type="dxa" w:w="787"/>
           </w:tcPr>
           <w:p>
             <w:pPr>
-              <w:keepNext w:val="0"/>
+              <w:keepNext/>
               <w:spacing w:before="0" w:after="0"/>
               <w:jc w:val="left"/>
             </w:pPr>
@@ -5976,7 +6057,7 @@
           </w:tcPr>
           <w:p>
             <w:pPr>
-              <w:keepNext w:val="0"/>
+              <w:keepNext/>
               <w:spacing w:before="0" w:after="0"/>
               <w:jc w:val="left"/>
             </w:pPr>
@@ -5997,7 +6078,7 @@
           </w:tcPr>
           <w:p>
             <w:pPr>
-              <w:keepNext w:val="0"/>
+              <w:keepNext/>
               <w:spacing w:before="0" w:after="0"/>
               <w:jc w:val="center"/>
             </w:pPr>
@@ -6018,7 +6099,7 @@
           </w:tcPr>
           <w:p>
             <w:pPr>
-              <w:keepNext w:val="0"/>
+              <w:keepNext/>
               <w:spacing w:before="0" w:after="0"/>
               <w:jc w:val="center"/>
             </w:pPr>
@@ -6039,7 +6120,7 @@
           </w:tcPr>
           <w:p>
             <w:pPr>
-              <w:keepNext w:val="0"/>
+              <w:keepNext/>
               <w:spacing w:before="0" w:after="0"/>
               <w:jc w:val="center"/>
             </w:pPr>
@@ -6060,7 +6141,7 @@
           </w:tcPr>
           <w:p>
             <w:pPr>
-              <w:keepNext w:val="0"/>
+              <w:keepNext/>
               <w:spacing w:before="0" w:after="0"/>
               <w:jc w:val="center"/>
             </w:pPr>
@@ -6081,7 +6162,7 @@
           </w:tcPr>
           <w:p>
             <w:pPr>
-              <w:keepNext w:val="0"/>
+              <w:keepNext/>
               <w:spacing w:before="0" w:after="0"/>
               <w:jc w:val="center"/>
             </w:pPr>
@@ -6102,7 +6183,7 @@
           </w:tcPr>
           <w:p>
             <w:pPr>
-              <w:keepNext w:val="0"/>
+              <w:keepNext/>
               <w:spacing w:before="0" w:after="0"/>
               <w:jc w:val="center"/>
             </w:pPr>
@@ -6119,13 +6200,16 @@
         </w:tc>
       </w:tr>
       <w:tr>
+        <w:trPr>
+          <w:cantSplit/>
+        </w:trPr>
         <w:tc>
           <w:tcPr>
             <w:tcW w:type="dxa" w:w="787"/>
           </w:tcPr>
           <w:p>
             <w:pPr>
-              <w:keepNext w:val="0"/>
+              <w:keepNext/>
               <w:spacing w:before="0" w:after="0"/>
               <w:jc w:val="left"/>
             </w:pPr>
@@ -6146,7 +6230,7 @@
           </w:tcPr>
           <w:p>
             <w:pPr>
-              <w:keepNext w:val="0"/>
+              <w:keepNext/>
               <w:spacing w:before="0" w:after="0"/>
               <w:jc w:val="left"/>
             </w:pPr>
@@ -6167,7 +6251,7 @@
           </w:tcPr>
           <w:p>
             <w:pPr>
-              <w:keepNext w:val="0"/>
+              <w:keepNext/>
               <w:spacing w:before="0" w:after="0"/>
               <w:jc w:val="center"/>
             </w:pPr>
@@ -6188,7 +6272,7 @@
           </w:tcPr>
           <w:p>
             <w:pPr>
-              <w:keepNext w:val="0"/>
+              <w:keepNext/>
               <w:spacing w:before="0" w:after="0"/>
               <w:jc w:val="center"/>
             </w:pPr>
@@ -6209,7 +6293,7 @@
           </w:tcPr>
           <w:p>
             <w:pPr>
-              <w:keepNext w:val="0"/>
+              <w:keepNext/>
               <w:spacing w:before="0" w:after="0"/>
               <w:jc w:val="center"/>
             </w:pPr>
@@ -6230,7 +6314,7 @@
           </w:tcPr>
           <w:p>
             <w:pPr>
-              <w:keepNext w:val="0"/>
+              <w:keepNext/>
               <w:spacing w:before="0" w:after="0"/>
               <w:jc w:val="center"/>
             </w:pPr>
@@ -6251,7 +6335,7 @@
           </w:tcPr>
           <w:p>
             <w:pPr>
-              <w:keepNext w:val="0"/>
+              <w:keepNext/>
               <w:spacing w:before="0" w:after="0"/>
               <w:jc w:val="center"/>
             </w:pPr>
@@ -6272,7 +6356,7 @@
           </w:tcPr>
           <w:p>
             <w:pPr>
-              <w:keepNext w:val="0"/>
+              <w:keepNext/>
               <w:spacing w:before="0" w:after="0"/>
               <w:jc w:val="center"/>
             </w:pPr>
@@ -6289,13 +6373,16 @@
         </w:tc>
       </w:tr>
       <w:tr>
+        <w:trPr>
+          <w:cantSplit/>
+        </w:trPr>
         <w:tc>
           <w:tcPr>
             <w:tcW w:type="dxa" w:w="787"/>
           </w:tcPr>
           <w:p>
             <w:pPr>
-              <w:keepNext w:val="0"/>
+              <w:keepNext/>
               <w:spacing w:before="0" w:after="0"/>
               <w:jc w:val="left"/>
             </w:pPr>
@@ -6316,7 +6403,7 @@
           </w:tcPr>
           <w:p>
             <w:pPr>
-              <w:keepNext w:val="0"/>
+              <w:keepNext/>
               <w:spacing w:before="0" w:after="0"/>
               <w:jc w:val="left"/>
             </w:pPr>
@@ -6337,7 +6424,7 @@
           </w:tcPr>
           <w:p>
             <w:pPr>
-              <w:keepNext w:val="0"/>
+              <w:keepNext/>
               <w:spacing w:before="0" w:after="0"/>
               <w:jc w:val="center"/>
             </w:pPr>
@@ -6358,7 +6445,7 @@
           </w:tcPr>
           <w:p>
             <w:pPr>
-              <w:keepNext w:val="0"/>
+              <w:keepNext/>
               <w:spacing w:before="0" w:after="0"/>
               <w:jc w:val="center"/>
             </w:pPr>
@@ -6379,7 +6466,7 @@
           </w:tcPr>
           <w:p>
             <w:pPr>
-              <w:keepNext w:val="0"/>
+              <w:keepNext/>
               <w:spacing w:before="0" w:after="0"/>
               <w:jc w:val="center"/>
             </w:pPr>
@@ -6400,7 +6487,7 @@
           </w:tcPr>
           <w:p>
             <w:pPr>
-              <w:keepNext w:val="0"/>
+              <w:keepNext/>
               <w:spacing w:before="0" w:after="0"/>
               <w:jc w:val="center"/>
             </w:pPr>
@@ -6421,7 +6508,7 @@
           </w:tcPr>
           <w:p>
             <w:pPr>
-              <w:keepNext w:val="0"/>
+              <w:keepNext/>
               <w:spacing w:before="0" w:after="0"/>
               <w:jc w:val="center"/>
             </w:pPr>
@@ -6442,7 +6529,7 @@
           </w:tcPr>
           <w:p>
             <w:pPr>
-              <w:keepNext w:val="0"/>
+              <w:keepNext/>
               <w:spacing w:before="0" w:after="0"/>
               <w:jc w:val="center"/>
             </w:pPr>
@@ -6459,13 +6546,16 @@
         </w:tc>
       </w:tr>
       <w:tr>
+        <w:trPr>
+          <w:cantSplit/>
+        </w:trPr>
         <w:tc>
           <w:tcPr>
             <w:tcW w:type="dxa" w:w="787"/>
           </w:tcPr>
           <w:p>
             <w:pPr>
-              <w:keepNext w:val="0"/>
+              <w:keepNext/>
               <w:spacing w:before="0" w:after="0"/>
               <w:jc w:val="left"/>
             </w:pPr>
@@ -6486,7 +6576,7 @@
           </w:tcPr>
           <w:p>
             <w:pPr>
-              <w:keepNext w:val="0"/>
+              <w:keepNext/>
               <w:spacing w:before="0" w:after="0"/>
               <w:jc w:val="left"/>
             </w:pPr>
@@ -6507,7 +6597,7 @@
           </w:tcPr>
           <w:p>
             <w:pPr>
-              <w:keepNext w:val="0"/>
+              <w:keepNext/>
               <w:spacing w:before="0" w:after="0"/>
               <w:jc w:val="center"/>
             </w:pPr>
@@ -6528,7 +6618,7 @@
           </w:tcPr>
           <w:p>
             <w:pPr>
-              <w:keepNext w:val="0"/>
+              <w:keepNext/>
               <w:spacing w:before="0" w:after="0"/>
               <w:jc w:val="center"/>
             </w:pPr>
@@ -6549,7 +6639,7 @@
           </w:tcPr>
           <w:p>
             <w:pPr>
-              <w:keepNext w:val="0"/>
+              <w:keepNext/>
               <w:spacing w:before="0" w:after="0"/>
               <w:jc w:val="center"/>
             </w:pPr>
@@ -6570,7 +6660,7 @@
           </w:tcPr>
           <w:p>
             <w:pPr>
-              <w:keepNext w:val="0"/>
+              <w:keepNext/>
               <w:spacing w:before="0" w:after="0"/>
               <w:jc w:val="center"/>
             </w:pPr>
@@ -6591,7 +6681,7 @@
           </w:tcPr>
           <w:p>
             <w:pPr>
-              <w:keepNext w:val="0"/>
+              <w:keepNext/>
               <w:spacing w:before="0" w:after="0"/>
               <w:jc w:val="center"/>
             </w:pPr>
@@ -6612,7 +6702,7 @@
           </w:tcPr>
           <w:p>
             <w:pPr>
-              <w:keepNext w:val="0"/>
+              <w:keepNext/>
               <w:spacing w:before="0" w:after="0"/>
               <w:jc w:val="center"/>
             </w:pPr>
@@ -6629,13 +6719,16 @@
         </w:tc>
       </w:tr>
       <w:tr>
+        <w:trPr>
+          <w:cantSplit/>
+        </w:trPr>
         <w:tc>
           <w:tcPr>
             <w:tcW w:type="dxa" w:w="787"/>
           </w:tcPr>
           <w:p>
             <w:pPr>
-              <w:keepNext w:val="0"/>
+              <w:keepNext/>
               <w:spacing w:before="0" w:after="0"/>
               <w:jc w:val="left"/>
             </w:pPr>
@@ -6656,7 +6749,7 @@
           </w:tcPr>
           <w:p>
             <w:pPr>
-              <w:keepNext w:val="0"/>
+              <w:keepNext/>
               <w:spacing w:before="0" w:after="0"/>
               <w:jc w:val="left"/>
             </w:pPr>
@@ -6677,7 +6770,7 @@
           </w:tcPr>
           <w:p>
             <w:pPr>
-              <w:keepNext w:val="0"/>
+              <w:keepNext/>
               <w:spacing w:before="0" w:after="0"/>
               <w:jc w:val="center"/>
             </w:pPr>
@@ -6698,7 +6791,7 @@
           </w:tcPr>
           <w:p>
             <w:pPr>
-              <w:keepNext w:val="0"/>
+              <w:keepNext/>
               <w:spacing w:before="0" w:after="0"/>
               <w:jc w:val="center"/>
             </w:pPr>
@@ -6719,7 +6812,7 @@
           </w:tcPr>
           <w:p>
             <w:pPr>
-              <w:keepNext w:val="0"/>
+              <w:keepNext/>
               <w:spacing w:before="0" w:after="0"/>
               <w:jc w:val="center"/>
             </w:pPr>
@@ -6740,7 +6833,7 @@
           </w:tcPr>
           <w:p>
             <w:pPr>
-              <w:keepNext w:val="0"/>
+              <w:keepNext/>
               <w:spacing w:before="0" w:after="0"/>
               <w:jc w:val="center"/>
             </w:pPr>
@@ -6761,7 +6854,7 @@
           </w:tcPr>
           <w:p>
             <w:pPr>
-              <w:keepNext w:val="0"/>
+              <w:keepNext/>
               <w:spacing w:before="0" w:after="0"/>
               <w:jc w:val="center"/>
             </w:pPr>
@@ -6782,7 +6875,7 @@
           </w:tcPr>
           <w:p>
             <w:pPr>
-              <w:keepNext w:val="0"/>
+              <w:keepNext/>
               <w:spacing w:before="0" w:after="0"/>
               <w:jc w:val="center"/>
             </w:pPr>
@@ -6799,13 +6892,16 @@
         </w:tc>
       </w:tr>
       <w:tr>
+        <w:trPr>
+          <w:cantSplit/>
+        </w:trPr>
         <w:tc>
           <w:tcPr>
             <w:tcW w:type="dxa" w:w="787"/>
           </w:tcPr>
           <w:p>
             <w:pPr>
-              <w:keepNext w:val="0"/>
+              <w:keepNext/>
               <w:spacing w:before="0" w:after="0"/>
               <w:jc w:val="left"/>
             </w:pPr>
@@ -6826,7 +6922,7 @@
           </w:tcPr>
           <w:p>
             <w:pPr>
-              <w:keepNext w:val="0"/>
+              <w:keepNext/>
               <w:spacing w:before="0" w:after="0"/>
               <w:jc w:val="left"/>
             </w:pPr>
@@ -6847,7 +6943,7 @@
           </w:tcPr>
           <w:p>
             <w:pPr>
-              <w:keepNext w:val="0"/>
+              <w:keepNext/>
               <w:spacing w:before="0" w:after="0"/>
               <w:jc w:val="center"/>
             </w:pPr>
@@ -6868,7 +6964,7 @@
           </w:tcPr>
           <w:p>
             <w:pPr>
-              <w:keepNext w:val="0"/>
+              <w:keepNext/>
               <w:spacing w:before="0" w:after="0"/>
               <w:jc w:val="center"/>
             </w:pPr>
@@ -6889,7 +6985,7 @@
           </w:tcPr>
           <w:p>
             <w:pPr>
-              <w:keepNext w:val="0"/>
+              <w:keepNext/>
               <w:spacing w:before="0" w:after="0"/>
               <w:jc w:val="center"/>
             </w:pPr>
@@ -6910,7 +7006,7 @@
           </w:tcPr>
           <w:p>
             <w:pPr>
-              <w:keepNext w:val="0"/>
+              <w:keepNext/>
               <w:spacing w:before="0" w:after="0"/>
               <w:jc w:val="center"/>
             </w:pPr>
@@ -6931,7 +7027,7 @@
           </w:tcPr>
           <w:p>
             <w:pPr>
-              <w:keepNext w:val="0"/>
+              <w:keepNext/>
               <w:spacing w:before="0" w:after="0"/>
               <w:jc w:val="center"/>
             </w:pPr>
@@ -6952,7 +7048,7 @@
           </w:tcPr>
           <w:p>
             <w:pPr>
-              <w:keepNext w:val="0"/>
+              <w:keepNext/>
               <w:spacing w:before="0" w:after="0"/>
               <w:jc w:val="center"/>
             </w:pPr>
@@ -6969,13 +7065,16 @@
         </w:tc>
       </w:tr>
       <w:tr>
+        <w:trPr>
+          <w:cantSplit/>
+        </w:trPr>
         <w:tc>
           <w:tcPr>
             <w:tcW w:type="dxa" w:w="787"/>
           </w:tcPr>
           <w:p>
             <w:pPr>
-              <w:keepNext w:val="0"/>
+              <w:keepNext/>
               <w:spacing w:before="0" w:after="0"/>
               <w:jc w:val="left"/>
             </w:pPr>
@@ -6996,7 +7095,7 @@
           </w:tcPr>
           <w:p>
             <w:pPr>
-              <w:keepNext w:val="0"/>
+              <w:keepNext/>
               <w:spacing w:before="0" w:after="0"/>
               <w:jc w:val="left"/>
             </w:pPr>
@@ -7017,7 +7116,7 @@
           </w:tcPr>
           <w:p>
             <w:pPr>
-              <w:keepNext w:val="0"/>
+              <w:keepNext/>
               <w:spacing w:before="0" w:after="0"/>
               <w:jc w:val="center"/>
             </w:pPr>
@@ -7038,7 +7137,7 @@
           </w:tcPr>
           <w:p>
             <w:pPr>
-              <w:keepNext w:val="0"/>
+              <w:keepNext/>
               <w:spacing w:before="0" w:after="0"/>
               <w:jc w:val="center"/>
             </w:pPr>
@@ -7059,7 +7158,7 @@
           </w:tcPr>
           <w:p>
             <w:pPr>
-              <w:keepNext w:val="0"/>
+              <w:keepNext/>
               <w:spacing w:before="0" w:after="0"/>
               <w:jc w:val="center"/>
             </w:pPr>
@@ -7080,7 +7179,7 @@
           </w:tcPr>
           <w:p>
             <w:pPr>
-              <w:keepNext w:val="0"/>
+              <w:keepNext/>
               <w:spacing w:before="0" w:after="0"/>
               <w:jc w:val="center"/>
             </w:pPr>
@@ -7101,7 +7200,7 @@
           </w:tcPr>
           <w:p>
             <w:pPr>
-              <w:keepNext w:val="0"/>
+              <w:keepNext/>
               <w:spacing w:before="0" w:after="0"/>
               <w:jc w:val="center"/>
             </w:pPr>
@@ -7122,7 +7221,7 @@
           </w:tcPr>
           <w:p>
             <w:pPr>
-              <w:keepNext w:val="0"/>
+              <w:keepNext/>
               <w:spacing w:before="0" w:after="0"/>
               <w:jc w:val="center"/>
             </w:pPr>
@@ -7139,6 +7238,9 @@
         </w:tc>
       </w:tr>
       <w:tr>
+        <w:trPr>
+          <w:cantSplit/>
+        </w:trPr>
         <w:tc>
           <w:tcPr>
             <w:tcW w:type="dxa" w:w="787"/>
@@ -7421,6 +7523,9 @@
         <w:gridCol w:w="1199"/>
       </w:tblGrid>
       <w:tr>
+        <w:trPr>
+          <w:cantSplit/>
+        </w:trPr>
         <w:tc>
           <w:tcPr>
             <w:tcW w:type="dxa" w:w="742"/>
@@ -7430,7 +7535,7 @@
           </w:tcPr>
           <w:p>
             <w:pPr>
-              <w:keepNext w:val="0"/>
+              <w:keepNext/>
               <w:spacing w:before="0" w:after="0"/>
               <w:jc w:val="left"/>
             </w:pPr>
@@ -7454,7 +7559,7 @@
           </w:tcPr>
           <w:p>
             <w:pPr>
-              <w:keepNext w:val="0"/>
+              <w:keepNext/>
               <w:spacing w:before="0" w:after="0"/>
               <w:jc w:val="left"/>
             </w:pPr>
@@ -7478,7 +7583,7 @@
           </w:tcPr>
           <w:p>
             <w:pPr>
-              <w:keepNext w:val="0"/>
+              <w:keepNext/>
               <w:spacing w:before="0" w:after="0"/>
               <w:jc w:val="center"/>
             </w:pPr>
@@ -7502,7 +7607,7 @@
           </w:tcPr>
           <w:p>
             <w:pPr>
-              <w:keepNext w:val="0"/>
+              <w:keepNext/>
               <w:spacing w:before="0" w:after="0"/>
               <w:jc w:val="center"/>
             </w:pPr>
@@ -7526,7 +7631,7 @@
           </w:tcPr>
           <w:p>
             <w:pPr>
-              <w:keepNext w:val="0"/>
+              <w:keepNext/>
               <w:spacing w:before="0" w:after="0"/>
               <w:jc w:val="center"/>
             </w:pPr>
@@ -7550,7 +7655,7 @@
           </w:tcPr>
           <w:p>
             <w:pPr>
-              <w:keepNext w:val="0"/>
+              <w:keepNext/>
               <w:spacing w:before="0" w:after="0"/>
               <w:jc w:val="center"/>
             </w:pPr>
@@ -7574,7 +7679,7 @@
           </w:tcPr>
           <w:p>
             <w:pPr>
-              <w:keepNext w:val="0"/>
+              <w:keepNext/>
               <w:spacing w:before="0" w:after="0"/>
               <w:jc w:val="center"/>
             </w:pPr>
@@ -7591,13 +7696,16 @@
         </w:tc>
       </w:tr>
       <w:tr>
+        <w:trPr>
+          <w:cantSplit/>
+        </w:trPr>
         <w:tc>
           <w:tcPr>
             <w:tcW w:type="dxa" w:w="742"/>
           </w:tcPr>
           <w:p>
             <w:pPr>
-              <w:keepNext w:val="0"/>
+              <w:keepNext/>
               <w:spacing w:before="0" w:after="0"/>
               <w:jc w:val="left"/>
             </w:pPr>
@@ -7618,7 +7726,7 @@
           </w:tcPr>
           <w:p>
             <w:pPr>
-              <w:keepNext w:val="0"/>
+              <w:keepNext/>
               <w:spacing w:before="0" w:after="0"/>
               <w:jc w:val="left"/>
             </w:pPr>
@@ -7639,7 +7747,7 @@
           </w:tcPr>
           <w:p>
             <w:pPr>
-              <w:keepNext w:val="0"/>
+              <w:keepNext/>
               <w:spacing w:before="0" w:after="0"/>
               <w:jc w:val="center"/>
             </w:pPr>
@@ -7660,7 +7768,7 @@
           </w:tcPr>
           <w:p>
             <w:pPr>
-              <w:keepNext w:val="0"/>
+              <w:keepNext/>
               <w:spacing w:before="0" w:after="0"/>
               <w:jc w:val="center"/>
             </w:pPr>
@@ -7681,7 +7789,7 @@
           </w:tcPr>
           <w:p>
             <w:pPr>
-              <w:keepNext w:val="0"/>
+              <w:keepNext/>
               <w:spacing w:before="0" w:after="0"/>
               <w:jc w:val="center"/>
             </w:pPr>
@@ -7702,7 +7810,7 @@
           </w:tcPr>
           <w:p>
             <w:pPr>
-              <w:keepNext w:val="0"/>
+              <w:keepNext/>
               <w:spacing w:before="0" w:after="0"/>
               <w:jc w:val="center"/>
             </w:pPr>
@@ -7723,7 +7831,7 @@
           </w:tcPr>
           <w:p>
             <w:pPr>
-              <w:keepNext w:val="0"/>
+              <w:keepNext/>
               <w:spacing w:before="0" w:after="0"/>
               <w:jc w:val="center"/>
             </w:pPr>
@@ -7740,13 +7848,16 @@
         </w:tc>
       </w:tr>
       <w:tr>
+        <w:trPr>
+          <w:cantSplit/>
+        </w:trPr>
         <w:tc>
           <w:tcPr>
             <w:tcW w:type="dxa" w:w="742"/>
           </w:tcPr>
           <w:p>
             <w:pPr>
-              <w:keepNext w:val="0"/>
+              <w:keepNext/>
               <w:spacing w:before="0" w:after="0"/>
               <w:jc w:val="left"/>
             </w:pPr>
@@ -7767,7 +7878,7 @@
           </w:tcPr>
           <w:p>
             <w:pPr>
-              <w:keepNext w:val="0"/>
+              <w:keepNext/>
               <w:spacing w:before="0" w:after="0"/>
               <w:jc w:val="left"/>
             </w:pPr>
@@ -7788,7 +7899,7 @@
           </w:tcPr>
           <w:p>
             <w:pPr>
-              <w:keepNext w:val="0"/>
+              <w:keepNext/>
               <w:spacing w:before="0" w:after="0"/>
               <w:jc w:val="center"/>
             </w:pPr>
@@ -7809,7 +7920,7 @@
           </w:tcPr>
           <w:p>
             <w:pPr>
-              <w:keepNext w:val="0"/>
+              <w:keepNext/>
               <w:spacing w:before="0" w:after="0"/>
               <w:jc w:val="center"/>
             </w:pPr>
@@ -7830,7 +7941,7 @@
           </w:tcPr>
           <w:p>
             <w:pPr>
-              <w:keepNext w:val="0"/>
+              <w:keepNext/>
               <w:spacing w:before="0" w:after="0"/>
               <w:jc w:val="center"/>
             </w:pPr>
@@ -7851,7 +7962,7 @@
           </w:tcPr>
           <w:p>
             <w:pPr>
-              <w:keepNext w:val="0"/>
+              <w:keepNext/>
               <w:spacing w:before="0" w:after="0"/>
               <w:jc w:val="center"/>
             </w:pPr>
@@ -7872,7 +7983,7 @@
           </w:tcPr>
           <w:p>
             <w:pPr>
-              <w:keepNext w:val="0"/>
+              <w:keepNext/>
               <w:spacing w:before="0" w:after="0"/>
               <w:jc w:val="center"/>
             </w:pPr>
@@ -7889,13 +8000,16 @@
         </w:tc>
       </w:tr>
       <w:tr>
+        <w:trPr>
+          <w:cantSplit/>
+        </w:trPr>
         <w:tc>
           <w:tcPr>
             <w:tcW w:type="dxa" w:w="742"/>
           </w:tcPr>
           <w:p>
             <w:pPr>
-              <w:keepNext w:val="0"/>
+              <w:keepNext/>
               <w:spacing w:before="0" w:after="0"/>
               <w:jc w:val="left"/>
             </w:pPr>
@@ -7916,7 +8030,7 @@
           </w:tcPr>
           <w:p>
             <w:pPr>
-              <w:keepNext w:val="0"/>
+              <w:keepNext/>
               <w:spacing w:before="0" w:after="0"/>
               <w:jc w:val="left"/>
             </w:pPr>
@@ -7937,7 +8051,7 @@
           </w:tcPr>
           <w:p>
             <w:pPr>
-              <w:keepNext w:val="0"/>
+              <w:keepNext/>
               <w:spacing w:before="0" w:after="0"/>
               <w:jc w:val="center"/>
             </w:pPr>
@@ -7958,7 +8072,7 @@
           </w:tcPr>
           <w:p>
             <w:pPr>
-              <w:keepNext w:val="0"/>
+              <w:keepNext/>
               <w:spacing w:before="0" w:after="0"/>
               <w:jc w:val="center"/>
             </w:pPr>
@@ -7979,7 +8093,7 @@
           </w:tcPr>
           <w:p>
             <w:pPr>
-              <w:keepNext w:val="0"/>
+              <w:keepNext/>
               <w:spacing w:before="0" w:after="0"/>
               <w:jc w:val="center"/>
             </w:pPr>
@@ -8000,7 +8114,7 @@
           </w:tcPr>
           <w:p>
             <w:pPr>
-              <w:keepNext w:val="0"/>
+              <w:keepNext/>
               <w:spacing w:before="0" w:after="0"/>
               <w:jc w:val="center"/>
             </w:pPr>
@@ -8021,7 +8135,7 @@
           </w:tcPr>
           <w:p>
             <w:pPr>
-              <w:keepNext w:val="0"/>
+              <w:keepNext/>
               <w:spacing w:before="0" w:after="0"/>
               <w:jc w:val="center"/>
             </w:pPr>
@@ -8038,13 +8152,16 @@
         </w:tc>
       </w:tr>
       <w:tr>
+        <w:trPr>
+          <w:cantSplit/>
+        </w:trPr>
         <w:tc>
           <w:tcPr>
             <w:tcW w:type="dxa" w:w="742"/>
           </w:tcPr>
           <w:p>
             <w:pPr>
-              <w:keepNext w:val="0"/>
+              <w:keepNext/>
               <w:spacing w:before="0" w:after="0"/>
               <w:jc w:val="left"/>
             </w:pPr>
@@ -8065,7 +8182,7 @@
           </w:tcPr>
           <w:p>
             <w:pPr>
-              <w:keepNext w:val="0"/>
+              <w:keepNext/>
               <w:spacing w:before="0" w:after="0"/>
               <w:jc w:val="left"/>
             </w:pPr>
@@ -8086,7 +8203,7 @@
           </w:tcPr>
           <w:p>
             <w:pPr>
-              <w:keepNext w:val="0"/>
+              <w:keepNext/>
               <w:spacing w:before="0" w:after="0"/>
               <w:jc w:val="center"/>
             </w:pPr>
@@ -8107,7 +8224,7 @@
           </w:tcPr>
           <w:p>
             <w:pPr>
-              <w:keepNext w:val="0"/>
+              <w:keepNext/>
               <w:spacing w:before="0" w:after="0"/>
               <w:jc w:val="center"/>
             </w:pPr>
@@ -8128,7 +8245,7 @@
           </w:tcPr>
           <w:p>
             <w:pPr>
-              <w:keepNext w:val="0"/>
+              <w:keepNext/>
               <w:spacing w:before="0" w:after="0"/>
               <w:jc w:val="center"/>
             </w:pPr>
@@ -8149,7 +8266,7 @@
           </w:tcPr>
           <w:p>
             <w:pPr>
-              <w:keepNext w:val="0"/>
+              <w:keepNext/>
               <w:spacing w:before="0" w:after="0"/>
               <w:jc w:val="center"/>
             </w:pPr>
@@ -8170,7 +8287,7 @@
           </w:tcPr>
           <w:p>
             <w:pPr>
-              <w:keepNext w:val="0"/>
+              <w:keepNext/>
               <w:spacing w:before="0" w:after="0"/>
               <w:jc w:val="center"/>
             </w:pPr>
@@ -8187,13 +8304,16 @@
         </w:tc>
       </w:tr>
       <w:tr>
+        <w:trPr>
+          <w:cantSplit/>
+        </w:trPr>
         <w:tc>
           <w:tcPr>
             <w:tcW w:type="dxa" w:w="742"/>
           </w:tcPr>
           <w:p>
             <w:pPr>
-              <w:keepNext w:val="0"/>
+              <w:keepNext/>
               <w:spacing w:before="0" w:after="0"/>
               <w:jc w:val="left"/>
             </w:pPr>
@@ -8214,7 +8334,7 @@
           </w:tcPr>
           <w:p>
             <w:pPr>
-              <w:keepNext w:val="0"/>
+              <w:keepNext/>
               <w:spacing w:before="0" w:after="0"/>
               <w:jc w:val="left"/>
             </w:pPr>
@@ -8235,7 +8355,7 @@
           </w:tcPr>
           <w:p>
             <w:pPr>
-              <w:keepNext w:val="0"/>
+              <w:keepNext/>
               <w:spacing w:before="0" w:after="0"/>
               <w:jc w:val="center"/>
             </w:pPr>
@@ -8256,7 +8376,7 @@
           </w:tcPr>
           <w:p>
             <w:pPr>
-              <w:keepNext w:val="0"/>
+              <w:keepNext/>
               <w:spacing w:before="0" w:after="0"/>
               <w:jc w:val="center"/>
             </w:pPr>
@@ -8277,7 +8397,7 @@
           </w:tcPr>
           <w:p>
             <w:pPr>
-              <w:keepNext w:val="0"/>
+              <w:keepNext/>
               <w:spacing w:before="0" w:after="0"/>
               <w:jc w:val="center"/>
             </w:pPr>
@@ -8298,7 +8418,7 @@
           </w:tcPr>
           <w:p>
             <w:pPr>
-              <w:keepNext w:val="0"/>
+              <w:keepNext/>
               <w:spacing w:before="0" w:after="0"/>
               <w:jc w:val="center"/>
             </w:pPr>
@@ -8319,7 +8439,7 @@
           </w:tcPr>
           <w:p>
             <w:pPr>
-              <w:keepNext w:val="0"/>
+              <w:keepNext/>
               <w:spacing w:before="0" w:after="0"/>
               <w:jc w:val="center"/>
             </w:pPr>
@@ -8336,13 +8456,16 @@
         </w:tc>
       </w:tr>
       <w:tr>
+        <w:trPr>
+          <w:cantSplit/>
+        </w:trPr>
         <w:tc>
           <w:tcPr>
             <w:tcW w:type="dxa" w:w="742"/>
           </w:tcPr>
           <w:p>
             <w:pPr>
-              <w:keepNext w:val="0"/>
+              <w:keepNext/>
               <w:spacing w:before="0" w:after="0"/>
               <w:jc w:val="left"/>
             </w:pPr>
@@ -8363,7 +8486,7 @@
           </w:tcPr>
           <w:p>
             <w:pPr>
-              <w:keepNext w:val="0"/>
+              <w:keepNext/>
               <w:spacing w:before="0" w:after="0"/>
               <w:jc w:val="left"/>
             </w:pPr>
@@ -8384,7 +8507,7 @@
           </w:tcPr>
           <w:p>
             <w:pPr>
-              <w:keepNext w:val="0"/>
+              <w:keepNext/>
               <w:spacing w:before="0" w:after="0"/>
               <w:jc w:val="center"/>
             </w:pPr>
@@ -8405,7 +8528,7 @@
           </w:tcPr>
           <w:p>
             <w:pPr>
-              <w:keepNext w:val="0"/>
+              <w:keepNext/>
               <w:spacing w:before="0" w:after="0"/>
               <w:jc w:val="center"/>
             </w:pPr>
@@ -8426,7 +8549,7 @@
           </w:tcPr>
           <w:p>
             <w:pPr>
-              <w:keepNext w:val="0"/>
+              <w:keepNext/>
               <w:spacing w:before="0" w:after="0"/>
               <w:jc w:val="center"/>
             </w:pPr>
@@ -8447,7 +8570,7 @@
           </w:tcPr>
           <w:p>
             <w:pPr>
-              <w:keepNext w:val="0"/>
+              <w:keepNext/>
               <w:spacing w:before="0" w:after="0"/>
               <w:jc w:val="center"/>
             </w:pPr>
@@ -8468,7 +8591,7 @@
           </w:tcPr>
           <w:p>
             <w:pPr>
-              <w:keepNext w:val="0"/>
+              <w:keepNext/>
               <w:spacing w:before="0" w:after="0"/>
               <w:jc w:val="center"/>
             </w:pPr>
@@ -8485,13 +8608,16 @@
         </w:tc>
       </w:tr>
       <w:tr>
+        <w:trPr>
+          <w:cantSplit/>
+        </w:trPr>
         <w:tc>
           <w:tcPr>
             <w:tcW w:type="dxa" w:w="742"/>
           </w:tcPr>
           <w:p>
             <w:pPr>
-              <w:keepNext w:val="0"/>
+              <w:keepNext/>
               <w:spacing w:before="0" w:after="0"/>
               <w:jc w:val="left"/>
             </w:pPr>
@@ -8512,7 +8638,7 @@
           </w:tcPr>
           <w:p>
             <w:pPr>
-              <w:keepNext w:val="0"/>
+              <w:keepNext/>
               <w:spacing w:before="0" w:after="0"/>
               <w:jc w:val="left"/>
             </w:pPr>
@@ -8533,7 +8659,7 @@
           </w:tcPr>
           <w:p>
             <w:pPr>
-              <w:keepNext w:val="0"/>
+              <w:keepNext/>
               <w:spacing w:before="0" w:after="0"/>
               <w:jc w:val="center"/>
             </w:pPr>
@@ -8554,7 +8680,7 @@
           </w:tcPr>
           <w:p>
             <w:pPr>
-              <w:keepNext w:val="0"/>
+              <w:keepNext/>
               <w:spacing w:before="0" w:after="0"/>
               <w:jc w:val="center"/>
             </w:pPr>
@@ -8575,7 +8701,7 @@
           </w:tcPr>
           <w:p>
             <w:pPr>
-              <w:keepNext w:val="0"/>
+              <w:keepNext/>
               <w:spacing w:before="0" w:after="0"/>
               <w:jc w:val="center"/>
             </w:pPr>
@@ -8596,7 +8722,7 @@
           </w:tcPr>
           <w:p>
             <w:pPr>
-              <w:keepNext w:val="0"/>
+              <w:keepNext/>
               <w:spacing w:before="0" w:after="0"/>
               <w:jc w:val="center"/>
             </w:pPr>
@@ -8617,7 +8743,7 @@
           </w:tcPr>
           <w:p>
             <w:pPr>
-              <w:keepNext w:val="0"/>
+              <w:keepNext/>
               <w:spacing w:before="0" w:after="0"/>
               <w:jc w:val="center"/>
             </w:pPr>
@@ -8634,13 +8760,16 @@
         </w:tc>
       </w:tr>
       <w:tr>
+        <w:trPr>
+          <w:cantSplit/>
+        </w:trPr>
         <w:tc>
           <w:tcPr>
             <w:tcW w:type="dxa" w:w="742"/>
           </w:tcPr>
           <w:p>
             <w:pPr>
-              <w:keepNext w:val="0"/>
+              <w:keepNext/>
               <w:spacing w:before="0" w:after="0"/>
               <w:jc w:val="left"/>
             </w:pPr>
@@ -8661,7 +8790,7 @@
           </w:tcPr>
           <w:p>
             <w:pPr>
-              <w:keepNext w:val="0"/>
+              <w:keepNext/>
               <w:spacing w:before="0" w:after="0"/>
               <w:jc w:val="left"/>
             </w:pPr>
@@ -8682,7 +8811,7 @@
           </w:tcPr>
           <w:p>
             <w:pPr>
-              <w:keepNext w:val="0"/>
+              <w:keepNext/>
               <w:spacing w:before="0" w:after="0"/>
               <w:jc w:val="center"/>
             </w:pPr>
@@ -8703,7 +8832,7 @@
           </w:tcPr>
           <w:p>
             <w:pPr>
-              <w:keepNext w:val="0"/>
+              <w:keepNext/>
               <w:spacing w:before="0" w:after="0"/>
               <w:jc w:val="center"/>
             </w:pPr>
@@ -8724,7 +8853,7 @@
           </w:tcPr>
           <w:p>
             <w:pPr>
-              <w:keepNext w:val="0"/>
+              <w:keepNext/>
               <w:spacing w:before="0" w:after="0"/>
               <w:jc w:val="center"/>
             </w:pPr>
@@ -8745,7 +8874,7 @@
           </w:tcPr>
           <w:p>
             <w:pPr>
-              <w:keepNext w:val="0"/>
+              <w:keepNext/>
               <w:spacing w:before="0" w:after="0"/>
               <w:jc w:val="center"/>
             </w:pPr>
@@ -8766,7 +8895,7 @@
           </w:tcPr>
           <w:p>
             <w:pPr>
-              <w:keepNext w:val="0"/>
+              <w:keepNext/>
               <w:spacing w:before="0" w:after="0"/>
               <w:jc w:val="center"/>
             </w:pPr>
@@ -8783,6 +8912,9 @@
         </w:tc>
       </w:tr>
       <w:tr>
+        <w:trPr>
+          <w:cantSplit/>
+        </w:trPr>
         <w:tc>
           <w:tcPr>
             <w:tcW w:type="dxa" w:w="742"/>
@@ -9200,6 +9332,9 @@
         <w:gridCol w:w="1608"/>
       </w:tblGrid>
       <w:tr>
+        <w:trPr>
+          <w:cantSplit/>
+        </w:trPr>
         <w:tc>
           <w:tcPr>
             <w:tcW w:type="dxa" w:w="4028"/>
@@ -9209,7 +9344,7 @@
           </w:tcPr>
           <w:p>
             <w:pPr>
-              <w:keepNext w:val="0"/>
+              <w:keepNext/>
               <w:spacing w:before="0" w:after="0"/>
               <w:jc w:val="left"/>
             </w:pPr>
@@ -9233,7 +9368,7 @@
           </w:tcPr>
           <w:p>
             <w:pPr>
-              <w:keepNext w:val="0"/>
+              <w:keepNext/>
               <w:spacing w:before="0" w:after="0"/>
               <w:jc w:val="center"/>
             </w:pPr>
@@ -9257,7 +9392,7 @@
           </w:tcPr>
           <w:p>
             <w:pPr>
-              <w:keepNext w:val="0"/>
+              <w:keepNext/>
               <w:spacing w:before="0" w:after="0"/>
               <w:jc w:val="center"/>
             </w:pPr>
@@ -9281,7 +9416,7 @@
           </w:tcPr>
           <w:p>
             <w:pPr>
-              <w:keepNext w:val="0"/>
+              <w:keepNext/>
               <w:spacing w:before="0" w:after="0"/>
               <w:jc w:val="center"/>
             </w:pPr>
@@ -9305,7 +9440,7 @@
           </w:tcPr>
           <w:p>
             <w:pPr>
-              <w:keepNext w:val="0"/>
+              <w:keepNext/>
               <w:spacing w:before="0" w:after="0"/>
               <w:jc w:val="center"/>
             </w:pPr>
@@ -9322,13 +9457,16 @@
         </w:tc>
       </w:tr>
       <w:tr>
+        <w:trPr>
+          <w:cantSplit/>
+        </w:trPr>
         <w:tc>
           <w:tcPr>
             <w:tcW w:type="dxa" w:w="4028"/>
           </w:tcPr>
           <w:p>
             <w:pPr>
-              <w:keepNext w:val="0"/>
+              <w:keepNext/>
               <w:spacing w:before="0" w:after="0"/>
               <w:jc w:val="left"/>
             </w:pPr>
@@ -9349,7 +9487,7 @@
           </w:tcPr>
           <w:p>
             <w:pPr>
-              <w:keepNext w:val="0"/>
+              <w:keepNext/>
               <w:spacing w:before="0" w:after="0"/>
               <w:jc w:val="center"/>
             </w:pPr>
@@ -9370,7 +9508,7 @@
           </w:tcPr>
           <w:p>
             <w:pPr>
-              <w:keepNext w:val="0"/>
+              <w:keepNext/>
               <w:spacing w:before="0" w:after="0"/>
               <w:jc w:val="center"/>
             </w:pPr>
@@ -9391,7 +9529,7 @@
           </w:tcPr>
           <w:p>
             <w:pPr>
-              <w:keepNext w:val="0"/>
+              <w:keepNext/>
               <w:spacing w:before="0" w:after="0"/>
               <w:jc w:val="center"/>
             </w:pPr>
@@ -9412,7 +9550,7 @@
           </w:tcPr>
           <w:p>
             <w:pPr>
-              <w:keepNext w:val="0"/>
+              <w:keepNext/>
               <w:spacing w:before="0" w:after="0"/>
               <w:jc w:val="center"/>
             </w:pPr>
@@ -9429,13 +9567,16 @@
         </w:tc>
       </w:tr>
       <w:tr>
+        <w:trPr>
+          <w:cantSplit/>
+        </w:trPr>
         <w:tc>
           <w:tcPr>
             <w:tcW w:type="dxa" w:w="4028"/>
           </w:tcPr>
           <w:p>
             <w:pPr>
-              <w:keepNext w:val="0"/>
+              <w:keepNext/>
               <w:spacing w:before="0" w:after="0"/>
               <w:jc w:val="left"/>
             </w:pPr>
@@ -9456,7 +9597,7 @@
           </w:tcPr>
           <w:p>
             <w:pPr>
-              <w:keepNext w:val="0"/>
+              <w:keepNext/>
               <w:spacing w:before="0" w:after="0"/>
               <w:jc w:val="center"/>
             </w:pPr>
@@ -9477,7 +9618,7 @@
           </w:tcPr>
           <w:p>
             <w:pPr>
-              <w:keepNext w:val="0"/>
+              <w:keepNext/>
               <w:spacing w:before="0" w:after="0"/>
               <w:jc w:val="center"/>
             </w:pPr>
@@ -9498,7 +9639,7 @@
           </w:tcPr>
           <w:p>
             <w:pPr>
-              <w:keepNext w:val="0"/>
+              <w:keepNext/>
               <w:spacing w:before="0" w:after="0"/>
               <w:jc w:val="center"/>
             </w:pPr>
@@ -9519,7 +9660,7 @@
           </w:tcPr>
           <w:p>
             <w:pPr>
-              <w:keepNext w:val="0"/>
+              <w:keepNext/>
               <w:spacing w:before="0" w:after="0"/>
               <w:jc w:val="center"/>
             </w:pPr>
@@ -9536,13 +9677,16 @@
         </w:tc>
       </w:tr>
       <w:tr>
+        <w:trPr>
+          <w:cantSplit/>
+        </w:trPr>
         <w:tc>
           <w:tcPr>
             <w:tcW w:type="dxa" w:w="4028"/>
           </w:tcPr>
           <w:p>
             <w:pPr>
-              <w:keepNext w:val="0"/>
+              <w:keepNext/>
               <w:spacing w:before="0" w:after="0"/>
               <w:jc w:val="left"/>
             </w:pPr>
@@ -9563,7 +9707,7 @@
           </w:tcPr>
           <w:p>
             <w:pPr>
-              <w:keepNext w:val="0"/>
+              <w:keepNext/>
               <w:spacing w:before="0" w:after="0"/>
               <w:jc w:val="center"/>
             </w:pPr>
@@ -9584,7 +9728,7 @@
           </w:tcPr>
           <w:p>
             <w:pPr>
-              <w:keepNext w:val="0"/>
+              <w:keepNext/>
               <w:spacing w:before="0" w:after="0"/>
               <w:jc w:val="center"/>
             </w:pPr>
@@ -9605,7 +9749,7 @@
           </w:tcPr>
           <w:p>
             <w:pPr>
-              <w:keepNext w:val="0"/>
+              <w:keepNext/>
               <w:spacing w:before="0" w:after="0"/>
               <w:jc w:val="center"/>
             </w:pPr>
@@ -9626,7 +9770,7 @@
           </w:tcPr>
           <w:p>
             <w:pPr>
-              <w:keepNext w:val="0"/>
+              <w:keepNext/>
               <w:spacing w:before="0" w:after="0"/>
               <w:jc w:val="center"/>
             </w:pPr>
@@ -9643,13 +9787,16 @@
         </w:tc>
       </w:tr>
       <w:tr>
+        <w:trPr>
+          <w:cantSplit/>
+        </w:trPr>
         <w:tc>
           <w:tcPr>
             <w:tcW w:type="dxa" w:w="4028"/>
           </w:tcPr>
           <w:p>
             <w:pPr>
-              <w:keepNext w:val="0"/>
+              <w:keepNext/>
               <w:spacing w:before="0" w:after="0"/>
               <w:jc w:val="left"/>
             </w:pPr>
@@ -9670,7 +9817,7 @@
           </w:tcPr>
           <w:p>
             <w:pPr>
-              <w:keepNext w:val="0"/>
+              <w:keepNext/>
               <w:spacing w:before="0" w:after="0"/>
               <w:jc w:val="center"/>
             </w:pPr>
@@ -9691,7 +9838,7 @@
           </w:tcPr>
           <w:p>
             <w:pPr>
-              <w:keepNext w:val="0"/>
+              <w:keepNext/>
               <w:spacing w:before="0" w:after="0"/>
               <w:jc w:val="center"/>
             </w:pPr>
@@ -9712,7 +9859,7 @@
           </w:tcPr>
           <w:p>
             <w:pPr>
-              <w:keepNext w:val="0"/>
+              <w:keepNext/>
               <w:spacing w:before="0" w:after="0"/>
               <w:jc w:val="center"/>
             </w:pPr>
@@ -9733,7 +9880,7 @@
           </w:tcPr>
           <w:p>
             <w:pPr>
-              <w:keepNext w:val="0"/>
+              <w:keepNext/>
               <w:spacing w:before="0" w:after="0"/>
               <w:jc w:val="center"/>
             </w:pPr>
@@ -9750,13 +9897,16 @@
         </w:tc>
       </w:tr>
       <w:tr>
+        <w:trPr>
+          <w:cantSplit/>
+        </w:trPr>
         <w:tc>
           <w:tcPr>
             <w:tcW w:type="dxa" w:w="4028"/>
           </w:tcPr>
           <w:p>
             <w:pPr>
-              <w:keepNext w:val="0"/>
+              <w:keepNext/>
               <w:spacing w:before="0" w:after="0"/>
               <w:jc w:val="left"/>
             </w:pPr>
@@ -9777,7 +9927,7 @@
           </w:tcPr>
           <w:p>
             <w:pPr>
-              <w:keepNext w:val="0"/>
+              <w:keepNext/>
               <w:spacing w:before="0" w:after="0"/>
               <w:jc w:val="center"/>
             </w:pPr>
@@ -9798,7 +9948,7 @@
           </w:tcPr>
           <w:p>
             <w:pPr>
-              <w:keepNext w:val="0"/>
+              <w:keepNext/>
               <w:spacing w:before="0" w:after="0"/>
               <w:jc w:val="center"/>
             </w:pPr>
@@ -9819,7 +9969,7 @@
           </w:tcPr>
           <w:p>
             <w:pPr>
-              <w:keepNext w:val="0"/>
+              <w:keepNext/>
               <w:spacing w:before="0" w:after="0"/>
               <w:jc w:val="center"/>
             </w:pPr>
@@ -9840,7 +9990,7 @@
           </w:tcPr>
           <w:p>
             <w:pPr>
-              <w:keepNext w:val="0"/>
+              <w:keepNext/>
               <w:spacing w:before="0" w:after="0"/>
               <w:jc w:val="center"/>
             </w:pPr>
@@ -9857,6 +10007,9 @@
         </w:tc>
       </w:tr>
       <w:tr>
+        <w:trPr>
+          <w:cantSplit/>
+        </w:trPr>
         <w:tc>
           <w:tcPr>
             <w:tcW w:type="dxa" w:w="4028"/>
@@ -10246,17 +10399,7 @@
           <w:smallCaps w:val="0"/>
           <w:sz w:val="16"/>
         </w:rPr>
-        <w:t xml:space="preserve">, vol. 24, no. 2, pp. 967–993, 2022. </w:t>
-      </w:r>
-      <w:r>
-        <w:rPr>
-          <w:b/>
-          <w:i w:val="0"/>
-          <w:smallCaps w:val="0"/>
-          <w:sz w:val="16"/>
-          <w:highlight w:val="yellow"/>
-        </w:rPr>
-        <w:t>[VERIFY: the first draft attributed this paper to I. F. Akyildiz et al. in IEEE JSAC.]</w:t>
+        <w:t>, vol. 24, no. 2, pp. 967–993, 2022, doi: 10.1109/COMST.2022.3143454.</w:t>
       </w:r>
     </w:p>
     <w:p>
@@ -10456,25 +10599,7 @@
         </w:rPr>
         <w:t>[7]</w:t>
         <w:tab/>
-      </w:r>
-      <w:r>
-        <w:rPr>
-          <w:b/>
-          <w:i w:val="0"/>
-          <w:smallCaps w:val="0"/>
-          <w:sz w:val="16"/>
-          <w:highlight w:val="yellow"/>
-        </w:rPr>
-        <w:t>[VERIFY: authors missing]</w:t>
-      </w:r>
-      <w:r>
-        <w:rPr>
-          <w:b w:val="0"/>
-          <w:i w:val="0"/>
-          <w:smallCaps w:val="0"/>
-          <w:sz w:val="16"/>
-        </w:rPr>
-        <w:t xml:space="preserve"> "Fundamentals of wobbling and hardware impairments-aware air-to-ground channel model," </w:t>
+        <w:t xml:space="preserve">M. Banagar and H. S. Dhillon, "Fundamentals of wobbling and hardware impairments-aware air-to-ground channel model," </w:t>
       </w:r>
       <w:r>
         <w:rPr>
@@ -11129,7 +11254,7 @@
         </w:rPr>
         <w:t>[22]</w:t>
         <w:tab/>
-        <w:t xml:space="preserve">3GPP TS 38.213, "NR; Physical layer procedures for control," Sec. 4.1 (SS/PBCH block candidate positions, case D). </w:t>
+        <w:t xml:space="preserve">3GPP TS 38.213, "NR; Physical layer procedures for control," Sec. 4.1 (SS/PBCH block candidate positions, case D: up to 64 SS/PBCH blocks per 5 ms half-frame at 120 kHz SCS). </w:t>
       </w:r>
       <w:r>
         <w:rPr>
@@ -11139,7 +11264,7 @@
           <w:sz w:val="16"/>
           <w:highlight w:val="yellow"/>
         </w:rPr>
-        <w:t>[VERIFY: release and version.]</w:t>
+        <w:t>[VERIFY: release and version; we could not confirm the latest version online.]</w:t>
       </w:r>
     </w:p>
     <w:p>
@@ -11179,7 +11304,7 @@
           <w:smallCaps w:val="0"/>
           <w:sz w:val="16"/>
         </w:rPr>
-        <w:t>, vol. 16, no. 4, pp. 494–591, 2023.</w:t>
+        <w:t>, vol. 16, no. 4, pp. 494–591, 2023, doi: 10.1561/2200000101.</w:t>
       </w:r>
     </w:p>
     <w:p>
@@ -11219,7 +11344,7 @@
           <w:smallCaps w:val="0"/>
           <w:sz w:val="16"/>
         </w:rPr>
-        <w:t>, 2020.</w:t>
+        <w:t>, vol. 33, 2020.</w:t>
       </w:r>
     </w:p>
     <w:p>

</xml_diff>

<commit_message>
Paper: add Fig. 5 (conformal coverage vs target)
Also handle the PyTorch Transformer, which can't be int8-quantised, in
the learned tracking latency study.

Co-Authored-By: Claude Opus 5.5 <noreply@anthropic.com>
</commit_message>
<xml_diff>
--- a/paper/revised_paper_ieee.docx
+++ b/paper/revised_paper_ieee.docx
@@ -9228,7 +9228,7 @@
           <w:smallCaps w:val="0"/>
           <w:sz w:val="20"/>
         </w:rPr>
-        <w:t>Conformal shortlists.</w:t>
+        <w:t>Conformal shortlists</w:t>
       </w:r>
       <w:r>
         <w:rPr>
@@ -9237,8 +9237,123 @@
           <w:smallCaps w:val="0"/>
           <w:sz w:val="20"/>
         </w:rPr>
-        <w:t xml:space="preserve"> Calibrated for 95% exact top-1, the rank-based set reaches 96.1% with 3 beams at t + 1 (worst held-out fold 95.3%) and 95.5% with 5.4 beams at t + 3 (worst fold 92.7%); for a 99% target, 99.2% with 6.2 beams and 99.0% with 17.4 beams. Coverage tracks the target on average, but a single flight group can fall short by up to 2.3 points, which is the cost of non-exchangeable flights. Adaptive sets over-cover (98.8% for a 95% target at t + 1) with a 95th-percentile size of 41–56 beams, which is worse for worst-case latency.</w:t>
+        <w:t xml:space="preserve"> (Fig. 5). Calibrated for 95% exact top-1, the rank-based set reaches 96.1% with 3 beams at t + 1 (worst held-out fold 95.3%) and 95.5% with 5.4 beams at t + 3 (worst fold 92.7%); for a 99% target, 99.2% with 6.2 beams and 99.0% with 17.4 beams. Coverage tracks the target on average, but a single flight group can fall short by up to 2.3 points, which is the cost of non-exchangeable flights. Adaptive sets over-cover (98.8% for a 95% target at t + 1) with a 95th-percentile size of 41–56 beams, which is worse for worst-case latency.</w:t>
       </w:r>
+    </w:p>
+    <w:p>
+      <w:pPr>
+        <w:sectPr>
+          <w:type w:val="continuous"/>
+          <w:pgSz w:w="12240" w:h="15840"/>
+          <w:pgMar w:top="1080" w:right="900" w:bottom="1440" w:left="900" w:header="720" w:footer="720" w:gutter="0"/>
+          <w:cols w:space="360" w:num="2"/>
+          <w:docGrid w:linePitch="360"/>
+        </w:sectPr>
+      </w:pPr>
+    </w:p>
+    <w:tbl>
+      <w:tblPr>
+        <w:tblW w:type="auto" w:w="0"/>
+        <w:jc w:val="center"/>
+        <w:tblLook w:firstColumn="1" w:firstRow="1" w:lastColumn="0" w:lastRow="0" w:noHBand="0" w:noVBand="1" w:val="04A0"/>
+      </w:tblPr>
+      <w:tblGrid>
+        <w:gridCol w:w="10440"/>
+      </w:tblGrid>
+      <w:tr>
+        <w:trPr>
+          <w:cantSplit/>
+        </w:trPr>
+        <w:tc>
+          <w:tcPr>
+            <w:tcW w:type="dxa" w:w="10440"/>
+          </w:tcPr>
+          <w:p>
+            <w:pPr>
+              <w:keepNext w:val="0"/>
+              <w:spacing w:before="80" w:after="0"/>
+              <w:jc w:val="center"/>
+            </w:pPr>
+            <w:r>
+              <w:drawing>
+                <wp:inline xmlns:a="http://schemas.openxmlformats.org/drawingml/2006/main" xmlns:pic="http://schemas.openxmlformats.org/drawingml/2006/picture">
+                  <wp:extent cx="5943600" cy="1938502"/>
+                  <wp:docPr id="5" name="Picture 5"/>
+                  <wp:cNvGraphicFramePr>
+                    <a:graphicFrameLocks noChangeAspect="1"/>
+                  </wp:cNvGraphicFramePr>
+                  <a:graphic>
+                    <a:graphicData uri="http://schemas.openxmlformats.org/drawingml/2006/picture">
+                      <pic:pic>
+                        <pic:nvPicPr>
+                          <pic:cNvPr id="0" name="fig_conformal.png"/>
+                          <pic:cNvPicPr/>
+                        </pic:nvPicPr>
+                        <pic:blipFill>
+                          <a:blip r:embed="rId13"/>
+                          <a:stretch>
+                            <a:fillRect/>
+                          </a:stretch>
+                        </pic:blipFill>
+                        <pic:spPr>
+                          <a:xfrm>
+                            <a:off x="0" y="0"/>
+                            <a:ext cx="5943600" cy="1938502"/>
+                          </a:xfrm>
+                          <a:prstGeom prst="rect"/>
+                        </pic:spPr>
+                      </pic:pic>
+                    </a:graphicData>
+                  </a:graphic>
+                </wp:inline>
+              </w:drawing>
+            </w:r>
+          </w:p>
+          <w:p>
+            <w:pPr>
+              <w:keepNext w:val="0"/>
+              <w:spacing w:before="0" w:after="120"/>
+              <w:jc w:val="center"/>
+            </w:pPr>
+            <w:r>
+              <w:rPr>
+                <w:b w:val="0"/>
+                <w:i w:val="0"/>
+                <w:smallCaps w:val="0"/>
+                <w:sz w:val="16"/>
+              </w:rPr>
+              <w:t xml:space="preserve">Fig. 5. </w:t>
+            </w:r>
+            <w:r>
+              <w:rPr>
+                <w:b w:val="0"/>
+                <w:i w:val="0"/>
+                <w:smallCaps w:val="0"/>
+                <w:sz w:val="16"/>
+              </w:rPr>
+              <w:t>Conformal shortlists (rank score, GRU ensemble). Left: achieved exact top-1 versus the target, pooled over held-out folds (solid) and for the worst fold (dotted); dashed: achieved = target. Right: mean beams measured.</w:t>
+            </w:r>
+          </w:p>
+        </w:tc>
+      </w:tr>
+    </w:tbl>
+    <w:p>
+      <w:pPr>
+        <w:keepNext w:val="0"/>
+        <w:spacing w:before="0" w:after="40"/>
+        <w:jc w:val="both"/>
+      </w:pPr>
+    </w:p>
+    <w:p>
+      <w:pPr>
+        <w:sectPr>
+          <w:type w:val="continuous"/>
+          <w:pgSz w:w="12240" w:h="15840"/>
+          <w:pgMar w:top="1080" w:right="900" w:bottom="1440" w:left="900" w:header="720" w:footer="720" w:gutter="0"/>
+          <w:cols w:space="360" w:num="1"/>
+          <w:docGrid w:linePitch="360"/>
+        </w:sectPr>
+      </w:pPr>
     </w:p>
     <w:p>
       <w:pPr>

</xml_diff>

<commit_message>
Learned tracking in the loop: negative result, Fig. 6 and Table X
Ten models (GRU, LSTM, TCN, Transformer, MLP, plus GRU variants) were
trained on measured-only logs and run in the closed loop. None beats the
learned tie graph at equal budget: 98.2-98.8% exact top-1 against 99.16%
with +2 and 99.28% with +4 tie partners. The validation-selected
Transformer is no better on test. The MLP is fastest (0.11 ms fp32) and
int8 is slower for every model on this CPU.

Paper: Fig. 6 (closed-loop accuracy vs latency, equal-budget zoom), Table
X, and updated abstract, discussion and conclusion. README and AUDIT
(H6) updated.

Co-Authored-By: Claude Opus 5.5 <noreply@anthropic.com>
</commit_message>
<xml_diff>
--- a/paper/revised_paper_ieee.docx
+++ b/paper/revised_paper_ieee.docx
@@ -115,7 +115,7 @@
           <w:smallCaps w:val="0"/>
           <w:sz w:val="18"/>
         </w:rPr>
-        <w:t>Millimetre-wave (mmWave) and sub-terahertz links can give unmanned aerial vehicles (UAVs) multi-gigabit connectivity, but narrow beams, high path loss and UAV mobility make beam management costly, and practical hardware departs from the ideal models most reconfigurable intelligent surface (RIS) studies assume. We present a hardware-aware framework for an RIS-assisted 60 GHz UAV link that models transmitter power-amplifier (PA) distortion through the Bussgang decomposition, RIS phase quantization, phase noise, amplitude–phase coupling and antenna mismatch, together with ITU-R P.676-13 gaseous absorption. On this model we show that (i) impairments cost 7.8 dB of SNDR, dominated by amplitude–phase coupling, so a realistic RIS needs about 2.25× more elements than an ideal one for full coverage of a 300 m flight; (ii) a position-parametric channel estimator reaches within 0.15 dB of perfect channel knowledge with 64× fewer pilots than per-element LMMSE, and needs no pilots when a 100 ms Kalman prediction is available; and (iii) predictive tracking delivers 99.3% of the ideal array gain at 500 ms latency, whereas persistence delivers 63%. On real 60 GHz measurements (DeepSense 6G Scenario 23) we show that exact blind beam prediction is bounded at 79% top-1 by measurement noise, and propose an AI-assisted reduced beam training scheme with a learned beam-tie graph. Given full-sweep history it selects the exact optimal beam 99.3% of the time at a 140 ms horizon (macro-F1 0.961 over all 56 beam classes) and 99.1% at 0.4 s. Replayed in closed loop, where the system knows only the beams it measured, tie-graph tracking selects the exact optimal beam 97.2% of the time (99.2% within measurement noise) with 1.05 ms of beam training per decision instead of 5 ms, under sequence-level cross-validation.</w:t>
+        <w:t>Millimetre-wave (mmWave) and sub-terahertz links can give unmanned aerial vehicles (UAVs) multi-gigabit connectivity, but narrow beams, high path loss and UAV mobility make beam management costly, and practical hardware departs from the ideal models most reconfigurable intelligent surface (RIS) studies assume. We present a hardware-aware framework for an RIS-assisted 60 GHz UAV link that models transmitter power-amplifier (PA) distortion through the Bussgang decomposition, RIS phase quantization, phase noise, amplitude–phase coupling and antenna mismatch, together with ITU-R P.676-13 gaseous absorption. On this model we show that (i) impairments cost 7.8 dB of SNDR, dominated by amplitude–phase coupling, so a realistic RIS needs about 2.25× more elements than an ideal one for full coverage of a 300 m flight; (ii) a position-parametric channel estimator reaches within 0.15 dB of perfect channel knowledge with 64× fewer pilots than per-element LMMSE, and needs no pilots when a 100 ms Kalman prediction is available; and (iii) predictive tracking delivers 99.3% of the ideal array gain at 500 ms latency, whereas persistence delivers 63%. On real 60 GHz measurements (DeepSense 6G Scenario 23) we show that exact blind beam prediction is bounded at 79% top-1 by measurement noise, and propose an AI-assisted reduced beam training scheme with a learned beam-tie graph. Given full-sweep history it selects the exact optimal beam 99.3% of the time at a 140 ms horizon (macro-F1 0.961 over all 56 beam classes) and 99.1% at 0.4 s. Replayed in closed loop, where the system knows only the beams it measured, tie-graph tracking selects the exact optimal beam 97.2–99.3% of the time with 1.05–1.31 ms of beam training per decision instead of 5 ms. Ten deep sequence models trained on the same measured-only data do not beat the tie graph at equal measurement budget, under sequence-level cross-validation.</w:t>
       </w:r>
     </w:p>
     <w:p>
@@ -296,7 +296,7 @@
         </w:rPr>
         <w:t>4)</w:t>
         <w:tab/>
-        <w:t>On real 60 GHz measurements, a proof that exact blind beam prediction is noise-limited, a GRU trained on a soft power target, a learned beam-tie graph, and an AI-assisted reduced beam training scheme meeting ≥ 95% exact top-1 and macro-F1, conformal shortlists calibrated to a target accuracy, and a closed-loop replay of every flight in which the system knows only what it measured, evaluated with sequence-level cross-validation and bootstrap confidence intervals (Sec. V, VI-D).</w:t>
+        <w:t>On real 60 GHz measurements, a proof that exact blind beam prediction is noise-limited, a GRU trained on a soft power target, a learned beam-tie graph, and an AI-assisted reduced beam training scheme meeting ≥ 95% exact top-1 and macro-F1, conformal shortlists calibrated to a target accuracy, a closed-loop replay of every flight in which the system knows only what it measured, and a matched-budget comparison of ten deep sequence models against the tie graph in that loop, evaluated with sequence-level cross-validation and bootstrap confidence intervals (Sec. V, VI-D).</w:t>
       </w:r>
     </w:p>
     <w:p>
@@ -2153,6 +2153,32 @@
     </w:p>
     <w:p>
       <w:pPr>
+        <w:keepNext w:val="0"/>
+        <w:spacing w:before="0" w:after="0"/>
+        <w:ind w:firstLine="288"/>
+        <w:jc w:val="both"/>
+      </w:pPr>
+      <w:r>
+        <w:rPr>
+          <w:b/>
+          <w:i w:val="0"/>
+          <w:smallCaps w:val="0"/>
+          <w:sz w:val="20"/>
+        </w:rPr>
+        <w:t>Learned closed-loop tracking.</w:t>
+      </w:r>
+      <w:r>
+        <w:rPr>
+          <w:b w:val="0"/>
+          <w:i w:val="0"/>
+          <w:smallCaps w:val="0"/>
+          <w:sz w:val="20"/>
+        </w:rPr>
+        <w:t xml:space="preserve"> To test whether a learned model helps once only measured beams are known, we log each flight under the tie-graph tracker (±1 window, four partners, full sweep every 8 steps). Each logged step holds the measured beams' power in dB relative to the strongest measured beam, −20 dB for unmeasured beams, the measurement mask, a full-sweep flag and the time gap. A model reads the last W steps and predicts the next step's best beam; the training target is the next recorded full sweep (soft, 0.5 dB temperature, or hard), available offline only. In deployment the tracker measures its usual set plus the model's top k ∈ {2, 4} beams not already in it, and the model's next input is built from what was measured. The baseline at the same budget is the tracker with k more tie partners. We compare a GRU, an LSTM, a dilated temporal CNN, a Transformer encoder and an MLP over the window, and GRU variants in hidden size (64, 128), learning rate (10⁻³, 3·10⁻⁴), window (4, 8, 16) and target (soft, hard); all are trained with AdamW, batch 128, early stopping on validation flights. The headline configuration is selected by top-4 accuracy on validation flights inside the training folds. Inference latency is the median of 300 batch-1 forward passes on one thread of a laptop CPU, in fp32 and with dynamic int8 quantization; it is not a measurement on embedded hardware.</w:t>
+      </w:r>
+    </w:p>
+    <w:p>
+      <w:pPr>
         <w:keepNext/>
         <w:spacing w:before="160" w:after="80"/>
         <w:jc w:val="center"/>
@@ -10252,6 +10278,1822 @@
     </w:p>
     <w:p>
       <w:pPr>
+        <w:keepNext w:val="0"/>
+        <w:spacing w:before="0" w:after="0"/>
+        <w:ind w:firstLine="288"/>
+        <w:jc w:val="both"/>
+      </w:pPr>
+      <w:r>
+        <w:rPr>
+          <w:b/>
+          <w:i w:val="0"/>
+          <w:smallCaps w:val="0"/>
+          <w:sz w:val="20"/>
+        </w:rPr>
+        <w:t>Learned tracking in the loop</w:t>
+      </w:r>
+      <w:r>
+        <w:rPr>
+          <w:b w:val="0"/>
+          <w:i w:val="0"/>
+          <w:smallCaps w:val="0"/>
+          <w:sz w:val="20"/>
+        </w:rPr>
+        <w:t xml:space="preserve"> (Table X, Fig. 6). At equal budget, every learned model is below the tie graph. With two extra beams, the tracker with six tie partners reaches 99.16% exact top-1 at 1.18 ms, while the ten models reach 98.17–98.71%; with four extra beams, 99.28% against 98.59–98.83%. The models differ from each other by at most 0.6 points, so architecture and the training settings we varied matter little. The configuration selected on validation flights (the Transformer, 91.9% validation top-4) is not better on test than the others. The extra beams of every model still help over the four-partner tracker (97.15%), so the models learn useful structure, but the tie graph already captures it. For latency, the MLP is fastest (0.11 ms fp32); dynamic int8 quantization made every model slower on this CPU and is not supported for the Transformer encoder in our PyTorch version. Inference runs between steps, off the beam-training critical path.</w:t>
+      </w:r>
+    </w:p>
+    <w:p>
+      <w:pPr>
+        <w:sectPr>
+          <w:type w:val="continuous"/>
+          <w:pgSz w:w="12240" w:h="15840"/>
+          <w:pgMar w:top="1080" w:right="900" w:bottom="1440" w:left="900" w:header="720" w:footer="720" w:gutter="0"/>
+          <w:cols w:space="360" w:num="2"/>
+          <w:docGrid w:linePitch="360"/>
+        </w:sectPr>
+      </w:pPr>
+    </w:p>
+    <w:p>
+      <w:pPr>
+        <w:keepNext/>
+        <w:spacing w:before="120" w:after="0"/>
+        <w:jc w:val="center"/>
+      </w:pPr>
+      <w:r>
+        <w:rPr>
+          <w:b w:val="0"/>
+          <w:i w:val="0"/>
+          <w:smallCaps w:val="0"/>
+          <w:sz w:val="16"/>
+        </w:rPr>
+        <w:t>TABLE X</w:t>
+      </w:r>
+    </w:p>
+    <w:p>
+      <w:pPr>
+        <w:keepNext/>
+        <w:spacing w:before="0" w:after="60"/>
+        <w:jc w:val="center"/>
+      </w:pPr>
+      <w:r>
+        <w:rPr>
+          <w:b w:val="0"/>
+          <w:i w:val="0"/>
+          <w:smallCaps/>
+          <w:sz w:val="16"/>
+        </w:rPr>
+        <w:t>Learned closed-loop tracking (held-out flights, pooled over folds). Exact top-1 with the tracker (four partners) plus k model beams; tie-graph baseline at the same budget: 99.16% (k = 2, 1.18 ms) and 99.28% (k = 4, 1.31 ms). Inference: median batch-1 latency, one laptop CPU thread</w:t>
+      </w:r>
+    </w:p>
+    <w:tbl>
+      <w:tblPr>
+        <w:tblW w:type="auto" w:w="0"/>
+        <w:jc w:val="center"/>
+        <w:tblLayout w:type="fixed"/>
+        <w:tblLook w:firstColumn="1" w:firstRow="1" w:lastColumn="0" w:lastRow="0" w:noHBand="0" w:noVBand="1" w:val="04A0"/>
+        <w:tblBorders>
+          <w:top w:val="single" w:sz="8" w:color="000000"/>
+          <w:bottom w:val="single" w:sz="8" w:color="000000"/>
+        </w:tblBorders>
+        <w:tblCellMar>
+          <w:left w:w="50" w:type="dxa"/>
+          <w:right w:w="50" w:type="dxa"/>
+        </w:tblCellMar>
+      </w:tblPr>
+      <w:tblGrid>
+        <w:gridCol w:w="5190"/>
+        <w:gridCol w:w="977"/>
+        <w:gridCol w:w="1138"/>
+        <w:gridCol w:w="1138"/>
+        <w:gridCol w:w="817"/>
+        <w:gridCol w:w="817"/>
+      </w:tblGrid>
+      <w:tr>
+        <w:trPr>
+          <w:cantSplit/>
+        </w:trPr>
+        <w:tc>
+          <w:tcPr>
+            <w:tcW w:type="dxa" w:w="5190"/>
+            <w:tcBorders>
+              <w:bottom w:val="single" w:sz="4" w:color="000000"/>
+            </w:tcBorders>
+          </w:tcPr>
+          <w:p>
+            <w:pPr>
+              <w:keepNext/>
+              <w:spacing w:before="0" w:after="0"/>
+              <w:jc w:val="left"/>
+            </w:pPr>
+            <w:r>
+              <w:rPr>
+                <w:b/>
+                <w:i w:val="0"/>
+                <w:smallCaps w:val="0"/>
+                <w:sz w:val="16"/>
+              </w:rPr>
+              <w:t>Model</w:t>
+            </w:r>
+          </w:p>
+        </w:tc>
+        <w:tc>
+          <w:tcPr>
+            <w:tcW w:type="dxa" w:w="978"/>
+            <w:tcBorders>
+              <w:bottom w:val="single" w:sz="4" w:color="000000"/>
+            </w:tcBorders>
+          </w:tcPr>
+          <w:p>
+            <w:pPr>
+              <w:keepNext/>
+              <w:spacing w:before="0" w:after="0"/>
+              <w:jc w:val="center"/>
+            </w:pPr>
+            <w:r>
+              <w:rPr>
+                <w:b/>
+                <w:i w:val="0"/>
+                <w:smallCaps w:val="0"/>
+                <w:sz w:val="16"/>
+              </w:rPr>
+              <w:t>Val. top-4 (%)</w:t>
+            </w:r>
+          </w:p>
+        </w:tc>
+        <w:tc>
+          <w:tcPr>
+            <w:tcW w:type="dxa" w:w="1138"/>
+            <w:tcBorders>
+              <w:bottom w:val="single" w:sz="4" w:color="000000"/>
+            </w:tcBorders>
+          </w:tcPr>
+          <w:p>
+            <w:pPr>
+              <w:keepNext/>
+              <w:spacing w:before="0" w:after="0"/>
+              <w:jc w:val="center"/>
+            </w:pPr>
+            <w:r>
+              <w:rPr>
+                <w:b/>
+                <w:i w:val="0"/>
+                <w:smallCaps w:val="0"/>
+                <w:sz w:val="16"/>
+              </w:rPr>
+              <w:t>Exact top-1, k = 2 (%)</w:t>
+            </w:r>
+          </w:p>
+        </w:tc>
+        <w:tc>
+          <w:tcPr>
+            <w:tcW w:type="dxa" w:w="1138"/>
+            <w:tcBorders>
+              <w:bottom w:val="single" w:sz="4" w:color="000000"/>
+            </w:tcBorders>
+          </w:tcPr>
+          <w:p>
+            <w:pPr>
+              <w:keepNext/>
+              <w:spacing w:before="0" w:after="0"/>
+              <w:jc w:val="center"/>
+            </w:pPr>
+            <w:r>
+              <w:rPr>
+                <w:b/>
+                <w:i w:val="0"/>
+                <w:smallCaps w:val="0"/>
+                <w:sz w:val="16"/>
+              </w:rPr>
+              <w:t>Exact top-1, k = 4 (%)</w:t>
+            </w:r>
+          </w:p>
+        </w:tc>
+        <w:tc>
+          <w:tcPr>
+            <w:tcW w:type="dxa" w:w="818"/>
+            <w:tcBorders>
+              <w:bottom w:val="single" w:sz="4" w:color="000000"/>
+            </w:tcBorders>
+          </w:tcPr>
+          <w:p>
+            <w:pPr>
+              <w:keepNext/>
+              <w:spacing w:before="0" w:after="0"/>
+              <w:jc w:val="center"/>
+            </w:pPr>
+            <w:r>
+              <w:rPr>
+                <w:b/>
+                <w:i w:val="0"/>
+                <w:smallCaps w:val="0"/>
+                <w:sz w:val="16"/>
+              </w:rPr>
+              <w:t>fp32 (ms)</w:t>
+            </w:r>
+          </w:p>
+        </w:tc>
+        <w:tc>
+          <w:tcPr>
+            <w:tcW w:type="dxa" w:w="818"/>
+            <w:tcBorders>
+              <w:bottom w:val="single" w:sz="4" w:color="000000"/>
+            </w:tcBorders>
+          </w:tcPr>
+          <w:p>
+            <w:pPr>
+              <w:keepNext/>
+              <w:spacing w:before="0" w:after="0"/>
+              <w:jc w:val="center"/>
+            </w:pPr>
+            <w:r>
+              <w:rPr>
+                <w:b/>
+                <w:i w:val="0"/>
+                <w:smallCaps w:val="0"/>
+                <w:sz w:val="16"/>
+              </w:rPr>
+              <w:t>int8 (ms)</w:t>
+            </w:r>
+          </w:p>
+        </w:tc>
+      </w:tr>
+      <w:tr>
+        <w:trPr>
+          <w:cantSplit/>
+        </w:trPr>
+        <w:tc>
+          <w:tcPr>
+            <w:tcW w:type="dxa" w:w="5190"/>
+          </w:tcPr>
+          <w:p>
+            <w:pPr>
+              <w:keepNext/>
+              <w:spacing w:before="0" w:after="0"/>
+              <w:jc w:val="left"/>
+            </w:pPr>
+            <w:r>
+              <w:rPr>
+                <w:b w:val="0"/>
+                <w:i w:val="0"/>
+                <w:smallCaps w:val="0"/>
+                <w:sz w:val="16"/>
+              </w:rPr>
+              <w:t>Tie graph, +k partners (no learning)</w:t>
+            </w:r>
+          </w:p>
+        </w:tc>
+        <w:tc>
+          <w:tcPr>
+            <w:tcW w:type="dxa" w:w="978"/>
+          </w:tcPr>
+          <w:p>
+            <w:pPr>
+              <w:keepNext/>
+              <w:spacing w:before="0" w:after="0"/>
+              <w:jc w:val="center"/>
+            </w:pPr>
+            <w:r>
+              <w:rPr>
+                <w:b w:val="0"/>
+                <w:i w:val="0"/>
+                <w:smallCaps w:val="0"/>
+                <w:sz w:val="16"/>
+              </w:rPr>
+              <w:t>–</w:t>
+            </w:r>
+          </w:p>
+        </w:tc>
+        <w:tc>
+          <w:tcPr>
+            <w:tcW w:type="dxa" w:w="1138"/>
+          </w:tcPr>
+          <w:p>
+            <w:pPr>
+              <w:keepNext/>
+              <w:spacing w:before="0" w:after="0"/>
+              <w:jc w:val="center"/>
+            </w:pPr>
+            <w:r>
+              <w:rPr>
+                <w:b/>
+                <w:i w:val="0"/>
+                <w:smallCaps w:val="0"/>
+                <w:sz w:val="16"/>
+              </w:rPr>
+              <w:t>99.16</w:t>
+            </w:r>
+          </w:p>
+        </w:tc>
+        <w:tc>
+          <w:tcPr>
+            <w:tcW w:type="dxa" w:w="1138"/>
+          </w:tcPr>
+          <w:p>
+            <w:pPr>
+              <w:keepNext/>
+              <w:spacing w:before="0" w:after="0"/>
+              <w:jc w:val="center"/>
+            </w:pPr>
+            <w:r>
+              <w:rPr>
+                <w:b/>
+                <w:i w:val="0"/>
+                <w:smallCaps w:val="0"/>
+                <w:sz w:val="16"/>
+              </w:rPr>
+              <w:t>99.28</w:t>
+            </w:r>
+          </w:p>
+        </w:tc>
+        <w:tc>
+          <w:tcPr>
+            <w:tcW w:type="dxa" w:w="818"/>
+          </w:tcPr>
+          <w:p>
+            <w:pPr>
+              <w:keepNext/>
+              <w:spacing w:before="0" w:after="0"/>
+              <w:jc w:val="center"/>
+            </w:pPr>
+            <w:r>
+              <w:rPr>
+                <w:b w:val="0"/>
+                <w:i w:val="0"/>
+                <w:smallCaps w:val="0"/>
+                <w:sz w:val="16"/>
+              </w:rPr>
+              <w:t>–</w:t>
+            </w:r>
+          </w:p>
+        </w:tc>
+        <w:tc>
+          <w:tcPr>
+            <w:tcW w:type="dxa" w:w="818"/>
+          </w:tcPr>
+          <w:p>
+            <w:pPr>
+              <w:keepNext/>
+              <w:spacing w:before="0" w:after="0"/>
+              <w:jc w:val="center"/>
+            </w:pPr>
+            <w:r>
+              <w:rPr>
+                <w:b w:val="0"/>
+                <w:i w:val="0"/>
+                <w:smallCaps w:val="0"/>
+                <w:sz w:val="16"/>
+              </w:rPr>
+              <w:t>–</w:t>
+            </w:r>
+          </w:p>
+        </w:tc>
+      </w:tr>
+      <w:tr>
+        <w:trPr>
+          <w:cantSplit/>
+        </w:trPr>
+        <w:tc>
+          <w:tcPr>
+            <w:tcW w:type="dxa" w:w="5190"/>
+          </w:tcPr>
+          <w:p>
+            <w:pPr>
+              <w:keepNext/>
+              <w:spacing w:before="0" w:after="0"/>
+              <w:jc w:val="left"/>
+            </w:pPr>
+            <w:r>
+              <w:rPr>
+                <w:b w:val="0"/>
+                <w:i w:val="0"/>
+                <w:smallCaps w:val="0"/>
+                <w:sz w:val="16"/>
+              </w:rPr>
+              <w:t>GRU, h = 128</w:t>
+            </w:r>
+          </w:p>
+        </w:tc>
+        <w:tc>
+          <w:tcPr>
+            <w:tcW w:type="dxa" w:w="978"/>
+          </w:tcPr>
+          <w:p>
+            <w:pPr>
+              <w:keepNext/>
+              <w:spacing w:before="0" w:after="0"/>
+              <w:jc w:val="center"/>
+            </w:pPr>
+            <w:r>
+              <w:rPr>
+                <w:b w:val="0"/>
+                <w:i w:val="0"/>
+                <w:smallCaps w:val="0"/>
+                <w:sz w:val="16"/>
+              </w:rPr>
+              <w:t>90.3</w:t>
+            </w:r>
+          </w:p>
+        </w:tc>
+        <w:tc>
+          <w:tcPr>
+            <w:tcW w:type="dxa" w:w="1138"/>
+          </w:tcPr>
+          <w:p>
+            <w:pPr>
+              <w:keepNext/>
+              <w:spacing w:before="0" w:after="0"/>
+              <w:jc w:val="center"/>
+            </w:pPr>
+            <w:r>
+              <w:rPr>
+                <w:b w:val="0"/>
+                <w:i w:val="0"/>
+                <w:smallCaps w:val="0"/>
+                <w:sz w:val="16"/>
+              </w:rPr>
+              <w:t>98.37</w:t>
+            </w:r>
+          </w:p>
+        </w:tc>
+        <w:tc>
+          <w:tcPr>
+            <w:tcW w:type="dxa" w:w="1138"/>
+          </w:tcPr>
+          <w:p>
+            <w:pPr>
+              <w:keepNext/>
+              <w:spacing w:before="0" w:after="0"/>
+              <w:jc w:val="center"/>
+            </w:pPr>
+            <w:r>
+              <w:rPr>
+                <w:b w:val="0"/>
+                <w:i w:val="0"/>
+                <w:smallCaps w:val="0"/>
+                <w:sz w:val="16"/>
+              </w:rPr>
+              <w:t>98.71</w:t>
+            </w:r>
+          </w:p>
+        </w:tc>
+        <w:tc>
+          <w:tcPr>
+            <w:tcW w:type="dxa" w:w="818"/>
+          </w:tcPr>
+          <w:p>
+            <w:pPr>
+              <w:keepNext/>
+              <w:spacing w:before="0" w:after="0"/>
+              <w:jc w:val="center"/>
+            </w:pPr>
+            <w:r>
+              <w:rPr>
+                <w:b w:val="0"/>
+                <w:i w:val="0"/>
+                <w:smallCaps w:val="0"/>
+                <w:sz w:val="16"/>
+              </w:rPr>
+              <w:t>0.54</w:t>
+            </w:r>
+          </w:p>
+        </w:tc>
+        <w:tc>
+          <w:tcPr>
+            <w:tcW w:type="dxa" w:w="818"/>
+          </w:tcPr>
+          <w:p>
+            <w:pPr>
+              <w:keepNext/>
+              <w:spacing w:before="0" w:after="0"/>
+              <w:jc w:val="center"/>
+            </w:pPr>
+            <w:r>
+              <w:rPr>
+                <w:b w:val="0"/>
+                <w:i w:val="0"/>
+                <w:smallCaps w:val="0"/>
+                <w:sz w:val="16"/>
+              </w:rPr>
+              <w:t>0.88</w:t>
+            </w:r>
+          </w:p>
+        </w:tc>
+      </w:tr>
+      <w:tr>
+        <w:trPr>
+          <w:cantSplit/>
+        </w:trPr>
+        <w:tc>
+          <w:tcPr>
+            <w:tcW w:type="dxa" w:w="5190"/>
+          </w:tcPr>
+          <w:p>
+            <w:pPr>
+              <w:keepNext/>
+              <w:spacing w:before="0" w:after="0"/>
+              <w:jc w:val="left"/>
+            </w:pPr>
+            <w:r>
+              <w:rPr>
+                <w:b w:val="0"/>
+                <w:i w:val="0"/>
+                <w:smallCaps w:val="0"/>
+                <w:sz w:val="16"/>
+              </w:rPr>
+              <w:t>LSTM, h = 128</w:t>
+            </w:r>
+          </w:p>
+        </w:tc>
+        <w:tc>
+          <w:tcPr>
+            <w:tcW w:type="dxa" w:w="978"/>
+          </w:tcPr>
+          <w:p>
+            <w:pPr>
+              <w:keepNext/>
+              <w:spacing w:before="0" w:after="0"/>
+              <w:jc w:val="center"/>
+            </w:pPr>
+            <w:r>
+              <w:rPr>
+                <w:b w:val="0"/>
+                <w:i w:val="0"/>
+                <w:smallCaps w:val="0"/>
+                <w:sz w:val="16"/>
+              </w:rPr>
+              <w:t>89.8</w:t>
+            </w:r>
+          </w:p>
+        </w:tc>
+        <w:tc>
+          <w:tcPr>
+            <w:tcW w:type="dxa" w:w="1138"/>
+          </w:tcPr>
+          <w:p>
+            <w:pPr>
+              <w:keepNext/>
+              <w:spacing w:before="0" w:after="0"/>
+              <w:jc w:val="center"/>
+            </w:pPr>
+            <w:r>
+              <w:rPr>
+                <w:b w:val="0"/>
+                <w:i w:val="0"/>
+                <w:smallCaps w:val="0"/>
+                <w:sz w:val="16"/>
+              </w:rPr>
+              <w:t>98.51</w:t>
+            </w:r>
+          </w:p>
+        </w:tc>
+        <w:tc>
+          <w:tcPr>
+            <w:tcW w:type="dxa" w:w="1138"/>
+          </w:tcPr>
+          <w:p>
+            <w:pPr>
+              <w:keepNext/>
+              <w:spacing w:before="0" w:after="0"/>
+              <w:jc w:val="center"/>
+            </w:pPr>
+            <w:r>
+              <w:rPr>
+                <w:b w:val="0"/>
+                <w:i w:val="0"/>
+                <w:smallCaps w:val="0"/>
+                <w:sz w:val="16"/>
+              </w:rPr>
+              <w:t>98.78</w:t>
+            </w:r>
+          </w:p>
+        </w:tc>
+        <w:tc>
+          <w:tcPr>
+            <w:tcW w:type="dxa" w:w="818"/>
+          </w:tcPr>
+          <w:p>
+            <w:pPr>
+              <w:keepNext/>
+              <w:spacing w:before="0" w:after="0"/>
+              <w:jc w:val="center"/>
+            </w:pPr>
+            <w:r>
+              <w:rPr>
+                <w:b w:val="0"/>
+                <w:i w:val="0"/>
+                <w:smallCaps w:val="0"/>
+                <w:sz w:val="16"/>
+              </w:rPr>
+              <w:t>0.62</w:t>
+            </w:r>
+          </w:p>
+        </w:tc>
+        <w:tc>
+          <w:tcPr>
+            <w:tcW w:type="dxa" w:w="818"/>
+          </w:tcPr>
+          <w:p>
+            <w:pPr>
+              <w:keepNext/>
+              <w:spacing w:before="0" w:after="0"/>
+              <w:jc w:val="center"/>
+            </w:pPr>
+            <w:r>
+              <w:rPr>
+                <w:b w:val="0"/>
+                <w:i w:val="0"/>
+                <w:smallCaps w:val="0"/>
+                <w:sz w:val="16"/>
+              </w:rPr>
+              <w:t>1.24</w:t>
+            </w:r>
+          </w:p>
+        </w:tc>
+      </w:tr>
+      <w:tr>
+        <w:trPr>
+          <w:cantSplit/>
+        </w:trPr>
+        <w:tc>
+          <w:tcPr>
+            <w:tcW w:type="dxa" w:w="5190"/>
+          </w:tcPr>
+          <w:p>
+            <w:pPr>
+              <w:keepNext/>
+              <w:spacing w:before="0" w:after="0"/>
+              <w:jc w:val="left"/>
+            </w:pPr>
+            <w:r>
+              <w:rPr>
+                <w:b w:val="0"/>
+                <w:i w:val="0"/>
+                <w:smallCaps w:val="0"/>
+                <w:sz w:val="16"/>
+              </w:rPr>
+              <w:t>Temporal CNN, h = 128</w:t>
+            </w:r>
+          </w:p>
+        </w:tc>
+        <w:tc>
+          <w:tcPr>
+            <w:tcW w:type="dxa" w:w="978"/>
+          </w:tcPr>
+          <w:p>
+            <w:pPr>
+              <w:keepNext/>
+              <w:spacing w:before="0" w:after="0"/>
+              <w:jc w:val="center"/>
+            </w:pPr>
+            <w:r>
+              <w:rPr>
+                <w:b w:val="0"/>
+                <w:i w:val="0"/>
+                <w:smallCaps w:val="0"/>
+                <w:sz w:val="16"/>
+              </w:rPr>
+              <w:t>89.8</w:t>
+            </w:r>
+          </w:p>
+        </w:tc>
+        <w:tc>
+          <w:tcPr>
+            <w:tcW w:type="dxa" w:w="1138"/>
+          </w:tcPr>
+          <w:p>
+            <w:pPr>
+              <w:keepNext/>
+              <w:spacing w:before="0" w:after="0"/>
+              <w:jc w:val="center"/>
+            </w:pPr>
+            <w:r>
+              <w:rPr>
+                <w:b w:val="0"/>
+                <w:i w:val="0"/>
+                <w:smallCaps w:val="0"/>
+                <w:sz w:val="16"/>
+              </w:rPr>
+              <w:t>98.47</w:t>
+            </w:r>
+          </w:p>
+        </w:tc>
+        <w:tc>
+          <w:tcPr>
+            <w:tcW w:type="dxa" w:w="1138"/>
+          </w:tcPr>
+          <w:p>
+            <w:pPr>
+              <w:keepNext/>
+              <w:spacing w:before="0" w:after="0"/>
+              <w:jc w:val="center"/>
+            </w:pPr>
+            <w:r>
+              <w:rPr>
+                <w:b w:val="0"/>
+                <w:i w:val="0"/>
+                <w:smallCaps w:val="0"/>
+                <w:sz w:val="16"/>
+              </w:rPr>
+              <w:t>98.75</w:t>
+            </w:r>
+          </w:p>
+        </w:tc>
+        <w:tc>
+          <w:tcPr>
+            <w:tcW w:type="dxa" w:w="818"/>
+          </w:tcPr>
+          <w:p>
+            <w:pPr>
+              <w:keepNext/>
+              <w:spacing w:before="0" w:after="0"/>
+              <w:jc w:val="center"/>
+            </w:pPr>
+            <w:r>
+              <w:rPr>
+                <w:b w:val="0"/>
+                <w:i w:val="0"/>
+                <w:smallCaps w:val="0"/>
+                <w:sz w:val="16"/>
+              </w:rPr>
+              <w:t>0.67</w:t>
+            </w:r>
+          </w:p>
+        </w:tc>
+        <w:tc>
+          <w:tcPr>
+            <w:tcW w:type="dxa" w:w="818"/>
+          </w:tcPr>
+          <w:p>
+            <w:pPr>
+              <w:keepNext/>
+              <w:spacing w:before="0" w:after="0"/>
+              <w:jc w:val="center"/>
+            </w:pPr>
+            <w:r>
+              <w:rPr>
+                <w:b w:val="0"/>
+                <w:i w:val="0"/>
+                <w:smallCaps w:val="0"/>
+                <w:sz w:val="16"/>
+              </w:rPr>
+              <w:t>0.80</w:t>
+            </w:r>
+          </w:p>
+        </w:tc>
+      </w:tr>
+      <w:tr>
+        <w:trPr>
+          <w:cantSplit/>
+        </w:trPr>
+        <w:tc>
+          <w:tcPr>
+            <w:tcW w:type="dxa" w:w="5190"/>
+          </w:tcPr>
+          <w:p>
+            <w:pPr>
+              <w:keepNext/>
+              <w:spacing w:before="0" w:after="0"/>
+              <w:jc w:val="left"/>
+            </w:pPr>
+            <w:r>
+              <w:rPr>
+                <w:b w:val="0"/>
+                <w:i w:val="0"/>
+                <w:smallCaps w:val="0"/>
+                <w:sz w:val="16"/>
+              </w:rPr>
+              <w:t>Transformer, h = 64 (selected)</w:t>
+            </w:r>
+          </w:p>
+        </w:tc>
+        <w:tc>
+          <w:tcPr>
+            <w:tcW w:type="dxa" w:w="978"/>
+          </w:tcPr>
+          <w:p>
+            <w:pPr>
+              <w:keepNext/>
+              <w:spacing w:before="0" w:after="0"/>
+              <w:jc w:val="center"/>
+            </w:pPr>
+            <w:r>
+              <w:rPr>
+                <w:b w:val="0"/>
+                <w:i w:val="0"/>
+                <w:smallCaps w:val="0"/>
+                <w:sz w:val="16"/>
+              </w:rPr>
+              <w:t>91.9</w:t>
+            </w:r>
+          </w:p>
+        </w:tc>
+        <w:tc>
+          <w:tcPr>
+            <w:tcW w:type="dxa" w:w="1138"/>
+          </w:tcPr>
+          <w:p>
+            <w:pPr>
+              <w:keepNext/>
+              <w:spacing w:before="0" w:after="0"/>
+              <w:jc w:val="center"/>
+            </w:pPr>
+            <w:r>
+              <w:rPr>
+                <w:b w:val="0"/>
+                <w:i w:val="0"/>
+                <w:smallCaps w:val="0"/>
+                <w:sz w:val="16"/>
+              </w:rPr>
+              <w:t>98.39</w:t>
+            </w:r>
+          </w:p>
+        </w:tc>
+        <w:tc>
+          <w:tcPr>
+            <w:tcW w:type="dxa" w:w="1138"/>
+          </w:tcPr>
+          <w:p>
+            <w:pPr>
+              <w:keepNext/>
+              <w:spacing w:before="0" w:after="0"/>
+              <w:jc w:val="center"/>
+            </w:pPr>
+            <w:r>
+              <w:rPr>
+                <w:b w:val="0"/>
+                <w:i w:val="0"/>
+                <w:smallCaps w:val="0"/>
+                <w:sz w:val="16"/>
+              </w:rPr>
+              <w:t>98.71</w:t>
+            </w:r>
+          </w:p>
+        </w:tc>
+        <w:tc>
+          <w:tcPr>
+            <w:tcW w:type="dxa" w:w="818"/>
+          </w:tcPr>
+          <w:p>
+            <w:pPr>
+              <w:keepNext/>
+              <w:spacing w:before="0" w:after="0"/>
+              <w:jc w:val="center"/>
+            </w:pPr>
+            <w:r>
+              <w:rPr>
+                <w:b w:val="0"/>
+                <w:i w:val="0"/>
+                <w:smallCaps w:val="0"/>
+                <w:sz w:val="16"/>
+              </w:rPr>
+              <w:t>1.00</w:t>
+            </w:r>
+          </w:p>
+        </w:tc>
+        <w:tc>
+          <w:tcPr>
+            <w:tcW w:type="dxa" w:w="818"/>
+          </w:tcPr>
+          <w:p>
+            <w:pPr>
+              <w:keepNext/>
+              <w:spacing w:before="0" w:after="0"/>
+              <w:jc w:val="center"/>
+            </w:pPr>
+            <w:r>
+              <w:rPr>
+                <w:b w:val="0"/>
+                <w:i w:val="0"/>
+                <w:smallCaps w:val="0"/>
+                <w:sz w:val="16"/>
+              </w:rPr>
+              <w:t>n/a</w:t>
+            </w:r>
+          </w:p>
+        </w:tc>
+      </w:tr>
+      <w:tr>
+        <w:trPr>
+          <w:cantSplit/>
+        </w:trPr>
+        <w:tc>
+          <w:tcPr>
+            <w:tcW w:type="dxa" w:w="5190"/>
+          </w:tcPr>
+          <w:p>
+            <w:pPr>
+              <w:keepNext/>
+              <w:spacing w:before="0" w:after="0"/>
+              <w:jc w:val="left"/>
+            </w:pPr>
+            <w:r>
+              <w:rPr>
+                <w:b w:val="0"/>
+                <w:i w:val="0"/>
+                <w:smallCaps w:val="0"/>
+                <w:sz w:val="16"/>
+              </w:rPr>
+              <w:t>MLP, h = 256</w:t>
+            </w:r>
+          </w:p>
+        </w:tc>
+        <w:tc>
+          <w:tcPr>
+            <w:tcW w:type="dxa" w:w="978"/>
+          </w:tcPr>
+          <w:p>
+            <w:pPr>
+              <w:keepNext/>
+              <w:spacing w:before="0" w:after="0"/>
+              <w:jc w:val="center"/>
+            </w:pPr>
+            <w:r>
+              <w:rPr>
+                <w:b w:val="0"/>
+                <w:i w:val="0"/>
+                <w:smallCaps w:val="0"/>
+                <w:sz w:val="16"/>
+              </w:rPr>
+              <w:t>90.5</w:t>
+            </w:r>
+          </w:p>
+        </w:tc>
+        <w:tc>
+          <w:tcPr>
+            <w:tcW w:type="dxa" w:w="1138"/>
+          </w:tcPr>
+          <w:p>
+            <w:pPr>
+              <w:keepNext/>
+              <w:spacing w:before="0" w:after="0"/>
+              <w:jc w:val="center"/>
+            </w:pPr>
+            <w:r>
+              <w:rPr>
+                <w:b w:val="0"/>
+                <w:i w:val="0"/>
+                <w:smallCaps w:val="0"/>
+                <w:sz w:val="16"/>
+              </w:rPr>
+              <w:t>98.48</w:t>
+            </w:r>
+          </w:p>
+        </w:tc>
+        <w:tc>
+          <w:tcPr>
+            <w:tcW w:type="dxa" w:w="1138"/>
+          </w:tcPr>
+          <w:p>
+            <w:pPr>
+              <w:keepNext/>
+              <w:spacing w:before="0" w:after="0"/>
+              <w:jc w:val="center"/>
+            </w:pPr>
+            <w:r>
+              <w:rPr>
+                <w:b w:val="0"/>
+                <w:i w:val="0"/>
+                <w:smallCaps w:val="0"/>
+                <w:sz w:val="16"/>
+              </w:rPr>
+              <w:t>98.81</w:t>
+            </w:r>
+          </w:p>
+        </w:tc>
+        <w:tc>
+          <w:tcPr>
+            <w:tcW w:type="dxa" w:w="818"/>
+          </w:tcPr>
+          <w:p>
+            <w:pPr>
+              <w:keepNext/>
+              <w:spacing w:before="0" w:after="0"/>
+              <w:jc w:val="center"/>
+            </w:pPr>
+            <w:r>
+              <w:rPr>
+                <w:b/>
+                <w:i w:val="0"/>
+                <w:smallCaps w:val="0"/>
+                <w:sz w:val="16"/>
+              </w:rPr>
+              <w:t>0.11</w:t>
+            </w:r>
+          </w:p>
+        </w:tc>
+        <w:tc>
+          <w:tcPr>
+            <w:tcW w:type="dxa" w:w="818"/>
+          </w:tcPr>
+          <w:p>
+            <w:pPr>
+              <w:keepNext/>
+              <w:spacing w:before="0" w:after="0"/>
+              <w:jc w:val="center"/>
+            </w:pPr>
+            <w:r>
+              <w:rPr>
+                <w:b w:val="0"/>
+                <w:i w:val="0"/>
+                <w:smallCaps w:val="0"/>
+                <w:sz w:val="16"/>
+              </w:rPr>
+              <w:t>0.33</w:t>
+            </w:r>
+          </w:p>
+        </w:tc>
+      </w:tr>
+      <w:tr>
+        <w:trPr>
+          <w:cantSplit/>
+        </w:trPr>
+        <w:tc>
+          <w:tcPr>
+            <w:tcW w:type="dxa" w:w="5190"/>
+          </w:tcPr>
+          <w:p>
+            <w:pPr>
+              <w:keepNext/>
+              <w:spacing w:before="0" w:after="0"/>
+              <w:jc w:val="left"/>
+            </w:pPr>
+            <w:r>
+              <w:rPr>
+                <w:b w:val="0"/>
+                <w:i w:val="0"/>
+                <w:smallCaps w:val="0"/>
+                <w:sz w:val="16"/>
+              </w:rPr>
+              <w:t>GRU, h = 64</w:t>
+            </w:r>
+          </w:p>
+        </w:tc>
+        <w:tc>
+          <w:tcPr>
+            <w:tcW w:type="dxa" w:w="978"/>
+          </w:tcPr>
+          <w:p>
+            <w:pPr>
+              <w:keepNext/>
+              <w:spacing w:before="0" w:after="0"/>
+              <w:jc w:val="center"/>
+            </w:pPr>
+            <w:r>
+              <w:rPr>
+                <w:b w:val="0"/>
+                <w:i w:val="0"/>
+                <w:smallCaps w:val="0"/>
+                <w:sz w:val="16"/>
+              </w:rPr>
+              <w:t>89.4</w:t>
+            </w:r>
+          </w:p>
+        </w:tc>
+        <w:tc>
+          <w:tcPr>
+            <w:tcW w:type="dxa" w:w="1138"/>
+          </w:tcPr>
+          <w:p>
+            <w:pPr>
+              <w:keepNext/>
+              <w:spacing w:before="0" w:after="0"/>
+              <w:jc w:val="center"/>
+            </w:pPr>
+            <w:r>
+              <w:rPr>
+                <w:b w:val="0"/>
+                <w:i w:val="0"/>
+                <w:smallCaps w:val="0"/>
+                <w:sz w:val="16"/>
+              </w:rPr>
+              <w:t>98.24</w:t>
+            </w:r>
+          </w:p>
+        </w:tc>
+        <w:tc>
+          <w:tcPr>
+            <w:tcW w:type="dxa" w:w="1138"/>
+          </w:tcPr>
+          <w:p>
+            <w:pPr>
+              <w:keepNext/>
+              <w:spacing w:before="0" w:after="0"/>
+              <w:jc w:val="center"/>
+            </w:pPr>
+            <w:r>
+              <w:rPr>
+                <w:b w:val="0"/>
+                <w:i w:val="0"/>
+                <w:smallCaps w:val="0"/>
+                <w:sz w:val="16"/>
+              </w:rPr>
+              <w:t>98.68</w:t>
+            </w:r>
+          </w:p>
+        </w:tc>
+        <w:tc>
+          <w:tcPr>
+            <w:tcW w:type="dxa" w:w="818"/>
+          </w:tcPr>
+          <w:p>
+            <w:pPr>
+              <w:keepNext/>
+              <w:spacing w:before="0" w:after="0"/>
+              <w:jc w:val="center"/>
+            </w:pPr>
+            <w:r>
+              <w:rPr>
+                <w:b w:val="0"/>
+                <w:i w:val="0"/>
+                <w:smallCaps w:val="0"/>
+                <w:sz w:val="16"/>
+              </w:rPr>
+              <w:t>0.43</w:t>
+            </w:r>
+          </w:p>
+        </w:tc>
+        <w:tc>
+          <w:tcPr>
+            <w:tcW w:type="dxa" w:w="818"/>
+          </w:tcPr>
+          <w:p>
+            <w:pPr>
+              <w:keepNext/>
+              <w:spacing w:before="0" w:after="0"/>
+              <w:jc w:val="center"/>
+            </w:pPr>
+            <w:r>
+              <w:rPr>
+                <w:b w:val="0"/>
+                <w:i w:val="0"/>
+                <w:smallCaps w:val="0"/>
+                <w:sz w:val="16"/>
+              </w:rPr>
+              <w:t>0.87</w:t>
+            </w:r>
+          </w:p>
+        </w:tc>
+      </w:tr>
+      <w:tr>
+        <w:trPr>
+          <w:cantSplit/>
+        </w:trPr>
+        <w:tc>
+          <w:tcPr>
+            <w:tcW w:type="dxa" w:w="5190"/>
+          </w:tcPr>
+          <w:p>
+            <w:pPr>
+              <w:keepNext/>
+              <w:spacing w:before="0" w:after="0"/>
+              <w:jc w:val="left"/>
+            </w:pPr>
+            <w:r>
+              <w:rPr>
+                <w:b w:val="0"/>
+                <w:i w:val="0"/>
+                <w:smallCaps w:val="0"/>
+                <w:sz w:val="16"/>
+              </w:rPr>
+              <w:t>GRU, lr = 3·10⁻⁴</w:t>
+            </w:r>
+          </w:p>
+        </w:tc>
+        <w:tc>
+          <w:tcPr>
+            <w:tcW w:type="dxa" w:w="978"/>
+          </w:tcPr>
+          <w:p>
+            <w:pPr>
+              <w:keepNext/>
+              <w:spacing w:before="0" w:after="0"/>
+              <w:jc w:val="center"/>
+            </w:pPr>
+            <w:r>
+              <w:rPr>
+                <w:b w:val="0"/>
+                <w:i w:val="0"/>
+                <w:smallCaps w:val="0"/>
+                <w:sz w:val="16"/>
+              </w:rPr>
+              <w:t>90.0</w:t>
+            </w:r>
+          </w:p>
+        </w:tc>
+        <w:tc>
+          <w:tcPr>
+            <w:tcW w:type="dxa" w:w="1138"/>
+          </w:tcPr>
+          <w:p>
+            <w:pPr>
+              <w:keepNext/>
+              <w:spacing w:before="0" w:after="0"/>
+              <w:jc w:val="center"/>
+            </w:pPr>
+            <w:r>
+              <w:rPr>
+                <w:b w:val="0"/>
+                <w:i w:val="0"/>
+                <w:smallCaps w:val="0"/>
+                <w:sz w:val="16"/>
+              </w:rPr>
+              <w:t>98.24</w:t>
+            </w:r>
+          </w:p>
+        </w:tc>
+        <w:tc>
+          <w:tcPr>
+            <w:tcW w:type="dxa" w:w="1138"/>
+          </w:tcPr>
+          <w:p>
+            <w:pPr>
+              <w:keepNext/>
+              <w:spacing w:before="0" w:after="0"/>
+              <w:jc w:val="center"/>
+            </w:pPr>
+            <w:r>
+              <w:rPr>
+                <w:b w:val="0"/>
+                <w:i w:val="0"/>
+                <w:smallCaps w:val="0"/>
+                <w:sz w:val="16"/>
+              </w:rPr>
+              <w:t>98.70</w:t>
+            </w:r>
+          </w:p>
+        </w:tc>
+        <w:tc>
+          <w:tcPr>
+            <w:tcW w:type="dxa" w:w="818"/>
+          </w:tcPr>
+          <w:p>
+            <w:pPr>
+              <w:keepNext/>
+              <w:spacing w:before="0" w:after="0"/>
+              <w:jc w:val="center"/>
+            </w:pPr>
+            <w:r>
+              <w:rPr>
+                <w:b w:val="0"/>
+                <w:i w:val="0"/>
+                <w:smallCaps w:val="0"/>
+                <w:sz w:val="16"/>
+              </w:rPr>
+              <w:t>0.50</w:t>
+            </w:r>
+          </w:p>
+        </w:tc>
+        <w:tc>
+          <w:tcPr>
+            <w:tcW w:type="dxa" w:w="818"/>
+          </w:tcPr>
+          <w:p>
+            <w:pPr>
+              <w:keepNext/>
+              <w:spacing w:before="0" w:after="0"/>
+              <w:jc w:val="center"/>
+            </w:pPr>
+            <w:r>
+              <w:rPr>
+                <w:b w:val="0"/>
+                <w:i w:val="0"/>
+                <w:smallCaps w:val="0"/>
+                <w:sz w:val="16"/>
+              </w:rPr>
+              <w:t>0.92</w:t>
+            </w:r>
+          </w:p>
+        </w:tc>
+      </w:tr>
+      <w:tr>
+        <w:trPr>
+          <w:cantSplit/>
+        </w:trPr>
+        <w:tc>
+          <w:tcPr>
+            <w:tcW w:type="dxa" w:w="5190"/>
+          </w:tcPr>
+          <w:p>
+            <w:pPr>
+              <w:keepNext/>
+              <w:spacing w:before="0" w:after="0"/>
+              <w:jc w:val="left"/>
+            </w:pPr>
+            <w:r>
+              <w:rPr>
+                <w:b w:val="0"/>
+                <w:i w:val="0"/>
+                <w:smallCaps w:val="0"/>
+                <w:sz w:val="16"/>
+              </w:rPr>
+              <w:t>GRU, W = 4</w:t>
+            </w:r>
+          </w:p>
+        </w:tc>
+        <w:tc>
+          <w:tcPr>
+            <w:tcW w:type="dxa" w:w="978"/>
+          </w:tcPr>
+          <w:p>
+            <w:pPr>
+              <w:keepNext/>
+              <w:spacing w:before="0" w:after="0"/>
+              <w:jc w:val="center"/>
+            </w:pPr>
+            <w:r>
+              <w:rPr>
+                <w:b w:val="0"/>
+                <w:i w:val="0"/>
+                <w:smallCaps w:val="0"/>
+                <w:sz w:val="16"/>
+              </w:rPr>
+              <w:t>90.3</w:t>
+            </w:r>
+          </w:p>
+        </w:tc>
+        <w:tc>
+          <w:tcPr>
+            <w:tcW w:type="dxa" w:w="1138"/>
+          </w:tcPr>
+          <w:p>
+            <w:pPr>
+              <w:keepNext/>
+              <w:spacing w:before="0" w:after="0"/>
+              <w:jc w:val="center"/>
+            </w:pPr>
+            <w:r>
+              <w:rPr>
+                <w:b w:val="0"/>
+                <w:i w:val="0"/>
+                <w:smallCaps w:val="0"/>
+                <w:sz w:val="16"/>
+              </w:rPr>
+              <w:t>98.17</w:t>
+            </w:r>
+          </w:p>
+        </w:tc>
+        <w:tc>
+          <w:tcPr>
+            <w:tcW w:type="dxa" w:w="1138"/>
+          </w:tcPr>
+          <w:p>
+            <w:pPr>
+              <w:keepNext/>
+              <w:spacing w:before="0" w:after="0"/>
+              <w:jc w:val="center"/>
+            </w:pPr>
+            <w:r>
+              <w:rPr>
+                <w:b w:val="0"/>
+                <w:i w:val="0"/>
+                <w:smallCaps w:val="0"/>
+                <w:sz w:val="16"/>
+              </w:rPr>
+              <w:t>98.59</w:t>
+            </w:r>
+          </w:p>
+        </w:tc>
+        <w:tc>
+          <w:tcPr>
+            <w:tcW w:type="dxa" w:w="818"/>
+          </w:tcPr>
+          <w:p>
+            <w:pPr>
+              <w:keepNext/>
+              <w:spacing w:before="0" w:after="0"/>
+              <w:jc w:val="center"/>
+            </w:pPr>
+            <w:r>
+              <w:rPr>
+                <w:b w:val="0"/>
+                <w:i w:val="0"/>
+                <w:smallCaps w:val="0"/>
+                <w:sz w:val="16"/>
+              </w:rPr>
+              <w:t>0.33</w:t>
+            </w:r>
+          </w:p>
+        </w:tc>
+        <w:tc>
+          <w:tcPr>
+            <w:tcW w:type="dxa" w:w="818"/>
+          </w:tcPr>
+          <w:p>
+            <w:pPr>
+              <w:keepNext/>
+              <w:spacing w:before="0" w:after="0"/>
+              <w:jc w:val="center"/>
+            </w:pPr>
+            <w:r>
+              <w:rPr>
+                <w:b w:val="0"/>
+                <w:i w:val="0"/>
+                <w:smallCaps w:val="0"/>
+                <w:sz w:val="16"/>
+              </w:rPr>
+              <w:t>0.64</w:t>
+            </w:r>
+          </w:p>
+        </w:tc>
+      </w:tr>
+      <w:tr>
+        <w:trPr>
+          <w:cantSplit/>
+        </w:trPr>
+        <w:tc>
+          <w:tcPr>
+            <w:tcW w:type="dxa" w:w="5190"/>
+          </w:tcPr>
+          <w:p>
+            <w:pPr>
+              <w:keepNext/>
+              <w:spacing w:before="0" w:after="0"/>
+              <w:jc w:val="left"/>
+            </w:pPr>
+            <w:r>
+              <w:rPr>
+                <w:b w:val="0"/>
+                <w:i w:val="0"/>
+                <w:smallCaps w:val="0"/>
+                <w:sz w:val="16"/>
+              </w:rPr>
+              <w:t>GRU, W = 16</w:t>
+            </w:r>
+          </w:p>
+        </w:tc>
+        <w:tc>
+          <w:tcPr>
+            <w:tcW w:type="dxa" w:w="978"/>
+          </w:tcPr>
+          <w:p>
+            <w:pPr>
+              <w:keepNext/>
+              <w:spacing w:before="0" w:after="0"/>
+              <w:jc w:val="center"/>
+            </w:pPr>
+            <w:r>
+              <w:rPr>
+                <w:b w:val="0"/>
+                <w:i w:val="0"/>
+                <w:smallCaps w:val="0"/>
+                <w:sz w:val="16"/>
+              </w:rPr>
+              <w:t>89.3</w:t>
+            </w:r>
+          </w:p>
+        </w:tc>
+        <w:tc>
+          <w:tcPr>
+            <w:tcW w:type="dxa" w:w="1138"/>
+          </w:tcPr>
+          <w:p>
+            <w:pPr>
+              <w:keepNext/>
+              <w:spacing w:before="0" w:after="0"/>
+              <w:jc w:val="center"/>
+            </w:pPr>
+            <w:r>
+              <w:rPr>
+                <w:b w:val="0"/>
+                <w:i w:val="0"/>
+                <w:smallCaps w:val="0"/>
+                <w:sz w:val="16"/>
+              </w:rPr>
+              <w:t>98.29</w:t>
+            </w:r>
+          </w:p>
+        </w:tc>
+        <w:tc>
+          <w:tcPr>
+            <w:tcW w:type="dxa" w:w="1138"/>
+          </w:tcPr>
+          <w:p>
+            <w:pPr>
+              <w:keepNext/>
+              <w:spacing w:before="0" w:after="0"/>
+              <w:jc w:val="center"/>
+            </w:pPr>
+            <w:r>
+              <w:rPr>
+                <w:b w:val="0"/>
+                <w:i w:val="0"/>
+                <w:smallCaps w:val="0"/>
+                <w:sz w:val="16"/>
+              </w:rPr>
+              <w:t>98.64</w:t>
+            </w:r>
+          </w:p>
+        </w:tc>
+        <w:tc>
+          <w:tcPr>
+            <w:tcW w:type="dxa" w:w="818"/>
+          </w:tcPr>
+          <w:p>
+            <w:pPr>
+              <w:keepNext/>
+              <w:spacing w:before="0" w:after="0"/>
+              <w:jc w:val="center"/>
+            </w:pPr>
+            <w:r>
+              <w:rPr>
+                <w:b w:val="0"/>
+                <w:i w:val="0"/>
+                <w:smallCaps w:val="0"/>
+                <w:sz w:val="16"/>
+              </w:rPr>
+              <w:t>0.91</w:t>
+            </w:r>
+          </w:p>
+        </w:tc>
+        <w:tc>
+          <w:tcPr>
+            <w:tcW w:type="dxa" w:w="818"/>
+          </w:tcPr>
+          <w:p>
+            <w:pPr>
+              <w:keepNext/>
+              <w:spacing w:before="0" w:after="0"/>
+              <w:jc w:val="center"/>
+            </w:pPr>
+            <w:r>
+              <w:rPr>
+                <w:b w:val="0"/>
+                <w:i w:val="0"/>
+                <w:smallCaps w:val="0"/>
+                <w:sz w:val="16"/>
+              </w:rPr>
+              <w:t>1.67</w:t>
+            </w:r>
+          </w:p>
+        </w:tc>
+      </w:tr>
+      <w:tr>
+        <w:trPr>
+          <w:cantSplit/>
+        </w:trPr>
+        <w:tc>
+          <w:tcPr>
+            <w:tcW w:type="dxa" w:w="5190"/>
+          </w:tcPr>
+          <w:p>
+            <w:pPr>
+              <w:keepNext w:val="0"/>
+              <w:spacing w:before="0" w:after="0"/>
+              <w:jc w:val="left"/>
+            </w:pPr>
+            <w:r>
+              <w:rPr>
+                <w:b w:val="0"/>
+                <w:i w:val="0"/>
+                <w:smallCaps w:val="0"/>
+                <w:sz w:val="16"/>
+              </w:rPr>
+              <w:t>GRU, hard target</w:t>
+            </w:r>
+          </w:p>
+        </w:tc>
+        <w:tc>
+          <w:tcPr>
+            <w:tcW w:type="dxa" w:w="978"/>
+          </w:tcPr>
+          <w:p>
+            <w:pPr>
+              <w:keepNext w:val="0"/>
+              <w:spacing w:before="0" w:after="0"/>
+              <w:jc w:val="center"/>
+            </w:pPr>
+            <w:r>
+              <w:rPr>
+                <w:b w:val="0"/>
+                <w:i w:val="0"/>
+                <w:smallCaps w:val="0"/>
+                <w:sz w:val="16"/>
+              </w:rPr>
+              <w:t>91.2</w:t>
+            </w:r>
+          </w:p>
+        </w:tc>
+        <w:tc>
+          <w:tcPr>
+            <w:tcW w:type="dxa" w:w="1138"/>
+          </w:tcPr>
+          <w:p>
+            <w:pPr>
+              <w:keepNext w:val="0"/>
+              <w:spacing w:before="0" w:after="0"/>
+              <w:jc w:val="center"/>
+            </w:pPr>
+            <w:r>
+              <w:rPr>
+                <w:b w:val="0"/>
+                <w:i w:val="0"/>
+                <w:smallCaps w:val="0"/>
+                <w:sz w:val="16"/>
+              </w:rPr>
+              <w:t>98.71</w:t>
+            </w:r>
+          </w:p>
+        </w:tc>
+        <w:tc>
+          <w:tcPr>
+            <w:tcW w:type="dxa" w:w="1138"/>
+          </w:tcPr>
+          <w:p>
+            <w:pPr>
+              <w:keepNext w:val="0"/>
+              <w:spacing w:before="0" w:after="0"/>
+              <w:jc w:val="center"/>
+            </w:pPr>
+            <w:r>
+              <w:rPr>
+                <w:b w:val="0"/>
+                <w:i w:val="0"/>
+                <w:smallCaps w:val="0"/>
+                <w:sz w:val="16"/>
+              </w:rPr>
+              <w:t>98.83</w:t>
+            </w:r>
+          </w:p>
+        </w:tc>
+        <w:tc>
+          <w:tcPr>
+            <w:tcW w:type="dxa" w:w="818"/>
+          </w:tcPr>
+          <w:p>
+            <w:pPr>
+              <w:keepNext w:val="0"/>
+              <w:spacing w:before="0" w:after="0"/>
+              <w:jc w:val="center"/>
+            </w:pPr>
+            <w:r>
+              <w:rPr>
+                <w:b w:val="0"/>
+                <w:i w:val="0"/>
+                <w:smallCaps w:val="0"/>
+                <w:sz w:val="16"/>
+              </w:rPr>
+              <w:t>0.56</w:t>
+            </w:r>
+          </w:p>
+        </w:tc>
+        <w:tc>
+          <w:tcPr>
+            <w:tcW w:type="dxa" w:w="818"/>
+          </w:tcPr>
+          <w:p>
+            <w:pPr>
+              <w:keepNext w:val="0"/>
+              <w:spacing w:before="0" w:after="0"/>
+              <w:jc w:val="center"/>
+            </w:pPr>
+            <w:r>
+              <w:rPr>
+                <w:b w:val="0"/>
+                <w:i w:val="0"/>
+                <w:smallCaps w:val="0"/>
+                <w:sz w:val="16"/>
+              </w:rPr>
+              <w:t>1.04</w:t>
+            </w:r>
+          </w:p>
+        </w:tc>
+      </w:tr>
+    </w:tbl>
+    <w:p>
+      <w:pPr>
+        <w:keepNext w:val="0"/>
+        <w:spacing w:before="0" w:after="120"/>
+        <w:jc w:val="both"/>
+      </w:pPr>
+    </w:p>
+    <w:p>
+      <w:pPr>
+        <w:sectPr>
+          <w:type w:val="continuous"/>
+          <w:pgSz w:w="12240" w:h="15840"/>
+          <w:pgMar w:top="1080" w:right="900" w:bottom="1440" w:left="900" w:header="720" w:footer="720" w:gutter="0"/>
+          <w:cols w:space="360" w:num="1"/>
+          <w:docGrid w:linePitch="360"/>
+        </w:sectPr>
+      </w:pPr>
+    </w:p>
+    <w:p>
+      <w:pPr>
+        <w:sectPr>
+          <w:type w:val="continuous"/>
+          <w:pgSz w:w="12240" w:h="15840"/>
+          <w:pgMar w:top="1080" w:right="900" w:bottom="1440" w:left="900" w:header="720" w:footer="720" w:gutter="0"/>
+          <w:cols w:space="360" w:num="2"/>
+          <w:docGrid w:linePitch="360"/>
+        </w:sectPr>
+      </w:pPr>
+    </w:p>
+    <w:tbl>
+      <w:tblPr>
+        <w:tblW w:type="auto" w:w="0"/>
+        <w:jc w:val="center"/>
+        <w:tblLook w:firstColumn="1" w:firstRow="1" w:lastColumn="0" w:lastRow="0" w:noHBand="0" w:noVBand="1" w:val="04A0"/>
+      </w:tblPr>
+      <w:tblGrid>
+        <w:gridCol w:w="10440"/>
+      </w:tblGrid>
+      <w:tr>
+        <w:trPr>
+          <w:cantSplit/>
+        </w:trPr>
+        <w:tc>
+          <w:tcPr>
+            <w:tcW w:type="dxa" w:w="10440"/>
+          </w:tcPr>
+          <w:p>
+            <w:pPr>
+              <w:keepNext w:val="0"/>
+              <w:spacing w:before="80" w:after="0"/>
+              <w:jc w:val="center"/>
+            </w:pPr>
+            <w:r>
+              <w:drawing>
+                <wp:inline xmlns:a="http://schemas.openxmlformats.org/drawingml/2006/main" xmlns:pic="http://schemas.openxmlformats.org/drawingml/2006/picture">
+                  <wp:extent cx="5943600" cy="2118228"/>
+                  <wp:docPr id="6" name="Picture 6"/>
+                  <wp:cNvGraphicFramePr>
+                    <a:graphicFrameLocks noChangeAspect="1"/>
+                  </wp:cNvGraphicFramePr>
+                  <a:graphic>
+                    <a:graphicData uri="http://schemas.openxmlformats.org/drawingml/2006/picture">
+                      <pic:pic>
+                        <pic:nvPicPr>
+                          <pic:cNvPr id="0" name="fig_closed_loop.png"/>
+                          <pic:cNvPicPr/>
+                        </pic:nvPicPr>
+                        <pic:blipFill>
+                          <a:blip r:embed="rId14"/>
+                          <a:stretch>
+                            <a:fillRect/>
+                          </a:stretch>
+                        </pic:blipFill>
+                        <pic:spPr>
+                          <a:xfrm>
+                            <a:off x="0" y="0"/>
+                            <a:ext cx="5943600" cy="2118228"/>
+                          </a:xfrm>
+                          <a:prstGeom prst="rect"/>
+                        </pic:spPr>
+                      </pic:pic>
+                    </a:graphicData>
+                  </a:graphic>
+                </wp:inline>
+              </w:drawing>
+            </w:r>
+          </w:p>
+          <w:p>
+            <w:pPr>
+              <w:keepNext w:val="0"/>
+              <w:spacing w:before="0" w:after="120"/>
+              <w:jc w:val="center"/>
+            </w:pPr>
+            <w:r>
+              <w:rPr>
+                <w:b w:val="0"/>
+                <w:i w:val="0"/>
+                <w:smallCaps w:val="0"/>
+                <w:sz w:val="16"/>
+              </w:rPr>
+              <w:t xml:space="preserve">Fig. 6. </w:t>
+            </w:r>
+            <w:r>
+              <w:rPr>
+                <w:b w:val="0"/>
+                <w:i w:val="0"/>
+                <w:smallCaps w:val="0"/>
+                <w:sz w:val="16"/>
+              </w:rPr>
+              <w:t>Closed loop. Left: exact top-1 versus mean beam-training latency for every policy (log scale); dashed: 95%. Right: at equal budget, extra beams chosen by the tie graph (line) versus by each of the ten learned models (squares).</w:t>
+            </w:r>
+          </w:p>
+        </w:tc>
+      </w:tr>
+    </w:tbl>
+    <w:p>
+      <w:pPr>
+        <w:keepNext w:val="0"/>
+        <w:spacing w:before="0" w:after="40"/>
+        <w:jc w:val="both"/>
+      </w:pPr>
+    </w:p>
+    <w:p>
+      <w:pPr>
+        <w:sectPr>
+          <w:type w:val="continuous"/>
+          <w:pgSz w:w="12240" w:h="15840"/>
+          <w:pgMar w:top="1080" w:right="900" w:bottom="1440" w:left="900" w:header="720" w:footer="720" w:gutter="0"/>
+          <w:cols w:space="360" w:num="1"/>
+          <w:docGrid w:linePitch="360"/>
+        </w:sectPr>
+      </w:pPr>
+    </w:p>
+    <w:p>
+      <w:pPr>
         <w:keepNext/>
         <w:spacing w:before="160" w:after="80"/>
         <w:jc w:val="center"/>
@@ -10341,7 +12183,7 @@
           <w:smallCaps w:val="0"/>
           <w:sz w:val="20"/>
         </w:rPr>
-        <w:t xml:space="preserve"> On power sweeps alone the learned gain over persistence is modest at t + 1 and clear at t + 3 (86.0% vs 78.1% within noise). In reduced beam training, the largest single gain comes from a simple learned structure, the beam-tie graph, rather than from the sequence model. The GRU then reduces the beams measured at t + 3. In closed loop the GRU cannot yet be used, because it expects full-sweep history; a sequence model trained on the sparse measurements a tracker actually has is the natural next step. The soft target and beam-axis augmentation matter more than the architecture. Logit adjustment for the class imbalance [19] lowered every metric because the beam distribution differs between flights.</w:t>
+        <w:t xml:space="preserve"> On power sweeps alone the learned gain over persistence is modest at t + 1 and clear at t + 3 (86.0% vs 78.1% within noise). In reduced beam training, the largest single gain comes from a simple learned structure, the beam-tie graph, rather than from the sequence model. The GRU then reduces the beams measured at t + 3. In closed loop, where only measured beams are known, ten deep sequence models trained on those measurements did not beat the tie graph at equal budget (Table X). On this dataset, the useful structure is which beams tie, and a co-occurrence count captures it; we report this negative result because it bounds what learning adds once measurement is cheap. The soft target and beam-axis augmentation matter more than the architecture. Logit adjustment for the class imbalance [19] lowered every metric because the beam distribution differs between flights.</w:t>
       </w:r>
     </w:p>
     <w:p>
@@ -10400,7 +12242,7 @@
           <w:smallCaps w:val="0"/>
           <w:sz w:val="20"/>
         </w:rPr>
-        <w:t>We built a hardware-aware model of an RIS-assisted mmWave UAV link and used it, with real 60 GHz measurements, to evaluate beam management end to end. Hardware impairments cost 7.8 dB and 2.25× RIS elements at 60 GHz, and D-band transceiver limits push the 140 GHz panel to 32 cm; a position-parametric estimator matches perfect channel knowledge with 64× fewer pilots; Kalman-based prediction preserves 99.3% of the array gain at 500 ms latency; and AI-assisted reduced beam training with a learned beam-tie graph selects the exact optimal beam 99.3% of the time given full-sweep history and 97.2% in a closed-loop replay of every flight, with 1.05 ms of beam training per decision instead of 5 ms, with all reported metrics evaluated under sequence-level cross-validation. Future work will add UAV position to beam prediction, measured hardware coefficients, and a sequence model trained on the sparse measurements of the closed loop.</w:t>
+        <w:t>We built a hardware-aware model of an RIS-assisted mmWave UAV link and used it, with real 60 GHz measurements, to evaluate beam management end to end. Hardware impairments cost 7.8 dB and 2.25× RIS elements at 60 GHz, and D-band transceiver limits push the 140 GHz panel to 32 cm; a position-parametric estimator matches perfect channel knowledge with 64× fewer pilots; Kalman-based prediction preserves 99.3% of the array gain at 500 ms latency; and AI-assisted reduced beam training with a learned beam-tie graph selects the exact optimal beam 99.3% of the time given full-sweep history and 97.2–99.3% in a closed-loop replay of every flight, with 1.05–1.31 ms of beam training per decision instead of 5 ms; deep sequence models trained on measured-only data did not improve on it at equal budget. All reported metrics are evaluated under sequence-level cross-validation. Future work will add UAV position and camera input to beam prediction (the full Scenario 23 release), measured hardware coefficients, and paired per-flight significance tests between tracking policies.</w:t>
       </w:r>
     </w:p>
     <w:p>

</xml_diff>

<commit_message>
Add position-aided beam prediction (full Scenario 23): Table XI, Fig. 7
With UAV GPS, speed, velocity, height, pitch and roll, blind within-noise
accuracy at t+3 rises 1.1-4.2 points (GRU ensemble 86.0 -> 87.2%,
balanced 75.5 -> 79.3%). At t+1 the change is -0.8 to +0.3, since the
last sweep already encodes position. Add SCENARIO23_FEATURES=power so the
paper's power-only tables stay reproducible from the shipped CSV.

Co-Authored-By: Claude Opus 5.5 <noreply@anthropic.com>
</commit_message>
<xml_diff>
--- a/paper/revised_paper_ieee.docx
+++ b/paper/revised_paper_ieee.docx
@@ -12094,6 +12094,1060 @@
     </w:p>
     <w:p>
       <w:pPr>
+        <w:keepNext w:val="0"/>
+        <w:spacing w:before="0" w:after="0"/>
+        <w:ind w:firstLine="288"/>
+        <w:jc w:val="both"/>
+      </w:pPr>
+      <w:r>
+        <w:rPr>
+          <w:b/>
+          <w:i w:val="0"/>
+          <w:smallCaps w:val="0"/>
+          <w:sz w:val="20"/>
+        </w:rPr>
+        <w:t>Position-aided prediction</w:t>
+      </w:r>
+      <w:r>
+        <w:rPr>
+          <w:b w:val="0"/>
+          <w:i w:val="0"/>
+          <w:smallCaps w:val="0"/>
+          <w:sz w:val="20"/>
+        </w:rPr>
+        <w:t xml:space="preserve"> (Table XI, Fig. 7). The full Scenario 23 release adds, for every sample, the UAV's GPS position, speed, velocity components, height, pitch and roll. We convert the GPS fix to east/north offsets from the base station and its bearing, append these and the raw kinematic channels to every step of each model's input window, and repeat the blind-prediction study with the same folds. All other tables use power sweeps only, so that they can be reproduced from the beam CSV shipped with the repository. The height channel ranges from 31 to 391 while the UAV–BS distance is at most 120 m, so its unit or reference is not documented consistently; the models standardise it, but we do not interpret it physically.</w:t>
+      </w:r>
+    </w:p>
+    <w:p>
+      <w:pPr>
+        <w:keepNext w:val="0"/>
+        <w:spacing w:before="0" w:after="0"/>
+        <w:ind w:firstLine="288"/>
+        <w:jc w:val="both"/>
+      </w:pPr>
+      <w:r>
+        <w:rPr>
+          <w:b w:val="0"/>
+          <w:i w:val="0"/>
+          <w:smallCaps w:val="0"/>
+          <w:sz w:val="20"/>
+        </w:rPr>
+        <w:t>Position helps when the prediction reaches further ahead. At t + 3, within-noise accuracy rises by 4.2 points for the random forest (78.5 → 82.7%), 2.1 for the soft-target GRU and 1.1 for the GRU ensemble (86.0 → 87.2%), whose class-balanced score rises from 75.5 to 79.3%. At t + 1 the change is −0.8 to +0.3 points: the last sweep already encodes where the UAV is. Exact top-1 moves by at most 3.7 points and stays far below the 79% noise ceiling, as it must.</w:t>
+      </w:r>
+    </w:p>
+    <w:p>
+      <w:pPr>
+        <w:sectPr>
+          <w:type w:val="continuous"/>
+          <w:pgSz w:w="12240" w:h="15840"/>
+          <w:pgMar w:top="1080" w:right="900" w:bottom="1440" w:left="900" w:header="720" w:footer="720" w:gutter="0"/>
+          <w:cols w:space="360" w:num="2"/>
+          <w:docGrid w:linePitch="360"/>
+        </w:sectPr>
+      </w:pPr>
+    </w:p>
+    <w:p>
+      <w:pPr>
+        <w:keepNext/>
+        <w:spacing w:before="120" w:after="0"/>
+        <w:jc w:val="center"/>
+      </w:pPr>
+      <w:r>
+        <w:rPr>
+          <w:b w:val="0"/>
+          <w:i w:val="0"/>
+          <w:smallCaps w:val="0"/>
+          <w:sz w:val="16"/>
+        </w:rPr>
+        <w:t>TABLE XI</w:t>
+      </w:r>
+    </w:p>
+    <w:p>
+      <w:pPr>
+        <w:keepNext/>
+        <w:spacing w:before="0" w:after="60"/>
+        <w:jc w:val="center"/>
+      </w:pPr>
+      <w:r>
+        <w:rPr>
+          <w:b w:val="0"/>
+          <w:i w:val="0"/>
+          <w:smallCaps/>
+          <w:sz w:val="16"/>
+        </w:rPr>
+        <w:t>Blind beam prediction with power sweeps only versus power plus UAV GPS and kinematics (GroupKFold over 35 sequences). Within noise / class-balanced within noise / exact top-1, in %</w:t>
+      </w:r>
+    </w:p>
+    <w:tbl>
+      <w:tblPr>
+        <w:tblW w:type="auto" w:w="0"/>
+        <w:jc w:val="center"/>
+        <w:tblLayout w:type="fixed"/>
+        <w:tblLook w:firstColumn="1" w:firstRow="1" w:lastColumn="0" w:lastRow="0" w:noHBand="0" w:noVBand="1" w:val="04A0"/>
+        <w:tblBorders>
+          <w:top w:val="single" w:sz="8" w:color="000000"/>
+          <w:bottom w:val="single" w:sz="8" w:color="000000"/>
+        </w:tblBorders>
+        <w:tblCellMar>
+          <w:left w:w="50" w:type="dxa"/>
+          <w:right w:w="50" w:type="dxa"/>
+        </w:tblCellMar>
+      </w:tblPr>
+      <w:tblGrid>
+        <w:gridCol w:w="1442"/>
+        <w:gridCol w:w="2672"/>
+        <w:gridCol w:w="2982"/>
+        <w:gridCol w:w="2982"/>
+      </w:tblGrid>
+      <w:tr>
+        <w:trPr>
+          <w:cantSplit/>
+        </w:trPr>
+        <w:tc>
+          <w:tcPr>
+            <w:tcW w:type="dxa" w:w="1443"/>
+            <w:tcBorders>
+              <w:bottom w:val="single" w:sz="4" w:color="000000"/>
+            </w:tcBorders>
+          </w:tcPr>
+          <w:p>
+            <w:pPr>
+              <w:keepNext/>
+              <w:spacing w:before="0" w:after="0"/>
+              <w:jc w:val="left"/>
+            </w:pPr>
+            <w:r>
+              <w:rPr>
+                <w:b/>
+                <w:i w:val="0"/>
+                <w:smallCaps w:val="0"/>
+                <w:sz w:val="16"/>
+              </w:rPr>
+              <w:t>Horizon</w:t>
+            </w:r>
+          </w:p>
+        </w:tc>
+        <w:tc>
+          <w:tcPr>
+            <w:tcW w:type="dxa" w:w="2673"/>
+            <w:tcBorders>
+              <w:bottom w:val="single" w:sz="4" w:color="000000"/>
+            </w:tcBorders>
+          </w:tcPr>
+          <w:p>
+            <w:pPr>
+              <w:keepNext/>
+              <w:spacing w:before="0" w:after="0"/>
+              <w:jc w:val="left"/>
+            </w:pPr>
+            <w:r>
+              <w:rPr>
+                <w:b/>
+                <w:i w:val="0"/>
+                <w:smallCaps w:val="0"/>
+                <w:sz w:val="16"/>
+              </w:rPr>
+              <w:t>Model</w:t>
+            </w:r>
+          </w:p>
+        </w:tc>
+        <w:tc>
+          <w:tcPr>
+            <w:tcW w:type="dxa" w:w="2982"/>
+            <w:tcBorders>
+              <w:bottom w:val="single" w:sz="4" w:color="000000"/>
+            </w:tcBorders>
+          </w:tcPr>
+          <w:p>
+            <w:pPr>
+              <w:keepNext/>
+              <w:spacing w:before="0" w:after="0"/>
+              <w:jc w:val="center"/>
+            </w:pPr>
+            <w:r>
+              <w:rPr>
+                <w:b/>
+                <w:i w:val="0"/>
+                <w:smallCaps w:val="0"/>
+                <w:sz w:val="16"/>
+              </w:rPr>
+              <w:t>Power only</w:t>
+            </w:r>
+          </w:p>
+        </w:tc>
+        <w:tc>
+          <w:tcPr>
+            <w:tcW w:type="dxa" w:w="2982"/>
+            <w:tcBorders>
+              <w:bottom w:val="single" w:sz="4" w:color="000000"/>
+            </w:tcBorders>
+          </w:tcPr>
+          <w:p>
+            <w:pPr>
+              <w:keepNext/>
+              <w:spacing w:before="0" w:after="0"/>
+              <w:jc w:val="center"/>
+            </w:pPr>
+            <w:r>
+              <w:rPr>
+                <w:b/>
+                <w:i w:val="0"/>
+                <w:smallCaps w:val="0"/>
+                <w:sz w:val="16"/>
+              </w:rPr>
+              <w:t>Power + GPS</w:t>
+            </w:r>
+          </w:p>
+        </w:tc>
+      </w:tr>
+      <w:tr>
+        <w:trPr>
+          <w:cantSplit/>
+        </w:trPr>
+        <w:tc>
+          <w:tcPr>
+            <w:tcW w:type="dxa" w:w="1443"/>
+          </w:tcPr>
+          <w:p>
+            <w:pPr>
+              <w:keepNext/>
+              <w:spacing w:before="0" w:after="0"/>
+              <w:jc w:val="left"/>
+            </w:pPr>
+            <w:r>
+              <w:rPr>
+                <w:b w:val="0"/>
+                <w:i w:val="0"/>
+                <w:smallCaps w:val="0"/>
+                <w:sz w:val="16"/>
+              </w:rPr>
+              <w:t>t+1</w:t>
+            </w:r>
+          </w:p>
+        </w:tc>
+        <w:tc>
+          <w:tcPr>
+            <w:tcW w:type="dxa" w:w="2673"/>
+          </w:tcPr>
+          <w:p>
+            <w:pPr>
+              <w:keepNext/>
+              <w:spacing w:before="0" w:after="0"/>
+              <w:jc w:val="left"/>
+            </w:pPr>
+            <w:r>
+              <w:rPr>
+                <w:b w:val="0"/>
+                <w:i w:val="0"/>
+                <w:smallCaps w:val="0"/>
+                <w:sz w:val="16"/>
+              </w:rPr>
+              <w:t>Persistence</w:t>
+            </w:r>
+          </w:p>
+        </w:tc>
+        <w:tc>
+          <w:tcPr>
+            <w:tcW w:type="dxa" w:w="2982"/>
+          </w:tcPr>
+          <w:p>
+            <w:pPr>
+              <w:keepNext/>
+              <w:spacing w:before="0" w:after="0"/>
+              <w:jc w:val="center"/>
+            </w:pPr>
+            <w:r>
+              <w:rPr>
+                <w:b w:val="0"/>
+                <w:i w:val="0"/>
+                <w:smallCaps w:val="0"/>
+                <w:sz w:val="16"/>
+              </w:rPr>
+              <w:t>93.7 / 86.3 / 69.2</w:t>
+            </w:r>
+          </w:p>
+        </w:tc>
+        <w:tc>
+          <w:tcPr>
+            <w:tcW w:type="dxa" w:w="2982"/>
+          </w:tcPr>
+          <w:p>
+            <w:pPr>
+              <w:keepNext/>
+              <w:spacing w:before="0" w:after="0"/>
+              <w:jc w:val="center"/>
+            </w:pPr>
+            <w:r>
+              <w:rPr>
+                <w:b w:val="0"/>
+                <w:i w:val="0"/>
+                <w:smallCaps w:val="0"/>
+                <w:sz w:val="16"/>
+              </w:rPr>
+              <w:t>93.7 / 86.3 / 69.2</w:t>
+            </w:r>
+          </w:p>
+        </w:tc>
+      </w:tr>
+      <w:tr>
+        <w:trPr>
+          <w:cantSplit/>
+        </w:trPr>
+        <w:tc>
+          <w:tcPr>
+            <w:tcW w:type="dxa" w:w="1443"/>
+          </w:tcPr>
+          <w:p>
+            <w:pPr>
+              <w:keepNext/>
+              <w:spacing w:before="0" w:after="0"/>
+              <w:jc w:val="left"/>
+            </w:pPr>
+            <w:r>
+              <w:rPr>
+                <w:b w:val="0"/>
+                <w:i w:val="0"/>
+                <w:smallCaps w:val="0"/>
+                <w:sz w:val="16"/>
+              </w:rPr>
+              <w:t>t+1</w:t>
+            </w:r>
+          </w:p>
+        </w:tc>
+        <w:tc>
+          <w:tcPr>
+            <w:tcW w:type="dxa" w:w="2673"/>
+          </w:tcPr>
+          <w:p>
+            <w:pPr>
+              <w:keepNext/>
+              <w:spacing w:before="0" w:after="0"/>
+              <w:jc w:val="left"/>
+            </w:pPr>
+            <w:r>
+              <w:rPr>
+                <w:b w:val="0"/>
+                <w:i w:val="0"/>
+                <w:smallCaps w:val="0"/>
+                <w:sz w:val="16"/>
+              </w:rPr>
+              <w:t>RF + sweep prior</w:t>
+            </w:r>
+          </w:p>
+        </w:tc>
+        <w:tc>
+          <w:tcPr>
+            <w:tcW w:type="dxa" w:w="2982"/>
+          </w:tcPr>
+          <w:p>
+            <w:pPr>
+              <w:keepNext/>
+              <w:spacing w:before="0" w:after="0"/>
+              <w:jc w:val="center"/>
+            </w:pPr>
+            <w:r>
+              <w:rPr>
+                <w:b w:val="0"/>
+                <w:i w:val="0"/>
+                <w:smallCaps w:val="0"/>
+                <w:sz w:val="16"/>
+              </w:rPr>
+              <w:t>93.7 / 86.7 / 70.4</w:t>
+            </w:r>
+          </w:p>
+        </w:tc>
+        <w:tc>
+          <w:tcPr>
+            <w:tcW w:type="dxa" w:w="2982"/>
+          </w:tcPr>
+          <w:p>
+            <w:pPr>
+              <w:keepNext/>
+              <w:spacing w:before="0" w:after="0"/>
+              <w:jc w:val="center"/>
+            </w:pPr>
+            <w:r>
+              <w:rPr>
+                <w:b w:val="0"/>
+                <w:i w:val="0"/>
+                <w:smallCaps w:val="0"/>
+                <w:sz w:val="16"/>
+              </w:rPr>
+              <w:t>94.0 / 85.9 / 71.0</w:t>
+            </w:r>
+          </w:p>
+        </w:tc>
+      </w:tr>
+      <w:tr>
+        <w:trPr>
+          <w:cantSplit/>
+        </w:trPr>
+        <w:tc>
+          <w:tcPr>
+            <w:tcW w:type="dxa" w:w="1443"/>
+          </w:tcPr>
+          <w:p>
+            <w:pPr>
+              <w:keepNext/>
+              <w:spacing w:before="0" w:after="0"/>
+              <w:jc w:val="left"/>
+            </w:pPr>
+            <w:r>
+              <w:rPr>
+                <w:b w:val="0"/>
+                <w:i w:val="0"/>
+                <w:smallCaps w:val="0"/>
+                <w:sz w:val="16"/>
+              </w:rPr>
+              <w:t>t+1</w:t>
+            </w:r>
+          </w:p>
+        </w:tc>
+        <w:tc>
+          <w:tcPr>
+            <w:tcW w:type="dxa" w:w="2673"/>
+          </w:tcPr>
+          <w:p>
+            <w:pPr>
+              <w:keepNext/>
+              <w:spacing w:before="0" w:after="0"/>
+              <w:jc w:val="left"/>
+            </w:pPr>
+            <w:r>
+              <w:rPr>
+                <w:b w:val="0"/>
+                <w:i w:val="0"/>
+                <w:smallCaps w:val="0"/>
+                <w:sz w:val="16"/>
+              </w:rPr>
+              <w:t>GRU, soft target</w:t>
+            </w:r>
+          </w:p>
+        </w:tc>
+        <w:tc>
+          <w:tcPr>
+            <w:tcW w:type="dxa" w:w="2982"/>
+          </w:tcPr>
+          <w:p>
+            <w:pPr>
+              <w:keepNext/>
+              <w:spacing w:before="0" w:after="0"/>
+              <w:jc w:val="center"/>
+            </w:pPr>
+            <w:r>
+              <w:rPr>
+                <w:b w:val="0"/>
+                <w:i w:val="0"/>
+                <w:smallCaps w:val="0"/>
+                <w:sz w:val="16"/>
+              </w:rPr>
+              <w:t>95.6 / 89.2 / 70.9</w:t>
+            </w:r>
+          </w:p>
+        </w:tc>
+        <w:tc>
+          <w:tcPr>
+            <w:tcW w:type="dxa" w:w="2982"/>
+          </w:tcPr>
+          <w:p>
+            <w:pPr>
+              <w:keepNext/>
+              <w:spacing w:before="0" w:after="0"/>
+              <w:jc w:val="center"/>
+            </w:pPr>
+            <w:r>
+              <w:rPr>
+                <w:b w:val="0"/>
+                <w:i w:val="0"/>
+                <w:smallCaps w:val="0"/>
+                <w:sz w:val="16"/>
+              </w:rPr>
+              <w:t>94.8 / 88.0 / 70.0</w:t>
+            </w:r>
+          </w:p>
+        </w:tc>
+      </w:tr>
+      <w:tr>
+        <w:trPr>
+          <w:cantSplit/>
+        </w:trPr>
+        <w:tc>
+          <w:tcPr>
+            <w:tcW w:type="dxa" w:w="1443"/>
+          </w:tcPr>
+          <w:p>
+            <w:pPr>
+              <w:keepNext/>
+              <w:spacing w:before="0" w:after="0"/>
+              <w:jc w:val="left"/>
+            </w:pPr>
+            <w:r>
+              <w:rPr>
+                <w:b w:val="0"/>
+                <w:i w:val="0"/>
+                <w:smallCaps w:val="0"/>
+                <w:sz w:val="16"/>
+              </w:rPr>
+              <w:t>t+1</w:t>
+            </w:r>
+          </w:p>
+        </w:tc>
+        <w:tc>
+          <w:tcPr>
+            <w:tcW w:type="dxa" w:w="2673"/>
+          </w:tcPr>
+          <w:p>
+            <w:pPr>
+              <w:keepNext/>
+              <w:spacing w:before="0" w:after="0"/>
+              <w:jc w:val="left"/>
+            </w:pPr>
+            <w:r>
+              <w:rPr>
+                <w:b w:val="0"/>
+                <w:i w:val="0"/>
+                <w:smallCaps w:val="0"/>
+                <w:sz w:val="16"/>
+              </w:rPr>
+              <w:t>GRU ensemble</w:t>
+            </w:r>
+          </w:p>
+        </w:tc>
+        <w:tc>
+          <w:tcPr>
+            <w:tcW w:type="dxa" w:w="2982"/>
+          </w:tcPr>
+          <w:p>
+            <w:pPr>
+              <w:keepNext/>
+              <w:spacing w:before="0" w:after="0"/>
+              <w:jc w:val="center"/>
+            </w:pPr>
+            <w:r>
+              <w:rPr>
+                <w:b/>
+                <w:i w:val="0"/>
+                <w:smallCaps w:val="0"/>
+                <w:sz w:val="16"/>
+              </w:rPr>
+              <w:t>96.4 / 91.7 / 72.1</w:t>
+            </w:r>
+          </w:p>
+        </w:tc>
+        <w:tc>
+          <w:tcPr>
+            <w:tcW w:type="dxa" w:w="2982"/>
+          </w:tcPr>
+          <w:p>
+            <w:pPr>
+              <w:keepNext/>
+              <w:spacing w:before="0" w:after="0"/>
+              <w:jc w:val="center"/>
+            </w:pPr>
+            <w:r>
+              <w:rPr>
+                <w:b/>
+                <w:i w:val="0"/>
+                <w:smallCaps w:val="0"/>
+                <w:sz w:val="16"/>
+              </w:rPr>
+              <w:t>96.5 / 91.6 / 72.2</w:t>
+            </w:r>
+          </w:p>
+        </w:tc>
+      </w:tr>
+      <w:tr>
+        <w:trPr>
+          <w:cantSplit/>
+        </w:trPr>
+        <w:tc>
+          <w:tcPr>
+            <w:tcW w:type="dxa" w:w="1443"/>
+          </w:tcPr>
+          <w:p>
+            <w:pPr>
+              <w:keepNext/>
+              <w:spacing w:before="0" w:after="0"/>
+              <w:jc w:val="left"/>
+            </w:pPr>
+            <w:r>
+              <w:rPr>
+                <w:b w:val="0"/>
+                <w:i w:val="0"/>
+                <w:smallCaps w:val="0"/>
+                <w:sz w:val="16"/>
+              </w:rPr>
+              <w:t>t+3</w:t>
+            </w:r>
+          </w:p>
+        </w:tc>
+        <w:tc>
+          <w:tcPr>
+            <w:tcW w:type="dxa" w:w="2673"/>
+          </w:tcPr>
+          <w:p>
+            <w:pPr>
+              <w:keepNext/>
+              <w:spacing w:before="0" w:after="0"/>
+              <w:jc w:val="left"/>
+            </w:pPr>
+            <w:r>
+              <w:rPr>
+                <w:b w:val="0"/>
+                <w:i w:val="0"/>
+                <w:smallCaps w:val="0"/>
+                <w:sz w:val="16"/>
+              </w:rPr>
+              <w:t>Persistence</w:t>
+            </w:r>
+          </w:p>
+        </w:tc>
+        <w:tc>
+          <w:tcPr>
+            <w:tcW w:type="dxa" w:w="2982"/>
+          </w:tcPr>
+          <w:p>
+            <w:pPr>
+              <w:keepNext/>
+              <w:spacing w:before="0" w:after="0"/>
+              <w:jc w:val="center"/>
+            </w:pPr>
+            <w:r>
+              <w:rPr>
+                <w:b w:val="0"/>
+                <w:i w:val="0"/>
+                <w:smallCaps w:val="0"/>
+                <w:sz w:val="16"/>
+              </w:rPr>
+              <w:t>78.1 / 66.1 / 53.3</w:t>
+            </w:r>
+          </w:p>
+        </w:tc>
+        <w:tc>
+          <w:tcPr>
+            <w:tcW w:type="dxa" w:w="2982"/>
+          </w:tcPr>
+          <w:p>
+            <w:pPr>
+              <w:keepNext/>
+              <w:spacing w:before="0" w:after="0"/>
+              <w:jc w:val="center"/>
+            </w:pPr>
+            <w:r>
+              <w:rPr>
+                <w:b w:val="0"/>
+                <w:i w:val="0"/>
+                <w:smallCaps w:val="0"/>
+                <w:sz w:val="16"/>
+              </w:rPr>
+              <w:t>78.1 / 66.1 / 53.3</w:t>
+            </w:r>
+          </w:p>
+        </w:tc>
+      </w:tr>
+      <w:tr>
+        <w:trPr>
+          <w:cantSplit/>
+        </w:trPr>
+        <w:tc>
+          <w:tcPr>
+            <w:tcW w:type="dxa" w:w="1443"/>
+          </w:tcPr>
+          <w:p>
+            <w:pPr>
+              <w:keepNext/>
+              <w:spacing w:before="0" w:after="0"/>
+              <w:jc w:val="left"/>
+            </w:pPr>
+            <w:r>
+              <w:rPr>
+                <w:b w:val="0"/>
+                <w:i w:val="0"/>
+                <w:smallCaps w:val="0"/>
+                <w:sz w:val="16"/>
+              </w:rPr>
+              <w:t>t+3</w:t>
+            </w:r>
+          </w:p>
+        </w:tc>
+        <w:tc>
+          <w:tcPr>
+            <w:tcW w:type="dxa" w:w="2673"/>
+          </w:tcPr>
+          <w:p>
+            <w:pPr>
+              <w:keepNext/>
+              <w:spacing w:before="0" w:after="0"/>
+              <w:jc w:val="left"/>
+            </w:pPr>
+            <w:r>
+              <w:rPr>
+                <w:b w:val="0"/>
+                <w:i w:val="0"/>
+                <w:smallCaps w:val="0"/>
+                <w:sz w:val="16"/>
+              </w:rPr>
+              <w:t>RF + sweep prior</w:t>
+            </w:r>
+          </w:p>
+        </w:tc>
+        <w:tc>
+          <w:tcPr>
+            <w:tcW w:type="dxa" w:w="2982"/>
+          </w:tcPr>
+          <w:p>
+            <w:pPr>
+              <w:keepNext/>
+              <w:spacing w:before="0" w:after="0"/>
+              <w:jc w:val="center"/>
+            </w:pPr>
+            <w:r>
+              <w:rPr>
+                <w:b w:val="0"/>
+                <w:i w:val="0"/>
+                <w:smallCaps w:val="0"/>
+                <w:sz w:val="16"/>
+              </w:rPr>
+              <w:t>78.5 / 63.0 / 53.9</w:t>
+            </w:r>
+          </w:p>
+        </w:tc>
+        <w:tc>
+          <w:tcPr>
+            <w:tcW w:type="dxa" w:w="2982"/>
+          </w:tcPr>
+          <w:p>
+            <w:pPr>
+              <w:keepNext/>
+              <w:spacing w:before="0" w:after="0"/>
+              <w:jc w:val="center"/>
+            </w:pPr>
+            <w:r>
+              <w:rPr>
+                <w:b w:val="0"/>
+                <w:i w:val="0"/>
+                <w:smallCaps w:val="0"/>
+                <w:sz w:val="16"/>
+              </w:rPr>
+              <w:t>82.7 / 65.3 / 57.6</w:t>
+            </w:r>
+          </w:p>
+        </w:tc>
+      </w:tr>
+      <w:tr>
+        <w:trPr>
+          <w:cantSplit/>
+        </w:trPr>
+        <w:tc>
+          <w:tcPr>
+            <w:tcW w:type="dxa" w:w="1443"/>
+          </w:tcPr>
+          <w:p>
+            <w:pPr>
+              <w:keepNext/>
+              <w:spacing w:before="0" w:after="0"/>
+              <w:jc w:val="left"/>
+            </w:pPr>
+            <w:r>
+              <w:rPr>
+                <w:b w:val="0"/>
+                <w:i w:val="0"/>
+                <w:smallCaps w:val="0"/>
+                <w:sz w:val="16"/>
+              </w:rPr>
+              <w:t>t+3</w:t>
+            </w:r>
+          </w:p>
+        </w:tc>
+        <w:tc>
+          <w:tcPr>
+            <w:tcW w:type="dxa" w:w="2673"/>
+          </w:tcPr>
+          <w:p>
+            <w:pPr>
+              <w:keepNext/>
+              <w:spacing w:before="0" w:after="0"/>
+              <w:jc w:val="left"/>
+            </w:pPr>
+            <w:r>
+              <w:rPr>
+                <w:b w:val="0"/>
+                <w:i w:val="0"/>
+                <w:smallCaps w:val="0"/>
+                <w:sz w:val="16"/>
+              </w:rPr>
+              <w:t>GRU, soft target</w:t>
+            </w:r>
+          </w:p>
+        </w:tc>
+        <w:tc>
+          <w:tcPr>
+            <w:tcW w:type="dxa" w:w="2982"/>
+          </w:tcPr>
+          <w:p>
+            <w:pPr>
+              <w:keepNext/>
+              <w:spacing w:before="0" w:after="0"/>
+              <w:jc w:val="center"/>
+            </w:pPr>
+            <w:r>
+              <w:rPr>
+                <w:b w:val="0"/>
+                <w:i w:val="0"/>
+                <w:smallCaps w:val="0"/>
+                <w:sz w:val="16"/>
+              </w:rPr>
+              <w:t>81.1 / 65.8 / 55.3</w:t>
+            </w:r>
+          </w:p>
+        </w:tc>
+        <w:tc>
+          <w:tcPr>
+            <w:tcW w:type="dxa" w:w="2982"/>
+          </w:tcPr>
+          <w:p>
+            <w:pPr>
+              <w:keepNext/>
+              <w:spacing w:before="0" w:after="0"/>
+              <w:jc w:val="center"/>
+            </w:pPr>
+            <w:r>
+              <w:rPr>
+                <w:b w:val="0"/>
+                <w:i w:val="0"/>
+                <w:smallCaps w:val="0"/>
+                <w:sz w:val="16"/>
+              </w:rPr>
+              <w:t>83.2 / 69.7 / 56.4</w:t>
+            </w:r>
+          </w:p>
+        </w:tc>
+      </w:tr>
+      <w:tr>
+        <w:trPr>
+          <w:cantSplit/>
+        </w:trPr>
+        <w:tc>
+          <w:tcPr>
+            <w:tcW w:type="dxa" w:w="1443"/>
+          </w:tcPr>
+          <w:p>
+            <w:pPr>
+              <w:keepNext w:val="0"/>
+              <w:spacing w:before="0" w:after="0"/>
+              <w:jc w:val="left"/>
+            </w:pPr>
+            <w:r>
+              <w:rPr>
+                <w:b w:val="0"/>
+                <w:i w:val="0"/>
+                <w:smallCaps w:val="0"/>
+                <w:sz w:val="16"/>
+              </w:rPr>
+              <w:t>t+3</w:t>
+            </w:r>
+          </w:p>
+        </w:tc>
+        <w:tc>
+          <w:tcPr>
+            <w:tcW w:type="dxa" w:w="2673"/>
+          </w:tcPr>
+          <w:p>
+            <w:pPr>
+              <w:keepNext w:val="0"/>
+              <w:spacing w:before="0" w:after="0"/>
+              <w:jc w:val="left"/>
+            </w:pPr>
+            <w:r>
+              <w:rPr>
+                <w:b w:val="0"/>
+                <w:i w:val="0"/>
+                <w:smallCaps w:val="0"/>
+                <w:sz w:val="16"/>
+              </w:rPr>
+              <w:t>GRU ensemble</w:t>
+            </w:r>
+          </w:p>
+        </w:tc>
+        <w:tc>
+          <w:tcPr>
+            <w:tcW w:type="dxa" w:w="2982"/>
+          </w:tcPr>
+          <w:p>
+            <w:pPr>
+              <w:keepNext w:val="0"/>
+              <w:spacing w:before="0" w:after="0"/>
+              <w:jc w:val="center"/>
+            </w:pPr>
+            <w:r>
+              <w:rPr>
+                <w:b/>
+                <w:i w:val="0"/>
+                <w:smallCaps w:val="0"/>
+                <w:sz w:val="16"/>
+              </w:rPr>
+              <w:t>86.0 / 75.5 / 56.7</w:t>
+            </w:r>
+          </w:p>
+        </w:tc>
+        <w:tc>
+          <w:tcPr>
+            <w:tcW w:type="dxa" w:w="2982"/>
+          </w:tcPr>
+          <w:p>
+            <w:pPr>
+              <w:keepNext w:val="0"/>
+              <w:spacing w:before="0" w:after="0"/>
+              <w:jc w:val="center"/>
+            </w:pPr>
+            <w:r>
+              <w:rPr>
+                <w:b/>
+                <w:i w:val="0"/>
+                <w:smallCaps w:val="0"/>
+                <w:sz w:val="16"/>
+              </w:rPr>
+              <w:t>87.2 / 79.3 / 57.8</w:t>
+            </w:r>
+          </w:p>
+        </w:tc>
+      </w:tr>
+    </w:tbl>
+    <w:p>
+      <w:pPr>
+        <w:keepNext w:val="0"/>
+        <w:spacing w:before="0" w:after="120"/>
+        <w:jc w:val="both"/>
+      </w:pPr>
+    </w:p>
+    <w:p>
+      <w:pPr>
+        <w:sectPr>
+          <w:type w:val="continuous"/>
+          <w:pgSz w:w="12240" w:h="15840"/>
+          <w:pgMar w:top="1080" w:right="900" w:bottom="1440" w:left="900" w:header="720" w:footer="720" w:gutter="0"/>
+          <w:cols w:space="360" w:num="1"/>
+          <w:docGrid w:linePitch="360"/>
+        </w:sectPr>
+      </w:pPr>
+    </w:p>
+    <w:p>
+      <w:pPr>
+        <w:sectPr>
+          <w:type w:val="continuous"/>
+          <w:pgSz w:w="12240" w:h="15840"/>
+          <w:pgMar w:top="1080" w:right="900" w:bottom="1440" w:left="900" w:header="720" w:footer="720" w:gutter="0"/>
+          <w:cols w:space="360" w:num="2"/>
+          <w:docGrid w:linePitch="360"/>
+        </w:sectPr>
+      </w:pPr>
+    </w:p>
+    <w:tbl>
+      <w:tblPr>
+        <w:tblW w:type="auto" w:w="0"/>
+        <w:jc w:val="center"/>
+        <w:tblLook w:firstColumn="1" w:firstRow="1" w:lastColumn="0" w:lastRow="0" w:noHBand="0" w:noVBand="1" w:val="04A0"/>
+      </w:tblPr>
+      <w:tblGrid>
+        <w:gridCol w:w="10440"/>
+      </w:tblGrid>
+      <w:tr>
+        <w:trPr>
+          <w:cantSplit/>
+        </w:trPr>
+        <w:tc>
+          <w:tcPr>
+            <w:tcW w:type="dxa" w:w="10440"/>
+          </w:tcPr>
+          <w:p>
+            <w:pPr>
+              <w:keepNext w:val="0"/>
+              <w:spacing w:before="80" w:after="0"/>
+              <w:jc w:val="center"/>
+            </w:pPr>
+            <w:r>
+              <w:drawing>
+                <wp:inline xmlns:a="http://schemas.openxmlformats.org/drawingml/2006/main" xmlns:pic="http://schemas.openxmlformats.org/drawingml/2006/picture">
+                  <wp:extent cx="5943600" cy="1767708"/>
+                  <wp:docPr id="7" name="Picture 7"/>
+                  <wp:cNvGraphicFramePr>
+                    <a:graphicFrameLocks noChangeAspect="1"/>
+                  </wp:cNvGraphicFramePr>
+                  <a:graphic>
+                    <a:graphicData uri="http://schemas.openxmlformats.org/drawingml/2006/picture">
+                      <pic:pic>
+                        <pic:nvPicPr>
+                          <pic:cNvPr id="0" name="fig_gps.png"/>
+                          <pic:cNvPicPr/>
+                        </pic:nvPicPr>
+                        <pic:blipFill>
+                          <a:blip r:embed="rId15"/>
+                          <a:stretch>
+                            <a:fillRect/>
+                          </a:stretch>
+                        </pic:blipFill>
+                        <pic:spPr>
+                          <a:xfrm>
+                            <a:off x="0" y="0"/>
+                            <a:ext cx="5943600" cy="1767708"/>
+                          </a:xfrm>
+                          <a:prstGeom prst="rect"/>
+                        </pic:spPr>
+                      </pic:pic>
+                    </a:graphicData>
+                  </a:graphic>
+                </wp:inline>
+              </w:drawing>
+            </w:r>
+          </w:p>
+          <w:p>
+            <w:pPr>
+              <w:keepNext w:val="0"/>
+              <w:spacing w:before="0" w:after="120"/>
+              <w:jc w:val="center"/>
+            </w:pPr>
+            <w:r>
+              <w:rPr>
+                <w:b w:val="0"/>
+                <w:i w:val="0"/>
+                <w:smallCaps w:val="0"/>
+                <w:sz w:val="16"/>
+              </w:rPr>
+              <w:t xml:space="preserve">Fig. 7. </w:t>
+            </w:r>
+            <w:r>
+              <w:rPr>
+                <w:b w:val="0"/>
+                <w:i w:val="0"/>
+                <w:smallCaps w:val="0"/>
+                <w:sz w:val="16"/>
+              </w:rPr>
+              <w:t>Blind within-noise accuracy with power sweeps only (circles) and with UAV GPS and kinematics added (squares); labels give the change in points.</w:t>
+            </w:r>
+          </w:p>
+        </w:tc>
+      </w:tr>
+    </w:tbl>
+    <w:p>
+      <w:pPr>
+        <w:keepNext w:val="0"/>
+        <w:spacing w:before="0" w:after="40"/>
+        <w:jc w:val="both"/>
+      </w:pPr>
+    </w:p>
+    <w:p>
+      <w:pPr>
+        <w:sectPr>
+          <w:type w:val="continuous"/>
+          <w:pgSz w:w="12240" w:h="15840"/>
+          <w:pgMar w:top="1080" w:right="900" w:bottom="1440" w:left="900" w:header="720" w:footer="720" w:gutter="0"/>
+          <w:cols w:space="360" w:num="1"/>
+          <w:docGrid w:linePitch="360"/>
+        </w:sectPr>
+      </w:pPr>
+    </w:p>
+    <w:p>
+      <w:pPr>
         <w:keepNext/>
         <w:spacing w:before="160" w:after="80"/>
         <w:jc w:val="center"/>
@@ -12209,7 +13263,7 @@
           <w:smallCaps w:val="0"/>
           <w:sz w:val="20"/>
         </w:rPr>
-        <w:t xml:space="preserve"> Saleh and coupling coefficients are literature values, not measurements of a 60 GHz PA or RIS; Table II bounds the effect of the coupling strength. The obliquity exponent is assumed. The physical-layer results are simulated; the beam-prediction results use power sweeps only, because the UAV GPS files of Scenario 23 were not available to us at the time of writing. The all-class macro-F1 at t + 3 (0.929) is limited by beams seen only once; more flights, not a different model, are needed to estimate it reliably. The latency model uses standard 5G NR FR2 timing, not the testbed's own sweep timing. The Table VIII figures are open-loop (they assume full-sweep history); Table IX gives the closed-loop figures. Effective spectral efficiency is reported at nominal SNRs because the dataset's powers are unitless. The D-band transceiver values are representative published figures, not a specific design.</w:t>
+        <w:t xml:space="preserve"> Saleh and coupling coefficients are literature values, not measurements of a 60 GHz PA or RIS; Table II bounds the effect of the coupling strength. The obliquity exponent is assumed. The physical-layer results are simulated; the beam-prediction results use power sweeps only except in Table XI, where UAV position adds 1–4 points at t + 3; the UAV height channel's unit is not documented consistently. The all-class macro-F1 at t + 3 (0.929) is limited by beams seen only once; more flights, not a different model, are needed to estimate it reliably. The latency model uses standard 5G NR FR2 timing, not the testbed's own sweep timing. The Table VIII figures are open-loop (they assume full-sweep history); Table IX gives the closed-loop figures. Effective spectral efficiency is reported at nominal SNRs because the dataset's powers are unitless. The D-band transceiver values are representative published figures, not a specific design.</w:t>
       </w:r>
     </w:p>
     <w:p>
@@ -12242,7 +13296,7 @@
           <w:smallCaps w:val="0"/>
           <w:sz w:val="20"/>
         </w:rPr>
-        <w:t>We built a hardware-aware model of an RIS-assisted mmWave UAV link and used it, with real 60 GHz measurements, to evaluate beam management end to end. Hardware impairments cost 7.8 dB and 2.25× RIS elements at 60 GHz, and D-band transceiver limits push the 140 GHz panel to 32 cm; a position-parametric estimator matches perfect channel knowledge with 64× fewer pilots; Kalman-based prediction preserves 99.3% of the array gain at 500 ms latency; and AI-assisted reduced beam training with a learned beam-tie graph selects the exact optimal beam 99.3% of the time given full-sweep history and 97.2–99.3% in a closed-loop replay of every flight, with 1.05–1.31 ms of beam training per decision instead of 5 ms; deep sequence models trained on measured-only data did not improve on it at equal budget. All reported metrics are evaluated under sequence-level cross-validation. Future work will add UAV position and camera input to beam prediction (the full Scenario 23 release), measured hardware coefficients, and paired per-flight significance tests between tracking policies.</w:t>
+        <w:t>We built a hardware-aware model of an RIS-assisted mmWave UAV link and used it, with real 60 GHz measurements, to evaluate beam management end to end. Hardware impairments cost 7.8 dB and 2.25× RIS elements at 60 GHz, and D-band transceiver limits push the 140 GHz panel to 32 cm; a position-parametric estimator matches perfect channel knowledge with 64× fewer pilots; Kalman-based prediction preserves 99.3% of the array gain at 500 ms latency; and AI-assisted reduced beam training with a learned beam-tie graph selects the exact optimal beam 99.3% of the time given full-sweep history and 97.2–99.3% in a closed-loop replay of every flight, with 1.05–1.31 ms of beam training per decision instead of 5 ms; deep sequence models trained on measured-only data did not improve on it at equal budget. All reported metrics are evaluated under sequence-level cross-validation. UAV position improves blind prediction at a 0.4 s horizon by 1–4 points. Future work will add camera input to beam prediction, measured hardware coefficients, and paired per-flight significance tests between tracking policies.</w:t>
       </w:r>
     </w:p>
     <w:p>

</xml_diff>

<commit_message>
Camera and GPS+camera side information, GPS-aided beam training, per-flight significance
- Paper: Table XI now four input sets (generated from fold means; fixes 89.2 -> 89.3),
  Table XII camera only, Table XIII and Fig. 8 per-flight tests, Fig. 7 redrawn
- Camera features lower blind accuracy significantly; GPS gain at t+3 not significant
- Beam training and conformal studies rerun on GPS-aided GRU ensemble
- Abstract, discussion, limitations, conclusion, reproducibility table updated

Co-Authored-By: Claude Opus 5.5 <noreply@anthropic.com>
</commit_message>
<xml_diff>
--- a/paper/revised_paper_ieee.docx
+++ b/paper/revised_paper_ieee.docx
@@ -115,7 +115,7 @@
           <w:smallCaps w:val="0"/>
           <w:sz w:val="18"/>
         </w:rPr>
-        <w:t>Millimetre-wave (mmWave) and sub-terahertz links can give unmanned aerial vehicles (UAVs) multi-gigabit connectivity, but narrow beams, high path loss and UAV mobility make beam management costly, and practical hardware departs from the ideal models most reconfigurable intelligent surface (RIS) studies assume. We present a hardware-aware framework for an RIS-assisted 60 GHz UAV link that models transmitter power-amplifier (PA) distortion through the Bussgang decomposition, RIS phase quantization, phase noise, amplitude–phase coupling and antenna mismatch, together with ITU-R P.676-13 gaseous absorption. On this model we show that (i) impairments cost 7.8 dB of SNDR, dominated by amplitude–phase coupling, so a realistic RIS needs about 2.25× more elements than an ideal one for full coverage of a 300 m flight; (ii) a position-parametric channel estimator reaches within 0.15 dB of perfect channel knowledge with 64× fewer pilots than per-element LMMSE, and needs no pilots when a 100 ms Kalman prediction is available; and (iii) predictive tracking delivers 99.3% of the ideal array gain at 500 ms latency, whereas persistence delivers 63%. On real 60 GHz measurements (DeepSense 6G Scenario 23) we show that exact blind beam prediction is bounded at 79% top-1 by measurement noise, and propose an AI-assisted reduced beam training scheme with a learned beam-tie graph. Given full-sweep history it selects the exact optimal beam 99.3% of the time at a 140 ms horizon (macro-F1 0.961 over all 56 beam classes) and 99.1% at 0.4 s. Replayed in closed loop, where the system knows only the beams it measured, tie-graph tracking selects the exact optimal beam 97.2–99.3% of the time with 1.05–1.31 ms of beam training per decision instead of 5 ms. Ten deep sequence models trained on the same measured-only data do not beat the tie graph at equal measurement budget, under sequence-level cross-validation.</w:t>
+        <w:t>Millimetre-wave (mmWave) and sub-terahertz links can give unmanned aerial vehicles (UAVs) multi-gigabit connectivity, but narrow beams, high path loss and UAV mobility make beam management costly, and practical hardware departs from the ideal models most reconfigurable intelligent surface (RIS) studies assume. We present a hardware-aware framework for an RIS-assisted 60 GHz UAV link that models transmitter power-amplifier (PA) distortion through the Bussgang decomposition, RIS phase quantization, phase noise, amplitude–phase coupling and antenna mismatch, together with ITU-R P.676-13 gaseous absorption. On this model we show that (i) impairments cost 7.8 dB of SNDR, dominated by amplitude–phase coupling, so a realistic RIS needs about 2.25× more elements than an ideal one for full coverage of a 300 m flight; (ii) a position-parametric channel estimator reaches within 0.15 dB of perfect channel knowledge with 64× fewer pilots than per-element LMMSE, and needs no pilots when a 100 ms Kalman prediction is available; and (iii) predictive tracking delivers 99.3% of the ideal array gain at 500 ms latency, whereas persistence delivers 63%. On real 60 GHz measurements (DeepSense 6G Scenario 23) we show that exact blind beam prediction is bounded at 79% top-1 by measurement noise, and propose an AI-assisted reduced beam training scheme with a learned beam-tie graph. Given full-sweep history it selects the exact optimal beam 99.3% of the time at a 140 ms horizon (macro-F1 0.961 over all 56 beam classes) and 99.1% at 0.4 s. Replayed in closed loop, where the system knows only the beams it measured, tie-graph tracking selects the exact optimal beam 97.2–99.3% of the time with 1.05–1.31 ms of beam training per decision instead of 5 ms, and per-flight tests confirm its spectral-efficiency gain over full sweeps on 32 of 33 flights. Ten deep sequence models trained on the same measured-only data do not beat the tie graph at equal measurement budget, and neither UAV position nor camera features significantly improve blind prediction, under sequence-level cross-validation.</w:t>
       </w:r>
     </w:p>
     <w:p>
@@ -296,7 +296,7 @@
         </w:rPr>
         <w:t>4)</w:t>
         <w:tab/>
-        <w:t>On real 60 GHz measurements, a proof that exact blind beam prediction is noise-limited, a GRU trained on a soft power target, a learned beam-tie graph, and an AI-assisted reduced beam training scheme meeting ≥ 95% exact top-1 and macro-F1, conformal shortlists calibrated to a target accuracy, a closed-loop replay of every flight in which the system knows only what it measured, and a matched-budget comparison of ten deep sequence models against the tie graph in that loop, evaluated with sequence-level cross-validation and bootstrap confidence intervals (Sec. V, VI-D).</w:t>
+        <w:t>On real 60 GHz measurements, a proof that exact blind beam prediction is noise-limited, a GRU trained on a soft power target, a learned beam-tie graph, and an AI-assisted reduced beam training scheme meeting ≥ 95% exact top-1 and macro-F1, conformal shortlists calibrated to a target accuracy, a closed-loop replay of every multi-sweep flight in which the system knows only what it measured, and a matched-budget comparison of ten deep sequence models against the tie graph in that loop, evaluated with sequence-level cross-validation and bootstrap confidence intervals (Sec. V, VI-D).</w:t>
       </w:r>
     </w:p>
     <w:p>
@@ -1711,6 +1711,23 @@
     </w:p>
     <w:p>
       <w:pPr>
+        <w:keepNext w:val="0"/>
+        <w:spacing w:before="0" w:after="0"/>
+        <w:ind w:firstLine="288"/>
+        <w:jc w:val="both"/>
+      </w:pPr>
+      <w:r>
+        <w:rPr>
+          <w:b w:val="0"/>
+          <w:i w:val="0"/>
+          <w:smallCaps w:val="0"/>
+          <w:sz w:val="20"/>
+        </w:rPr>
+        <w:t>Comparisons between two methods are tested per flight, the unit of replication, because samples within a flight are strongly correlated: we report the pooled difference with a 95% CI from a paired bootstrap over flights (5000 resamples) and the Wilcoxon signed-rank test on per-flight differences, Holm-corrected within each family of comparisons.</w:t>
+      </w:r>
+    </w:p>
+    <w:p>
+      <w:pPr>
         <w:keepNext/>
         <w:spacing w:before="80" w:after="40"/>
         <w:jc w:val="left"/>
@@ -2091,7 +2108,7 @@
           <w:smallCaps w:val="0"/>
           <w:sz w:val="20"/>
         </w:rPr>
-        <w:t xml:space="preserve"> The schemes above build each shortlist from full sweeps of earlier steps, which a system measuring only K beams per step never has. We therefore replay every flight step by step with policies that know only the beams they measured: the current beam, its ±1 index neighbours and its M strongest tie-graph partners (fitted on other folds' flights), with a full sweep every N steps or only on beam loss (best measured power more than 3 dB below the current beam's last value). The effective spectral efficiency over each interval is (1 − T</w:t>
+        <w:t xml:space="preserve"> The schemes above build each shortlist from full sweeps of earlier steps, which a system measuring only K beams per step never has. We therefore replay every flight with more than one sweep (33 of 35) step by step with policies that know only the beams they measured: the current beam, its ±1 index neighbours and its M strongest tie-graph partners (fitted on other folds' flights), with a full sweep every N steps or only on beam loss (best measured power more than 3 dB below the current beam's last value). The effective spectral efficiency over each interval is (1 − T</w:t>
       </w:r>
       <w:r>
         <w:rPr>
@@ -6739,7 +6756,7 @@
                 <w:smallCaps w:val="0"/>
                 <w:sz w:val="16"/>
               </w:rPr>
-              <w:t>0.49</w:t>
+              <w:t>0.48</w:t>
             </w:r>
           </w:p>
         </w:tc>
@@ -9447,7 +9464,7 @@
           <w:smallCaps/>
           <w:sz w:val="16"/>
         </w:rPr>
-        <w:t>Closed-loop replay of all 35 flights (each policy knows only what it measured). Latency: mean beam-training time per decision. SE: effective spectral efficiency as % of a genie that always uses the best beam with no training time, at nominal best-beam SNR of 0 / 10 / 20 dB</w:t>
+        <w:t>Closed-loop replay of the 33 flights with more than one sweep (flights 22 and 30 hold a single sweep) (each policy knows only what it measured). Latency: mean beam-training time per decision. SE: effective spectral efficiency as % of a genie that always uses the best beam with no training time, at nominal best-beam SNR of 0 / 10 / 20 dB</w:t>
       </w:r>
     </w:p>
     <w:tbl>
@@ -12106,7 +12123,7 @@
           <w:smallCaps w:val="0"/>
           <w:sz w:val="20"/>
         </w:rPr>
-        <w:t>Position-aided prediction</w:t>
+        <w:t>Position- and vision-aided prediction</w:t>
       </w:r>
       <w:r>
         <w:rPr>
@@ -12115,7 +12132,7 @@
           <w:smallCaps w:val="0"/>
           <w:sz w:val="20"/>
         </w:rPr>
-        <w:t xml:space="preserve"> (Table XI, Fig. 7). The full Scenario 23 release adds, for every sample, the UAV's GPS position, speed, velocity components, height, pitch and roll. We convert the GPS fix to east/north offsets from the base station and its bearing, append these and the raw kinematic channels to every step of each model's input window, and repeat the blind-prediction study with the same folds. All other tables use power sweeps only, so that they can be reproduced from the beam CSV shipped with the repository. The height channel ranges from 31 to 391 while the UAV–BS distance is at most 120 m, so its unit or reference is not documented consistently; the models standardise it, but we do not interpret it physically.</w:t>
+        <w:t xml:space="preserve"> (Tables XI–XII, Fig. 7). The full Scenario 23 release adds, for every sample, the UAV's GPS position, speed, velocity components, height, pitch and roll. We convert the GPS fix to east/north offsets from the base station and its bearing, append these and the raw kinematic channels to every step of each model's input window, and repeat the blind-prediction study with the same folds. All other tables use power sweeps only, so that they can be reproduced from the beam CSV shipped with the repository. The height channel ranges from 31 to 391 while the UAV–BS distance is at most 120 m, so its unit or reference is not documented consistently; the models standardise it, but we do not interpret it physically.</w:t>
       </w:r>
     </w:p>
     <w:p>
@@ -12132,7 +12149,41 @@
           <w:smallCaps w:val="0"/>
           <w:sz w:val="20"/>
         </w:rPr>
-        <w:t>Position helps when the prediction reaches further ahead. At t + 3, within-noise accuracy rises by 4.2 points for the random forest (78.5 → 82.7%), 2.1 for the soft-target GRU and 1.1 for the GRU ensemble (86.0 → 87.2%), whose class-balanced score rises from 75.5 to 79.3%. At t + 1 the change is −0.8 to +0.3 points: the last sweep already encodes where the UAV is. Exact top-1 moves by at most 3.7 points and stays far below the 79% noise ceiling, as it must.</w:t>
+        <w:t>The base station also records one 960 × 540 camera frame per sweep. We encode every frame with a ResNet-18 pretrained on ImageNet and kept frozen (input 224 × 398, 512-d global-pooled embedding), and use the embedding in two ways: alone, with a logistic-regression or one-hidden-layer MLP classifier fitted inside the same folds; and as side information, as a 16-component PCA of the embedding (fitted on all frames without labels, 79% of the variance) appended to every step like the GPS channels.</w:t>
+      </w:r>
+    </w:p>
+    <w:p>
+      <w:pPr>
+        <w:keepNext w:val="0"/>
+        <w:spacing w:before="0" w:after="0"/>
+        <w:ind w:firstLine="288"/>
+        <w:jc w:val="both"/>
+      </w:pPr>
+      <w:r>
+        <w:rPr>
+          <w:b w:val="0"/>
+          <w:i w:val="0"/>
+          <w:smallCaps w:val="0"/>
+          <w:sz w:val="20"/>
+        </w:rPr>
+        <w:t>Position helps when the prediction reaches further ahead. At t + 3, pooled within-noise accuracy rises by 4.2 points for the random forest (78.5 → 82.7%), 2.1 for the soft-target GRU and 1.1 for the GRU ensemble (86.0 → 87.2%), whose class-balanced score rises from 75.5 to 79.3%. At t + 1 the change is −0.8 to +0.3 points: the last sweep already encodes where the UAV is. For the GRU ensemble the t + 3 gain is not significant across flights (+1.1 points, 95% CI −0.1 to +2.4, 16 flights better and 11 worse, Holm p = 0.34; Table XIII), so the evidence for position is consistent but weak.</w:t>
+      </w:r>
+    </w:p>
+    <w:p>
+      <w:pPr>
+        <w:keepNext w:val="0"/>
+        <w:spacing w:before="0" w:after="0"/>
+        <w:ind w:firstLine="288"/>
+        <w:jc w:val="both"/>
+      </w:pPr>
+      <w:r>
+        <w:rPr>
+          <w:b w:val="0"/>
+          <w:i w:val="0"/>
+          <w:smallCaps w:val="0"/>
+          <w:sz w:val="20"/>
+        </w:rPr>
+        <w:t>The camera does not help. Alone, the frozen embedding identifies the current beam within noise 67.4% of the time (most frequent beam: 14.9%), so it carries real information about where the UAV is, but at t + 3 it reaches only 43.2% (Table XII). Appended to the power sweeps it lowers every model at both horizons; for the GRU ensemble at t + 3 by 5.6 points (worse on 23 of 33 flights, Holm p &lt; 10⁻⁴), and together with GPS it cancels the GPS gain (85.0% against 86.0% with power only). With 35 flights, 16 generic scene features let the models fit flight-specific appearance (lighting, background) that does not transfer to held-out flights; a detector that localises the UAV in the frame, which Scenario 23 does not label, would be needed to turn the image into a position. The encoder also costs 108 ms per frame on one CPU thread, close to the 142 ms sweep interval. Exact top-1 changes by −5.0 to +3.7 points across configurations and stays far below the 79% noise ceiling in all of them, as it must.</w:t>
       </w:r>
     </w:p>
     <w:p>
@@ -12175,7 +12226,7 @@
           <w:smallCaps/>
           <w:sz w:val="16"/>
         </w:rPr>
-        <w:t>Blind beam prediction with power sweeps only versus power plus UAV GPS and kinematics (GroupKFold over 35 sequences). Within noise / class-balanced within noise / exact top-1, in %</w:t>
+        <w:t>Blind beam prediction with power sweeps only and with UAV GPS and kinematics, camera features, or both (GroupKFold over 35 sequences, fold means). Within noise / class-balanced within noise / exact top-1, in %; bold: best side information per model</w:t>
       </w:r>
     </w:p>
     <w:tbl>
@@ -12194,10 +12245,12 @@
         </w:tblCellMar>
       </w:tblPr>
       <w:tblGrid>
-        <w:gridCol w:w="1442"/>
-        <w:gridCol w:w="2672"/>
-        <w:gridCol w:w="2982"/>
-        <w:gridCol w:w="2982"/>
+        <w:gridCol w:w="906"/>
+        <w:gridCol w:w="1679"/>
+        <w:gridCol w:w="1873"/>
+        <w:gridCol w:w="1873"/>
+        <w:gridCol w:w="1873"/>
+        <w:gridCol w:w="1873"/>
       </w:tblGrid>
       <w:tr>
         <w:trPr>
@@ -12205,7 +12258,7 @@
         </w:trPr>
         <w:tc>
           <w:tcPr>
-            <w:tcW w:type="dxa" w:w="1443"/>
+            <w:tcW w:type="dxa" w:w="906"/>
             <w:tcBorders>
               <w:bottom w:val="single" w:sz="4" w:color="000000"/>
             </w:tcBorders>
@@ -12229,7 +12282,7 @@
         </w:tc>
         <w:tc>
           <w:tcPr>
-            <w:tcW w:type="dxa" w:w="2673"/>
+            <w:tcW w:type="dxa" w:w="1679"/>
             <w:tcBorders>
               <w:bottom w:val="single" w:sz="4" w:color="000000"/>
             </w:tcBorders>
@@ -12253,7 +12306,7 @@
         </w:tc>
         <w:tc>
           <w:tcPr>
-            <w:tcW w:type="dxa" w:w="2982"/>
+            <w:tcW w:type="dxa" w:w="1874"/>
             <w:tcBorders>
               <w:bottom w:val="single" w:sz="4" w:color="000000"/>
             </w:tcBorders>
@@ -12277,7 +12330,7 @@
         </w:tc>
         <w:tc>
           <w:tcPr>
-            <w:tcW w:type="dxa" w:w="2982"/>
+            <w:tcW w:type="dxa" w:w="1874"/>
             <w:tcBorders>
               <w:bottom w:val="single" w:sz="4" w:color="000000"/>
             </w:tcBorders>
@@ -12295,7 +12348,55 @@
                 <w:smallCaps w:val="0"/>
                 <w:sz w:val="16"/>
               </w:rPr>
-              <w:t>Power + GPS</w:t>
+              <w:t>+ GPS</w:t>
+            </w:r>
+          </w:p>
+        </w:tc>
+        <w:tc>
+          <w:tcPr>
+            <w:tcW w:type="dxa" w:w="1874"/>
+            <w:tcBorders>
+              <w:bottom w:val="single" w:sz="4" w:color="000000"/>
+            </w:tcBorders>
+          </w:tcPr>
+          <w:p>
+            <w:pPr>
+              <w:keepNext/>
+              <w:spacing w:before="0" w:after="0"/>
+              <w:jc w:val="center"/>
+            </w:pPr>
+            <w:r>
+              <w:rPr>
+                <w:b/>
+                <w:i w:val="0"/>
+                <w:smallCaps w:val="0"/>
+                <w:sz w:val="16"/>
+              </w:rPr>
+              <w:t>+ camera</w:t>
+            </w:r>
+          </w:p>
+        </w:tc>
+        <w:tc>
+          <w:tcPr>
+            <w:tcW w:type="dxa" w:w="1874"/>
+            <w:tcBorders>
+              <w:bottom w:val="single" w:sz="4" w:color="000000"/>
+            </w:tcBorders>
+          </w:tcPr>
+          <w:p>
+            <w:pPr>
+              <w:keepNext/>
+              <w:spacing w:before="0" w:after="0"/>
+              <w:jc w:val="center"/>
+            </w:pPr>
+            <w:r>
+              <w:rPr>
+                <w:b/>
+                <w:i w:val="0"/>
+                <w:smallCaps w:val="0"/>
+                <w:sz w:val="16"/>
+              </w:rPr>
+              <w:t>+ GPS + camera</w:t>
             </w:r>
           </w:p>
         </w:tc>
@@ -12306,7 +12407,7 @@
         </w:trPr>
         <w:tc>
           <w:tcPr>
-            <w:tcW w:type="dxa" w:w="1443"/>
+            <w:tcW w:type="dxa" w:w="906"/>
           </w:tcPr>
           <w:p>
             <w:pPr>
@@ -12327,7 +12428,7 @@
         </w:tc>
         <w:tc>
           <w:tcPr>
-            <w:tcW w:type="dxa" w:w="2673"/>
+            <w:tcW w:type="dxa" w:w="1679"/>
           </w:tcPr>
           <w:p>
             <w:pPr>
@@ -12348,7 +12449,7 @@
         </w:tc>
         <w:tc>
           <w:tcPr>
-            <w:tcW w:type="dxa" w:w="2982"/>
+            <w:tcW w:type="dxa" w:w="1874"/>
           </w:tcPr>
           <w:p>
             <w:pPr>
@@ -12369,7 +12470,49 @@
         </w:tc>
         <w:tc>
           <w:tcPr>
-            <w:tcW w:type="dxa" w:w="2982"/>
+            <w:tcW w:type="dxa" w:w="1874"/>
+          </w:tcPr>
+          <w:p>
+            <w:pPr>
+              <w:keepNext/>
+              <w:spacing w:before="0" w:after="0"/>
+              <w:jc w:val="center"/>
+            </w:pPr>
+            <w:r>
+              <w:rPr>
+                <w:b w:val="0"/>
+                <w:i w:val="0"/>
+                <w:smallCaps w:val="0"/>
+                <w:sz w:val="16"/>
+              </w:rPr>
+              <w:t>93.7 / 86.3 / 69.2</w:t>
+            </w:r>
+          </w:p>
+        </w:tc>
+        <w:tc>
+          <w:tcPr>
+            <w:tcW w:type="dxa" w:w="1874"/>
+          </w:tcPr>
+          <w:p>
+            <w:pPr>
+              <w:keepNext/>
+              <w:spacing w:before="0" w:after="0"/>
+              <w:jc w:val="center"/>
+            </w:pPr>
+            <w:r>
+              <w:rPr>
+                <w:b w:val="0"/>
+                <w:i w:val="0"/>
+                <w:smallCaps w:val="0"/>
+                <w:sz w:val="16"/>
+              </w:rPr>
+              <w:t>93.7 / 86.3 / 69.2</w:t>
+            </w:r>
+          </w:p>
+        </w:tc>
+        <w:tc>
+          <w:tcPr>
+            <w:tcW w:type="dxa" w:w="1874"/>
           </w:tcPr>
           <w:p>
             <w:pPr>
@@ -12395,7 +12538,7 @@
         </w:trPr>
         <w:tc>
           <w:tcPr>
-            <w:tcW w:type="dxa" w:w="1443"/>
+            <w:tcW w:type="dxa" w:w="906"/>
           </w:tcPr>
           <w:p>
             <w:pPr>
@@ -12416,7 +12559,7 @@
         </w:tc>
         <w:tc>
           <w:tcPr>
-            <w:tcW w:type="dxa" w:w="2673"/>
+            <w:tcW w:type="dxa" w:w="1679"/>
           </w:tcPr>
           <w:p>
             <w:pPr>
@@ -12437,7 +12580,7 @@
         </w:tc>
         <w:tc>
           <w:tcPr>
-            <w:tcW w:type="dxa" w:w="2982"/>
+            <w:tcW w:type="dxa" w:w="1874"/>
           </w:tcPr>
           <w:p>
             <w:pPr>
@@ -12458,7 +12601,7 @@
         </w:tc>
         <w:tc>
           <w:tcPr>
-            <w:tcW w:type="dxa" w:w="2982"/>
+            <w:tcW w:type="dxa" w:w="1874"/>
           </w:tcPr>
           <w:p>
             <w:pPr>
@@ -12468,12 +12611,54 @@
             </w:pPr>
             <w:r>
               <w:rPr>
-                <w:b w:val="0"/>
+                <w:b/>
                 <w:i w:val="0"/>
                 <w:smallCaps w:val="0"/>
                 <w:sz w:val="16"/>
               </w:rPr>
               <w:t>94.0 / 85.9 / 71.0</w:t>
+            </w:r>
+          </w:p>
+        </w:tc>
+        <w:tc>
+          <w:tcPr>
+            <w:tcW w:type="dxa" w:w="1874"/>
+          </w:tcPr>
+          <w:p>
+            <w:pPr>
+              <w:keepNext/>
+              <w:spacing w:before="0" w:after="0"/>
+              <w:jc w:val="center"/>
+            </w:pPr>
+            <w:r>
+              <w:rPr>
+                <w:b w:val="0"/>
+                <w:i w:val="0"/>
+                <w:smallCaps w:val="0"/>
+                <w:sz w:val="16"/>
+              </w:rPr>
+              <w:t>93.1 / 84.4 / 69.7</w:t>
+            </w:r>
+          </w:p>
+        </w:tc>
+        <w:tc>
+          <w:tcPr>
+            <w:tcW w:type="dxa" w:w="1874"/>
+          </w:tcPr>
+          <w:p>
+            <w:pPr>
+              <w:keepNext/>
+              <w:spacing w:before="0" w:after="0"/>
+              <w:jc w:val="center"/>
+            </w:pPr>
+            <w:r>
+              <w:rPr>
+                <w:b w:val="0"/>
+                <w:i w:val="0"/>
+                <w:smallCaps w:val="0"/>
+                <w:sz w:val="16"/>
+              </w:rPr>
+              <w:t>93.7 / 85.4 / 70.1</w:t>
             </w:r>
           </w:p>
         </w:tc>
@@ -12484,7 +12669,7 @@
         </w:trPr>
         <w:tc>
           <w:tcPr>
-            <w:tcW w:type="dxa" w:w="1443"/>
+            <w:tcW w:type="dxa" w:w="906"/>
           </w:tcPr>
           <w:p>
             <w:pPr>
@@ -12505,7 +12690,7 @@
         </w:tc>
         <w:tc>
           <w:tcPr>
-            <w:tcW w:type="dxa" w:w="2673"/>
+            <w:tcW w:type="dxa" w:w="1679"/>
           </w:tcPr>
           <w:p>
             <w:pPr>
@@ -12526,7 +12711,7 @@
         </w:tc>
         <w:tc>
           <w:tcPr>
-            <w:tcW w:type="dxa" w:w="2982"/>
+            <w:tcW w:type="dxa" w:w="1874"/>
           </w:tcPr>
           <w:p>
             <w:pPr>
@@ -12536,18 +12721,18 @@
             </w:pPr>
             <w:r>
               <w:rPr>
-                <w:b w:val="0"/>
-                <w:i w:val="0"/>
-                <w:smallCaps w:val="0"/>
-                <w:sz w:val="16"/>
-              </w:rPr>
-              <w:t>95.6 / 89.2 / 70.9</w:t>
-            </w:r>
-          </w:p>
-        </w:tc>
-        <w:tc>
-          <w:tcPr>
-            <w:tcW w:type="dxa" w:w="2982"/>
+                <w:b/>
+                <w:i w:val="0"/>
+                <w:smallCaps w:val="0"/>
+                <w:sz w:val="16"/>
+              </w:rPr>
+              <w:t>95.6 / 89.3 / 70.9</w:t>
+            </w:r>
+          </w:p>
+        </w:tc>
+        <w:tc>
+          <w:tcPr>
+            <w:tcW w:type="dxa" w:w="1874"/>
           </w:tcPr>
           <w:p>
             <w:pPr>
@@ -12563,6 +12748,48 @@
                 <w:sz w:val="16"/>
               </w:rPr>
               <w:t>94.8 / 88.0 / 70.0</w:t>
+            </w:r>
+          </w:p>
+        </w:tc>
+        <w:tc>
+          <w:tcPr>
+            <w:tcW w:type="dxa" w:w="1874"/>
+          </w:tcPr>
+          <w:p>
+            <w:pPr>
+              <w:keepNext/>
+              <w:spacing w:before="0" w:after="0"/>
+              <w:jc w:val="center"/>
+            </w:pPr>
+            <w:r>
+              <w:rPr>
+                <w:b w:val="0"/>
+                <w:i w:val="0"/>
+                <w:smallCaps w:val="0"/>
+                <w:sz w:val="16"/>
+              </w:rPr>
+              <w:t>93.0 / 84.5 / 67.9</w:t>
+            </w:r>
+          </w:p>
+        </w:tc>
+        <w:tc>
+          <w:tcPr>
+            <w:tcW w:type="dxa" w:w="1874"/>
+          </w:tcPr>
+          <w:p>
+            <w:pPr>
+              <w:keepNext/>
+              <w:spacing w:before="0" w:after="0"/>
+              <w:jc w:val="center"/>
+            </w:pPr>
+            <w:r>
+              <w:rPr>
+                <w:b w:val="0"/>
+                <w:i w:val="0"/>
+                <w:smallCaps w:val="0"/>
+                <w:sz w:val="16"/>
+              </w:rPr>
+              <w:t>94.8 / 86.5 / 68.8</w:t>
             </w:r>
           </w:p>
         </w:tc>
@@ -12573,7 +12800,7 @@
         </w:trPr>
         <w:tc>
           <w:tcPr>
-            <w:tcW w:type="dxa" w:w="1443"/>
+            <w:tcW w:type="dxa" w:w="906"/>
           </w:tcPr>
           <w:p>
             <w:pPr>
@@ -12594,7 +12821,7 @@
         </w:tc>
         <w:tc>
           <w:tcPr>
-            <w:tcW w:type="dxa" w:w="2673"/>
+            <w:tcW w:type="dxa" w:w="1679"/>
           </w:tcPr>
           <w:p>
             <w:pPr>
@@ -12615,7 +12842,7 @@
         </w:tc>
         <w:tc>
           <w:tcPr>
-            <w:tcW w:type="dxa" w:w="2982"/>
+            <w:tcW w:type="dxa" w:w="1874"/>
           </w:tcPr>
           <w:p>
             <w:pPr>
@@ -12625,18 +12852,39 @@
             </w:pPr>
             <w:r>
               <w:rPr>
+                <w:b w:val="0"/>
+                <w:i w:val="0"/>
+                <w:smallCaps w:val="0"/>
+                <w:sz w:val="16"/>
+              </w:rPr>
+              <w:t>96.4 / 91.7 / 72.1</w:t>
+            </w:r>
+          </w:p>
+        </w:tc>
+        <w:tc>
+          <w:tcPr>
+            <w:tcW w:type="dxa" w:w="1874"/>
+          </w:tcPr>
+          <w:p>
+            <w:pPr>
+              <w:keepNext/>
+              <w:spacing w:before="0" w:after="0"/>
+              <w:jc w:val="center"/>
+            </w:pPr>
+            <w:r>
+              <w:rPr>
                 <w:b/>
                 <w:i w:val="0"/>
                 <w:smallCaps w:val="0"/>
                 <w:sz w:val="16"/>
               </w:rPr>
-              <w:t>96.4 / 91.7 / 72.1</w:t>
-            </w:r>
-          </w:p>
-        </w:tc>
-        <w:tc>
-          <w:tcPr>
-            <w:tcW w:type="dxa" w:w="2982"/>
+              <w:t>96.5 / 91.6 / 72.2</w:t>
+            </w:r>
+          </w:p>
+        </w:tc>
+        <w:tc>
+          <w:tcPr>
+            <w:tcW w:type="dxa" w:w="1874"/>
           </w:tcPr>
           <w:p>
             <w:pPr>
@@ -12646,12 +12894,33 @@
             </w:pPr>
             <w:r>
               <w:rPr>
-                <w:b/>
-                <w:i w:val="0"/>
-                <w:smallCaps w:val="0"/>
-                <w:sz w:val="16"/>
-              </w:rPr>
-              <w:t>96.5 / 91.6 / 72.2</w:t>
+                <w:b w:val="0"/>
+                <w:i w:val="0"/>
+                <w:smallCaps w:val="0"/>
+                <w:sz w:val="16"/>
+              </w:rPr>
+              <w:t>95.9 / 89.6 / 69.1</w:t>
+            </w:r>
+          </w:p>
+        </w:tc>
+        <w:tc>
+          <w:tcPr>
+            <w:tcW w:type="dxa" w:w="1874"/>
+          </w:tcPr>
+          <w:p>
+            <w:pPr>
+              <w:keepNext/>
+              <w:spacing w:before="0" w:after="0"/>
+              <w:jc w:val="center"/>
+            </w:pPr>
+            <w:r>
+              <w:rPr>
+                <w:b w:val="0"/>
+                <w:i w:val="0"/>
+                <w:smallCaps w:val="0"/>
+                <w:sz w:val="16"/>
+              </w:rPr>
+              <w:t>96.0 / 90.4 / 70.7</w:t>
             </w:r>
           </w:p>
         </w:tc>
@@ -12662,7 +12931,7 @@
         </w:trPr>
         <w:tc>
           <w:tcPr>
-            <w:tcW w:type="dxa" w:w="1443"/>
+            <w:tcW w:type="dxa" w:w="906"/>
           </w:tcPr>
           <w:p>
             <w:pPr>
@@ -12683,7 +12952,7 @@
         </w:tc>
         <w:tc>
           <w:tcPr>
-            <w:tcW w:type="dxa" w:w="2673"/>
+            <w:tcW w:type="dxa" w:w="1679"/>
           </w:tcPr>
           <w:p>
             <w:pPr>
@@ -12704,7 +12973,7 @@
         </w:tc>
         <w:tc>
           <w:tcPr>
-            <w:tcW w:type="dxa" w:w="2982"/>
+            <w:tcW w:type="dxa" w:w="1874"/>
           </w:tcPr>
           <w:p>
             <w:pPr>
@@ -12725,7 +12994,49 @@
         </w:tc>
         <w:tc>
           <w:tcPr>
-            <w:tcW w:type="dxa" w:w="2982"/>
+            <w:tcW w:type="dxa" w:w="1874"/>
+          </w:tcPr>
+          <w:p>
+            <w:pPr>
+              <w:keepNext/>
+              <w:spacing w:before="0" w:after="0"/>
+              <w:jc w:val="center"/>
+            </w:pPr>
+            <w:r>
+              <w:rPr>
+                <w:b w:val="0"/>
+                <w:i w:val="0"/>
+                <w:smallCaps w:val="0"/>
+                <w:sz w:val="16"/>
+              </w:rPr>
+              <w:t>78.1 / 66.1 / 53.3</w:t>
+            </w:r>
+          </w:p>
+        </w:tc>
+        <w:tc>
+          <w:tcPr>
+            <w:tcW w:type="dxa" w:w="1874"/>
+          </w:tcPr>
+          <w:p>
+            <w:pPr>
+              <w:keepNext/>
+              <w:spacing w:before="0" w:after="0"/>
+              <w:jc w:val="center"/>
+            </w:pPr>
+            <w:r>
+              <w:rPr>
+                <w:b w:val="0"/>
+                <w:i w:val="0"/>
+                <w:smallCaps w:val="0"/>
+                <w:sz w:val="16"/>
+              </w:rPr>
+              <w:t>78.1 / 66.1 / 53.3</w:t>
+            </w:r>
+          </w:p>
+        </w:tc>
+        <w:tc>
+          <w:tcPr>
+            <w:tcW w:type="dxa" w:w="1874"/>
           </w:tcPr>
           <w:p>
             <w:pPr>
@@ -12751,7 +13062,7 @@
         </w:trPr>
         <w:tc>
           <w:tcPr>
-            <w:tcW w:type="dxa" w:w="1443"/>
+            <w:tcW w:type="dxa" w:w="906"/>
           </w:tcPr>
           <w:p>
             <w:pPr>
@@ -12772,7 +13083,7 @@
         </w:tc>
         <w:tc>
           <w:tcPr>
-            <w:tcW w:type="dxa" w:w="2673"/>
+            <w:tcW w:type="dxa" w:w="1679"/>
           </w:tcPr>
           <w:p>
             <w:pPr>
@@ -12793,7 +13104,7 @@
         </w:tc>
         <w:tc>
           <w:tcPr>
-            <w:tcW w:type="dxa" w:w="2982"/>
+            <w:tcW w:type="dxa" w:w="1874"/>
           </w:tcPr>
           <w:p>
             <w:pPr>
@@ -12814,7 +13125,7 @@
         </w:tc>
         <w:tc>
           <w:tcPr>
-            <w:tcW w:type="dxa" w:w="2982"/>
+            <w:tcW w:type="dxa" w:w="1874"/>
           </w:tcPr>
           <w:p>
             <w:pPr>
@@ -12824,12 +13135,54 @@
             </w:pPr>
             <w:r>
               <w:rPr>
-                <w:b w:val="0"/>
+                <w:b/>
                 <w:i w:val="0"/>
                 <w:smallCaps w:val="0"/>
                 <w:sz w:val="16"/>
               </w:rPr>
               <w:t>82.7 / 65.3 / 57.6</w:t>
+            </w:r>
+          </w:p>
+        </w:tc>
+        <w:tc>
+          <w:tcPr>
+            <w:tcW w:type="dxa" w:w="1874"/>
+          </w:tcPr>
+          <w:p>
+            <w:pPr>
+              <w:keepNext/>
+              <w:spacing w:before="0" w:after="0"/>
+              <w:jc w:val="center"/>
+            </w:pPr>
+            <w:r>
+              <w:rPr>
+                <w:b w:val="0"/>
+                <w:i w:val="0"/>
+                <w:smallCaps w:val="0"/>
+                <w:sz w:val="16"/>
+              </w:rPr>
+              <w:t>75.9 / 61.0 / 51.2</w:t>
+            </w:r>
+          </w:p>
+        </w:tc>
+        <w:tc>
+          <w:tcPr>
+            <w:tcW w:type="dxa" w:w="1874"/>
+          </w:tcPr>
+          <w:p>
+            <w:pPr>
+              <w:keepNext/>
+              <w:spacing w:before="0" w:after="0"/>
+              <w:jc w:val="center"/>
+            </w:pPr>
+            <w:r>
+              <w:rPr>
+                <w:b w:val="0"/>
+                <w:i w:val="0"/>
+                <w:smallCaps w:val="0"/>
+                <w:sz w:val="16"/>
+              </w:rPr>
+              <w:t>81.3 / 63.9 / 56.8</w:t>
             </w:r>
           </w:p>
         </w:tc>
@@ -12840,7 +13193,7 @@
         </w:trPr>
         <w:tc>
           <w:tcPr>
-            <w:tcW w:type="dxa" w:w="1443"/>
+            <w:tcW w:type="dxa" w:w="906"/>
           </w:tcPr>
           <w:p>
             <w:pPr>
@@ -12861,7 +13214,7 @@
         </w:tc>
         <w:tc>
           <w:tcPr>
-            <w:tcW w:type="dxa" w:w="2673"/>
+            <w:tcW w:type="dxa" w:w="1679"/>
           </w:tcPr>
           <w:p>
             <w:pPr>
@@ -12882,7 +13235,7 @@
         </w:tc>
         <w:tc>
           <w:tcPr>
-            <w:tcW w:type="dxa" w:w="2982"/>
+            <w:tcW w:type="dxa" w:w="1874"/>
           </w:tcPr>
           <w:p>
             <w:pPr>
@@ -12903,7 +13256,7 @@
         </w:tc>
         <w:tc>
           <w:tcPr>
-            <w:tcW w:type="dxa" w:w="2982"/>
+            <w:tcW w:type="dxa" w:w="1874"/>
           </w:tcPr>
           <w:p>
             <w:pPr>
@@ -12913,12 +13266,54 @@
             </w:pPr>
             <w:r>
               <w:rPr>
-                <w:b w:val="0"/>
+                <w:b/>
                 <w:i w:val="0"/>
                 <w:smallCaps w:val="0"/>
                 <w:sz w:val="16"/>
               </w:rPr>
               <w:t>83.2 / 69.7 / 56.4</w:t>
+            </w:r>
+          </w:p>
+        </w:tc>
+        <w:tc>
+          <w:tcPr>
+            <w:tcW w:type="dxa" w:w="1874"/>
+          </w:tcPr>
+          <w:p>
+            <w:pPr>
+              <w:keepNext/>
+              <w:spacing w:before="0" w:after="0"/>
+              <w:jc w:val="center"/>
+            </w:pPr>
+            <w:r>
+              <w:rPr>
+                <w:b w:val="0"/>
+                <w:i w:val="0"/>
+                <w:smallCaps w:val="0"/>
+                <w:sz w:val="16"/>
+              </w:rPr>
+              <w:t>74.8 / 59.0 / 50.3</w:t>
+            </w:r>
+          </w:p>
+        </w:tc>
+        <w:tc>
+          <w:tcPr>
+            <w:tcW w:type="dxa" w:w="1874"/>
+          </w:tcPr>
+          <w:p>
+            <w:pPr>
+              <w:keepNext/>
+              <w:spacing w:before="0" w:after="0"/>
+              <w:jc w:val="center"/>
+            </w:pPr>
+            <w:r>
+              <w:rPr>
+                <w:b w:val="0"/>
+                <w:i w:val="0"/>
+                <w:smallCaps w:val="0"/>
+                <w:sz w:val="16"/>
+              </w:rPr>
+              <w:t>78.1 / 64.6 / 51.9</w:t>
             </w:r>
           </w:p>
         </w:tc>
@@ -12929,7 +13324,7 @@
         </w:trPr>
         <w:tc>
           <w:tcPr>
-            <w:tcW w:type="dxa" w:w="1443"/>
+            <w:tcW w:type="dxa" w:w="906"/>
           </w:tcPr>
           <w:p>
             <w:pPr>
@@ -12950,7 +13345,7 @@
         </w:tc>
         <w:tc>
           <w:tcPr>
-            <w:tcW w:type="dxa" w:w="2673"/>
+            <w:tcW w:type="dxa" w:w="1679"/>
           </w:tcPr>
           <w:p>
             <w:pPr>
@@ -12971,7 +13366,7 @@
         </w:tc>
         <w:tc>
           <w:tcPr>
-            <w:tcW w:type="dxa" w:w="2982"/>
+            <w:tcW w:type="dxa" w:w="1874"/>
           </w:tcPr>
           <w:p>
             <w:pPr>
@@ -12981,18 +13376,39 @@
             </w:pPr>
             <w:r>
               <w:rPr>
+                <w:b w:val="0"/>
+                <w:i w:val="0"/>
+                <w:smallCaps w:val="0"/>
+                <w:sz w:val="16"/>
+              </w:rPr>
+              <w:t>86.0 / 75.5 / 56.7</w:t>
+            </w:r>
+          </w:p>
+        </w:tc>
+        <w:tc>
+          <w:tcPr>
+            <w:tcW w:type="dxa" w:w="1874"/>
+          </w:tcPr>
+          <w:p>
+            <w:pPr>
+              <w:keepNext w:val="0"/>
+              <w:spacing w:before="0" w:after="0"/>
+              <w:jc w:val="center"/>
+            </w:pPr>
+            <w:r>
+              <w:rPr>
                 <w:b/>
                 <w:i w:val="0"/>
                 <w:smallCaps w:val="0"/>
                 <w:sz w:val="16"/>
               </w:rPr>
-              <w:t>86.0 / 75.5 / 56.7</w:t>
-            </w:r>
-          </w:p>
-        </w:tc>
-        <w:tc>
-          <w:tcPr>
-            <w:tcW w:type="dxa" w:w="2982"/>
+              <w:t>87.2 / 79.3 / 57.8</w:t>
+            </w:r>
+          </w:p>
+        </w:tc>
+        <w:tc>
+          <w:tcPr>
+            <w:tcW w:type="dxa" w:w="1874"/>
           </w:tcPr>
           <w:p>
             <w:pPr>
@@ -13002,12 +13418,1204 @@
             </w:pPr>
             <w:r>
               <w:rPr>
+                <w:b w:val="0"/>
+                <w:i w:val="0"/>
+                <w:smallCaps w:val="0"/>
+                <w:sz w:val="16"/>
+              </w:rPr>
+              <w:t>80.5 / 67.3 / 52.9</w:t>
+            </w:r>
+          </w:p>
+        </w:tc>
+        <w:tc>
+          <w:tcPr>
+            <w:tcW w:type="dxa" w:w="1874"/>
+          </w:tcPr>
+          <w:p>
+            <w:pPr>
+              <w:keepNext w:val="0"/>
+              <w:spacing w:before="0" w:after="0"/>
+              <w:jc w:val="center"/>
+            </w:pPr>
+            <w:r>
+              <w:rPr>
+                <w:b w:val="0"/>
+                <w:i w:val="0"/>
+                <w:smallCaps w:val="0"/>
+                <w:sz w:val="16"/>
+              </w:rPr>
+              <w:t>85.0 / 75.7 / 56.3</w:t>
+            </w:r>
+          </w:p>
+        </w:tc>
+      </w:tr>
+    </w:tbl>
+    <w:p>
+      <w:pPr>
+        <w:keepNext w:val="0"/>
+        <w:spacing w:before="0" w:after="120"/>
+        <w:jc w:val="both"/>
+      </w:pPr>
+    </w:p>
+    <w:p>
+      <w:pPr>
+        <w:sectPr>
+          <w:type w:val="continuous"/>
+          <w:pgSz w:w="12240" w:h="15840"/>
+          <w:pgMar w:top="1080" w:right="900" w:bottom="1440" w:left="900" w:header="720" w:footer="720" w:gutter="0"/>
+          <w:cols w:space="360" w:num="1"/>
+          <w:docGrid w:linePitch="360"/>
+        </w:sectPr>
+      </w:pPr>
+    </w:p>
+    <w:p>
+      <w:pPr>
+        <w:sectPr>
+          <w:type w:val="continuous"/>
+          <w:pgSz w:w="12240" w:h="15840"/>
+          <w:pgMar w:top="1080" w:right="900" w:bottom="1440" w:left="900" w:header="720" w:footer="720" w:gutter="0"/>
+          <w:cols w:space="360" w:num="2"/>
+          <w:docGrid w:linePitch="360"/>
+        </w:sectPr>
+      </w:pPr>
+    </w:p>
+    <w:p>
+      <w:pPr>
+        <w:keepNext/>
+        <w:spacing w:before="120" w:after="0"/>
+        <w:jc w:val="center"/>
+      </w:pPr>
+      <w:r>
+        <w:rPr>
+          <w:b w:val="0"/>
+          <w:i w:val="0"/>
+          <w:smallCaps w:val="0"/>
+          <w:sz w:val="16"/>
+        </w:rPr>
+        <w:t>TABLE XII</w:t>
+      </w:r>
+    </w:p>
+    <w:p>
+      <w:pPr>
+        <w:keepNext/>
+        <w:spacing w:before="0" w:after="60"/>
+        <w:jc w:val="center"/>
+      </w:pPr>
+      <w:r>
+        <w:rPr>
+          <w:b w:val="0"/>
+          <w:i w:val="0"/>
+          <w:smallCaps/>
+          <w:sz w:val="16"/>
+        </w:rPr>
+        <w:t>Camera only: frozen ResNet-18 embedding of the frame at t, best beam at t + h, no power measurement (GroupKFold over 35 sequences)</w:t>
+      </w:r>
+    </w:p>
+    <w:tbl>
+      <w:tblPr>
+        <w:tblW w:type="auto" w:w="0"/>
+        <w:jc w:val="center"/>
+        <w:tblLayout w:type="fixed"/>
+        <w:tblLook w:firstColumn="1" w:firstRow="1" w:lastColumn="0" w:lastRow="0" w:noHBand="0" w:noVBand="1" w:val="04A0"/>
+        <w:tblBorders>
+          <w:top w:val="single" w:sz="8" w:color="000000"/>
+          <w:bottom w:val="single" w:sz="8" w:color="000000"/>
+        </w:tblBorders>
+        <w:tblCellMar>
+          <w:left w:w="50" w:type="dxa"/>
+          <w:right w:w="50" w:type="dxa"/>
+        </w:tblCellMar>
+      </w:tblPr>
+      <w:tblGrid>
+        <w:gridCol w:w="895"/>
+        <w:gridCol w:w="1946"/>
+        <w:gridCol w:w="1889"/>
+        <w:gridCol w:w="1447"/>
+        <w:gridCol w:w="1116"/>
+        <w:gridCol w:w="1778"/>
+        <w:gridCol w:w="1005"/>
+      </w:tblGrid>
+      <w:tr>
+        <w:trPr>
+          <w:cantSplit/>
+        </w:trPr>
+        <w:tc>
+          <w:tcPr>
+            <w:tcW w:type="dxa" w:w="895"/>
+            <w:tcBorders>
+              <w:bottom w:val="single" w:sz="4" w:color="000000"/>
+            </w:tcBorders>
+          </w:tcPr>
+          <w:p>
+            <w:pPr>
+              <w:keepNext/>
+              <w:spacing w:before="0" w:after="0"/>
+              <w:jc w:val="left"/>
+            </w:pPr>
+            <w:r>
+              <w:rPr>
                 <w:b/>
                 <w:i w:val="0"/>
                 <w:smallCaps w:val="0"/>
                 <w:sz w:val="16"/>
               </w:rPr>
-              <w:t>87.2 / 79.3 / 57.8</w:t>
+              <w:t>Horizon</w:t>
+            </w:r>
+          </w:p>
+        </w:tc>
+        <w:tc>
+          <w:tcPr>
+            <w:tcW w:type="dxa" w:w="1947"/>
+            <w:tcBorders>
+              <w:bottom w:val="single" w:sz="4" w:color="000000"/>
+            </w:tcBorders>
+          </w:tcPr>
+          <w:p>
+            <w:pPr>
+              <w:keepNext/>
+              <w:spacing w:before="0" w:after="0"/>
+              <w:jc w:val="left"/>
+            </w:pPr>
+            <w:r>
+              <w:rPr>
+                <w:b/>
+                <w:i w:val="0"/>
+                <w:smallCaps w:val="0"/>
+                <w:sz w:val="16"/>
+              </w:rPr>
+              <w:t>Classifier</w:t>
+            </w:r>
+          </w:p>
+        </w:tc>
+        <w:tc>
+          <w:tcPr>
+            <w:tcW w:type="dxa" w:w="1889"/>
+            <w:tcBorders>
+              <w:bottom w:val="single" w:sz="4" w:color="000000"/>
+            </w:tcBorders>
+          </w:tcPr>
+          <w:p>
+            <w:pPr>
+              <w:keepNext/>
+              <w:spacing w:before="0" w:after="0"/>
+              <w:jc w:val="center"/>
+            </w:pPr>
+            <w:r>
+              <w:rPr>
+                <w:b/>
+                <w:i w:val="0"/>
+                <w:smallCaps w:val="0"/>
+                <w:sz w:val="16"/>
+              </w:rPr>
+              <w:t>Within noise (%)</w:t>
+            </w:r>
+          </w:p>
+        </w:tc>
+        <w:tc>
+          <w:tcPr>
+            <w:tcW w:type="dxa" w:w="1448"/>
+            <w:tcBorders>
+              <w:bottom w:val="single" w:sz="4" w:color="000000"/>
+            </w:tcBorders>
+          </w:tcPr>
+          <w:p>
+            <w:pPr>
+              <w:keepNext/>
+              <w:spacing w:before="0" w:after="0"/>
+              <w:jc w:val="center"/>
+            </w:pPr>
+            <w:r>
+              <w:rPr>
+                <w:b/>
+                <w:i w:val="0"/>
+                <w:smallCaps w:val="0"/>
+                <w:sz w:val="16"/>
+              </w:rPr>
+              <w:t>Balanced (%)</w:t>
+            </w:r>
+          </w:p>
+        </w:tc>
+        <w:tc>
+          <w:tcPr>
+            <w:tcW w:type="dxa" w:w="1116"/>
+            <w:tcBorders>
+              <w:bottom w:val="single" w:sz="4" w:color="000000"/>
+            </w:tcBorders>
+          </w:tcPr>
+          <w:p>
+            <w:pPr>
+              <w:keepNext/>
+              <w:spacing w:before="0" w:after="0"/>
+              <w:jc w:val="center"/>
+            </w:pPr>
+            <w:r>
+              <w:rPr>
+                <w:b/>
+                <w:i w:val="0"/>
+                <w:smallCaps w:val="0"/>
+                <w:sz w:val="16"/>
+              </w:rPr>
+              <w:t>Top-3 (%)</w:t>
+            </w:r>
+          </w:p>
+        </w:tc>
+        <w:tc>
+          <w:tcPr>
+            <w:tcW w:type="dxa" w:w="1779"/>
+            <w:tcBorders>
+              <w:bottom w:val="single" w:sz="4" w:color="000000"/>
+            </w:tcBorders>
+          </w:tcPr>
+          <w:p>
+            <w:pPr>
+              <w:keepNext/>
+              <w:spacing w:before="0" w:after="0"/>
+              <w:jc w:val="center"/>
+            </w:pPr>
+            <w:r>
+              <w:rPr>
+                <w:b/>
+                <w:i w:val="0"/>
+                <w:smallCaps w:val="0"/>
+                <w:sz w:val="16"/>
+              </w:rPr>
+              <w:t>Exact top-1 (%)</w:t>
+            </w:r>
+          </w:p>
+        </w:tc>
+        <w:tc>
+          <w:tcPr>
+            <w:tcW w:type="dxa" w:w="1006"/>
+            <w:tcBorders>
+              <w:bottom w:val="single" w:sz="4" w:color="000000"/>
+            </w:tcBorders>
+          </w:tcPr>
+          <w:p>
+            <w:pPr>
+              <w:keepNext/>
+              <w:spacing w:before="0" w:after="0"/>
+              <w:jc w:val="center"/>
+            </w:pPr>
+            <w:r>
+              <w:rPr>
+                <w:b/>
+                <w:i w:val="0"/>
+                <w:smallCaps w:val="0"/>
+                <w:sz w:val="16"/>
+              </w:rPr>
+              <w:t>Macro-F1</w:t>
+            </w:r>
+          </w:p>
+        </w:tc>
+      </w:tr>
+      <w:tr>
+        <w:trPr>
+          <w:cantSplit/>
+        </w:trPr>
+        <w:tc>
+          <w:tcPr>
+            <w:tcW w:type="dxa" w:w="895"/>
+          </w:tcPr>
+          <w:p>
+            <w:pPr>
+              <w:keepNext/>
+              <w:spacing w:before="0" w:after="0"/>
+              <w:jc w:val="left"/>
+            </w:pPr>
+            <w:r>
+              <w:rPr>
+                <w:b w:val="0"/>
+                <w:i w:val="0"/>
+                <w:smallCaps w:val="0"/>
+                <w:sz w:val="16"/>
+              </w:rPr>
+              <w:t>t+0</w:t>
+            </w:r>
+          </w:p>
+        </w:tc>
+        <w:tc>
+          <w:tcPr>
+            <w:tcW w:type="dxa" w:w="1947"/>
+          </w:tcPr>
+          <w:p>
+            <w:pPr>
+              <w:keepNext/>
+              <w:spacing w:before="0" w:after="0"/>
+              <w:jc w:val="left"/>
+            </w:pPr>
+            <w:r>
+              <w:rPr>
+                <w:b w:val="0"/>
+                <w:i w:val="0"/>
+                <w:smallCaps w:val="0"/>
+                <w:sz w:val="16"/>
+              </w:rPr>
+              <w:t>Most frequent beam</w:t>
+            </w:r>
+          </w:p>
+        </w:tc>
+        <w:tc>
+          <w:tcPr>
+            <w:tcW w:type="dxa" w:w="1889"/>
+          </w:tcPr>
+          <w:p>
+            <w:pPr>
+              <w:keepNext/>
+              <w:spacing w:before="0" w:after="0"/>
+              <w:jc w:val="center"/>
+            </w:pPr>
+            <w:r>
+              <w:rPr>
+                <w:b w:val="0"/>
+                <w:i w:val="0"/>
+                <w:smallCaps w:val="0"/>
+                <w:sz w:val="16"/>
+              </w:rPr>
+              <w:t>14.9</w:t>
+            </w:r>
+          </w:p>
+        </w:tc>
+        <w:tc>
+          <w:tcPr>
+            <w:tcW w:type="dxa" w:w="1448"/>
+          </w:tcPr>
+          <w:p>
+            <w:pPr>
+              <w:keepNext/>
+              <w:spacing w:before="0" w:after="0"/>
+              <w:jc w:val="center"/>
+            </w:pPr>
+            <w:r>
+              <w:rPr>
+                <w:b w:val="0"/>
+                <w:i w:val="0"/>
+                <w:smallCaps w:val="0"/>
+                <w:sz w:val="16"/>
+              </w:rPr>
+              <w:t>13.0</w:t>
+            </w:r>
+          </w:p>
+        </w:tc>
+        <w:tc>
+          <w:tcPr>
+            <w:tcW w:type="dxa" w:w="1116"/>
+          </w:tcPr>
+          <w:p>
+            <w:pPr>
+              <w:keepNext/>
+              <w:spacing w:before="0" w:after="0"/>
+              <w:jc w:val="center"/>
+            </w:pPr>
+            <w:r>
+              <w:rPr>
+                <w:b w:val="0"/>
+                <w:i w:val="0"/>
+                <w:smallCaps w:val="0"/>
+                <w:sz w:val="16"/>
+              </w:rPr>
+              <w:t>39.6</w:t>
+            </w:r>
+          </w:p>
+        </w:tc>
+        <w:tc>
+          <w:tcPr>
+            <w:tcW w:type="dxa" w:w="1779"/>
+          </w:tcPr>
+          <w:p>
+            <w:pPr>
+              <w:keepNext/>
+              <w:spacing w:before="0" w:after="0"/>
+              <w:jc w:val="center"/>
+            </w:pPr>
+            <w:r>
+              <w:rPr>
+                <w:b w:val="0"/>
+                <w:i w:val="0"/>
+                <w:smallCaps w:val="0"/>
+                <w:sz w:val="16"/>
+              </w:rPr>
+              <w:t>7.6</w:t>
+            </w:r>
+          </w:p>
+        </w:tc>
+        <w:tc>
+          <w:tcPr>
+            <w:tcW w:type="dxa" w:w="1006"/>
+          </w:tcPr>
+          <w:p>
+            <w:pPr>
+              <w:keepNext/>
+              <w:spacing w:before="0" w:after="0"/>
+              <w:jc w:val="center"/>
+            </w:pPr>
+            <w:r>
+              <w:rPr>
+                <w:b w:val="0"/>
+                <w:i w:val="0"/>
+                <w:smallCaps w:val="0"/>
+                <w:sz w:val="16"/>
+              </w:rPr>
+              <w:t>0.00</w:t>
+            </w:r>
+          </w:p>
+        </w:tc>
+      </w:tr>
+      <w:tr>
+        <w:trPr>
+          <w:cantSplit/>
+        </w:trPr>
+        <w:tc>
+          <w:tcPr>
+            <w:tcW w:type="dxa" w:w="895"/>
+          </w:tcPr>
+          <w:p>
+            <w:pPr>
+              <w:keepNext/>
+              <w:spacing w:before="0" w:after="0"/>
+              <w:jc w:val="left"/>
+            </w:pPr>
+            <w:r>
+              <w:rPr>
+                <w:b w:val="0"/>
+                <w:i w:val="0"/>
+                <w:smallCaps w:val="0"/>
+                <w:sz w:val="16"/>
+              </w:rPr>
+              <w:t>t+0</w:t>
+            </w:r>
+          </w:p>
+        </w:tc>
+        <w:tc>
+          <w:tcPr>
+            <w:tcW w:type="dxa" w:w="1947"/>
+          </w:tcPr>
+          <w:p>
+            <w:pPr>
+              <w:keepNext/>
+              <w:spacing w:before="0" w:after="0"/>
+              <w:jc w:val="left"/>
+            </w:pPr>
+            <w:r>
+              <w:rPr>
+                <w:b w:val="0"/>
+                <w:i w:val="0"/>
+                <w:smallCaps w:val="0"/>
+                <w:sz w:val="16"/>
+              </w:rPr>
+              <w:t>Logistic regression</w:t>
+            </w:r>
+          </w:p>
+        </w:tc>
+        <w:tc>
+          <w:tcPr>
+            <w:tcW w:type="dxa" w:w="1889"/>
+          </w:tcPr>
+          <w:p>
+            <w:pPr>
+              <w:keepNext/>
+              <w:spacing w:before="0" w:after="0"/>
+              <w:jc w:val="center"/>
+            </w:pPr>
+            <w:r>
+              <w:rPr>
+                <w:b w:val="0"/>
+                <w:i w:val="0"/>
+                <w:smallCaps w:val="0"/>
+                <w:sz w:val="16"/>
+              </w:rPr>
+              <w:t>63.3</w:t>
+            </w:r>
+          </w:p>
+        </w:tc>
+        <w:tc>
+          <w:tcPr>
+            <w:tcW w:type="dxa" w:w="1448"/>
+          </w:tcPr>
+          <w:p>
+            <w:pPr>
+              <w:keepNext/>
+              <w:spacing w:before="0" w:after="0"/>
+              <w:jc w:val="center"/>
+            </w:pPr>
+            <w:r>
+              <w:rPr>
+                <w:b w:val="0"/>
+                <w:i w:val="0"/>
+                <w:smallCaps w:val="0"/>
+                <w:sz w:val="16"/>
+              </w:rPr>
+              <w:t>62.7</w:t>
+            </w:r>
+          </w:p>
+        </w:tc>
+        <w:tc>
+          <w:tcPr>
+            <w:tcW w:type="dxa" w:w="1116"/>
+          </w:tcPr>
+          <w:p>
+            <w:pPr>
+              <w:keepNext/>
+              <w:spacing w:before="0" w:after="0"/>
+              <w:jc w:val="center"/>
+            </w:pPr>
+            <w:r>
+              <w:rPr>
+                <w:b w:val="0"/>
+                <w:i w:val="0"/>
+                <w:smallCaps w:val="0"/>
+                <w:sz w:val="16"/>
+              </w:rPr>
+              <w:t>70.9</w:t>
+            </w:r>
+          </w:p>
+        </w:tc>
+        <w:tc>
+          <w:tcPr>
+            <w:tcW w:type="dxa" w:w="1779"/>
+          </w:tcPr>
+          <w:p>
+            <w:pPr>
+              <w:keepNext/>
+              <w:spacing w:before="0" w:after="0"/>
+              <w:jc w:val="center"/>
+            </w:pPr>
+            <w:r>
+              <w:rPr>
+                <w:b w:val="0"/>
+                <w:i w:val="0"/>
+                <w:smallCaps w:val="0"/>
+                <w:sz w:val="16"/>
+              </w:rPr>
+              <w:t>40.2</w:t>
+            </w:r>
+          </w:p>
+        </w:tc>
+        <w:tc>
+          <w:tcPr>
+            <w:tcW w:type="dxa" w:w="1006"/>
+          </w:tcPr>
+          <w:p>
+            <w:pPr>
+              <w:keepNext/>
+              <w:spacing w:before="0" w:after="0"/>
+              <w:jc w:val="center"/>
+            </w:pPr>
+            <w:r>
+              <w:rPr>
+                <w:b w:val="0"/>
+                <w:i w:val="0"/>
+                <w:smallCaps w:val="0"/>
+                <w:sz w:val="16"/>
+              </w:rPr>
+              <w:t>0.23</w:t>
+            </w:r>
+          </w:p>
+        </w:tc>
+      </w:tr>
+      <w:tr>
+        <w:trPr>
+          <w:cantSplit/>
+        </w:trPr>
+        <w:tc>
+          <w:tcPr>
+            <w:tcW w:type="dxa" w:w="895"/>
+          </w:tcPr>
+          <w:p>
+            <w:pPr>
+              <w:keepNext/>
+              <w:spacing w:before="0" w:after="0"/>
+              <w:jc w:val="left"/>
+            </w:pPr>
+            <w:r>
+              <w:rPr>
+                <w:b w:val="0"/>
+                <w:i w:val="0"/>
+                <w:smallCaps w:val="0"/>
+                <w:sz w:val="16"/>
+              </w:rPr>
+              <w:t>t+0</w:t>
+            </w:r>
+          </w:p>
+        </w:tc>
+        <w:tc>
+          <w:tcPr>
+            <w:tcW w:type="dxa" w:w="1947"/>
+          </w:tcPr>
+          <w:p>
+            <w:pPr>
+              <w:keepNext/>
+              <w:spacing w:before="0" w:after="0"/>
+              <w:jc w:val="left"/>
+            </w:pPr>
+            <w:r>
+              <w:rPr>
+                <w:b w:val="0"/>
+                <w:i w:val="0"/>
+                <w:smallCaps w:val="0"/>
+                <w:sz w:val="16"/>
+              </w:rPr>
+              <w:t>MLP</w:t>
+            </w:r>
+          </w:p>
+        </w:tc>
+        <w:tc>
+          <w:tcPr>
+            <w:tcW w:type="dxa" w:w="1889"/>
+          </w:tcPr>
+          <w:p>
+            <w:pPr>
+              <w:keepNext/>
+              <w:spacing w:before="0" w:after="0"/>
+              <w:jc w:val="center"/>
+            </w:pPr>
+            <w:r>
+              <w:rPr>
+                <w:b/>
+                <w:i w:val="0"/>
+                <w:smallCaps w:val="0"/>
+                <w:sz w:val="16"/>
+              </w:rPr>
+              <w:t>67.4</w:t>
+            </w:r>
+          </w:p>
+        </w:tc>
+        <w:tc>
+          <w:tcPr>
+            <w:tcW w:type="dxa" w:w="1448"/>
+          </w:tcPr>
+          <w:p>
+            <w:pPr>
+              <w:keepNext/>
+              <w:spacing w:before="0" w:after="0"/>
+              <w:jc w:val="center"/>
+            </w:pPr>
+            <w:r>
+              <w:rPr>
+                <w:b/>
+                <w:i w:val="0"/>
+                <w:smallCaps w:val="0"/>
+                <w:sz w:val="16"/>
+              </w:rPr>
+              <w:t>66.5</w:t>
+            </w:r>
+          </w:p>
+        </w:tc>
+        <w:tc>
+          <w:tcPr>
+            <w:tcW w:type="dxa" w:w="1116"/>
+          </w:tcPr>
+          <w:p>
+            <w:pPr>
+              <w:keepNext/>
+              <w:spacing w:before="0" w:after="0"/>
+              <w:jc w:val="center"/>
+            </w:pPr>
+            <w:r>
+              <w:rPr>
+                <w:b/>
+                <w:i w:val="0"/>
+                <w:smallCaps w:val="0"/>
+                <w:sz w:val="16"/>
+              </w:rPr>
+              <w:t>74.6</w:t>
+            </w:r>
+          </w:p>
+        </w:tc>
+        <w:tc>
+          <w:tcPr>
+            <w:tcW w:type="dxa" w:w="1779"/>
+          </w:tcPr>
+          <w:p>
+            <w:pPr>
+              <w:keepNext/>
+              <w:spacing w:before="0" w:after="0"/>
+              <w:jc w:val="center"/>
+            </w:pPr>
+            <w:r>
+              <w:rPr>
+                <w:b/>
+                <w:i w:val="0"/>
+                <w:smallCaps w:val="0"/>
+                <w:sz w:val="16"/>
+              </w:rPr>
+              <w:t>42.3</w:t>
+            </w:r>
+          </w:p>
+        </w:tc>
+        <w:tc>
+          <w:tcPr>
+            <w:tcW w:type="dxa" w:w="1006"/>
+          </w:tcPr>
+          <w:p>
+            <w:pPr>
+              <w:keepNext/>
+              <w:spacing w:before="0" w:after="0"/>
+              <w:jc w:val="center"/>
+            </w:pPr>
+            <w:r>
+              <w:rPr>
+                <w:b/>
+                <w:i w:val="0"/>
+                <w:smallCaps w:val="0"/>
+                <w:sz w:val="16"/>
+              </w:rPr>
+              <w:t>0.25</w:t>
+            </w:r>
+          </w:p>
+        </w:tc>
+      </w:tr>
+      <w:tr>
+        <w:trPr>
+          <w:cantSplit/>
+        </w:trPr>
+        <w:tc>
+          <w:tcPr>
+            <w:tcW w:type="dxa" w:w="895"/>
+          </w:tcPr>
+          <w:p>
+            <w:pPr>
+              <w:keepNext/>
+              <w:spacing w:before="0" w:after="0"/>
+              <w:jc w:val="left"/>
+            </w:pPr>
+            <w:r>
+              <w:rPr>
+                <w:b w:val="0"/>
+                <w:i w:val="0"/>
+                <w:smallCaps w:val="0"/>
+                <w:sz w:val="16"/>
+              </w:rPr>
+              <w:t>t+1</w:t>
+            </w:r>
+          </w:p>
+        </w:tc>
+        <w:tc>
+          <w:tcPr>
+            <w:tcW w:type="dxa" w:w="1947"/>
+          </w:tcPr>
+          <w:p>
+            <w:pPr>
+              <w:keepNext/>
+              <w:spacing w:before="0" w:after="0"/>
+              <w:jc w:val="left"/>
+            </w:pPr>
+            <w:r>
+              <w:rPr>
+                <w:b w:val="0"/>
+                <w:i w:val="0"/>
+                <w:smallCaps w:val="0"/>
+                <w:sz w:val="16"/>
+              </w:rPr>
+              <w:t>MLP</w:t>
+            </w:r>
+          </w:p>
+        </w:tc>
+        <w:tc>
+          <w:tcPr>
+            <w:tcW w:type="dxa" w:w="1889"/>
+          </w:tcPr>
+          <w:p>
+            <w:pPr>
+              <w:keepNext/>
+              <w:spacing w:before="0" w:after="0"/>
+              <w:jc w:val="center"/>
+            </w:pPr>
+            <w:r>
+              <w:rPr>
+                <w:b w:val="0"/>
+                <w:i w:val="0"/>
+                <w:smallCaps w:val="0"/>
+                <w:sz w:val="16"/>
+              </w:rPr>
+              <w:t>57.3</w:t>
+            </w:r>
+          </w:p>
+        </w:tc>
+        <w:tc>
+          <w:tcPr>
+            <w:tcW w:type="dxa" w:w="1448"/>
+          </w:tcPr>
+          <w:p>
+            <w:pPr>
+              <w:keepNext/>
+              <w:spacing w:before="0" w:after="0"/>
+              <w:jc w:val="center"/>
+            </w:pPr>
+            <w:r>
+              <w:rPr>
+                <w:b w:val="0"/>
+                <w:i w:val="0"/>
+                <w:smallCaps w:val="0"/>
+                <w:sz w:val="16"/>
+              </w:rPr>
+              <w:t>53.8</w:t>
+            </w:r>
+          </w:p>
+        </w:tc>
+        <w:tc>
+          <w:tcPr>
+            <w:tcW w:type="dxa" w:w="1116"/>
+          </w:tcPr>
+          <w:p>
+            <w:pPr>
+              <w:keepNext/>
+              <w:spacing w:before="0" w:after="0"/>
+              <w:jc w:val="center"/>
+            </w:pPr>
+            <w:r>
+              <w:rPr>
+                <w:b w:val="0"/>
+                <w:i w:val="0"/>
+                <w:smallCaps w:val="0"/>
+                <w:sz w:val="16"/>
+              </w:rPr>
+              <w:t>66.2</w:t>
+            </w:r>
+          </w:p>
+        </w:tc>
+        <w:tc>
+          <w:tcPr>
+            <w:tcW w:type="dxa" w:w="1779"/>
+          </w:tcPr>
+          <w:p>
+            <w:pPr>
+              <w:keepNext/>
+              <w:spacing w:before="0" w:after="0"/>
+              <w:jc w:val="center"/>
+            </w:pPr>
+            <w:r>
+              <w:rPr>
+                <w:b w:val="0"/>
+                <w:i w:val="0"/>
+                <w:smallCaps w:val="0"/>
+                <w:sz w:val="16"/>
+              </w:rPr>
+              <w:t>33.2</w:t>
+            </w:r>
+          </w:p>
+        </w:tc>
+        <w:tc>
+          <w:tcPr>
+            <w:tcW w:type="dxa" w:w="1006"/>
+          </w:tcPr>
+          <w:p>
+            <w:pPr>
+              <w:keepNext/>
+              <w:spacing w:before="0" w:after="0"/>
+              <w:jc w:val="center"/>
+            </w:pPr>
+            <w:r>
+              <w:rPr>
+                <w:b w:val="0"/>
+                <w:i w:val="0"/>
+                <w:smallCaps w:val="0"/>
+                <w:sz w:val="16"/>
+              </w:rPr>
+              <w:t>0.16</w:t>
+            </w:r>
+          </w:p>
+        </w:tc>
+      </w:tr>
+      <w:tr>
+        <w:trPr>
+          <w:cantSplit/>
+        </w:trPr>
+        <w:tc>
+          <w:tcPr>
+            <w:tcW w:type="dxa" w:w="895"/>
+          </w:tcPr>
+          <w:p>
+            <w:pPr>
+              <w:keepNext/>
+              <w:spacing w:before="0" w:after="0"/>
+              <w:jc w:val="left"/>
+            </w:pPr>
+            <w:r>
+              <w:rPr>
+                <w:b w:val="0"/>
+                <w:i w:val="0"/>
+                <w:smallCaps w:val="0"/>
+                <w:sz w:val="16"/>
+              </w:rPr>
+              <w:t>t+3</w:t>
+            </w:r>
+          </w:p>
+        </w:tc>
+        <w:tc>
+          <w:tcPr>
+            <w:tcW w:type="dxa" w:w="1947"/>
+          </w:tcPr>
+          <w:p>
+            <w:pPr>
+              <w:keepNext/>
+              <w:spacing w:before="0" w:after="0"/>
+              <w:jc w:val="left"/>
+            </w:pPr>
+            <w:r>
+              <w:rPr>
+                <w:b w:val="0"/>
+                <w:i w:val="0"/>
+                <w:smallCaps w:val="0"/>
+                <w:sz w:val="16"/>
+              </w:rPr>
+              <w:t>Logistic regression</w:t>
+            </w:r>
+          </w:p>
+        </w:tc>
+        <w:tc>
+          <w:tcPr>
+            <w:tcW w:type="dxa" w:w="1889"/>
+          </w:tcPr>
+          <w:p>
+            <w:pPr>
+              <w:keepNext/>
+              <w:spacing w:before="0" w:after="0"/>
+              <w:jc w:val="center"/>
+            </w:pPr>
+            <w:r>
+              <w:rPr>
+                <w:b w:val="0"/>
+                <w:i w:val="0"/>
+                <w:smallCaps w:val="0"/>
+                <w:sz w:val="16"/>
+              </w:rPr>
+              <w:t>42.2</w:t>
+            </w:r>
+          </w:p>
+        </w:tc>
+        <w:tc>
+          <w:tcPr>
+            <w:tcW w:type="dxa" w:w="1448"/>
+          </w:tcPr>
+          <w:p>
+            <w:pPr>
+              <w:keepNext/>
+              <w:spacing w:before="0" w:after="0"/>
+              <w:jc w:val="center"/>
+            </w:pPr>
+            <w:r>
+              <w:rPr>
+                <w:b w:val="0"/>
+                <w:i w:val="0"/>
+                <w:smallCaps w:val="0"/>
+                <w:sz w:val="16"/>
+              </w:rPr>
+              <w:t>36.9</w:t>
+            </w:r>
+          </w:p>
+        </w:tc>
+        <w:tc>
+          <w:tcPr>
+            <w:tcW w:type="dxa" w:w="1116"/>
+          </w:tcPr>
+          <w:p>
+            <w:pPr>
+              <w:keepNext/>
+              <w:spacing w:before="0" w:after="0"/>
+              <w:jc w:val="center"/>
+            </w:pPr>
+            <w:r>
+              <w:rPr>
+                <w:b w:val="0"/>
+                <w:i w:val="0"/>
+                <w:smallCaps w:val="0"/>
+                <w:sz w:val="16"/>
+              </w:rPr>
+              <w:t>55.4</w:t>
+            </w:r>
+          </w:p>
+        </w:tc>
+        <w:tc>
+          <w:tcPr>
+            <w:tcW w:type="dxa" w:w="1779"/>
+          </w:tcPr>
+          <w:p>
+            <w:pPr>
+              <w:keepNext/>
+              <w:spacing w:before="0" w:after="0"/>
+              <w:jc w:val="center"/>
+            </w:pPr>
+            <w:r>
+              <w:rPr>
+                <w:b w:val="0"/>
+                <w:i w:val="0"/>
+                <w:smallCaps w:val="0"/>
+                <w:sz w:val="16"/>
+              </w:rPr>
+              <w:t>23.6</w:t>
+            </w:r>
+          </w:p>
+        </w:tc>
+        <w:tc>
+          <w:tcPr>
+            <w:tcW w:type="dxa" w:w="1006"/>
+          </w:tcPr>
+          <w:p>
+            <w:pPr>
+              <w:keepNext/>
+              <w:spacing w:before="0" w:after="0"/>
+              <w:jc w:val="center"/>
+            </w:pPr>
+            <w:r>
+              <w:rPr>
+                <w:b w:val="0"/>
+                <w:i w:val="0"/>
+                <w:smallCaps w:val="0"/>
+                <w:sz w:val="16"/>
+              </w:rPr>
+              <w:t>0.09</w:t>
+            </w:r>
+          </w:p>
+        </w:tc>
+      </w:tr>
+      <w:tr>
+        <w:trPr>
+          <w:cantSplit/>
+        </w:trPr>
+        <w:tc>
+          <w:tcPr>
+            <w:tcW w:type="dxa" w:w="895"/>
+          </w:tcPr>
+          <w:p>
+            <w:pPr>
+              <w:keepNext w:val="0"/>
+              <w:spacing w:before="0" w:after="0"/>
+              <w:jc w:val="left"/>
+            </w:pPr>
+            <w:r>
+              <w:rPr>
+                <w:b w:val="0"/>
+                <w:i w:val="0"/>
+                <w:smallCaps w:val="0"/>
+                <w:sz w:val="16"/>
+              </w:rPr>
+              <w:t>t+3</w:t>
+            </w:r>
+          </w:p>
+        </w:tc>
+        <w:tc>
+          <w:tcPr>
+            <w:tcW w:type="dxa" w:w="1947"/>
+          </w:tcPr>
+          <w:p>
+            <w:pPr>
+              <w:keepNext w:val="0"/>
+              <w:spacing w:before="0" w:after="0"/>
+              <w:jc w:val="left"/>
+            </w:pPr>
+            <w:r>
+              <w:rPr>
+                <w:b w:val="0"/>
+                <w:i w:val="0"/>
+                <w:smallCaps w:val="0"/>
+                <w:sz w:val="16"/>
+              </w:rPr>
+              <w:t>MLP</w:t>
+            </w:r>
+          </w:p>
+        </w:tc>
+        <w:tc>
+          <w:tcPr>
+            <w:tcW w:type="dxa" w:w="1889"/>
+          </w:tcPr>
+          <w:p>
+            <w:pPr>
+              <w:keepNext w:val="0"/>
+              <w:spacing w:before="0" w:after="0"/>
+              <w:jc w:val="center"/>
+            </w:pPr>
+            <w:r>
+              <w:rPr>
+                <w:b w:val="0"/>
+                <w:i w:val="0"/>
+                <w:smallCaps w:val="0"/>
+                <w:sz w:val="16"/>
+              </w:rPr>
+              <w:t>43.2</w:t>
+            </w:r>
+          </w:p>
+        </w:tc>
+        <w:tc>
+          <w:tcPr>
+            <w:tcW w:type="dxa" w:w="1448"/>
+          </w:tcPr>
+          <w:p>
+            <w:pPr>
+              <w:keepNext w:val="0"/>
+              <w:spacing w:before="0" w:after="0"/>
+              <w:jc w:val="center"/>
+            </w:pPr>
+            <w:r>
+              <w:rPr>
+                <w:b w:val="0"/>
+                <w:i w:val="0"/>
+                <w:smallCaps w:val="0"/>
+                <w:sz w:val="16"/>
+              </w:rPr>
+              <w:t>36.4</w:t>
+            </w:r>
+          </w:p>
+        </w:tc>
+        <w:tc>
+          <w:tcPr>
+            <w:tcW w:type="dxa" w:w="1116"/>
+          </w:tcPr>
+          <w:p>
+            <w:pPr>
+              <w:keepNext w:val="0"/>
+              <w:spacing w:before="0" w:after="0"/>
+              <w:jc w:val="center"/>
+            </w:pPr>
+            <w:r>
+              <w:rPr>
+                <w:b w:val="0"/>
+                <w:i w:val="0"/>
+                <w:smallCaps w:val="0"/>
+                <w:sz w:val="16"/>
+              </w:rPr>
+              <w:t>53.7</w:t>
+            </w:r>
+          </w:p>
+        </w:tc>
+        <w:tc>
+          <w:tcPr>
+            <w:tcW w:type="dxa" w:w="1779"/>
+          </w:tcPr>
+          <w:p>
+            <w:pPr>
+              <w:keepNext w:val="0"/>
+              <w:spacing w:before="0" w:after="0"/>
+              <w:jc w:val="center"/>
+            </w:pPr>
+            <w:r>
+              <w:rPr>
+                <w:b w:val="0"/>
+                <w:i w:val="0"/>
+                <w:smallCaps w:val="0"/>
+                <w:sz w:val="16"/>
+              </w:rPr>
+              <w:t>24.9</w:t>
+            </w:r>
+          </w:p>
+        </w:tc>
+        <w:tc>
+          <w:tcPr>
+            <w:tcW w:type="dxa" w:w="1006"/>
+          </w:tcPr>
+          <w:p>
+            <w:pPr>
+              <w:keepNext w:val="0"/>
+              <w:spacing w:before="0" w:after="0"/>
+              <w:jc w:val="center"/>
+            </w:pPr>
+            <w:r>
+              <w:rPr>
+                <w:b w:val="0"/>
+                <w:i w:val="0"/>
+                <w:smallCaps w:val="0"/>
+                <w:sz w:val="16"/>
+              </w:rPr>
+              <w:t>0.09</w:t>
             </w:r>
           </w:p>
         </w:tc>
@@ -13068,7 +14676,7 @@
             <w:r>
               <w:drawing>
                 <wp:inline xmlns:a="http://schemas.openxmlformats.org/drawingml/2006/main" xmlns:pic="http://schemas.openxmlformats.org/drawingml/2006/picture">
-                  <wp:extent cx="5943600" cy="1767708"/>
+                  <wp:extent cx="5943600" cy="1935655"/>
                   <wp:docPr id="7" name="Picture 7"/>
                   <wp:cNvGraphicFramePr>
                     <a:graphicFrameLocks noChangeAspect="1"/>
@@ -13077,7 +14685,7 @@
                     <a:graphicData uri="http://schemas.openxmlformats.org/drawingml/2006/picture">
                       <pic:pic>
                         <pic:nvPicPr>
-                          <pic:cNvPr id="0" name="fig_gps.png"/>
+                          <pic:cNvPr id="0" name="fig_side_information.png"/>
                           <pic:cNvPicPr/>
                         </pic:nvPicPr>
                         <pic:blipFill>
@@ -13089,7 +14697,7 @@
                         <pic:spPr>
                           <a:xfrm>
                             <a:off x="0" y="0"/>
-                            <a:ext cx="5943600" cy="1767708"/>
+                            <a:ext cx="5943600" cy="1935655"/>
                           </a:xfrm>
                           <a:prstGeom prst="rect"/>
                         </pic:spPr>
@@ -13122,7 +14730,2409 @@
                 <w:smallCaps w:val="0"/>
                 <w:sz w:val="16"/>
               </w:rPr>
-              <w:t>Blind within-noise accuracy with power sweeps only (circles) and with UAV GPS and kinematics added (squares); labels give the change in points.</w:t>
+              <w:t>Blind within-noise accuracy with each set of side information; dashed: persistence. Each series has its own marker shape.</w:t>
+            </w:r>
+          </w:p>
+        </w:tc>
+      </w:tr>
+    </w:tbl>
+    <w:p>
+      <w:pPr>
+        <w:keepNext w:val="0"/>
+        <w:spacing w:before="0" w:after="40"/>
+        <w:jc w:val="both"/>
+      </w:pPr>
+    </w:p>
+    <w:p>
+      <w:pPr>
+        <w:sectPr>
+          <w:type w:val="continuous"/>
+          <w:pgSz w:w="12240" w:h="15840"/>
+          <w:pgMar w:top="1080" w:right="900" w:bottom="1440" w:left="900" w:header="720" w:footer="720" w:gutter="0"/>
+          <w:cols w:space="360" w:num="1"/>
+          <w:docGrid w:linePitch="360"/>
+        </w:sectPr>
+      </w:pPr>
+    </w:p>
+    <w:p>
+      <w:pPr>
+        <w:keepNext w:val="0"/>
+        <w:spacing w:before="0" w:after="0"/>
+        <w:ind w:firstLine="288"/>
+        <w:jc w:val="both"/>
+      </w:pPr>
+      <w:r>
+        <w:rPr>
+          <w:b/>
+          <w:i w:val="0"/>
+          <w:smallCaps w:val="0"/>
+          <w:sz w:val="20"/>
+        </w:rPr>
+        <w:t>Position-aided beam training.</w:t>
+      </w:r>
+      <w:r>
+        <w:rPr>
+          <w:b w:val="0"/>
+          <w:i w:val="0"/>
+          <w:smallCaps w:val="0"/>
+          <w:sz w:val="20"/>
+        </w:rPr>
+        <w:t xml:space="preserve"> Rerunning the reduced beam training and conformal studies on the GPS-aided GRU ensemble changes little. At t + 3 the two-round scheme reaches 99.3% exact top-1 [98.7, 99.8] and all-class macro-F1 0.946 [0.923, 0.978] (power only: 99.1% and 0.929), but measures 14.5 instead of 11.7 beams (2.15 vs 1.93 ms); the intervals overlap. At t + 1 every operating point stays within 0.3 points. The 95% conformal shortlist at t + 3 uses 5.2 instead of 5.4 beams and its worst fold rises from 92.7 to 94.1% coverage. Position therefore does not remove the singleton-class limit on all-class macro-F1 at t + 3.</w:t>
+      </w:r>
+    </w:p>
+    <w:p>
+      <w:pPr>
+        <w:keepNext w:val="0"/>
+        <w:spacing w:before="0" w:after="0"/>
+        <w:ind w:firstLine="288"/>
+        <w:jc w:val="both"/>
+      </w:pPr>
+      <w:r>
+        <w:rPr>
+          <w:b/>
+          <w:i w:val="0"/>
+          <w:smallCaps w:val="0"/>
+          <w:sz w:val="20"/>
+        </w:rPr>
+        <w:t>Significance</w:t>
+      </w:r>
+      <w:r>
+        <w:rPr>
+          <w:b w:val="0"/>
+          <w:i w:val="0"/>
+          <w:smallCaps w:val="0"/>
+          <w:sz w:val="20"/>
+        </w:rPr>
+        <w:t xml:space="preserve"> (Table XIII, Fig. 8). Across the 33 replayed flights, the tie-graph tracker (four partners, full sweep every 8 steps) loses 2.8 points of exact top-1 against a full sweep every step on 27 flights and ties on 6, yet gains 2.6 points of effective spectral efficiency at 10 dB on 32 of 33 flights, because it spends 1.05 instead of 5 ms on training. Six partners improve exact top-1 by 2.0 points over four on 26 flights and lose on none; eight add nothing significant over six. Periodic sweeps every 4 instead of 8 steps buy 0.65 points of accuracy for 0.33 points of efficiency. Loss-triggered sweeps with six partners improve the median flight (22 better, 4 worse) but lose heavily on a few, so the pooled difference is negative with a CI that includes zero; this policy is not uniformly better.</w:t>
+      </w:r>
+    </w:p>
+    <w:p>
+      <w:pPr>
+        <w:sectPr>
+          <w:type w:val="continuous"/>
+          <w:pgSz w:w="12240" w:h="15840"/>
+          <w:pgMar w:top="1080" w:right="900" w:bottom="1440" w:left="900" w:header="720" w:footer="720" w:gutter="0"/>
+          <w:cols w:space="360" w:num="2"/>
+          <w:docGrid w:linePitch="360"/>
+        </w:sectPr>
+      </w:pPr>
+    </w:p>
+    <w:p>
+      <w:pPr>
+        <w:keepNext/>
+        <w:spacing w:before="120" w:after="0"/>
+        <w:jc w:val="center"/>
+      </w:pPr>
+      <w:r>
+        <w:rPr>
+          <w:b w:val="0"/>
+          <w:i w:val="0"/>
+          <w:smallCaps w:val="0"/>
+          <w:sz w:val="16"/>
+        </w:rPr>
+        <w:t>TABLE XIII</w:t>
+      </w:r>
+    </w:p>
+    <w:p>
+      <w:pPr>
+        <w:keepNext/>
+        <w:spacing w:before="0" w:after="60"/>
+        <w:jc w:val="center"/>
+      </w:pPr>
+      <w:r>
+        <w:rPr>
+          <w:b w:val="0"/>
+          <w:i w:val="0"/>
+          <w:smallCaps/>
+          <w:sz w:val="16"/>
+        </w:rPr>
+        <w:t>Paired per-flight comparisons (A − B, percentage points; 95% flight-bootstrap CI; Wilcoxon signed-rank, Holm-corrected within family; flights where A is better / tied / worse)</w:t>
+      </w:r>
+    </w:p>
+    <w:tbl>
+      <w:tblPr>
+        <w:tblW w:type="auto" w:w="0"/>
+        <w:jc w:val="center"/>
+        <w:tblLayout w:type="fixed"/>
+        <w:tblLook w:firstColumn="1" w:firstRow="1" w:lastColumn="0" w:lastRow="0" w:noHBand="0" w:noVBand="1" w:val="04A0"/>
+        <w:tblBorders>
+          <w:top w:val="single" w:sz="8" w:color="000000"/>
+          <w:bottom w:val="single" w:sz="8" w:color="000000"/>
+        </w:tblBorders>
+        <w:tblCellMar>
+          <w:left w:w="50" w:type="dxa"/>
+          <w:right w:w="50" w:type="dxa"/>
+        </w:tblCellMar>
+      </w:tblPr>
+      <w:tblGrid>
+        <w:gridCol w:w="1067"/>
+        <w:gridCol w:w="2371"/>
+        <w:gridCol w:w="1936"/>
+        <w:gridCol w:w="1154"/>
+        <w:gridCol w:w="1849"/>
+        <w:gridCol w:w="632"/>
+        <w:gridCol w:w="1067"/>
+      </w:tblGrid>
+      <w:tr>
+        <w:trPr>
+          <w:cantSplit/>
+        </w:trPr>
+        <w:tc>
+          <w:tcPr>
+            <w:tcW w:type="dxa" w:w="1067"/>
+            <w:tcBorders>
+              <w:bottom w:val="single" w:sz="4" w:color="000000"/>
+            </w:tcBorders>
+          </w:tcPr>
+          <w:p>
+            <w:pPr>
+              <w:keepNext/>
+              <w:spacing w:before="0" w:after="0"/>
+              <w:jc w:val="left"/>
+            </w:pPr>
+            <w:r>
+              <w:rPr>
+                <w:b/>
+                <w:i w:val="0"/>
+                <w:smallCaps w:val="0"/>
+                <w:sz w:val="16"/>
+              </w:rPr>
+              <w:t>Family</w:t>
+            </w:r>
+          </w:p>
+        </w:tc>
+        <w:tc>
+          <w:tcPr>
+            <w:tcW w:type="dxa" w:w="2372"/>
+            <w:tcBorders>
+              <w:bottom w:val="single" w:sz="4" w:color="000000"/>
+            </w:tcBorders>
+          </w:tcPr>
+          <w:p>
+            <w:pPr>
+              <w:keepNext/>
+              <w:spacing w:before="0" w:after="0"/>
+              <w:jc w:val="center"/>
+            </w:pPr>
+            <w:r>
+              <w:rPr>
+                <w:b/>
+                <w:i w:val="0"/>
+                <w:smallCaps w:val="0"/>
+                <w:sz w:val="16"/>
+              </w:rPr>
+              <w:t>A</w:t>
+            </w:r>
+          </w:p>
+        </w:tc>
+        <w:tc>
+          <w:tcPr>
+            <w:tcW w:type="dxa" w:w="1937"/>
+            <w:tcBorders>
+              <w:bottom w:val="single" w:sz="4" w:color="000000"/>
+            </w:tcBorders>
+          </w:tcPr>
+          <w:p>
+            <w:pPr>
+              <w:keepNext/>
+              <w:spacing w:before="0" w:after="0"/>
+              <w:jc w:val="left"/>
+            </w:pPr>
+            <w:r>
+              <w:rPr>
+                <w:b/>
+                <w:i w:val="0"/>
+                <w:smallCaps w:val="0"/>
+                <w:sz w:val="16"/>
+              </w:rPr>
+              <w:t>B</w:t>
+            </w:r>
+          </w:p>
+        </w:tc>
+        <w:tc>
+          <w:tcPr>
+            <w:tcW w:type="dxa" w:w="1154"/>
+            <w:tcBorders>
+              <w:bottom w:val="single" w:sz="4" w:color="000000"/>
+            </w:tcBorders>
+          </w:tcPr>
+          <w:p>
+            <w:pPr>
+              <w:keepNext/>
+              <w:spacing w:before="0" w:after="0"/>
+              <w:jc w:val="left"/>
+            </w:pPr>
+            <w:r>
+              <w:rPr>
+                <w:b/>
+                <w:i w:val="0"/>
+                <w:smallCaps w:val="0"/>
+                <w:sz w:val="16"/>
+              </w:rPr>
+              <w:t>Metric</w:t>
+            </w:r>
+          </w:p>
+        </w:tc>
+        <w:tc>
+          <w:tcPr>
+            <w:tcW w:type="dxa" w:w="1850"/>
+            <w:tcBorders>
+              <w:bottom w:val="single" w:sz="4" w:color="000000"/>
+            </w:tcBorders>
+          </w:tcPr>
+          <w:p>
+            <w:pPr>
+              <w:keepNext/>
+              <w:spacing w:before="0" w:after="0"/>
+              <w:jc w:val="center"/>
+            </w:pPr>
+            <w:r>
+              <w:rPr>
+                <w:b/>
+                <w:i w:val="0"/>
+                <w:smallCaps w:val="0"/>
+                <w:sz w:val="16"/>
+              </w:rPr>
+              <w:t>A − B [95% CI]</w:t>
+            </w:r>
+          </w:p>
+        </w:tc>
+        <w:tc>
+          <w:tcPr>
+            <w:tcW w:type="dxa" w:w="632"/>
+            <w:tcBorders>
+              <w:bottom w:val="single" w:sz="4" w:color="000000"/>
+            </w:tcBorders>
+          </w:tcPr>
+          <w:p>
+            <w:pPr>
+              <w:keepNext/>
+              <w:spacing w:before="0" w:after="0"/>
+              <w:jc w:val="center"/>
+            </w:pPr>
+            <w:r>
+              <w:rPr>
+                <w:b/>
+                <w:i w:val="0"/>
+                <w:smallCaps w:val="0"/>
+                <w:sz w:val="16"/>
+              </w:rPr>
+              <w:t>Holm p</w:t>
+            </w:r>
+          </w:p>
+        </w:tc>
+        <w:tc>
+          <w:tcPr>
+            <w:tcW w:type="dxa" w:w="1067"/>
+            <w:tcBorders>
+              <w:bottom w:val="single" w:sz="4" w:color="000000"/>
+            </w:tcBorders>
+          </w:tcPr>
+          <w:p>
+            <w:pPr>
+              <w:keepNext/>
+              <w:spacing w:before="0" w:after="0"/>
+              <w:jc w:val="center"/>
+            </w:pPr>
+            <w:r>
+              <w:rPr>
+                <w:b/>
+                <w:i w:val="0"/>
+                <w:smallCaps w:val="0"/>
+                <w:sz w:val="16"/>
+              </w:rPr>
+              <w:t>Better / tied / worse</w:t>
+            </w:r>
+          </w:p>
+        </w:tc>
+      </w:tr>
+      <w:tr>
+        <w:trPr>
+          <w:cantSplit/>
+        </w:trPr>
+        <w:tc>
+          <w:tcPr>
+            <w:tcW w:type="dxa" w:w="1067"/>
+          </w:tcPr>
+          <w:p>
+            <w:pPr>
+              <w:keepNext/>
+              <w:spacing w:before="0" w:after="0"/>
+              <w:jc w:val="left"/>
+            </w:pPr>
+            <w:r>
+              <w:rPr>
+                <w:b w:val="0"/>
+                <w:i w:val="0"/>
+                <w:smallCaps w:val="0"/>
+                <w:sz w:val="16"/>
+              </w:rPr>
+              <w:t>Closed loop</w:t>
+            </w:r>
+          </w:p>
+        </w:tc>
+        <w:tc>
+          <w:tcPr>
+            <w:tcW w:type="dxa" w:w="2372"/>
+          </w:tcPr>
+          <w:p>
+            <w:pPr>
+              <w:keepNext/>
+              <w:spacing w:before="0" w:after="0"/>
+              <w:jc w:val="center"/>
+            </w:pPr>
+            <w:r>
+              <w:rPr>
+                <w:b w:val="0"/>
+                <w:i w:val="0"/>
+                <w:smallCaps w:val="0"/>
+                <w:sz w:val="16"/>
+              </w:rPr>
+              <w:t>4 partners, full /8</w:t>
+            </w:r>
+          </w:p>
+        </w:tc>
+        <w:tc>
+          <w:tcPr>
+            <w:tcW w:type="dxa" w:w="1937"/>
+          </w:tcPr>
+          <w:p>
+            <w:pPr>
+              <w:keepNext/>
+              <w:spacing w:before="0" w:after="0"/>
+              <w:jc w:val="left"/>
+            </w:pPr>
+            <w:r>
+              <w:rPr>
+                <w:b w:val="0"/>
+                <w:i w:val="0"/>
+                <w:smallCaps w:val="0"/>
+                <w:sz w:val="16"/>
+              </w:rPr>
+              <w:t>Full sweep every step</w:t>
+            </w:r>
+          </w:p>
+        </w:tc>
+        <w:tc>
+          <w:tcPr>
+            <w:tcW w:type="dxa" w:w="1154"/>
+          </w:tcPr>
+          <w:p>
+            <w:pPr>
+              <w:keepNext/>
+              <w:spacing w:before="0" w:after="0"/>
+              <w:jc w:val="left"/>
+            </w:pPr>
+            <w:r>
+              <w:rPr>
+                <w:b w:val="0"/>
+                <w:i w:val="0"/>
+                <w:smallCaps w:val="0"/>
+                <w:sz w:val="16"/>
+              </w:rPr>
+              <w:t>Exact top-1</w:t>
+            </w:r>
+          </w:p>
+        </w:tc>
+        <w:tc>
+          <w:tcPr>
+            <w:tcW w:type="dxa" w:w="1850"/>
+          </w:tcPr>
+          <w:p>
+            <w:pPr>
+              <w:keepNext/>
+              <w:spacing w:before="0" w:after="0"/>
+              <w:jc w:val="center"/>
+            </w:pPr>
+            <w:r>
+              <w:rPr>
+                <w:b w:val="0"/>
+                <w:i w:val="0"/>
+                <w:smallCaps w:val="0"/>
+                <w:sz w:val="16"/>
+              </w:rPr>
+              <w:t>−2.85 [−4.04, −1.82]</w:t>
+            </w:r>
+          </w:p>
+        </w:tc>
+        <w:tc>
+          <w:tcPr>
+            <w:tcW w:type="dxa" w:w="632"/>
+          </w:tcPr>
+          <w:p>
+            <w:pPr>
+              <w:keepNext/>
+              <w:spacing w:before="0" w:after="0"/>
+              <w:jc w:val="center"/>
+            </w:pPr>
+            <w:r>
+              <w:rPr>
+                <w:b w:val="0"/>
+                <w:i w:val="0"/>
+                <w:smallCaps w:val="0"/>
+                <w:sz w:val="16"/>
+              </w:rPr>
+              <w:t>&lt; 10⁻⁴</w:t>
+            </w:r>
+          </w:p>
+        </w:tc>
+        <w:tc>
+          <w:tcPr>
+            <w:tcW w:type="dxa" w:w="1067"/>
+          </w:tcPr>
+          <w:p>
+            <w:pPr>
+              <w:keepNext/>
+              <w:spacing w:before="0" w:after="0"/>
+              <w:jc w:val="center"/>
+            </w:pPr>
+            <w:r>
+              <w:rPr>
+                <w:b w:val="0"/>
+                <w:i w:val="0"/>
+                <w:smallCaps w:val="0"/>
+                <w:sz w:val="16"/>
+              </w:rPr>
+              <w:t>0 / 6 / 27</w:t>
+            </w:r>
+          </w:p>
+        </w:tc>
+      </w:tr>
+      <w:tr>
+        <w:trPr>
+          <w:cantSplit/>
+        </w:trPr>
+        <w:tc>
+          <w:tcPr>
+            <w:tcW w:type="dxa" w:w="1067"/>
+          </w:tcPr>
+          <w:p>
+            <w:pPr>
+              <w:keepNext/>
+              <w:spacing w:before="0" w:after="0"/>
+              <w:jc w:val="left"/>
+            </w:pPr>
+            <w:r>
+              <w:rPr>
+                <w:b w:val="0"/>
+                <w:i w:val="0"/>
+                <w:smallCaps w:val="0"/>
+                <w:sz w:val="16"/>
+              </w:rPr>
+              <w:t>Closed loop</w:t>
+            </w:r>
+          </w:p>
+        </w:tc>
+        <w:tc>
+          <w:tcPr>
+            <w:tcW w:type="dxa" w:w="2372"/>
+          </w:tcPr>
+          <w:p>
+            <w:pPr>
+              <w:keepNext/>
+              <w:spacing w:before="0" w:after="0"/>
+              <w:jc w:val="center"/>
+            </w:pPr>
+            <w:r>
+              <w:rPr>
+                <w:b w:val="0"/>
+                <w:i w:val="0"/>
+                <w:smallCaps w:val="0"/>
+                <w:sz w:val="16"/>
+              </w:rPr>
+              <w:t>4 partners, full /8</w:t>
+            </w:r>
+          </w:p>
+        </w:tc>
+        <w:tc>
+          <w:tcPr>
+            <w:tcW w:type="dxa" w:w="1937"/>
+          </w:tcPr>
+          <w:p>
+            <w:pPr>
+              <w:keepNext/>
+              <w:spacing w:before="0" w:after="0"/>
+              <w:jc w:val="left"/>
+            </w:pPr>
+            <w:r>
+              <w:rPr>
+                <w:b w:val="0"/>
+                <w:i w:val="0"/>
+                <w:smallCaps w:val="0"/>
+                <w:sz w:val="16"/>
+              </w:rPr>
+              <w:t>Full sweep every step</w:t>
+            </w:r>
+          </w:p>
+        </w:tc>
+        <w:tc>
+          <w:tcPr>
+            <w:tcW w:type="dxa" w:w="1154"/>
+          </w:tcPr>
+          <w:p>
+            <w:pPr>
+              <w:keepNext/>
+              <w:spacing w:before="0" w:after="0"/>
+              <w:jc w:val="left"/>
+            </w:pPr>
+            <w:r>
+              <w:rPr>
+                <w:b w:val="0"/>
+                <w:i w:val="0"/>
+                <w:smallCaps w:val="0"/>
+                <w:sz w:val="16"/>
+              </w:rPr>
+              <w:t>SE, 10 dB</w:t>
+            </w:r>
+          </w:p>
+        </w:tc>
+        <w:tc>
+          <w:tcPr>
+            <w:tcW w:type="dxa" w:w="1850"/>
+          </w:tcPr>
+          <w:p>
+            <w:pPr>
+              <w:keepNext/>
+              <w:spacing w:before="0" w:after="0"/>
+              <w:jc w:val="center"/>
+            </w:pPr>
+            <w:r>
+              <w:rPr>
+                <w:b w:val="0"/>
+                <w:i w:val="0"/>
+                <w:smallCaps w:val="0"/>
+                <w:sz w:val="16"/>
+              </w:rPr>
+              <w:t>+2.61 [+2.50, +2.71]</w:t>
+            </w:r>
+          </w:p>
+        </w:tc>
+        <w:tc>
+          <w:tcPr>
+            <w:tcW w:type="dxa" w:w="632"/>
+          </w:tcPr>
+          <w:p>
+            <w:pPr>
+              <w:keepNext/>
+              <w:spacing w:before="0" w:after="0"/>
+              <w:jc w:val="center"/>
+            </w:pPr>
+            <w:r>
+              <w:rPr>
+                <w:b w:val="0"/>
+                <w:i w:val="0"/>
+                <w:smallCaps w:val="0"/>
+                <w:sz w:val="16"/>
+              </w:rPr>
+              <w:t>&lt; 10⁻⁴</w:t>
+            </w:r>
+          </w:p>
+        </w:tc>
+        <w:tc>
+          <w:tcPr>
+            <w:tcW w:type="dxa" w:w="1067"/>
+          </w:tcPr>
+          <w:p>
+            <w:pPr>
+              <w:keepNext/>
+              <w:spacing w:before="0" w:after="0"/>
+              <w:jc w:val="center"/>
+            </w:pPr>
+            <w:r>
+              <w:rPr>
+                <w:b w:val="0"/>
+                <w:i w:val="0"/>
+                <w:smallCaps w:val="0"/>
+                <w:sz w:val="16"/>
+              </w:rPr>
+              <w:t>32 / 1 / 0</w:t>
+            </w:r>
+          </w:p>
+        </w:tc>
+      </w:tr>
+      <w:tr>
+        <w:trPr>
+          <w:cantSplit/>
+        </w:trPr>
+        <w:tc>
+          <w:tcPr>
+            <w:tcW w:type="dxa" w:w="1067"/>
+          </w:tcPr>
+          <w:p>
+            <w:pPr>
+              <w:keepNext/>
+              <w:spacing w:before="0" w:after="0"/>
+              <w:jc w:val="left"/>
+            </w:pPr>
+            <w:r>
+              <w:rPr>
+                <w:b w:val="0"/>
+                <w:i w:val="0"/>
+                <w:smallCaps w:val="0"/>
+                <w:sz w:val="16"/>
+              </w:rPr>
+              <w:t>Closed loop</w:t>
+            </w:r>
+          </w:p>
+        </w:tc>
+        <w:tc>
+          <w:tcPr>
+            <w:tcW w:type="dxa" w:w="2372"/>
+          </w:tcPr>
+          <w:p>
+            <w:pPr>
+              <w:keepNext/>
+              <w:spacing w:before="0" w:after="0"/>
+              <w:jc w:val="center"/>
+            </w:pPr>
+            <w:r>
+              <w:rPr>
+                <w:b w:val="0"/>
+                <w:i w:val="0"/>
+                <w:smallCaps w:val="0"/>
+                <w:sz w:val="16"/>
+              </w:rPr>
+              <w:t>6 partners, full /8</w:t>
+            </w:r>
+          </w:p>
+        </w:tc>
+        <w:tc>
+          <w:tcPr>
+            <w:tcW w:type="dxa" w:w="1937"/>
+          </w:tcPr>
+          <w:p>
+            <w:pPr>
+              <w:keepNext/>
+              <w:spacing w:before="0" w:after="0"/>
+              <w:jc w:val="left"/>
+            </w:pPr>
+            <w:r>
+              <w:rPr>
+                <w:b w:val="0"/>
+                <w:i w:val="0"/>
+                <w:smallCaps w:val="0"/>
+                <w:sz w:val="16"/>
+              </w:rPr>
+              <w:t>4 partners, full /8</w:t>
+            </w:r>
+          </w:p>
+        </w:tc>
+        <w:tc>
+          <w:tcPr>
+            <w:tcW w:type="dxa" w:w="1154"/>
+          </w:tcPr>
+          <w:p>
+            <w:pPr>
+              <w:keepNext/>
+              <w:spacing w:before="0" w:after="0"/>
+              <w:jc w:val="left"/>
+            </w:pPr>
+            <w:r>
+              <w:rPr>
+                <w:b w:val="0"/>
+                <w:i w:val="0"/>
+                <w:smallCaps w:val="0"/>
+                <w:sz w:val="16"/>
+              </w:rPr>
+              <w:t>Exact top-1</w:t>
+            </w:r>
+          </w:p>
+        </w:tc>
+        <w:tc>
+          <w:tcPr>
+            <w:tcW w:type="dxa" w:w="1850"/>
+          </w:tcPr>
+          <w:p>
+            <w:pPr>
+              <w:keepNext/>
+              <w:spacing w:before="0" w:after="0"/>
+              <w:jc w:val="center"/>
+            </w:pPr>
+            <w:r>
+              <w:rPr>
+                <w:b w:val="0"/>
+                <w:i w:val="0"/>
+                <w:smallCaps w:val="0"/>
+                <w:sz w:val="16"/>
+              </w:rPr>
+              <w:t>+2.00 [+1.33, +2.77]</w:t>
+            </w:r>
+          </w:p>
+        </w:tc>
+        <w:tc>
+          <w:tcPr>
+            <w:tcW w:type="dxa" w:w="632"/>
+          </w:tcPr>
+          <w:p>
+            <w:pPr>
+              <w:keepNext/>
+              <w:spacing w:before="0" w:after="0"/>
+              <w:jc w:val="center"/>
+            </w:pPr>
+            <w:r>
+              <w:rPr>
+                <w:b w:val="0"/>
+                <w:i w:val="0"/>
+                <w:smallCaps w:val="0"/>
+                <w:sz w:val="16"/>
+              </w:rPr>
+              <w:t>&lt; 10⁻⁴</w:t>
+            </w:r>
+          </w:p>
+        </w:tc>
+        <w:tc>
+          <w:tcPr>
+            <w:tcW w:type="dxa" w:w="1067"/>
+          </w:tcPr>
+          <w:p>
+            <w:pPr>
+              <w:keepNext/>
+              <w:spacing w:before="0" w:after="0"/>
+              <w:jc w:val="center"/>
+            </w:pPr>
+            <w:r>
+              <w:rPr>
+                <w:b w:val="0"/>
+                <w:i w:val="0"/>
+                <w:smallCaps w:val="0"/>
+                <w:sz w:val="16"/>
+              </w:rPr>
+              <w:t>26 / 7 / 0</w:t>
+            </w:r>
+          </w:p>
+        </w:tc>
+      </w:tr>
+      <w:tr>
+        <w:trPr>
+          <w:cantSplit/>
+        </w:trPr>
+        <w:tc>
+          <w:tcPr>
+            <w:tcW w:type="dxa" w:w="1067"/>
+          </w:tcPr>
+          <w:p>
+            <w:pPr>
+              <w:keepNext/>
+              <w:spacing w:before="0" w:after="0"/>
+              <w:jc w:val="left"/>
+            </w:pPr>
+            <w:r>
+              <w:rPr>
+                <w:b w:val="0"/>
+                <w:i w:val="0"/>
+                <w:smallCaps w:val="0"/>
+                <w:sz w:val="16"/>
+              </w:rPr>
+              <w:t>Closed loop</w:t>
+            </w:r>
+          </w:p>
+        </w:tc>
+        <w:tc>
+          <w:tcPr>
+            <w:tcW w:type="dxa" w:w="2372"/>
+          </w:tcPr>
+          <w:p>
+            <w:pPr>
+              <w:keepNext/>
+              <w:spacing w:before="0" w:after="0"/>
+              <w:jc w:val="center"/>
+            </w:pPr>
+            <w:r>
+              <w:rPr>
+                <w:b w:val="0"/>
+                <w:i w:val="0"/>
+                <w:smallCaps w:val="0"/>
+                <w:sz w:val="16"/>
+              </w:rPr>
+              <w:t>8 partners, full /8</w:t>
+            </w:r>
+          </w:p>
+        </w:tc>
+        <w:tc>
+          <w:tcPr>
+            <w:tcW w:type="dxa" w:w="1937"/>
+          </w:tcPr>
+          <w:p>
+            <w:pPr>
+              <w:keepNext/>
+              <w:spacing w:before="0" w:after="0"/>
+              <w:jc w:val="left"/>
+            </w:pPr>
+            <w:r>
+              <w:rPr>
+                <w:b w:val="0"/>
+                <w:i w:val="0"/>
+                <w:smallCaps w:val="0"/>
+                <w:sz w:val="16"/>
+              </w:rPr>
+              <w:t>6 partners, full /8</w:t>
+            </w:r>
+          </w:p>
+        </w:tc>
+        <w:tc>
+          <w:tcPr>
+            <w:tcW w:type="dxa" w:w="1154"/>
+          </w:tcPr>
+          <w:p>
+            <w:pPr>
+              <w:keepNext/>
+              <w:spacing w:before="0" w:after="0"/>
+              <w:jc w:val="left"/>
+            </w:pPr>
+            <w:r>
+              <w:rPr>
+                <w:b w:val="0"/>
+                <w:i w:val="0"/>
+                <w:smallCaps w:val="0"/>
+                <w:sz w:val="16"/>
+              </w:rPr>
+              <w:t>Exact top-1</w:t>
+            </w:r>
+          </w:p>
+        </w:tc>
+        <w:tc>
+          <w:tcPr>
+            <w:tcW w:type="dxa" w:w="1850"/>
+          </w:tcPr>
+          <w:p>
+            <w:pPr>
+              <w:keepNext/>
+              <w:spacing w:before="0" w:after="0"/>
+              <w:jc w:val="center"/>
+            </w:pPr>
+            <w:r>
+              <w:rPr>
+                <w:b w:val="0"/>
+                <w:i w:val="0"/>
+                <w:smallCaps w:val="0"/>
+                <w:sz w:val="16"/>
+              </w:rPr>
+              <w:t>+0.12 [−0.02, +0.28]</w:t>
+            </w:r>
+          </w:p>
+        </w:tc>
+        <w:tc>
+          <w:tcPr>
+            <w:tcW w:type="dxa" w:w="632"/>
+          </w:tcPr>
+          <w:p>
+            <w:pPr>
+              <w:keepNext/>
+              <w:spacing w:before="0" w:after="0"/>
+              <w:jc w:val="center"/>
+            </w:pPr>
+            <w:r>
+              <w:rPr>
+                <w:b w:val="0"/>
+                <w:i w:val="0"/>
+                <w:smallCaps w:val="0"/>
+                <w:sz w:val="16"/>
+              </w:rPr>
+              <w:t>0.08</w:t>
+            </w:r>
+          </w:p>
+        </w:tc>
+        <w:tc>
+          <w:tcPr>
+            <w:tcW w:type="dxa" w:w="1067"/>
+          </w:tcPr>
+          <w:p>
+            <w:pPr>
+              <w:keepNext/>
+              <w:spacing w:before="0" w:after="0"/>
+              <w:jc w:val="center"/>
+            </w:pPr>
+            <w:r>
+              <w:rPr>
+                <w:b w:val="0"/>
+                <w:i w:val="0"/>
+                <w:smallCaps w:val="0"/>
+                <w:sz w:val="16"/>
+              </w:rPr>
+              <w:t>7 / 24 / 2</w:t>
+            </w:r>
+          </w:p>
+        </w:tc>
+      </w:tr>
+      <w:tr>
+        <w:trPr>
+          <w:cantSplit/>
+        </w:trPr>
+        <w:tc>
+          <w:tcPr>
+            <w:tcW w:type="dxa" w:w="1067"/>
+          </w:tcPr>
+          <w:p>
+            <w:pPr>
+              <w:keepNext/>
+              <w:spacing w:before="0" w:after="0"/>
+              <w:jc w:val="left"/>
+            </w:pPr>
+            <w:r>
+              <w:rPr>
+                <w:b w:val="0"/>
+                <w:i w:val="0"/>
+                <w:smallCaps w:val="0"/>
+                <w:sz w:val="16"/>
+              </w:rPr>
+              <w:t>Closed loop</w:t>
+            </w:r>
+          </w:p>
+        </w:tc>
+        <w:tc>
+          <w:tcPr>
+            <w:tcW w:type="dxa" w:w="2372"/>
+          </w:tcPr>
+          <w:p>
+            <w:pPr>
+              <w:keepNext/>
+              <w:spacing w:before="0" w:after="0"/>
+              <w:jc w:val="center"/>
+            </w:pPr>
+            <w:r>
+              <w:rPr>
+                <w:b w:val="0"/>
+                <w:i w:val="0"/>
+                <w:smallCaps w:val="0"/>
+                <w:sz w:val="16"/>
+              </w:rPr>
+              <w:t>4 partners, full /4</w:t>
+            </w:r>
+          </w:p>
+        </w:tc>
+        <w:tc>
+          <w:tcPr>
+            <w:tcW w:type="dxa" w:w="1937"/>
+          </w:tcPr>
+          <w:p>
+            <w:pPr>
+              <w:keepNext/>
+              <w:spacing w:before="0" w:after="0"/>
+              <w:jc w:val="left"/>
+            </w:pPr>
+            <w:r>
+              <w:rPr>
+                <w:b w:val="0"/>
+                <w:i w:val="0"/>
+                <w:smallCaps w:val="0"/>
+                <w:sz w:val="16"/>
+              </w:rPr>
+              <w:t>4 partners, full /8</w:t>
+            </w:r>
+          </w:p>
+        </w:tc>
+        <w:tc>
+          <w:tcPr>
+            <w:tcW w:type="dxa" w:w="1154"/>
+          </w:tcPr>
+          <w:p>
+            <w:pPr>
+              <w:keepNext/>
+              <w:spacing w:before="0" w:after="0"/>
+              <w:jc w:val="left"/>
+            </w:pPr>
+            <w:r>
+              <w:rPr>
+                <w:b w:val="0"/>
+                <w:i w:val="0"/>
+                <w:smallCaps w:val="0"/>
+                <w:sz w:val="16"/>
+              </w:rPr>
+              <w:t>Exact top-1</w:t>
+            </w:r>
+          </w:p>
+        </w:tc>
+        <w:tc>
+          <w:tcPr>
+            <w:tcW w:type="dxa" w:w="1850"/>
+          </w:tcPr>
+          <w:p>
+            <w:pPr>
+              <w:keepNext/>
+              <w:spacing w:before="0" w:after="0"/>
+              <w:jc w:val="center"/>
+            </w:pPr>
+            <w:r>
+              <w:rPr>
+                <w:b w:val="0"/>
+                <w:i w:val="0"/>
+                <w:smallCaps w:val="0"/>
+                <w:sz w:val="16"/>
+              </w:rPr>
+              <w:t>+0.65 [+0.39, +0.96]</w:t>
+            </w:r>
+          </w:p>
+        </w:tc>
+        <w:tc>
+          <w:tcPr>
+            <w:tcW w:type="dxa" w:w="632"/>
+          </w:tcPr>
+          <w:p>
+            <w:pPr>
+              <w:keepNext/>
+              <w:spacing w:before="0" w:after="0"/>
+              <w:jc w:val="center"/>
+            </w:pPr>
+            <w:r>
+              <w:rPr>
+                <w:b w:val="0"/>
+                <w:i w:val="0"/>
+                <w:smallCaps w:val="0"/>
+                <w:sz w:val="16"/>
+              </w:rPr>
+              <w:t>&lt; 10⁻⁴</w:t>
+            </w:r>
+          </w:p>
+        </w:tc>
+        <w:tc>
+          <w:tcPr>
+            <w:tcW w:type="dxa" w:w="1067"/>
+          </w:tcPr>
+          <w:p>
+            <w:pPr>
+              <w:keepNext/>
+              <w:spacing w:before="0" w:after="0"/>
+              <w:jc w:val="center"/>
+            </w:pPr>
+            <w:r>
+              <w:rPr>
+                <w:b w:val="0"/>
+                <w:i w:val="0"/>
+                <w:smallCaps w:val="0"/>
+                <w:sz w:val="16"/>
+              </w:rPr>
+              <w:t>18 / 15 / 0</w:t>
+            </w:r>
+          </w:p>
+        </w:tc>
+      </w:tr>
+      <w:tr>
+        <w:trPr>
+          <w:cantSplit/>
+        </w:trPr>
+        <w:tc>
+          <w:tcPr>
+            <w:tcW w:type="dxa" w:w="1067"/>
+          </w:tcPr>
+          <w:p>
+            <w:pPr>
+              <w:keepNext/>
+              <w:spacing w:before="0" w:after="0"/>
+              <w:jc w:val="left"/>
+            </w:pPr>
+            <w:r>
+              <w:rPr>
+                <w:b w:val="0"/>
+                <w:i w:val="0"/>
+                <w:smallCaps w:val="0"/>
+                <w:sz w:val="16"/>
+              </w:rPr>
+              <w:t>Closed loop</w:t>
+            </w:r>
+          </w:p>
+        </w:tc>
+        <w:tc>
+          <w:tcPr>
+            <w:tcW w:type="dxa" w:w="2372"/>
+          </w:tcPr>
+          <w:p>
+            <w:pPr>
+              <w:keepNext/>
+              <w:spacing w:before="0" w:after="0"/>
+              <w:jc w:val="center"/>
+            </w:pPr>
+            <w:r>
+              <w:rPr>
+                <w:b w:val="0"/>
+                <w:i w:val="0"/>
+                <w:smallCaps w:val="0"/>
+                <w:sz w:val="16"/>
+              </w:rPr>
+              <w:t>4 partners, full /4</w:t>
+            </w:r>
+          </w:p>
+        </w:tc>
+        <w:tc>
+          <w:tcPr>
+            <w:tcW w:type="dxa" w:w="1937"/>
+          </w:tcPr>
+          <w:p>
+            <w:pPr>
+              <w:keepNext/>
+              <w:spacing w:before="0" w:after="0"/>
+              <w:jc w:val="left"/>
+            </w:pPr>
+            <w:r>
+              <w:rPr>
+                <w:b w:val="0"/>
+                <w:i w:val="0"/>
+                <w:smallCaps w:val="0"/>
+                <w:sz w:val="16"/>
+              </w:rPr>
+              <w:t>4 partners, full /8</w:t>
+            </w:r>
+          </w:p>
+        </w:tc>
+        <w:tc>
+          <w:tcPr>
+            <w:tcW w:type="dxa" w:w="1154"/>
+          </w:tcPr>
+          <w:p>
+            <w:pPr>
+              <w:keepNext/>
+              <w:spacing w:before="0" w:after="0"/>
+              <w:jc w:val="left"/>
+            </w:pPr>
+            <w:r>
+              <w:rPr>
+                <w:b w:val="0"/>
+                <w:i w:val="0"/>
+                <w:smallCaps w:val="0"/>
+                <w:sz w:val="16"/>
+              </w:rPr>
+              <w:t>SE, 10 dB</w:t>
+            </w:r>
+          </w:p>
+        </w:tc>
+        <w:tc>
+          <w:tcPr>
+            <w:tcW w:type="dxa" w:w="1850"/>
+          </w:tcPr>
+          <w:p>
+            <w:pPr>
+              <w:keepNext/>
+              <w:spacing w:before="0" w:after="0"/>
+              <w:jc w:val="center"/>
+            </w:pPr>
+            <w:r>
+              <w:rPr>
+                <w:b w:val="0"/>
+                <w:i w:val="0"/>
+                <w:smallCaps w:val="0"/>
+                <w:sz w:val="16"/>
+              </w:rPr>
+              <w:t>−0.33 [−0.38, −0.27]</w:t>
+            </w:r>
+          </w:p>
+        </w:tc>
+        <w:tc>
+          <w:tcPr>
+            <w:tcW w:type="dxa" w:w="632"/>
+          </w:tcPr>
+          <w:p>
+            <w:pPr>
+              <w:keepNext/>
+              <w:spacing w:before="0" w:after="0"/>
+              <w:jc w:val="center"/>
+            </w:pPr>
+            <w:r>
+              <w:rPr>
+                <w:b w:val="0"/>
+                <w:i w:val="0"/>
+                <w:smallCaps w:val="0"/>
+                <w:sz w:val="16"/>
+              </w:rPr>
+              <w:t>&lt; 10⁻⁴</w:t>
+            </w:r>
+          </w:p>
+        </w:tc>
+        <w:tc>
+          <w:tcPr>
+            <w:tcW w:type="dxa" w:w="1067"/>
+          </w:tcPr>
+          <w:p>
+            <w:pPr>
+              <w:keepNext/>
+              <w:spacing w:before="0" w:after="0"/>
+              <w:jc w:val="center"/>
+            </w:pPr>
+            <w:r>
+              <w:rPr>
+                <w:b w:val="0"/>
+                <w:i w:val="0"/>
+                <w:smallCaps w:val="0"/>
+                <w:sz w:val="16"/>
+              </w:rPr>
+              <w:t>2 / 1 / 30</w:t>
+            </w:r>
+          </w:p>
+        </w:tc>
+      </w:tr>
+      <w:tr>
+        <w:trPr>
+          <w:cantSplit/>
+        </w:trPr>
+        <w:tc>
+          <w:tcPr>
+            <w:tcW w:type="dxa" w:w="1067"/>
+          </w:tcPr>
+          <w:p>
+            <w:pPr>
+              <w:keepNext/>
+              <w:spacing w:before="0" w:after="0"/>
+              <w:jc w:val="left"/>
+            </w:pPr>
+            <w:r>
+              <w:rPr>
+                <w:b w:val="0"/>
+                <w:i w:val="0"/>
+                <w:smallCaps w:val="0"/>
+                <w:sz w:val="16"/>
+              </w:rPr>
+              <w:t>Closed loop</w:t>
+            </w:r>
+          </w:p>
+        </w:tc>
+        <w:tc>
+          <w:tcPr>
+            <w:tcW w:type="dxa" w:w="2372"/>
+          </w:tcPr>
+          <w:p>
+            <w:pPr>
+              <w:keepNext/>
+              <w:spacing w:before="0" w:after="0"/>
+              <w:jc w:val="center"/>
+            </w:pPr>
+            <w:r>
+              <w:rPr>
+                <w:b w:val="0"/>
+                <w:i w:val="0"/>
+                <w:smallCaps w:val="0"/>
+                <w:sz w:val="16"/>
+              </w:rPr>
+              <w:t>4 partners, full /8</w:t>
+            </w:r>
+          </w:p>
+        </w:tc>
+        <w:tc>
+          <w:tcPr>
+            <w:tcW w:type="dxa" w:w="1937"/>
+          </w:tcPr>
+          <w:p>
+            <w:pPr>
+              <w:keepNext/>
+              <w:spacing w:before="0" w:after="0"/>
+              <w:jc w:val="left"/>
+            </w:pPr>
+            <w:r>
+              <w:rPr>
+                <w:b w:val="0"/>
+                <w:i w:val="0"/>
+                <w:smallCaps w:val="0"/>
+                <w:sz w:val="16"/>
+              </w:rPr>
+              <w:t>Window ±1, full /4</w:t>
+            </w:r>
+          </w:p>
+        </w:tc>
+        <w:tc>
+          <w:tcPr>
+            <w:tcW w:type="dxa" w:w="1154"/>
+          </w:tcPr>
+          <w:p>
+            <w:pPr>
+              <w:keepNext/>
+              <w:spacing w:before="0" w:after="0"/>
+              <w:jc w:val="left"/>
+            </w:pPr>
+            <w:r>
+              <w:rPr>
+                <w:b w:val="0"/>
+                <w:i w:val="0"/>
+                <w:smallCaps w:val="0"/>
+                <w:sz w:val="16"/>
+              </w:rPr>
+              <w:t>Exact top-1</w:t>
+            </w:r>
+          </w:p>
+        </w:tc>
+        <w:tc>
+          <w:tcPr>
+            <w:tcW w:type="dxa" w:w="1850"/>
+          </w:tcPr>
+          <w:p>
+            <w:pPr>
+              <w:keepNext/>
+              <w:spacing w:before="0" w:after="0"/>
+              <w:jc w:val="center"/>
+            </w:pPr>
+            <w:r>
+              <w:rPr>
+                <w:b w:val="0"/>
+                <w:i w:val="0"/>
+                <w:smallCaps w:val="0"/>
+                <w:sz w:val="16"/>
+              </w:rPr>
+              <w:t>+5.95 [+4.28, +7.73]</w:t>
+            </w:r>
+          </w:p>
+        </w:tc>
+        <w:tc>
+          <w:tcPr>
+            <w:tcW w:type="dxa" w:w="632"/>
+          </w:tcPr>
+          <w:p>
+            <w:pPr>
+              <w:keepNext/>
+              <w:spacing w:before="0" w:after="0"/>
+              <w:jc w:val="center"/>
+            </w:pPr>
+            <w:r>
+              <w:rPr>
+                <w:b w:val="0"/>
+                <w:i w:val="0"/>
+                <w:smallCaps w:val="0"/>
+                <w:sz w:val="16"/>
+              </w:rPr>
+              <w:t>&lt; 10⁻⁴</w:t>
+            </w:r>
+          </w:p>
+        </w:tc>
+        <w:tc>
+          <w:tcPr>
+            <w:tcW w:type="dxa" w:w="1067"/>
+          </w:tcPr>
+          <w:p>
+            <w:pPr>
+              <w:keepNext/>
+              <w:spacing w:before="0" w:after="0"/>
+              <w:jc w:val="center"/>
+            </w:pPr>
+            <w:r>
+              <w:rPr>
+                <w:b w:val="0"/>
+                <w:i w:val="0"/>
+                <w:smallCaps w:val="0"/>
+                <w:sz w:val="16"/>
+              </w:rPr>
+              <w:t>30 / 3 / 0</w:t>
+            </w:r>
+          </w:p>
+        </w:tc>
+      </w:tr>
+      <w:tr>
+        <w:trPr>
+          <w:cantSplit/>
+        </w:trPr>
+        <w:tc>
+          <w:tcPr>
+            <w:tcW w:type="dxa" w:w="1067"/>
+          </w:tcPr>
+          <w:p>
+            <w:pPr>
+              <w:keepNext/>
+              <w:spacing w:before="0" w:after="0"/>
+              <w:jc w:val="left"/>
+            </w:pPr>
+            <w:r>
+              <w:rPr>
+                <w:b w:val="0"/>
+                <w:i w:val="0"/>
+                <w:smallCaps w:val="0"/>
+                <w:sz w:val="16"/>
+              </w:rPr>
+              <w:t>Closed loop</w:t>
+            </w:r>
+          </w:p>
+        </w:tc>
+        <w:tc>
+          <w:tcPr>
+            <w:tcW w:type="dxa" w:w="2372"/>
+          </w:tcPr>
+          <w:p>
+            <w:pPr>
+              <w:keepNext/>
+              <w:spacing w:before="0" w:after="0"/>
+              <w:jc w:val="center"/>
+            </w:pPr>
+            <w:r>
+              <w:rPr>
+                <w:b w:val="0"/>
+                <w:i w:val="0"/>
+                <w:smallCaps w:val="0"/>
+                <w:sz w:val="16"/>
+              </w:rPr>
+              <w:t>6 partners, loss-triggered</w:t>
+            </w:r>
+          </w:p>
+        </w:tc>
+        <w:tc>
+          <w:tcPr>
+            <w:tcW w:type="dxa" w:w="1937"/>
+          </w:tcPr>
+          <w:p>
+            <w:pPr>
+              <w:keepNext/>
+              <w:spacing w:before="0" w:after="0"/>
+              <w:jc w:val="left"/>
+            </w:pPr>
+            <w:r>
+              <w:rPr>
+                <w:b w:val="0"/>
+                <w:i w:val="0"/>
+                <w:smallCaps w:val="0"/>
+                <w:sz w:val="16"/>
+              </w:rPr>
+              <w:t>4 partners, full /8</w:t>
+            </w:r>
+          </w:p>
+        </w:tc>
+        <w:tc>
+          <w:tcPr>
+            <w:tcW w:type="dxa" w:w="1154"/>
+          </w:tcPr>
+          <w:p>
+            <w:pPr>
+              <w:keepNext/>
+              <w:spacing w:before="0" w:after="0"/>
+              <w:jc w:val="left"/>
+            </w:pPr>
+            <w:r>
+              <w:rPr>
+                <w:b w:val="0"/>
+                <w:i w:val="0"/>
+                <w:smallCaps w:val="0"/>
+                <w:sz w:val="16"/>
+              </w:rPr>
+              <w:t>Exact top-1</w:t>
+            </w:r>
+          </w:p>
+        </w:tc>
+        <w:tc>
+          <w:tcPr>
+            <w:tcW w:type="dxa" w:w="1850"/>
+          </w:tcPr>
+          <w:p>
+            <w:pPr>
+              <w:keepNext/>
+              <w:spacing w:before="0" w:after="0"/>
+              <w:jc w:val="center"/>
+            </w:pPr>
+            <w:r>
+              <w:rPr>
+                <w:b w:val="0"/>
+                <w:i w:val="0"/>
+                <w:smallCaps w:val="0"/>
+                <w:sz w:val="16"/>
+              </w:rPr>
+              <w:t>−1.08 [−4.73, +1.41]</w:t>
+            </w:r>
+          </w:p>
+        </w:tc>
+        <w:tc>
+          <w:tcPr>
+            <w:tcW w:type="dxa" w:w="632"/>
+          </w:tcPr>
+          <w:p>
+            <w:pPr>
+              <w:keepNext/>
+              <w:spacing w:before="0" w:after="0"/>
+              <w:jc w:val="center"/>
+            </w:pPr>
+            <w:r>
+              <w:rPr>
+                <w:b w:val="0"/>
+                <w:i w:val="0"/>
+                <w:smallCaps w:val="0"/>
+                <w:sz w:val="16"/>
+              </w:rPr>
+              <w:t>0.01</w:t>
+            </w:r>
+          </w:p>
+        </w:tc>
+        <w:tc>
+          <w:tcPr>
+            <w:tcW w:type="dxa" w:w="1067"/>
+          </w:tcPr>
+          <w:p>
+            <w:pPr>
+              <w:keepNext/>
+              <w:spacing w:before="0" w:after="0"/>
+              <w:jc w:val="center"/>
+            </w:pPr>
+            <w:r>
+              <w:rPr>
+                <w:b w:val="0"/>
+                <w:i w:val="0"/>
+                <w:smallCaps w:val="0"/>
+                <w:sz w:val="16"/>
+              </w:rPr>
+              <w:t>22 / 7 / 4</w:t>
+            </w:r>
+          </w:p>
+        </w:tc>
+      </w:tr>
+      <w:tr>
+        <w:trPr>
+          <w:cantSplit/>
+        </w:trPr>
+        <w:tc>
+          <w:tcPr>
+            <w:tcW w:type="dxa" w:w="1067"/>
+          </w:tcPr>
+          <w:p>
+            <w:pPr>
+              <w:keepNext/>
+              <w:spacing w:before="0" w:after="0"/>
+              <w:jc w:val="left"/>
+            </w:pPr>
+            <w:r>
+              <w:rPr>
+                <w:b w:val="0"/>
+                <w:i w:val="0"/>
+                <w:smallCaps w:val="0"/>
+                <w:sz w:val="16"/>
+              </w:rPr>
+              <w:t>Blind t+1</w:t>
+            </w:r>
+          </w:p>
+        </w:tc>
+        <w:tc>
+          <w:tcPr>
+            <w:tcW w:type="dxa" w:w="2372"/>
+          </w:tcPr>
+          <w:p>
+            <w:pPr>
+              <w:keepNext/>
+              <w:spacing w:before="0" w:after="0"/>
+              <w:jc w:val="center"/>
+            </w:pPr>
+            <w:r>
+              <w:rPr>
+                <w:b w:val="0"/>
+                <w:i w:val="0"/>
+                <w:smallCaps w:val="0"/>
+                <w:sz w:val="16"/>
+              </w:rPr>
+              <w:t>GRU ens. + GPS</w:t>
+            </w:r>
+          </w:p>
+        </w:tc>
+        <w:tc>
+          <w:tcPr>
+            <w:tcW w:type="dxa" w:w="1937"/>
+          </w:tcPr>
+          <w:p>
+            <w:pPr>
+              <w:keepNext/>
+              <w:spacing w:before="0" w:after="0"/>
+              <w:jc w:val="left"/>
+            </w:pPr>
+            <w:r>
+              <w:rPr>
+                <w:b w:val="0"/>
+                <w:i w:val="0"/>
+                <w:smallCaps w:val="0"/>
+                <w:sz w:val="16"/>
+              </w:rPr>
+              <w:t>GRU ens., power</w:t>
+            </w:r>
+          </w:p>
+        </w:tc>
+        <w:tc>
+          <w:tcPr>
+            <w:tcW w:type="dxa" w:w="1154"/>
+          </w:tcPr>
+          <w:p>
+            <w:pPr>
+              <w:keepNext/>
+              <w:spacing w:before="0" w:after="0"/>
+              <w:jc w:val="left"/>
+            </w:pPr>
+            <w:r>
+              <w:rPr>
+                <w:b w:val="0"/>
+                <w:i w:val="0"/>
+                <w:smallCaps w:val="0"/>
+                <w:sz w:val="16"/>
+              </w:rPr>
+              <w:t>Within noise</w:t>
+            </w:r>
+          </w:p>
+        </w:tc>
+        <w:tc>
+          <w:tcPr>
+            <w:tcW w:type="dxa" w:w="1850"/>
+          </w:tcPr>
+          <w:p>
+            <w:pPr>
+              <w:keepNext/>
+              <w:spacing w:before="0" w:after="0"/>
+              <w:jc w:val="center"/>
+            </w:pPr>
+            <w:r>
+              <w:rPr>
+                <w:b w:val="0"/>
+                <w:i w:val="0"/>
+                <w:smallCaps w:val="0"/>
+                <w:sz w:val="16"/>
+              </w:rPr>
+              <w:t>+0.05 [−0.29, +0.39]</w:t>
+            </w:r>
+          </w:p>
+        </w:tc>
+        <w:tc>
+          <w:tcPr>
+            <w:tcW w:type="dxa" w:w="632"/>
+          </w:tcPr>
+          <w:p>
+            <w:pPr>
+              <w:keepNext/>
+              <w:spacing w:before="0" w:after="0"/>
+              <w:jc w:val="center"/>
+            </w:pPr>
+            <w:r>
+              <w:rPr>
+                <w:b w:val="0"/>
+                <w:i w:val="0"/>
+                <w:smallCaps w:val="0"/>
+                <w:sz w:val="16"/>
+              </w:rPr>
+              <w:t>0.60</w:t>
+            </w:r>
+          </w:p>
+        </w:tc>
+        <w:tc>
+          <w:tcPr>
+            <w:tcW w:type="dxa" w:w="1067"/>
+          </w:tcPr>
+          <w:p>
+            <w:pPr>
+              <w:keepNext/>
+              <w:spacing w:before="0" w:after="0"/>
+              <w:jc w:val="center"/>
+            </w:pPr>
+            <w:r>
+              <w:rPr>
+                <w:b w:val="0"/>
+                <w:i w:val="0"/>
+                <w:smallCaps w:val="0"/>
+                <w:sz w:val="16"/>
+              </w:rPr>
+              <w:t>10 / 8 / 12</w:t>
+            </w:r>
+          </w:p>
+        </w:tc>
+      </w:tr>
+      <w:tr>
+        <w:trPr>
+          <w:cantSplit/>
+        </w:trPr>
+        <w:tc>
+          <w:tcPr>
+            <w:tcW w:type="dxa" w:w="1067"/>
+          </w:tcPr>
+          <w:p>
+            <w:pPr>
+              <w:keepNext/>
+              <w:spacing w:before="0" w:after="0"/>
+              <w:jc w:val="left"/>
+            </w:pPr>
+            <w:r>
+              <w:rPr>
+                <w:b w:val="0"/>
+                <w:i w:val="0"/>
+                <w:smallCaps w:val="0"/>
+                <w:sz w:val="16"/>
+              </w:rPr>
+              <w:t>Blind t+1</w:t>
+            </w:r>
+          </w:p>
+        </w:tc>
+        <w:tc>
+          <w:tcPr>
+            <w:tcW w:type="dxa" w:w="2372"/>
+          </w:tcPr>
+          <w:p>
+            <w:pPr>
+              <w:keepNext/>
+              <w:spacing w:before="0" w:after="0"/>
+              <w:jc w:val="center"/>
+            </w:pPr>
+            <w:r>
+              <w:rPr>
+                <w:b w:val="0"/>
+                <w:i w:val="0"/>
+                <w:smallCaps w:val="0"/>
+                <w:sz w:val="16"/>
+              </w:rPr>
+              <w:t>GRU ens. + camera</w:t>
+            </w:r>
+          </w:p>
+        </w:tc>
+        <w:tc>
+          <w:tcPr>
+            <w:tcW w:type="dxa" w:w="1937"/>
+          </w:tcPr>
+          <w:p>
+            <w:pPr>
+              <w:keepNext/>
+              <w:spacing w:before="0" w:after="0"/>
+              <w:jc w:val="left"/>
+            </w:pPr>
+            <w:r>
+              <w:rPr>
+                <w:b w:val="0"/>
+                <w:i w:val="0"/>
+                <w:smallCaps w:val="0"/>
+                <w:sz w:val="16"/>
+              </w:rPr>
+              <w:t>GRU ens., power</w:t>
+            </w:r>
+          </w:p>
+        </w:tc>
+        <w:tc>
+          <w:tcPr>
+            <w:tcW w:type="dxa" w:w="1154"/>
+          </w:tcPr>
+          <w:p>
+            <w:pPr>
+              <w:keepNext/>
+              <w:spacing w:before="0" w:after="0"/>
+              <w:jc w:val="left"/>
+            </w:pPr>
+            <w:r>
+              <w:rPr>
+                <w:b w:val="0"/>
+                <w:i w:val="0"/>
+                <w:smallCaps w:val="0"/>
+                <w:sz w:val="16"/>
+              </w:rPr>
+              <w:t>Within noise</w:t>
+            </w:r>
+          </w:p>
+        </w:tc>
+        <w:tc>
+          <w:tcPr>
+            <w:tcW w:type="dxa" w:w="1850"/>
+          </w:tcPr>
+          <w:p>
+            <w:pPr>
+              <w:keepNext/>
+              <w:spacing w:before="0" w:after="0"/>
+              <w:jc w:val="center"/>
+            </w:pPr>
+            <w:r>
+              <w:rPr>
+                <w:b w:val="0"/>
+                <w:i w:val="0"/>
+                <w:smallCaps w:val="0"/>
+                <w:sz w:val="16"/>
+              </w:rPr>
+              <w:t>−0.49 [−0.78, −0.21]</w:t>
+            </w:r>
+          </w:p>
+        </w:tc>
+        <w:tc>
+          <w:tcPr>
+            <w:tcW w:type="dxa" w:w="632"/>
+          </w:tcPr>
+          <w:p>
+            <w:pPr>
+              <w:keepNext/>
+              <w:spacing w:before="0" w:after="0"/>
+              <w:jc w:val="center"/>
+            </w:pPr>
+            <w:r>
+              <w:rPr>
+                <w:b w:val="0"/>
+                <w:i w:val="0"/>
+                <w:smallCaps w:val="0"/>
+                <w:sz w:val="16"/>
+              </w:rPr>
+              <w:t>0.012</w:t>
+            </w:r>
+          </w:p>
+        </w:tc>
+        <w:tc>
+          <w:tcPr>
+            <w:tcW w:type="dxa" w:w="1067"/>
+          </w:tcPr>
+          <w:p>
+            <w:pPr>
+              <w:keepNext/>
+              <w:spacing w:before="0" w:after="0"/>
+              <w:jc w:val="center"/>
+            </w:pPr>
+            <w:r>
+              <w:rPr>
+                <w:b w:val="0"/>
+                <w:i w:val="0"/>
+                <w:smallCaps w:val="0"/>
+                <w:sz w:val="16"/>
+              </w:rPr>
+              <w:t>4 / 9 / 17</w:t>
+            </w:r>
+          </w:p>
+        </w:tc>
+      </w:tr>
+      <w:tr>
+        <w:trPr>
+          <w:cantSplit/>
+        </w:trPr>
+        <w:tc>
+          <w:tcPr>
+            <w:tcW w:type="dxa" w:w="1067"/>
+          </w:tcPr>
+          <w:p>
+            <w:pPr>
+              <w:keepNext/>
+              <w:spacing w:before="0" w:after="0"/>
+              <w:jc w:val="left"/>
+            </w:pPr>
+            <w:r>
+              <w:rPr>
+                <w:b w:val="0"/>
+                <w:i w:val="0"/>
+                <w:smallCaps w:val="0"/>
+                <w:sz w:val="16"/>
+              </w:rPr>
+              <w:t>Blind t+3</w:t>
+            </w:r>
+          </w:p>
+        </w:tc>
+        <w:tc>
+          <w:tcPr>
+            <w:tcW w:type="dxa" w:w="2372"/>
+          </w:tcPr>
+          <w:p>
+            <w:pPr>
+              <w:keepNext/>
+              <w:spacing w:before="0" w:after="0"/>
+              <w:jc w:val="center"/>
+            </w:pPr>
+            <w:r>
+              <w:rPr>
+                <w:b w:val="0"/>
+                <w:i w:val="0"/>
+                <w:smallCaps w:val="0"/>
+                <w:sz w:val="16"/>
+              </w:rPr>
+              <w:t>GRU ens. + GPS</w:t>
+            </w:r>
+          </w:p>
+        </w:tc>
+        <w:tc>
+          <w:tcPr>
+            <w:tcW w:type="dxa" w:w="1937"/>
+          </w:tcPr>
+          <w:p>
+            <w:pPr>
+              <w:keepNext/>
+              <w:spacing w:before="0" w:after="0"/>
+              <w:jc w:val="left"/>
+            </w:pPr>
+            <w:r>
+              <w:rPr>
+                <w:b w:val="0"/>
+                <w:i w:val="0"/>
+                <w:smallCaps w:val="0"/>
+                <w:sz w:val="16"/>
+              </w:rPr>
+              <w:t>GRU ens., power</w:t>
+            </w:r>
+          </w:p>
+        </w:tc>
+        <w:tc>
+          <w:tcPr>
+            <w:tcW w:type="dxa" w:w="1154"/>
+          </w:tcPr>
+          <w:p>
+            <w:pPr>
+              <w:keepNext/>
+              <w:spacing w:before="0" w:after="0"/>
+              <w:jc w:val="left"/>
+            </w:pPr>
+            <w:r>
+              <w:rPr>
+                <w:b w:val="0"/>
+                <w:i w:val="0"/>
+                <w:smallCaps w:val="0"/>
+                <w:sz w:val="16"/>
+              </w:rPr>
+              <w:t>Within noise</w:t>
+            </w:r>
+          </w:p>
+        </w:tc>
+        <w:tc>
+          <w:tcPr>
+            <w:tcW w:type="dxa" w:w="1850"/>
+          </w:tcPr>
+          <w:p>
+            <w:pPr>
+              <w:keepNext/>
+              <w:spacing w:before="0" w:after="0"/>
+              <w:jc w:val="center"/>
+            </w:pPr>
+            <w:r>
+              <w:rPr>
+                <w:b w:val="0"/>
+                <w:i w:val="0"/>
+                <w:smallCaps w:val="0"/>
+                <w:sz w:val="16"/>
+              </w:rPr>
+              <w:t>+1.12 [−0.08, +2.37]</w:t>
+            </w:r>
+          </w:p>
+        </w:tc>
+        <w:tc>
+          <w:tcPr>
+            <w:tcW w:type="dxa" w:w="632"/>
+          </w:tcPr>
+          <w:p>
+            <w:pPr>
+              <w:keepNext/>
+              <w:spacing w:before="0" w:after="0"/>
+              <w:jc w:val="center"/>
+            </w:pPr>
+            <w:r>
+              <w:rPr>
+                <w:b w:val="0"/>
+                <w:i w:val="0"/>
+                <w:smallCaps w:val="0"/>
+                <w:sz w:val="16"/>
+              </w:rPr>
+              <w:t>0.34</w:t>
+            </w:r>
+          </w:p>
+        </w:tc>
+        <w:tc>
+          <w:tcPr>
+            <w:tcW w:type="dxa" w:w="1067"/>
+          </w:tcPr>
+          <w:p>
+            <w:pPr>
+              <w:keepNext/>
+              <w:spacing w:before="0" w:after="0"/>
+              <w:jc w:val="center"/>
+            </w:pPr>
+            <w:r>
+              <w:rPr>
+                <w:b w:val="0"/>
+                <w:i w:val="0"/>
+                <w:smallCaps w:val="0"/>
+                <w:sz w:val="16"/>
+              </w:rPr>
+              <w:t>16 / 3 / 11</w:t>
+            </w:r>
+          </w:p>
+        </w:tc>
+      </w:tr>
+      <w:tr>
+        <w:trPr>
+          <w:cantSplit/>
+        </w:trPr>
+        <w:tc>
+          <w:tcPr>
+            <w:tcW w:type="dxa" w:w="1067"/>
+          </w:tcPr>
+          <w:p>
+            <w:pPr>
+              <w:keepNext/>
+              <w:spacing w:before="0" w:after="0"/>
+              <w:jc w:val="left"/>
+            </w:pPr>
+            <w:r>
+              <w:rPr>
+                <w:b w:val="0"/>
+                <w:i w:val="0"/>
+                <w:smallCaps w:val="0"/>
+                <w:sz w:val="16"/>
+              </w:rPr>
+              <w:t>Blind t+3</w:t>
+            </w:r>
+          </w:p>
+        </w:tc>
+        <w:tc>
+          <w:tcPr>
+            <w:tcW w:type="dxa" w:w="2372"/>
+          </w:tcPr>
+          <w:p>
+            <w:pPr>
+              <w:keepNext/>
+              <w:spacing w:before="0" w:after="0"/>
+              <w:jc w:val="center"/>
+            </w:pPr>
+            <w:r>
+              <w:rPr>
+                <w:b w:val="0"/>
+                <w:i w:val="0"/>
+                <w:smallCaps w:val="0"/>
+                <w:sz w:val="16"/>
+              </w:rPr>
+              <w:t>GRU ens. + camera</w:t>
+            </w:r>
+          </w:p>
+        </w:tc>
+        <w:tc>
+          <w:tcPr>
+            <w:tcW w:type="dxa" w:w="1937"/>
+          </w:tcPr>
+          <w:p>
+            <w:pPr>
+              <w:keepNext/>
+              <w:spacing w:before="0" w:after="0"/>
+              <w:jc w:val="left"/>
+            </w:pPr>
+            <w:r>
+              <w:rPr>
+                <w:b w:val="0"/>
+                <w:i w:val="0"/>
+                <w:smallCaps w:val="0"/>
+                <w:sz w:val="16"/>
+              </w:rPr>
+              <w:t>GRU ens., power</w:t>
+            </w:r>
+          </w:p>
+        </w:tc>
+        <w:tc>
+          <w:tcPr>
+            <w:tcW w:type="dxa" w:w="1154"/>
+          </w:tcPr>
+          <w:p>
+            <w:pPr>
+              <w:keepNext/>
+              <w:spacing w:before="0" w:after="0"/>
+              <w:jc w:val="left"/>
+            </w:pPr>
+            <w:r>
+              <w:rPr>
+                <w:b w:val="0"/>
+                <w:i w:val="0"/>
+                <w:smallCaps w:val="0"/>
+                <w:sz w:val="16"/>
+              </w:rPr>
+              <w:t>Within noise</w:t>
+            </w:r>
+          </w:p>
+        </w:tc>
+        <w:tc>
+          <w:tcPr>
+            <w:tcW w:type="dxa" w:w="1850"/>
+          </w:tcPr>
+          <w:p>
+            <w:pPr>
+              <w:keepNext/>
+              <w:spacing w:before="0" w:after="0"/>
+              <w:jc w:val="center"/>
+            </w:pPr>
+            <w:r>
+              <w:rPr>
+                <w:b w:val="0"/>
+                <w:i w:val="0"/>
+                <w:smallCaps w:val="0"/>
+                <w:sz w:val="16"/>
+              </w:rPr>
+              <w:t>−5.55 [−7.88, −3.35]</w:t>
+            </w:r>
+          </w:p>
+        </w:tc>
+        <w:tc>
+          <w:tcPr>
+            <w:tcW w:type="dxa" w:w="632"/>
+          </w:tcPr>
+          <w:p>
+            <w:pPr>
+              <w:keepNext/>
+              <w:spacing w:before="0" w:after="0"/>
+              <w:jc w:val="center"/>
+            </w:pPr>
+            <w:r>
+              <w:rPr>
+                <w:b w:val="0"/>
+                <w:i w:val="0"/>
+                <w:smallCaps w:val="0"/>
+                <w:sz w:val="16"/>
+              </w:rPr>
+              <w:t>&lt; 10⁻⁴</w:t>
+            </w:r>
+          </w:p>
+        </w:tc>
+        <w:tc>
+          <w:tcPr>
+            <w:tcW w:type="dxa" w:w="1067"/>
+          </w:tcPr>
+          <w:p>
+            <w:pPr>
+              <w:keepNext/>
+              <w:spacing w:before="0" w:after="0"/>
+              <w:jc w:val="center"/>
+            </w:pPr>
+            <w:r>
+              <w:rPr>
+                <w:b w:val="0"/>
+                <w:i w:val="0"/>
+                <w:smallCaps w:val="0"/>
+                <w:sz w:val="16"/>
+              </w:rPr>
+              <w:t>2 / 5 / 23</w:t>
+            </w:r>
+          </w:p>
+        </w:tc>
+      </w:tr>
+      <w:tr>
+        <w:trPr>
+          <w:cantSplit/>
+        </w:trPr>
+        <w:tc>
+          <w:tcPr>
+            <w:tcW w:type="dxa" w:w="1067"/>
+          </w:tcPr>
+          <w:p>
+            <w:pPr>
+              <w:keepNext w:val="0"/>
+              <w:spacing w:before="0" w:after="0"/>
+              <w:jc w:val="left"/>
+            </w:pPr>
+            <w:r>
+              <w:rPr>
+                <w:b w:val="0"/>
+                <w:i w:val="0"/>
+                <w:smallCaps w:val="0"/>
+                <w:sz w:val="16"/>
+              </w:rPr>
+              <w:t>Blind t+3</w:t>
+            </w:r>
+          </w:p>
+        </w:tc>
+        <w:tc>
+          <w:tcPr>
+            <w:tcW w:type="dxa" w:w="2372"/>
+          </w:tcPr>
+          <w:p>
+            <w:pPr>
+              <w:keepNext w:val="0"/>
+              <w:spacing w:before="0" w:after="0"/>
+              <w:jc w:val="center"/>
+            </w:pPr>
+            <w:r>
+              <w:rPr>
+                <w:b w:val="0"/>
+                <w:i w:val="0"/>
+                <w:smallCaps w:val="0"/>
+                <w:sz w:val="16"/>
+              </w:rPr>
+              <w:t>GRU ens. + GPS + camera</w:t>
+            </w:r>
+          </w:p>
+        </w:tc>
+        <w:tc>
+          <w:tcPr>
+            <w:tcW w:type="dxa" w:w="1937"/>
+          </w:tcPr>
+          <w:p>
+            <w:pPr>
+              <w:keepNext w:val="0"/>
+              <w:spacing w:before="0" w:after="0"/>
+              <w:jc w:val="left"/>
+            </w:pPr>
+            <w:r>
+              <w:rPr>
+                <w:b w:val="0"/>
+                <w:i w:val="0"/>
+                <w:smallCaps w:val="0"/>
+                <w:sz w:val="16"/>
+              </w:rPr>
+              <w:t>GRU ens., power</w:t>
+            </w:r>
+          </w:p>
+        </w:tc>
+        <w:tc>
+          <w:tcPr>
+            <w:tcW w:type="dxa" w:w="1154"/>
+          </w:tcPr>
+          <w:p>
+            <w:pPr>
+              <w:keepNext w:val="0"/>
+              <w:spacing w:before="0" w:after="0"/>
+              <w:jc w:val="left"/>
+            </w:pPr>
+            <w:r>
+              <w:rPr>
+                <w:b w:val="0"/>
+                <w:i w:val="0"/>
+                <w:smallCaps w:val="0"/>
+                <w:sz w:val="16"/>
+              </w:rPr>
+              <w:t>Within noise</w:t>
+            </w:r>
+          </w:p>
+        </w:tc>
+        <w:tc>
+          <w:tcPr>
+            <w:tcW w:type="dxa" w:w="1850"/>
+          </w:tcPr>
+          <w:p>
+            <w:pPr>
+              <w:keepNext w:val="0"/>
+              <w:spacing w:before="0" w:after="0"/>
+              <w:jc w:val="center"/>
+            </w:pPr>
+            <w:r>
+              <w:rPr>
+                <w:b w:val="0"/>
+                <w:i w:val="0"/>
+                <w:smallCaps w:val="0"/>
+                <w:sz w:val="16"/>
+              </w:rPr>
+              <w:t>−1.07 [−2.69, +0.33]</w:t>
+            </w:r>
+          </w:p>
+        </w:tc>
+        <w:tc>
+          <w:tcPr>
+            <w:tcW w:type="dxa" w:w="632"/>
+          </w:tcPr>
+          <w:p>
+            <w:pPr>
+              <w:keepNext w:val="0"/>
+              <w:spacing w:before="0" w:after="0"/>
+              <w:jc w:val="center"/>
+            </w:pPr>
+            <w:r>
+              <w:rPr>
+                <w:b w:val="0"/>
+                <w:i w:val="0"/>
+                <w:smallCaps w:val="0"/>
+                <w:sz w:val="16"/>
+              </w:rPr>
+              <w:t>0.13</w:t>
+            </w:r>
+          </w:p>
+        </w:tc>
+        <w:tc>
+          <w:tcPr>
+            <w:tcW w:type="dxa" w:w="1067"/>
+          </w:tcPr>
+          <w:p>
+            <w:pPr>
+              <w:keepNext w:val="0"/>
+              <w:spacing w:before="0" w:after="0"/>
+              <w:jc w:val="center"/>
+            </w:pPr>
+            <w:r>
+              <w:rPr>
+                <w:b w:val="0"/>
+                <w:i w:val="0"/>
+                <w:smallCaps w:val="0"/>
+                <w:sz w:val="16"/>
+              </w:rPr>
+              <w:t>9 / 3 / 18</w:t>
+            </w:r>
+          </w:p>
+        </w:tc>
+      </w:tr>
+    </w:tbl>
+    <w:p>
+      <w:pPr>
+        <w:keepNext w:val="0"/>
+        <w:spacing w:before="0" w:after="120"/>
+        <w:jc w:val="both"/>
+      </w:pPr>
+    </w:p>
+    <w:p>
+      <w:pPr>
+        <w:sectPr>
+          <w:type w:val="continuous"/>
+          <w:pgSz w:w="12240" w:h="15840"/>
+          <w:pgMar w:top="1080" w:right="900" w:bottom="1440" w:left="900" w:header="720" w:footer="720" w:gutter="0"/>
+          <w:cols w:space="360" w:num="1"/>
+          <w:docGrid w:linePitch="360"/>
+        </w:sectPr>
+      </w:pPr>
+    </w:p>
+    <w:p>
+      <w:pPr>
+        <w:sectPr>
+          <w:type w:val="continuous"/>
+          <w:pgSz w:w="12240" w:h="15840"/>
+          <w:pgMar w:top="1080" w:right="900" w:bottom="1440" w:left="900" w:header="720" w:footer="720" w:gutter="0"/>
+          <w:cols w:space="360" w:num="2"/>
+          <w:docGrid w:linePitch="360"/>
+        </w:sectPr>
+      </w:pPr>
+    </w:p>
+    <w:tbl>
+      <w:tblPr>
+        <w:tblW w:type="auto" w:w="0"/>
+        <w:jc w:val="center"/>
+        <w:tblLook w:firstColumn="1" w:firstRow="1" w:lastColumn="0" w:lastRow="0" w:noHBand="0" w:noVBand="1" w:val="04A0"/>
+      </w:tblPr>
+      <w:tblGrid>
+        <w:gridCol w:w="10440"/>
+      </w:tblGrid>
+      <w:tr>
+        <w:trPr>
+          <w:cantSplit/>
+        </w:trPr>
+        <w:tc>
+          <w:tcPr>
+            <w:tcW w:type="dxa" w:w="10440"/>
+          </w:tcPr>
+          <w:p>
+            <w:pPr>
+              <w:keepNext w:val="0"/>
+              <w:spacing w:before="80" w:after="0"/>
+              <w:jc w:val="center"/>
+            </w:pPr>
+            <w:r>
+              <w:drawing>
+                <wp:inline xmlns:a="http://schemas.openxmlformats.org/drawingml/2006/main" xmlns:pic="http://schemas.openxmlformats.org/drawingml/2006/picture">
+                  <wp:extent cx="5943600" cy="2220686"/>
+                  <wp:docPr id="8" name="Picture 8"/>
+                  <wp:cNvGraphicFramePr>
+                    <a:graphicFrameLocks noChangeAspect="1"/>
+                  </wp:cNvGraphicFramePr>
+                  <a:graphic>
+                    <a:graphicData uri="http://schemas.openxmlformats.org/drawingml/2006/picture">
+                      <pic:pic>
+                        <pic:nvPicPr>
+                          <pic:cNvPr id="0" name="fig_significance.png"/>
+                          <pic:cNvPicPr/>
+                        </pic:nvPicPr>
+                        <pic:blipFill>
+                          <a:blip r:embed="rId16"/>
+                          <a:stretch>
+                            <a:fillRect/>
+                          </a:stretch>
+                        </pic:blipFill>
+                        <pic:spPr>
+                          <a:xfrm>
+                            <a:off x="0" y="0"/>
+                            <a:ext cx="5943600" cy="2220686"/>
+                          </a:xfrm>
+                          <a:prstGeom prst="rect"/>
+                        </pic:spPr>
+                      </pic:pic>
+                    </a:graphicData>
+                  </a:graphic>
+                </wp:inline>
+              </w:drawing>
+            </w:r>
+          </w:p>
+          <w:p>
+            <w:pPr>
+              <w:keepNext w:val="0"/>
+              <w:spacing w:before="0" w:after="120"/>
+              <w:jc w:val="center"/>
+            </w:pPr>
+            <w:r>
+              <w:rPr>
+                <w:b w:val="0"/>
+                <w:i w:val="0"/>
+                <w:smallCaps w:val="0"/>
+                <w:sz w:val="16"/>
+              </w:rPr>
+              <w:t xml:space="preserve">Fig. 8. </w:t>
+            </w:r>
+            <w:r>
+              <w:rPr>
+                <w:b w:val="0"/>
+                <w:i w:val="0"/>
+                <w:smallCaps w:val="0"/>
+                <w:sz w:val="16"/>
+              </w:rPr>
+              <w:t>Paired per-flight differences with 95% flight-bootstrap CIs. Filled: Wilcoxon signed-rank on per-flight differences, Holm p &lt; 0.05. The two can disagree when most flights improve but a few lose heavily (bottom left).</w:t>
             </w:r>
           </w:p>
         </w:tc>
@@ -13237,7 +17247,7 @@
           <w:smallCaps w:val="0"/>
           <w:sz w:val="20"/>
         </w:rPr>
-        <w:t xml:space="preserve"> On power sweeps alone the learned gain over persistence is modest at t + 1 and clear at t + 3 (86.0% vs 78.1% within noise). In reduced beam training, the largest single gain comes from a simple learned structure, the beam-tie graph, rather than from the sequence model. The GRU then reduces the beams measured at t + 3. In closed loop, where only measured beams are known, ten deep sequence models trained on those measurements did not beat the tie graph at equal budget (Table X). On this dataset, the useful structure is which beams tie, and a co-occurrence count captures it; we report this negative result because it bounds what learning adds once measurement is cheap. The soft target and beam-axis augmentation matter more than the architecture. Logit adjustment for the class imbalance [19] lowered every metric because the beam distribution differs between flights.</w:t>
+        <w:t xml:space="preserve"> On power sweeps alone the learned gain over persistence is modest at t + 1 and clear at t + 3 (86.0% vs 78.1% within noise). In reduced beam training, the largest single gain comes from a simple learned structure, the beam-tie graph, rather than from the sequence model. The GRU then reduces the beams measured at t + 3. In closed loop, where only measured beams are known, ten deep sequence models trained on those measurements did not beat the tie graph at equal budget (Table X). On this dataset, the useful structure is which beams tie, and a co-occurrence count captures it; we report this negative result because it bounds what learning adds once measurement is cheap. The soft target and beam-axis augmentation matter more than the architecture. Logit adjustment for the class imbalance [19] lowered every metric because the beam distribution differs between flights. Side information follows the same pattern: UAV position gives a small, not yet significant gain at 0.4 s, and generic camera features hurt, because 35 flights are too few to learn which parts of a scene matter.</w:t>
       </w:r>
     </w:p>
     <w:p>
@@ -13263,7 +17273,7 @@
           <w:smallCaps w:val="0"/>
           <w:sz w:val="20"/>
         </w:rPr>
-        <w:t xml:space="preserve"> Saleh and coupling coefficients are literature values, not measurements of a 60 GHz PA or RIS; Table II bounds the effect of the coupling strength. The obliquity exponent is assumed. The physical-layer results are simulated; the beam-prediction results use power sweeps only except in Table XI, where UAV position adds 1–4 points at t + 3; the UAV height channel's unit is not documented consistently. The all-class macro-F1 at t + 3 (0.929) is limited by beams seen only once; more flights, not a different model, are needed to estimate it reliably. The latency model uses standard 5G NR FR2 timing, not the testbed's own sweep timing. The Table VIII figures are open-loop (they assume full-sweep history); Table IX gives the closed-loop figures. Effective spectral efficiency is reported at nominal SNRs because the dataset's powers are unitless. The D-band transceiver values are representative published figures, not a specific design.</w:t>
+        <w:t xml:space="preserve"> Saleh and coupling coefficients are literature values, not measurements of a 60 GHz PA or RIS; Table II bounds the effect of the coupling strength. The obliquity exponent is assumed. The physical-layer results are simulated; the beam-prediction results use power sweeps only except in Tables XI–XII; the camera study uses a frozen ImageNet encoder without a UAV detector, so it bounds generic scene features, not vision-aided prediction in general; the UAV height channel's unit is not documented consistently. The all-class macro-F1 at t + 3 (0.929) is limited by beams seen only once; more flights, not a different model, are needed to estimate it reliably. The latency model uses standard 5G NR FR2 timing, not the testbed's own sweep timing. The Table VIII figures are open-loop (they assume full-sweep history); Table IX gives the closed-loop figures. Effective spectral efficiency is reported at nominal SNRs because the dataset's powers are unitless. The D-band transceiver values are representative published figures, not a specific design.</w:t>
       </w:r>
     </w:p>
     <w:p>
@@ -13296,7 +17306,7 @@
           <w:smallCaps w:val="0"/>
           <w:sz w:val="20"/>
         </w:rPr>
-        <w:t>We built a hardware-aware model of an RIS-assisted mmWave UAV link and used it, with real 60 GHz measurements, to evaluate beam management end to end. Hardware impairments cost 7.8 dB and 2.25× RIS elements at 60 GHz, and D-band transceiver limits push the 140 GHz panel to 32 cm; a position-parametric estimator matches perfect channel knowledge with 64× fewer pilots; Kalman-based prediction preserves 99.3% of the array gain at 500 ms latency; and AI-assisted reduced beam training with a learned beam-tie graph selects the exact optimal beam 99.3% of the time given full-sweep history and 97.2–99.3% in a closed-loop replay of every flight, with 1.05–1.31 ms of beam training per decision instead of 5 ms; deep sequence models trained on measured-only data did not improve on it at equal budget. All reported metrics are evaluated under sequence-level cross-validation. UAV position improves blind prediction at a 0.4 s horizon by 1–4 points. Future work will add camera input to beam prediction, measured hardware coefficients, and paired per-flight significance tests between tracking policies.</w:t>
+        <w:t>We built a hardware-aware model of an RIS-assisted mmWave UAV link and used it, with real 60 GHz measurements, to evaluate beam management end to end. Hardware impairments cost 7.8 dB and 2.25× RIS elements at 60 GHz, and D-band transceiver limits push the 140 GHz panel to 32 cm; a position-parametric estimator matches perfect channel knowledge with 64× fewer pilots; Kalman-based prediction preserves 99.3% of the array gain at 500 ms latency; and AI-assisted reduced beam training with a learned beam-tie graph selects the exact optimal beam 99.3% of the time given full-sweep history and 97.2–99.3% in a closed-loop replay of 33 flights, with 1.05–1.31 ms of beam training per decision instead of 5 ms; deep sequence models trained on measured-only data did not improve on it at equal budget. All reported metrics are evaluated under sequence-level cross-validation. UAV position raises pooled blind accuracy at a 0.4 s horizon by 1–4 points, a gain that is not significant across flights for the best model, and frozen camera features lower it. Future work will add a UAV detector to the camera input, more flights to estimate rare-beam performance, and measured hardware coefficients.</w:t>
       </w:r>
     </w:p>
     <w:p>

</xml_diff>

<commit_message>
Resolve references, add 140 GHz NF sensitivity, closed-loop macro-F1, locator check vs GPS
- [20] full authors/pages, [21] measured D-band SiGe LNA (NF 4.8-6.1 dB), [22] TS 38.213 V17.9.0
- Model's 10 dB is a conservative receiver NF; Table III adds NF 6/7 dB rows (RIS 24-32 cm)
- Table XIV adds macro-F1: camera+GPS tracker 0.944 all / 0.980 (>=5 samples)
- camera_beam_prediction.py --validate: locator vs GPS; ~1% of frames misdetected
- No [VERIFY] items remain

Co-Authored-By: Claude Opus 5.5 <noreply@anthropic.com>
</commit_message>
<xml_diff>
--- a/paper/revised_paper_ieee.docx
+++ b/paper/revised_paper_ieee.docx
@@ -121,7 +121,7 @@
           <w:smallCaps w:val="0"/>
           <w:sz w:val="18"/>
         </w:rPr>
-        <w:t>Millimetre-wave (mmWave) and sub-terahertz links can give unmanned aerial vehicles (UAVs) multi-gigabit connectivity, but narrow beams, high path loss and UAV mobility make beam management costly, and practical hardware departs from the ideal models most reconfigurable intelligent surface (RIS) studies assume. We present a hardware-aware framework for an RIS-assisted 60 GHz UAV link that models transmitter power-amplifier (PA) distortion through the Bussgang decomposition, RIS phase quantization, phase noise, amplitude–phase coupling and antenna mismatch, together with ITU-R P.676-13 gaseous absorption. On this model we show that (i) impairments cost 7.8 dB of SNDR, dominated by amplitude–phase coupling, so a realistic RIS needs about 2.25× more elements than an ideal one for full coverage of a 300 m flight; (ii) a position-parametric channel estimator reaches within 0.15 dB of perfect channel knowledge with 64× fewer pilots than per-element LMMSE, and needs no pilots when a 100 ms Kalman prediction is available; and (iii) predictive tracking delivers 99.3% of the ideal array gain at 500 ms latency, whereas persistence delivers 63%. On real 60 GHz measurements (DeepSense 6G Scenario 23) we show that exact blind beam prediction is bounded at 79% top-1 by measurement noise, and propose an AI-assisted reduced beam training scheme with a learned beam-tie graph. Given full-sweep history it selects the exact optimal beam 99.3% of the time at a 140 ms horizon (macro-F1 0.961 over all 56 beam classes) and 99.1% at 0.4 s. Replayed in closed loop, where the system knows only the beams it measured, tie-graph tracking selects the exact optimal beam 97.2–99.3% of the time with 1.05–1.31 ms of beam training per decision instead of 5 ms, and per-flight tests confirm its spectral-efficiency gain over full sweeps on 32 of 33 flights. Adding candidate beams from the UAV's GPS and from its position in the base station's camera image, located without labels, lets the tracker drop periodic full sweeps: it then selects the exact optimal beam 99.2% of the time with 0.56 ms per decision, better than the tie-graph tracker on 25 of 33 flights. Ten deep sequence models trained on measured-only data do not beat the tie graph at equal measurement budget, and neither position nor camera features significantly improve blind prediction, under sequence-level cross-validation.</w:t>
+        <w:t>Millimetre-wave (mmWave) and sub-terahertz links can give unmanned aerial vehicles (UAVs) multi-gigabit connectivity, but narrow beams, high path loss and UAV mobility make beam management costly, and practical hardware departs from the ideal models most reconfigurable intelligent surface (RIS) studies assume. We present a hardware-aware framework for an RIS-assisted 60 GHz UAV link that models transmitter power-amplifier (PA) distortion through the Bussgang decomposition, RIS phase quantization, phase noise, amplitude–phase coupling and antenna mismatch, together with ITU-R P.676-13 gaseous absorption. On this model we show that (i) impairments cost 7.8 dB of SNDR, dominated by amplitude–phase coupling, so a realistic RIS needs about 2.25× more elements than an ideal one for full coverage of a 300 m flight; (ii) a position-parametric channel estimator reaches within 0.15 dB of perfect channel knowledge with 64× fewer pilots than per-element LMMSE, and needs no pilots when a 100 ms Kalman prediction is available; and (iii) predictive tracking delivers 99.3% of the ideal array gain at 500 ms latency, whereas persistence delivers 63%. On real 60 GHz measurements (DeepSense 6G Scenario 23) we show that exact blind beam prediction is bounded at 79% top-1 by measurement noise, and propose an AI-assisted reduced beam training scheme with a learned beam-tie graph. Given full-sweep history it selects the exact optimal beam 99.3% of the time at a 140 ms horizon (macro-F1 0.961 over all 56 beam classes) and 99.1% at 0.4 s. Replayed in closed loop, where the system knows only the beams it measured, tie-graph tracking selects the exact optimal beam 97.2–99.3% of the time with 1.05–1.31 ms of beam training per decision instead of 5 ms, and per-flight tests confirm its spectral-efficiency gain over full sweeps on 32 of 33 flights. Adding candidate beams from the UAV's GPS and from its position in the base station's camera image, located without labels, lets the tracker drop periodic full sweeps: it then selects the exact optimal beam 99.2% of the time (macro-F1 0.98 over beams with at least five samples) with 0.56 ms per decision, better than the tie-graph tracker on 25 of 33 flights. Ten deep sequence models trained on measured-only data do not beat the tie graph at equal measurement budget, and neither position nor camera features significantly improve blind prediction, under sequence-level cross-validation.</w:t>
       </w:r>
     </w:p>
     <w:p>
@@ -3594,8 +3594,19 @@
           <w:smallCaps w:val="0"/>
           <w:sz w:val="20"/>
         </w:rPr>
-        <w:t xml:space="preserve"> With the same 8 cm panel (32×32 at 60 GHz, 75×75 at 140 GHz) and the same transceiver hardware, 140 GHz performs slightly better (ideal SNR 16.6 vs 15.8 dB at 20 m; 47.5% vs 34.4% availability): it avoids the 60 GHz oxygen line (0.69 vs 14.6 dB/km) and fits 5.5× more elements in the same area. With published D-band hardware (about 20 dBm PA saturation [20], hence 14 dBm average at 6 dB back-off, and an LNA noise figure near 10 dB [21]) the link loses about 9 dB, and the RIS must grow to 32 cm (300×300 elements) for full availability with realistic impairments, against 24 cm at 60 GHz (Table III). At sub-THz, transceiver hardware, not propagation, sets the RIS size.</w:t>
+        <w:t xml:space="preserve"> With the same 8 cm panel (32×32 at 60 GHz, 75×75 at 140 GHz) and the same transceiver hardware, 140 GHz performs slightly better (ideal SNR 16.6 vs 15.8 dB at 20 m; 47.5% vs 34.4% availability): it avoids the 60 GHz oxygen line (0.69 vs 14.6 dB/km) and fits 5.5× more elements in the same area. With published D-band hardware (about 20 dBm PA saturation [20], hence 14 dBm average at 6 dB back-off) and a conservative 10 dB receiver noise figure the link loses about 9 dB, and the RIS must grow to 32 cm (300×300 elements) for full availability with realistic impairments, against 24 cm at 60 GHz (Table III). The receiver noise figure is the decisive assumption: D-band SiGe LNAs alone measure 4.8–6.1 dB [21], and with a 6 dB receiver 24 cm suffices at 140 GHz as well (7 dB: 28 cm). At sub-THz, transceiver hardware, not propagation, sets the RIS size, and the panel spans 24–32 cm across that range.</w:t>
       </w:r>
+    </w:p>
+    <w:p>
+      <w:pPr>
+        <w:sectPr>
+          <w:type w:val="continuous"/>
+          <w:pgSz w:w="12240" w:h="15840"/>
+          <w:pgMar w:top="1080" w:right="900" w:bottom="1440" w:left="900" w:header="720" w:footer="720" w:gutter="0"/>
+          <w:cols w:space="360" w:num="2"/>
+          <w:docGrid w:linePitch="360"/>
+        </w:sectPr>
+      </w:pPr>
     </w:p>
     <w:p>
       <w:pPr>
@@ -3628,7 +3639,7 @@
           <w:smallCaps/>
           <w:sz w:val="16"/>
         </w:rPr>
-        <w:t>Availability (%) over the flight, 140 GHz with D-band hardware, ideal / realistic RIS</w:t>
+        <w:t>Availability (%) over the flight at 140 GHz with D-band hardware (14 dBm average transmit power), by RIS size and receiver noise figure (NF)</w:t>
       </w:r>
     </w:p>
     <w:tbl>
@@ -3647,11 +3658,13 @@
         </w:tblCellMar>
       </w:tblPr>
       <w:tblGrid>
-        <w:gridCol w:w="2091"/>
-        <w:gridCol w:w="650"/>
-        <w:gridCol w:w="742"/>
-        <w:gridCol w:w="742"/>
-        <w:gridCol w:w="742"/>
+        <w:gridCol w:w="4015"/>
+        <w:gridCol w:w="904"/>
+        <w:gridCol w:w="1032"/>
+        <w:gridCol w:w="1032"/>
+        <w:gridCol w:w="1032"/>
+        <w:gridCol w:w="1032"/>
+        <w:gridCol w:w="1032"/>
       </w:tblGrid>
       <w:tr>
         <w:trPr>
@@ -3659,7 +3672,7 @@
         </w:trPr>
         <w:tc>
           <w:tcPr>
-            <w:tcW w:type="dxa" w:w="2091"/>
+            <w:tcW w:type="dxa" w:w="4015"/>
             <w:tcBorders>
               <w:bottom w:val="single" w:sz="4" w:color="000000"/>
             </w:tcBorders>
@@ -3684,7 +3697,7 @@
         </w:tc>
         <w:tc>
           <w:tcPr>
-            <w:tcW w:type="dxa" w:w="651"/>
+            <w:tcW w:type="dxa" w:w="905"/>
             <w:tcBorders>
               <w:bottom w:val="single" w:sz="4" w:color="000000"/>
             </w:tcBorders>
@@ -3709,7 +3722,7 @@
         </w:tc>
         <w:tc>
           <w:tcPr>
-            <w:tcW w:type="dxa" w:w="742"/>
+            <w:tcW w:type="dxa" w:w="1032"/>
             <w:tcBorders>
               <w:bottom w:val="single" w:sz="4" w:color="000000"/>
             </w:tcBorders>
@@ -3734,7 +3747,7 @@
         </w:tc>
         <w:tc>
           <w:tcPr>
-            <w:tcW w:type="dxa" w:w="742"/>
+            <w:tcW w:type="dxa" w:w="1032"/>
             <w:tcBorders>
               <w:bottom w:val="single" w:sz="4" w:color="000000"/>
             </w:tcBorders>
@@ -3753,13 +3766,63 @@
                 <w:smallCaps w:val="0"/>
                 <w:sz w:val="16"/>
               </w:rPr>
+              <w:t>188×188 (20 cm)</w:t>
+            </w:r>
+          </w:p>
+        </w:tc>
+        <w:tc>
+          <w:tcPr>
+            <w:tcW w:type="dxa" w:w="1032"/>
+            <w:tcBorders>
+              <w:bottom w:val="single" w:sz="4" w:color="000000"/>
+            </w:tcBorders>
+          </w:tcPr>
+          <w:p>
+            <w:pPr>
+              <w:keepNext/>
+              <w:keepLines/>
+              <w:spacing w:before="0" w:after="0"/>
+              <w:jc w:val="center"/>
+            </w:pPr>
+            <w:r>
+              <w:rPr>
+                <w:b/>
+                <w:i w:val="0"/>
+                <w:smallCaps w:val="0"/>
+                <w:sz w:val="16"/>
+              </w:rPr>
               <w:t>225×225 (24 cm)</w:t>
             </w:r>
           </w:p>
         </w:tc>
         <w:tc>
           <w:tcPr>
-            <w:tcW w:type="dxa" w:w="742"/>
+            <w:tcW w:type="dxa" w:w="1032"/>
+            <w:tcBorders>
+              <w:bottom w:val="single" w:sz="4" w:color="000000"/>
+            </w:tcBorders>
+          </w:tcPr>
+          <w:p>
+            <w:pPr>
+              <w:keepNext/>
+              <w:keepLines/>
+              <w:spacing w:before="0" w:after="0"/>
+              <w:jc w:val="center"/>
+            </w:pPr>
+            <w:r>
+              <w:rPr>
+                <w:b/>
+                <w:i w:val="0"/>
+                <w:smallCaps w:val="0"/>
+                <w:sz w:val="16"/>
+              </w:rPr>
+              <w:t>263×263 (28 cm)</w:t>
+            </w:r>
+          </w:p>
+        </w:tc>
+        <w:tc>
+          <w:tcPr>
+            <w:tcW w:type="dxa" w:w="1032"/>
             <w:tcBorders>
               <w:bottom w:val="single" w:sz="4" w:color="000000"/>
             </w:tcBorders>
@@ -3789,7 +3852,7 @@
         </w:trPr>
         <w:tc>
           <w:tcPr>
-            <w:tcW w:type="dxa" w:w="2091"/>
+            <w:tcW w:type="dxa" w:w="4015"/>
           </w:tcPr>
           <w:p>
             <w:pPr>
@@ -3805,13 +3868,13 @@
                 <w:smallCaps w:val="0"/>
                 <w:sz w:val="16"/>
               </w:rPr>
-              <w:t>Ideal hardware</w:t>
-            </w:r>
-          </w:p>
-        </w:tc>
-        <w:tc>
-          <w:tcPr>
-            <w:tcW w:type="dxa" w:w="651"/>
+              <w:t>Ideal hardware, NF 10 dB</w:t>
+            </w:r>
+          </w:p>
+        </w:tc>
+        <w:tc>
+          <w:tcPr>
+            <w:tcW w:type="dxa" w:w="905"/>
           </w:tcPr>
           <w:p>
             <w:pPr>
@@ -3833,7 +3896,7 @@
         </w:tc>
         <w:tc>
           <w:tcPr>
-            <w:tcW w:type="dxa" w:w="742"/>
+            <w:tcW w:type="dxa" w:w="1032"/>
           </w:tcPr>
           <w:p>
             <w:pPr>
@@ -3855,7 +3918,7 @@
         </w:tc>
         <w:tc>
           <w:tcPr>
-            <w:tcW w:type="dxa" w:w="742"/>
+            <w:tcW w:type="dxa" w:w="1032"/>
           </w:tcPr>
           <w:p>
             <w:pPr>
@@ -3877,7 +3940,51 @@
         </w:tc>
         <w:tc>
           <w:tcPr>
-            <w:tcW w:type="dxa" w:w="742"/>
+            <w:tcW w:type="dxa" w:w="1032"/>
+          </w:tcPr>
+          <w:p>
+            <w:pPr>
+              <w:keepNext/>
+              <w:keepLines/>
+              <w:spacing w:before="0" w:after="0"/>
+              <w:jc w:val="center"/>
+            </w:pPr>
+            <w:r>
+              <w:rPr>
+                <w:b w:val="0"/>
+                <w:i w:val="0"/>
+                <w:smallCaps w:val="0"/>
+                <w:sz w:val="16"/>
+              </w:rPr>
+              <w:t>100</w:t>
+            </w:r>
+          </w:p>
+        </w:tc>
+        <w:tc>
+          <w:tcPr>
+            <w:tcW w:type="dxa" w:w="1032"/>
+          </w:tcPr>
+          <w:p>
+            <w:pPr>
+              <w:keepNext/>
+              <w:keepLines/>
+              <w:spacing w:before="0" w:after="0"/>
+              <w:jc w:val="center"/>
+            </w:pPr>
+            <w:r>
+              <w:rPr>
+                <w:b w:val="0"/>
+                <w:i w:val="0"/>
+                <w:smallCaps w:val="0"/>
+                <w:sz w:val="16"/>
+              </w:rPr>
+              <w:t>100</w:t>
+            </w:r>
+          </w:p>
+        </w:tc>
+        <w:tc>
+          <w:tcPr>
+            <w:tcW w:type="dxa" w:w="1032"/>
           </w:tcPr>
           <w:p>
             <w:pPr>
@@ -3904,7 +4011,325 @@
         </w:trPr>
         <w:tc>
           <w:tcPr>
-            <w:tcW w:type="dxa" w:w="2091"/>
+            <w:tcW w:type="dxa" w:w="4015"/>
+          </w:tcPr>
+          <w:p>
+            <w:pPr>
+              <w:keepNext/>
+              <w:keepLines/>
+              <w:spacing w:before="0" w:after="0"/>
+              <w:jc w:val="left"/>
+            </w:pPr>
+            <w:r>
+              <w:rPr>
+                <w:b w:val="0"/>
+                <w:i w:val="0"/>
+                <w:smallCaps w:val="0"/>
+                <w:sz w:val="16"/>
+              </w:rPr>
+              <w:t>Realistic, coupling-aware, NF 10 dB</w:t>
+            </w:r>
+          </w:p>
+        </w:tc>
+        <w:tc>
+          <w:tcPr>
+            <w:tcW w:type="dxa" w:w="905"/>
+          </w:tcPr>
+          <w:p>
+            <w:pPr>
+              <w:keepNext/>
+              <w:keepLines/>
+              <w:spacing w:before="0" w:after="0"/>
+              <w:jc w:val="center"/>
+            </w:pPr>
+            <w:r>
+              <w:rPr>
+                <w:b w:val="0"/>
+                <w:i w:val="0"/>
+                <w:smallCaps w:val="0"/>
+                <w:sz w:val="16"/>
+              </w:rPr>
+              <w:t>1.6</w:t>
+            </w:r>
+          </w:p>
+        </w:tc>
+        <w:tc>
+          <w:tcPr>
+            <w:tcW w:type="dxa" w:w="1032"/>
+          </w:tcPr>
+          <w:p>
+            <w:pPr>
+              <w:keepNext/>
+              <w:keepLines/>
+              <w:spacing w:before="0" w:after="0"/>
+              <w:jc w:val="center"/>
+            </w:pPr>
+            <w:r>
+              <w:rPr>
+                <w:b w:val="0"/>
+                <w:i w:val="0"/>
+                <w:smallCaps w:val="0"/>
+                <w:sz w:val="16"/>
+              </w:rPr>
+              <w:t>27.9</w:t>
+            </w:r>
+          </w:p>
+        </w:tc>
+        <w:tc>
+          <w:tcPr>
+            <w:tcW w:type="dxa" w:w="1032"/>
+          </w:tcPr>
+          <w:p>
+            <w:pPr>
+              <w:keepNext/>
+              <w:keepLines/>
+              <w:spacing w:before="0" w:after="0"/>
+              <w:jc w:val="center"/>
+            </w:pPr>
+            <w:r>
+              <w:rPr>
+                <w:b w:val="0"/>
+                <w:i w:val="0"/>
+                <w:smallCaps w:val="0"/>
+                <w:sz w:val="16"/>
+              </w:rPr>
+              <w:t>45.9</w:t>
+            </w:r>
+          </w:p>
+        </w:tc>
+        <w:tc>
+          <w:tcPr>
+            <w:tcW w:type="dxa" w:w="1032"/>
+          </w:tcPr>
+          <w:p>
+            <w:pPr>
+              <w:keepNext/>
+              <w:keepLines/>
+              <w:spacing w:before="0" w:after="0"/>
+              <w:jc w:val="center"/>
+            </w:pPr>
+            <w:r>
+              <w:rPr>
+                <w:b w:val="0"/>
+                <w:i w:val="0"/>
+                <w:smallCaps w:val="0"/>
+                <w:sz w:val="16"/>
+              </w:rPr>
+              <w:t>67.2</w:t>
+            </w:r>
+          </w:p>
+        </w:tc>
+        <w:tc>
+          <w:tcPr>
+            <w:tcW w:type="dxa" w:w="1032"/>
+          </w:tcPr>
+          <w:p>
+            <w:pPr>
+              <w:keepNext/>
+              <w:keepLines/>
+              <w:spacing w:before="0" w:after="0"/>
+              <w:jc w:val="center"/>
+            </w:pPr>
+            <w:r>
+              <w:rPr>
+                <w:b w:val="0"/>
+                <w:i w:val="0"/>
+                <w:smallCaps w:val="0"/>
+                <w:sz w:val="16"/>
+              </w:rPr>
+              <w:t>95.1</w:t>
+            </w:r>
+          </w:p>
+        </w:tc>
+        <w:tc>
+          <w:tcPr>
+            <w:tcW w:type="dxa" w:w="1032"/>
+          </w:tcPr>
+          <w:p>
+            <w:pPr>
+              <w:keepNext/>
+              <w:keepLines/>
+              <w:spacing w:before="0" w:after="0"/>
+              <w:jc w:val="center"/>
+            </w:pPr>
+            <w:r>
+              <w:rPr>
+                <w:b w:val="0"/>
+                <w:i w:val="0"/>
+                <w:smallCaps w:val="0"/>
+                <w:sz w:val="16"/>
+              </w:rPr>
+              <w:t>100</w:t>
+            </w:r>
+          </w:p>
+        </w:tc>
+      </w:tr>
+      <w:tr>
+        <w:trPr>
+          <w:cantSplit/>
+        </w:trPr>
+        <w:tc>
+          <w:tcPr>
+            <w:tcW w:type="dxa" w:w="4015"/>
+          </w:tcPr>
+          <w:p>
+            <w:pPr>
+              <w:keepNext/>
+              <w:keepLines/>
+              <w:spacing w:before="0" w:after="0"/>
+              <w:jc w:val="left"/>
+            </w:pPr>
+            <w:r>
+              <w:rPr>
+                <w:b w:val="0"/>
+                <w:i w:val="0"/>
+                <w:smallCaps w:val="0"/>
+                <w:sz w:val="16"/>
+              </w:rPr>
+              <w:t>Realistic, coupling-aware, NF 7 dB</w:t>
+            </w:r>
+          </w:p>
+        </w:tc>
+        <w:tc>
+          <w:tcPr>
+            <w:tcW w:type="dxa" w:w="905"/>
+          </w:tcPr>
+          <w:p>
+            <w:pPr>
+              <w:keepNext/>
+              <w:keepLines/>
+              <w:spacing w:before="0" w:after="0"/>
+              <w:jc w:val="center"/>
+            </w:pPr>
+            <w:r>
+              <w:rPr>
+                <w:b w:val="0"/>
+                <w:i w:val="0"/>
+                <w:smallCaps w:val="0"/>
+                <w:sz w:val="16"/>
+              </w:rPr>
+              <w:t>–</w:t>
+            </w:r>
+          </w:p>
+        </w:tc>
+        <w:tc>
+          <w:tcPr>
+            <w:tcW w:type="dxa" w:w="1032"/>
+          </w:tcPr>
+          <w:p>
+            <w:pPr>
+              <w:keepNext/>
+              <w:keepLines/>
+              <w:spacing w:before="0" w:after="0"/>
+              <w:jc w:val="center"/>
+            </w:pPr>
+            <w:r>
+              <w:rPr>
+                <w:b w:val="0"/>
+                <w:i w:val="0"/>
+                <w:smallCaps w:val="0"/>
+                <w:sz w:val="16"/>
+              </w:rPr>
+              <w:t>41.0</w:t>
+            </w:r>
+          </w:p>
+        </w:tc>
+        <w:tc>
+          <w:tcPr>
+            <w:tcW w:type="dxa" w:w="1032"/>
+          </w:tcPr>
+          <w:p>
+            <w:pPr>
+              <w:keepNext/>
+              <w:keepLines/>
+              <w:spacing w:before="0" w:after="0"/>
+              <w:jc w:val="center"/>
+            </w:pPr>
+            <w:r>
+              <w:rPr>
+                <w:b w:val="0"/>
+                <w:i w:val="0"/>
+                <w:smallCaps w:val="0"/>
+                <w:sz w:val="16"/>
+              </w:rPr>
+              <w:t>67.2</w:t>
+            </w:r>
+          </w:p>
+        </w:tc>
+        <w:tc>
+          <w:tcPr>
+            <w:tcW w:type="dxa" w:w="1032"/>
+          </w:tcPr>
+          <w:p>
+            <w:pPr>
+              <w:keepNext/>
+              <w:keepLines/>
+              <w:spacing w:before="0" w:after="0"/>
+              <w:jc w:val="center"/>
+            </w:pPr>
+            <w:r>
+              <w:rPr>
+                <w:b w:val="0"/>
+                <w:i w:val="0"/>
+                <w:smallCaps w:val="0"/>
+                <w:sz w:val="16"/>
+              </w:rPr>
+              <w:t>98.4</w:t>
+            </w:r>
+          </w:p>
+        </w:tc>
+        <w:tc>
+          <w:tcPr>
+            <w:tcW w:type="dxa" w:w="1032"/>
+          </w:tcPr>
+          <w:p>
+            <w:pPr>
+              <w:keepNext/>
+              <w:keepLines/>
+              <w:spacing w:before="0" w:after="0"/>
+              <w:jc w:val="center"/>
+            </w:pPr>
+            <w:r>
+              <w:rPr>
+                <w:b w:val="0"/>
+                <w:i w:val="0"/>
+                <w:smallCaps w:val="0"/>
+                <w:sz w:val="16"/>
+              </w:rPr>
+              <w:t>100</w:t>
+            </w:r>
+          </w:p>
+        </w:tc>
+        <w:tc>
+          <w:tcPr>
+            <w:tcW w:type="dxa" w:w="1032"/>
+          </w:tcPr>
+          <w:p>
+            <w:pPr>
+              <w:keepNext/>
+              <w:keepLines/>
+              <w:spacing w:before="0" w:after="0"/>
+              <w:jc w:val="center"/>
+            </w:pPr>
+            <w:r>
+              <w:rPr>
+                <w:b w:val="0"/>
+                <w:i w:val="0"/>
+                <w:smallCaps w:val="0"/>
+                <w:sz w:val="16"/>
+              </w:rPr>
+              <w:t>100</w:t>
+            </w:r>
+          </w:p>
+        </w:tc>
+      </w:tr>
+      <w:tr>
+        <w:trPr>
+          <w:cantSplit/>
+        </w:trPr>
+        <w:tc>
+          <w:tcPr>
+            <w:tcW w:type="dxa" w:w="4015"/>
           </w:tcPr>
           <w:p>
             <w:pPr>
@@ -3920,13 +4345,13 @@
                 <w:smallCaps w:val="0"/>
                 <w:sz w:val="16"/>
               </w:rPr>
-              <w:t>Realistic, coupling-aware</w:t>
-            </w:r>
-          </w:p>
-        </w:tc>
-        <w:tc>
-          <w:tcPr>
-            <w:tcW w:type="dxa" w:w="651"/>
+              <w:t>Realistic, coupling-aware, NF 6 dB</w:t>
+            </w:r>
+          </w:p>
+        </w:tc>
+        <w:tc>
+          <w:tcPr>
+            <w:tcW w:type="dxa" w:w="905"/>
           </w:tcPr>
           <w:p>
             <w:pPr>
@@ -3942,13 +4367,13 @@
                 <w:smallCaps w:val="0"/>
                 <w:sz w:val="16"/>
               </w:rPr>
-              <w:t>1.6</w:t>
-            </w:r>
-          </w:p>
-        </w:tc>
-        <w:tc>
-          <w:tcPr>
-            <w:tcW w:type="dxa" w:w="742"/>
+              <w:t>–</w:t>
+            </w:r>
+          </w:p>
+        </w:tc>
+        <w:tc>
+          <w:tcPr>
+            <w:tcW w:type="dxa" w:w="1032"/>
           </w:tcPr>
           <w:p>
             <w:pPr>
@@ -3964,13 +4389,13 @@
                 <w:smallCaps w:val="0"/>
                 <w:sz w:val="16"/>
               </w:rPr>
-              <w:t>27.9</w:t>
-            </w:r>
-          </w:p>
-        </w:tc>
-        <w:tc>
-          <w:tcPr>
-            <w:tcW w:type="dxa" w:w="742"/>
+              <w:t>45.9</w:t>
+            </w:r>
+          </w:p>
+        </w:tc>
+        <w:tc>
+          <w:tcPr>
+            <w:tcW w:type="dxa" w:w="1032"/>
           </w:tcPr>
           <w:p>
             <w:pPr>
@@ -3986,13 +4411,57 @@
                 <w:smallCaps w:val="0"/>
                 <w:sz w:val="16"/>
               </w:rPr>
-              <w:t>67.2</w:t>
-            </w:r>
-          </w:p>
-        </w:tc>
-        <w:tc>
-          <w:tcPr>
-            <w:tcW w:type="dxa" w:w="742"/>
+              <w:t>75.4</w:t>
+            </w:r>
+          </w:p>
+        </w:tc>
+        <w:tc>
+          <w:tcPr>
+            <w:tcW w:type="dxa" w:w="1032"/>
+          </w:tcPr>
+          <w:p>
+            <w:pPr>
+              <w:keepNext w:val="0"/>
+              <w:keepLines w:val="0"/>
+              <w:spacing w:before="0" w:after="0"/>
+              <w:jc w:val="center"/>
+            </w:pPr>
+            <w:r>
+              <w:rPr>
+                <w:b w:val="0"/>
+                <w:i w:val="0"/>
+                <w:smallCaps w:val="0"/>
+                <w:sz w:val="16"/>
+              </w:rPr>
+              <w:t>100</w:t>
+            </w:r>
+          </w:p>
+        </w:tc>
+        <w:tc>
+          <w:tcPr>
+            <w:tcW w:type="dxa" w:w="1032"/>
+          </w:tcPr>
+          <w:p>
+            <w:pPr>
+              <w:keepNext w:val="0"/>
+              <w:keepLines w:val="0"/>
+              <w:spacing w:before="0" w:after="0"/>
+              <w:jc w:val="center"/>
+            </w:pPr>
+            <w:r>
+              <w:rPr>
+                <w:b w:val="0"/>
+                <w:i w:val="0"/>
+                <w:smallCaps w:val="0"/>
+                <w:sz w:val="16"/>
+              </w:rPr>
+              <w:t>100</w:t>
+            </w:r>
+          </w:p>
+        </w:tc>
+        <w:tc>
+          <w:tcPr>
+            <w:tcW w:type="dxa" w:w="1032"/>
           </w:tcPr>
           <w:p>
             <w:pPr>
@@ -4020,6 +4489,17 @@
         <w:keepLines w:val="0"/>
         <w:spacing w:before="0" w:after="120"/>
         <w:jc w:val="both"/>
+      </w:pPr>
+    </w:p>
+    <w:p>
+      <w:pPr>
+        <w:sectPr>
+          <w:type w:val="continuous"/>
+          <w:pgSz w:w="12240" w:h="15840"/>
+          <w:pgMar w:top="1080" w:right="900" w:bottom="1440" w:left="900" w:header="720" w:footer="720" w:gutter="0"/>
+          <w:cols w:space="360" w:num="1"/>
+          <w:docGrid w:linePitch="360"/>
+        </w:sectPr>
       </w:pPr>
     </w:p>
     <w:p>
@@ -12674,7 +13154,7 @@
           <w:smallCaps w:val="0"/>
           <w:sz w:val="20"/>
         </w:rPr>
-        <w:t>The base station also records one 960 × 540 camera frame per sweep, looking up at the sky; the UAV appears as a dark blob of a few pixels, often next to a sun-glare streak. We use the frames in two ways. (i) Generic features: every frame is encoded by a ResNet-18 pretrained on ImageNet and kept frozen (input 224 × 398, 512-d global-pooled embedding), classified with a logistic regression or a one-hidden-layer MLP, or appended to every step as a 16-component PCA (fitted on all frames without labels, 79% of the variance). (ii) UAV localisation without labels: the frame minus a Gaussian-blurred copy of itself (σ = 12 px) removes the smooth sky, and the most negative 3 × 3 mean of the residual is the UAV. Its pixel (x, y) and contrast form a three-number feature. In 95% of frames the UAV is at least 29 grey levels darker than the surrounding sky; inspected frames show the detection on the UAV body, also next to the glare and when the UAV is close. The locator takes 54 ms per frame on one CPU process, most of it JPEG decoding; the ResNet-18 encoder takes 108 ms on one thread.</w:t>
+        <w:t>The base station also records one 960 × 540 camera frame per sweep, looking up at the sky; the UAV appears as a dark blob of a few pixels, often next to a sun-glare streak. We use the frames in two ways. (i) Generic features: every frame is encoded by a ResNet-18 pretrained on ImageNet and kept frozen (input 224 × 398, 512-d global-pooled embedding), classified with a logistic regression or a one-hidden-layer MLP, or appended to every step as a 16-component PCA (fitted on all frames without labels, 79% of the variance). (ii) UAV localisation without labels: the frame minus a Gaussian-blurred copy of itself (σ = 12 px) removes the smooth sky, and the most negative 3 × 3 mean of the residual is the UAV. Its pixel (x, y) and contrast form a three-number feature. In 95% of frames the UAV is at least 29 grey levels darker than the surrounding sky; inspected frames show the detection on the UAV body, also next to the glare and when the UAV is close. We also check the locator against GPS, without labels: a quadratic map from pixel to the UAV's east/north offset, fitted on other flights, explains 67% of the east and 12% of the north variance (median error 4.4 m). The UAV is nearly overhead (elevation 71–90°) and its height is not recorded consistently, so a pixel fixes the direction but not the distance; in the frames with the largest disagreement the detection is visibly on the UAV. The pixel jumps by more than 100 px between consecutive frames in 1.8% of frame pairs, while the GPS moves at most 2.2 m (99th percentile), so about 1% of frames are misdetected. The locator takes 54 ms per frame on one CPU process, most of it JPEG decoding; the ResNet-18 encoder takes 108 ms on one thread.</w:t>
       </w:r>
     </w:p>
     <w:p>
@@ -18978,7 +19458,7 @@
           <w:smallCaps w:val="0"/>
           <w:sz w:val="20"/>
         </w:rPr>
-        <w:t>With camera and GPS candidates (k = 4), the tracker selects the exact best beam 99.19% of the time with 7.0 beams and 0.56 ms per decision, against 97.15% with 13.2 beams and 1.05 ms for the tie-graph tracker with periodic sweeps: better on 25 flights and worse on 1, with lower latency on 30 of 33 flights. It matches the tracker with eight tie partners (99.28%) at 43% of its latency (1.31 ms), and delivers 99.59% of the genie's spectral efficiency at 10 dB, within 0.03 points of the best policy (99.62%, k = 2). The camera alone (98.57%, 0.59 ms) and GPS alone (99.12%, 0.59 ms) are each enough for most of the gain. Without side information, dropping the periodic sweeps costs 4.5 points (92.70%), so the candidates are what make loss-triggered sweeps safe. Without tie partners, camera candidates are not enough (96.12%): the camera locates the UAV, the tie graph resolves which of the beams near that direction is strongest. Full sweeps remain for beam loss in 1.8% of steps, so the 95th-percentile latency of the worst flight is 6 ms.</w:t>
+        <w:t>With camera and GPS candidates (k = 4), the tracker selects the exact best beam 99.19% of the time with 7.0 beams and 0.56 ms per decision, against 97.15% with 13.2 beams and 1.05 ms for the tie-graph tracker with periodic sweeps: better on 25 flights and worse on 1, with lower latency on 30 of 33 flights. It matches the tracker with eight tie partners (99.28%) at 43% of its latency (1.31 ms), and delivers 99.59% of the genie's spectral efficiency at 10 dB, within 0.03 points of the best policy (99.62%, k = 2). The camera alone (98.57%, 0.59 ms) and GPS alone (99.12%, 0.59 ms) are each enough for most of the gain. Without side information, dropping the periodic sweeps costs 4.5 points (92.70%), so the candidates are what make loss-triggered sweeps safe. Without tie partners, camera candidates are not enough (96.12%): the camera locates the UAV, the tie graph resolves which of the beams near that direction is strongest. Full sweeps remain for beam loss in 1.8% of steps, so the 95th-percentile latency of the worst flight is 6 ms. The gain extends to rare beams: macro-F1 rises from 0.934 to 0.980 over beams with at least five steps (0.843 to 0.944 over all classes, where beams seen once or twice still dominate), so in closed loop the sensing-aided tracker meets the 95% target on exact top-1 and macro-F1 at half the latency.</w:t>
       </w:r>
     </w:p>
     <w:p>
@@ -19023,7 +19503,7 @@
           <w:smallCaps/>
           <w:sz w:val="16"/>
         </w:rPr>
-        <w:t>Closed-loop replay of 33 flights with camera (UAV pixel) and GPS candidates; "+ T": with the four-partner tracker; "loss": full sweeps only on beam loss (1.8% of steps). ms: mean beam-training time per decision (95th percentile on the worst flight: 6.0 ms, full sweep every step 5.0 ms). SE: effective spectral efficiency at 10 dB, % of genie. Δ: change in exact top-1 against the tracker with full sweeps every 8 steps (points, 95% flight-bootstrap CI); B / T / W: flights better / tied / worse; Holm p ≤ 0.007 except (a), p = 0.09</w:t>
+        <w:t>Closed-loop replay of 33 flights with camera (UAV pixel) and GPS candidates; "+ T": with the four-partner tracker; "loss": full sweeps only on beam loss (1.8% of steps; tracker with full every 8: 13.9%). Macro-F1 over all best-beam classes / classes with at least five steps. ms: mean beam-training time per decision (95th percentile on the worst flight: 6.0 ms, full sweep every step 5.0 ms). SE: effective spectral efficiency at 10 dB, % of genie. Δ: change in exact top-1 against the tracker with full sweeps every 8 steps (points, 95% flight-bootstrap CI); B / T / W: flights better / tied / worse; Holm p ≤ 0.007 except (a), p = 0.09</w:t>
       </w:r>
     </w:p>
     <w:tbl>
@@ -19042,15 +19522,15 @@
         </w:tblCellMar>
       </w:tblPr>
       <w:tblGrid>
-        <w:gridCol w:w="3290"/>
-        <w:gridCol w:w="637"/>
-        <w:gridCol w:w="478"/>
-        <w:gridCol w:w="741"/>
-        <w:gridCol w:w="659"/>
-        <w:gridCol w:w="659"/>
-        <w:gridCol w:w="569"/>
-        <w:gridCol w:w="1929"/>
-        <w:gridCol w:w="1113"/>
+        <w:gridCol w:w="3119"/>
+        <w:gridCol w:w="603"/>
+        <w:gridCol w:w="453"/>
+        <w:gridCol w:w="625"/>
+        <w:gridCol w:w="1227"/>
+        <w:gridCol w:w="625"/>
+        <w:gridCol w:w="539"/>
+        <w:gridCol w:w="1829"/>
+        <w:gridCol w:w="1055"/>
       </w:tblGrid>
       <w:tr>
         <w:trPr>
@@ -19058,7 +19538,7 @@
         </w:trPr>
         <w:tc>
           <w:tcPr>
-            <w:tcW w:type="dxa" w:w="3291"/>
+            <w:tcW w:type="dxa" w:w="3120"/>
             <w:tcBorders>
               <w:bottom w:val="single" w:sz="4" w:color="000000"/>
             </w:tcBorders>
@@ -19083,7 +19563,7 @@
         </w:tc>
         <w:tc>
           <w:tcPr>
-            <w:tcW w:type="dxa" w:w="637"/>
+            <w:tcW w:type="dxa" w:w="604"/>
             <w:tcBorders>
               <w:bottom w:val="single" w:sz="4" w:color="000000"/>
             </w:tcBorders>
@@ -19108,7 +19588,7 @@
         </w:tc>
         <w:tc>
           <w:tcPr>
-            <w:tcW w:type="dxa" w:w="478"/>
+            <w:tcW w:type="dxa" w:w="453"/>
             <w:tcBorders>
               <w:bottom w:val="single" w:sz="4" w:color="000000"/>
             </w:tcBorders>
@@ -19133,7 +19613,7 @@
         </w:tc>
         <w:tc>
           <w:tcPr>
-            <w:tcW w:type="dxa" w:w="741"/>
+            <w:tcW w:type="dxa" w:w="625"/>
             <w:tcBorders>
               <w:bottom w:val="single" w:sz="4" w:color="000000"/>
             </w:tcBorders>
@@ -19152,13 +19632,13 @@
                 <w:smallCaps w:val="0"/>
                 <w:sz w:val="16"/>
               </w:rPr>
-              <w:t>Full sweeps (%)</w:t>
-            </w:r>
-          </w:p>
-        </w:tc>
-        <w:tc>
-          <w:tcPr>
-            <w:tcW w:type="dxa" w:w="660"/>
+              <w:t>Top-1 (%)</w:t>
+            </w:r>
+          </w:p>
+        </w:tc>
+        <w:tc>
+          <w:tcPr>
+            <w:tcW w:type="dxa" w:w="1228"/>
             <w:tcBorders>
               <w:bottom w:val="single" w:sz="4" w:color="000000"/>
             </w:tcBorders>
@@ -19177,13 +19657,13 @@
                 <w:smallCaps w:val="0"/>
                 <w:sz w:val="16"/>
               </w:rPr>
-              <w:t>Top-1 (%)</w:t>
-            </w:r>
-          </w:p>
-        </w:tc>
-        <w:tc>
-          <w:tcPr>
-            <w:tcW w:type="dxa" w:w="660"/>
+              <w:t>Macro-F1 (all / ≥ 5)</w:t>
+            </w:r>
+          </w:p>
+        </w:tc>
+        <w:tc>
+          <w:tcPr>
+            <w:tcW w:type="dxa" w:w="625"/>
             <w:tcBorders>
               <w:bottom w:val="single" w:sz="4" w:color="000000"/>
             </w:tcBorders>
@@ -19208,7 +19688,7 @@
         </w:tc>
         <w:tc>
           <w:tcPr>
-            <w:tcW w:type="dxa" w:w="569"/>
+            <w:tcW w:type="dxa" w:w="539"/>
             <w:tcBorders>
               <w:bottom w:val="single" w:sz="4" w:color="000000"/>
             </w:tcBorders>
@@ -19233,7 +19713,7 @@
         </w:tc>
         <w:tc>
           <w:tcPr>
-            <w:tcW w:type="dxa" w:w="1930"/>
+            <w:tcW w:type="dxa" w:w="1830"/>
             <w:tcBorders>
               <w:bottom w:val="single" w:sz="4" w:color="000000"/>
             </w:tcBorders>
@@ -19258,7 +19738,7 @@
         </w:tc>
         <w:tc>
           <w:tcPr>
-            <w:tcW w:type="dxa" w:w="1113"/>
+            <w:tcW w:type="dxa" w:w="1055"/>
             <w:tcBorders>
               <w:bottom w:val="single" w:sz="4" w:color="000000"/>
             </w:tcBorders>
@@ -19288,7 +19768,7 @@
         </w:trPr>
         <w:tc>
           <w:tcPr>
-            <w:tcW w:type="dxa" w:w="3291"/>
+            <w:tcW w:type="dxa" w:w="3120"/>
           </w:tcPr>
           <w:p>
             <w:pPr>
@@ -19310,7 +19790,7 @@
         </w:tc>
         <w:tc>
           <w:tcPr>
-            <w:tcW w:type="dxa" w:w="637"/>
+            <w:tcW w:type="dxa" w:w="604"/>
           </w:tcPr>
           <w:p>
             <w:pPr>
@@ -19332,7 +19812,7 @@
         </w:tc>
         <w:tc>
           <w:tcPr>
-            <w:tcW w:type="dxa" w:w="478"/>
+            <w:tcW w:type="dxa" w:w="453"/>
           </w:tcPr>
           <w:p>
             <w:pPr>
@@ -19354,29 +19834,7 @@
         </w:tc>
         <w:tc>
           <w:tcPr>
-            <w:tcW w:type="dxa" w:w="741"/>
-          </w:tcPr>
-          <w:p>
-            <w:pPr>
-              <w:keepNext/>
-              <w:keepLines/>
-              <w:spacing w:before="0" w:after="0"/>
-              <w:jc w:val="center"/>
-            </w:pPr>
-            <w:r>
-              <w:rPr>
-                <w:b w:val="0"/>
-                <w:i w:val="0"/>
-                <w:smallCaps w:val="0"/>
-                <w:sz w:val="16"/>
-              </w:rPr>
-              <w:t>100</w:t>
-            </w:r>
-          </w:p>
-        </w:tc>
-        <w:tc>
-          <w:tcPr>
-            <w:tcW w:type="dxa" w:w="660"/>
+            <w:tcW w:type="dxa" w:w="625"/>
           </w:tcPr>
           <w:p>
             <w:pPr>
@@ -19398,7 +19856,29 @@
         </w:tc>
         <w:tc>
           <w:tcPr>
-            <w:tcW w:type="dxa" w:w="660"/>
+            <w:tcW w:type="dxa" w:w="1228"/>
+          </w:tcPr>
+          <w:p>
+            <w:pPr>
+              <w:keepNext/>
+              <w:keepLines/>
+              <w:spacing w:before="0" w:after="0"/>
+              <w:jc w:val="center"/>
+            </w:pPr>
+            <w:r>
+              <w:rPr>
+                <w:b w:val="0"/>
+                <w:i w:val="0"/>
+                <w:smallCaps w:val="0"/>
+                <w:sz w:val="16"/>
+              </w:rPr>
+              <w:t>1.000 / 1.000</w:t>
+            </w:r>
+          </w:p>
+        </w:tc>
+        <w:tc>
+          <w:tcPr>
+            <w:tcW w:type="dxa" w:w="625"/>
           </w:tcPr>
           <w:p>
             <w:pPr>
@@ -19420,7 +19900,7 @@
         </w:tc>
         <w:tc>
           <w:tcPr>
-            <w:tcW w:type="dxa" w:w="569"/>
+            <w:tcW w:type="dxa" w:w="539"/>
           </w:tcPr>
           <w:p>
             <w:pPr>
@@ -19442,7 +19922,7 @@
         </w:tc>
         <w:tc>
           <w:tcPr>
-            <w:tcW w:type="dxa" w:w="1930"/>
+            <w:tcW w:type="dxa" w:w="1830"/>
           </w:tcPr>
           <w:p>
             <w:pPr>
@@ -19464,7 +19944,7 @@
         </w:tc>
         <w:tc>
           <w:tcPr>
-            <w:tcW w:type="dxa" w:w="1113"/>
+            <w:tcW w:type="dxa" w:w="1055"/>
           </w:tcPr>
           <w:p>
             <w:pPr>
@@ -19491,7 +19971,7 @@
         </w:trPr>
         <w:tc>
           <w:tcPr>
-            <w:tcW w:type="dxa" w:w="3291"/>
+            <w:tcW w:type="dxa" w:w="3120"/>
           </w:tcPr>
           <w:p>
             <w:pPr>
@@ -19513,7 +19993,7 @@
         </w:tc>
         <w:tc>
           <w:tcPr>
-            <w:tcW w:type="dxa" w:w="637"/>
+            <w:tcW w:type="dxa" w:w="604"/>
           </w:tcPr>
           <w:p>
             <w:pPr>
@@ -19535,7 +20015,7 @@
         </w:tc>
         <w:tc>
           <w:tcPr>
-            <w:tcW w:type="dxa" w:w="478"/>
+            <w:tcW w:type="dxa" w:w="453"/>
           </w:tcPr>
           <w:p>
             <w:pPr>
@@ -19557,29 +20037,7 @@
         </w:tc>
         <w:tc>
           <w:tcPr>
-            <w:tcW w:type="dxa" w:w="741"/>
-          </w:tcPr>
-          <w:p>
-            <w:pPr>
-              <w:keepNext/>
-              <w:keepLines/>
-              <w:spacing w:before="0" w:after="0"/>
-              <w:jc w:val="center"/>
-            </w:pPr>
-            <w:r>
-              <w:rPr>
-                <w:b w:val="0"/>
-                <w:i w:val="0"/>
-                <w:smallCaps w:val="0"/>
-                <w:sz w:val="16"/>
-              </w:rPr>
-              <w:t>13.9</w:t>
-            </w:r>
-          </w:p>
-        </w:tc>
-        <w:tc>
-          <w:tcPr>
-            <w:tcW w:type="dxa" w:w="660"/>
+            <w:tcW w:type="dxa" w:w="625"/>
           </w:tcPr>
           <w:p>
             <w:pPr>
@@ -19601,7 +20059,29 @@
         </w:tc>
         <w:tc>
           <w:tcPr>
-            <w:tcW w:type="dxa" w:w="660"/>
+            <w:tcW w:type="dxa" w:w="1228"/>
+          </w:tcPr>
+          <w:p>
+            <w:pPr>
+              <w:keepNext/>
+              <w:keepLines/>
+              <w:spacing w:before="0" w:after="0"/>
+              <w:jc w:val="center"/>
+            </w:pPr>
+            <w:r>
+              <w:rPr>
+                <w:b w:val="0"/>
+                <w:i w:val="0"/>
+                <w:smallCaps w:val="0"/>
+                <w:sz w:val="16"/>
+              </w:rPr>
+              <w:t>0.843 / 0.934</w:t>
+            </w:r>
+          </w:p>
+        </w:tc>
+        <w:tc>
+          <w:tcPr>
+            <w:tcW w:type="dxa" w:w="625"/>
           </w:tcPr>
           <w:p>
             <w:pPr>
@@ -19623,7 +20103,7 @@
         </w:tc>
         <w:tc>
           <w:tcPr>
-            <w:tcW w:type="dxa" w:w="569"/>
+            <w:tcW w:type="dxa" w:w="539"/>
           </w:tcPr>
           <w:p>
             <w:pPr>
@@ -19645,7 +20125,7 @@
         </w:tc>
         <w:tc>
           <w:tcPr>
-            <w:tcW w:type="dxa" w:w="1930"/>
+            <w:tcW w:type="dxa" w:w="1830"/>
           </w:tcPr>
           <w:p>
             <w:pPr>
@@ -19667,7 +20147,7 @@
         </w:tc>
         <w:tc>
           <w:tcPr>
-            <w:tcW w:type="dxa" w:w="1113"/>
+            <w:tcW w:type="dxa" w:w="1055"/>
           </w:tcPr>
           <w:p>
             <w:pPr>
@@ -19694,7 +20174,7 @@
         </w:trPr>
         <w:tc>
           <w:tcPr>
-            <w:tcW w:type="dxa" w:w="3291"/>
+            <w:tcW w:type="dxa" w:w="3120"/>
           </w:tcPr>
           <w:p>
             <w:pPr>
@@ -19716,7 +20196,7 @@
         </w:tc>
         <w:tc>
           <w:tcPr>
-            <w:tcW w:type="dxa" w:w="637"/>
+            <w:tcW w:type="dxa" w:w="604"/>
           </w:tcPr>
           <w:p>
             <w:pPr>
@@ -19738,7 +20218,7 @@
         </w:tc>
         <w:tc>
           <w:tcPr>
-            <w:tcW w:type="dxa" w:w="478"/>
+            <w:tcW w:type="dxa" w:w="453"/>
           </w:tcPr>
           <w:p>
             <w:pPr>
@@ -19760,29 +20240,7 @@
         </w:tc>
         <w:tc>
           <w:tcPr>
-            <w:tcW w:type="dxa" w:w="741"/>
-          </w:tcPr>
-          <w:p>
-            <w:pPr>
-              <w:keepNext/>
-              <w:keepLines/>
-              <w:spacing w:before="0" w:after="0"/>
-              <w:jc w:val="center"/>
-            </w:pPr>
-            <w:r>
-              <w:rPr>
-                <w:b w:val="0"/>
-                <w:i w:val="0"/>
-                <w:smallCaps w:val="0"/>
-                <w:sz w:val="16"/>
-              </w:rPr>
-              <w:t>1.8</w:t>
-            </w:r>
-          </w:p>
-        </w:tc>
-        <w:tc>
-          <w:tcPr>
-            <w:tcW w:type="dxa" w:w="660"/>
+            <w:tcW w:type="dxa" w:w="625"/>
           </w:tcPr>
           <w:p>
             <w:pPr>
@@ -19804,7 +20262,29 @@
         </w:tc>
         <w:tc>
           <w:tcPr>
-            <w:tcW w:type="dxa" w:w="660"/>
+            <w:tcW w:type="dxa" w:w="1228"/>
+          </w:tcPr>
+          <w:p>
+            <w:pPr>
+              <w:keepNext/>
+              <w:keepLines/>
+              <w:spacing w:before="0" w:after="0"/>
+              <w:jc w:val="center"/>
+            </w:pPr>
+            <w:r>
+              <w:rPr>
+                <w:b w:val="0"/>
+                <w:i w:val="0"/>
+                <w:smallCaps w:val="0"/>
+                <w:sz w:val="16"/>
+              </w:rPr>
+              <w:t>0.708 / 0.845</w:t>
+            </w:r>
+          </w:p>
+        </w:tc>
+        <w:tc>
+          <w:tcPr>
+            <w:tcW w:type="dxa" w:w="625"/>
           </w:tcPr>
           <w:p>
             <w:pPr>
@@ -19826,7 +20306,7 @@
         </w:tc>
         <w:tc>
           <w:tcPr>
-            <w:tcW w:type="dxa" w:w="569"/>
+            <w:tcW w:type="dxa" w:w="539"/>
           </w:tcPr>
           <w:p>
             <w:pPr>
@@ -19848,7 +20328,7 @@
         </w:tc>
         <w:tc>
           <w:tcPr>
-            <w:tcW w:type="dxa" w:w="1930"/>
+            <w:tcW w:type="dxa" w:w="1830"/>
           </w:tcPr>
           <w:p>
             <w:pPr>
@@ -19870,7 +20350,7 @@
         </w:tc>
         <w:tc>
           <w:tcPr>
-            <w:tcW w:type="dxa" w:w="1113"/>
+            <w:tcW w:type="dxa" w:w="1055"/>
           </w:tcPr>
           <w:p>
             <w:pPr>
@@ -19897,7 +20377,7 @@
         </w:trPr>
         <w:tc>
           <w:tcPr>
-            <w:tcW w:type="dxa" w:w="3291"/>
+            <w:tcW w:type="dxa" w:w="3120"/>
           </w:tcPr>
           <w:p>
             <w:pPr>
@@ -19919,7 +20399,7 @@
         </w:tc>
         <w:tc>
           <w:tcPr>
-            <w:tcW w:type="dxa" w:w="637"/>
+            <w:tcW w:type="dxa" w:w="604"/>
           </w:tcPr>
           <w:p>
             <w:pPr>
@@ -19941,7 +20421,7 @@
         </w:tc>
         <w:tc>
           <w:tcPr>
-            <w:tcW w:type="dxa" w:w="478"/>
+            <w:tcW w:type="dxa" w:w="453"/>
           </w:tcPr>
           <w:p>
             <w:pPr>
@@ -19963,29 +20443,7 @@
         </w:tc>
         <w:tc>
           <w:tcPr>
-            <w:tcW w:type="dxa" w:w="741"/>
-          </w:tcPr>
-          <w:p>
-            <w:pPr>
-              <w:keepNext/>
-              <w:keepLines/>
-              <w:spacing w:before="0" w:after="0"/>
-              <w:jc w:val="center"/>
-            </w:pPr>
-            <w:r>
-              <w:rPr>
-                <w:b w:val="0"/>
-                <w:i w:val="0"/>
-                <w:smallCaps w:val="0"/>
-                <w:sz w:val="16"/>
-              </w:rPr>
-              <w:t>1.8</w:t>
-            </w:r>
-          </w:p>
-        </w:tc>
-        <w:tc>
-          <w:tcPr>
-            <w:tcW w:type="dxa" w:w="660"/>
+            <w:tcW w:type="dxa" w:w="625"/>
           </w:tcPr>
           <w:p>
             <w:pPr>
@@ -20007,7 +20465,29 @@
         </w:tc>
         <w:tc>
           <w:tcPr>
-            <w:tcW w:type="dxa" w:w="660"/>
+            <w:tcW w:type="dxa" w:w="1228"/>
+          </w:tcPr>
+          <w:p>
+            <w:pPr>
+              <w:keepNext/>
+              <w:keepLines/>
+              <w:spacing w:before="0" w:after="0"/>
+              <w:jc w:val="center"/>
+            </w:pPr>
+            <w:r>
+              <w:rPr>
+                <w:b w:val="0"/>
+                <w:i w:val="0"/>
+                <w:smallCaps w:val="0"/>
+                <w:sz w:val="16"/>
+              </w:rPr>
+              <w:t>0.875 / 0.947</w:t>
+            </w:r>
+          </w:p>
+        </w:tc>
+        <w:tc>
+          <w:tcPr>
+            <w:tcW w:type="dxa" w:w="625"/>
           </w:tcPr>
           <w:p>
             <w:pPr>
@@ -20029,7 +20509,7 @@
         </w:tc>
         <w:tc>
           <w:tcPr>
-            <w:tcW w:type="dxa" w:w="569"/>
+            <w:tcW w:type="dxa" w:w="539"/>
           </w:tcPr>
           <w:p>
             <w:pPr>
@@ -20051,7 +20531,7 @@
         </w:tc>
         <w:tc>
           <w:tcPr>
-            <w:tcW w:type="dxa" w:w="1930"/>
+            <w:tcW w:type="dxa" w:w="1830"/>
           </w:tcPr>
           <w:p>
             <w:pPr>
@@ -20073,7 +20553,7 @@
         </w:tc>
         <w:tc>
           <w:tcPr>
-            <w:tcW w:type="dxa" w:w="1113"/>
+            <w:tcW w:type="dxa" w:w="1055"/>
           </w:tcPr>
           <w:p>
             <w:pPr>
@@ -20100,7 +20580,7 @@
         </w:trPr>
         <w:tc>
           <w:tcPr>
-            <w:tcW w:type="dxa" w:w="3291"/>
+            <w:tcW w:type="dxa" w:w="3120"/>
           </w:tcPr>
           <w:p>
             <w:pPr>
@@ -20122,7 +20602,7 @@
         </w:tc>
         <w:tc>
           <w:tcPr>
-            <w:tcW w:type="dxa" w:w="637"/>
+            <w:tcW w:type="dxa" w:w="604"/>
           </w:tcPr>
           <w:p>
             <w:pPr>
@@ -20144,7 +20624,7 @@
         </w:tc>
         <w:tc>
           <w:tcPr>
-            <w:tcW w:type="dxa" w:w="478"/>
+            <w:tcW w:type="dxa" w:w="453"/>
           </w:tcPr>
           <w:p>
             <w:pPr>
@@ -20166,29 +20646,7 @@
         </w:tc>
         <w:tc>
           <w:tcPr>
-            <w:tcW w:type="dxa" w:w="741"/>
-          </w:tcPr>
-          <w:p>
-            <w:pPr>
-              <w:keepNext/>
-              <w:keepLines/>
-              <w:spacing w:before="0" w:after="0"/>
-              <w:jc w:val="center"/>
-            </w:pPr>
-            <w:r>
-              <w:rPr>
-                <w:b w:val="0"/>
-                <w:i w:val="0"/>
-                <w:smallCaps w:val="0"/>
-                <w:sz w:val="16"/>
-              </w:rPr>
-              <w:t>1.8</w:t>
-            </w:r>
-          </w:p>
-        </w:tc>
-        <w:tc>
-          <w:tcPr>
-            <w:tcW w:type="dxa" w:w="660"/>
+            <w:tcW w:type="dxa" w:w="625"/>
           </w:tcPr>
           <w:p>
             <w:pPr>
@@ -20210,7 +20668,29 @@
         </w:tc>
         <w:tc>
           <w:tcPr>
-            <w:tcW w:type="dxa" w:w="660"/>
+            <w:tcW w:type="dxa" w:w="1228"/>
+          </w:tcPr>
+          <w:p>
+            <w:pPr>
+              <w:keepNext/>
+              <w:keepLines/>
+              <w:spacing w:before="0" w:after="0"/>
+              <w:jc w:val="center"/>
+            </w:pPr>
+            <w:r>
+              <w:rPr>
+                <w:b w:val="0"/>
+                <w:i w:val="0"/>
+                <w:smallCaps w:val="0"/>
+                <w:sz w:val="16"/>
+              </w:rPr>
+              <w:t>0.914 / 0.961</w:t>
+            </w:r>
+          </w:p>
+        </w:tc>
+        <w:tc>
+          <w:tcPr>
+            <w:tcW w:type="dxa" w:w="625"/>
           </w:tcPr>
           <w:p>
             <w:pPr>
@@ -20232,7 +20712,7 @@
         </w:tc>
         <w:tc>
           <w:tcPr>
-            <w:tcW w:type="dxa" w:w="569"/>
+            <w:tcW w:type="dxa" w:w="539"/>
           </w:tcPr>
           <w:p>
             <w:pPr>
@@ -20254,7 +20734,7 @@
         </w:tc>
         <w:tc>
           <w:tcPr>
-            <w:tcW w:type="dxa" w:w="1930"/>
+            <w:tcW w:type="dxa" w:w="1830"/>
           </w:tcPr>
           <w:p>
             <w:pPr>
@@ -20276,7 +20756,7 @@
         </w:tc>
         <w:tc>
           <w:tcPr>
-            <w:tcW w:type="dxa" w:w="1113"/>
+            <w:tcW w:type="dxa" w:w="1055"/>
           </w:tcPr>
           <w:p>
             <w:pPr>
@@ -20303,7 +20783,7 @@
         </w:trPr>
         <w:tc>
           <w:tcPr>
-            <w:tcW w:type="dxa" w:w="3291"/>
+            <w:tcW w:type="dxa" w:w="3120"/>
           </w:tcPr>
           <w:p>
             <w:pPr>
@@ -20325,7 +20805,7 @@
         </w:tc>
         <w:tc>
           <w:tcPr>
-            <w:tcW w:type="dxa" w:w="637"/>
+            <w:tcW w:type="dxa" w:w="604"/>
           </w:tcPr>
           <w:p>
             <w:pPr>
@@ -20347,7 +20827,7 @@
         </w:tc>
         <w:tc>
           <w:tcPr>
-            <w:tcW w:type="dxa" w:w="478"/>
+            <w:tcW w:type="dxa" w:w="453"/>
           </w:tcPr>
           <w:p>
             <w:pPr>
@@ -20369,29 +20849,7 @@
         </w:tc>
         <w:tc>
           <w:tcPr>
-            <w:tcW w:type="dxa" w:w="741"/>
-          </w:tcPr>
-          <w:p>
-            <w:pPr>
-              <w:keepNext/>
-              <w:keepLines/>
-              <w:spacing w:before="0" w:after="0"/>
-              <w:jc w:val="center"/>
-            </w:pPr>
-            <w:r>
-              <w:rPr>
-                <w:b w:val="0"/>
-                <w:i w:val="0"/>
-                <w:smallCaps w:val="0"/>
-                <w:sz w:val="16"/>
-              </w:rPr>
-              <w:t>1.8</w:t>
-            </w:r>
-          </w:p>
-        </w:tc>
-        <w:tc>
-          <w:tcPr>
-            <w:tcW w:type="dxa" w:w="660"/>
+            <w:tcW w:type="dxa" w:w="625"/>
           </w:tcPr>
           <w:p>
             <w:pPr>
@@ -20413,7 +20871,29 @@
         </w:tc>
         <w:tc>
           <w:tcPr>
-            <w:tcW w:type="dxa" w:w="660"/>
+            <w:tcW w:type="dxa" w:w="1228"/>
+          </w:tcPr>
+          <w:p>
+            <w:pPr>
+              <w:keepNext/>
+              <w:keepLines/>
+              <w:spacing w:before="0" w:after="0"/>
+              <w:jc w:val="center"/>
+            </w:pPr>
+            <w:r>
+              <w:rPr>
+                <w:b w:val="0"/>
+                <w:i w:val="0"/>
+                <w:smallCaps w:val="0"/>
+                <w:sz w:val="16"/>
+              </w:rPr>
+              <w:t>0.780 / 0.883</w:t>
+            </w:r>
+          </w:p>
+        </w:tc>
+        <w:tc>
+          <w:tcPr>
+            <w:tcW w:type="dxa" w:w="625"/>
           </w:tcPr>
           <w:p>
             <w:pPr>
@@ -20435,7 +20915,7 @@
         </w:tc>
         <w:tc>
           <w:tcPr>
-            <w:tcW w:type="dxa" w:w="569"/>
+            <w:tcW w:type="dxa" w:w="539"/>
           </w:tcPr>
           <w:p>
             <w:pPr>
@@ -20457,7 +20937,7 @@
         </w:tc>
         <w:tc>
           <w:tcPr>
-            <w:tcW w:type="dxa" w:w="1930"/>
+            <w:tcW w:type="dxa" w:w="1830"/>
           </w:tcPr>
           <w:p>
             <w:pPr>
@@ -20479,7 +20959,7 @@
         </w:tc>
         <w:tc>
           <w:tcPr>
-            <w:tcW w:type="dxa" w:w="1113"/>
+            <w:tcW w:type="dxa" w:w="1055"/>
           </w:tcPr>
           <w:p>
             <w:pPr>
@@ -20506,7 +20986,7 @@
         </w:trPr>
         <w:tc>
           <w:tcPr>
-            <w:tcW w:type="dxa" w:w="3291"/>
+            <w:tcW w:type="dxa" w:w="3120"/>
           </w:tcPr>
           <w:p>
             <w:pPr>
@@ -20528,7 +21008,7 @@
         </w:tc>
         <w:tc>
           <w:tcPr>
-            <w:tcW w:type="dxa" w:w="637"/>
+            <w:tcW w:type="dxa" w:w="604"/>
           </w:tcPr>
           <w:p>
             <w:pPr>
@@ -20550,7 +21030,7 @@
         </w:tc>
         <w:tc>
           <w:tcPr>
-            <w:tcW w:type="dxa" w:w="478"/>
+            <w:tcW w:type="dxa" w:w="453"/>
           </w:tcPr>
           <w:p>
             <w:pPr>
@@ -20572,29 +21052,7 @@
         </w:tc>
         <w:tc>
           <w:tcPr>
-            <w:tcW w:type="dxa" w:w="741"/>
-          </w:tcPr>
-          <w:p>
-            <w:pPr>
-              <w:keepNext/>
-              <w:keepLines/>
-              <w:spacing w:before="0" w:after="0"/>
-              <w:jc w:val="center"/>
-            </w:pPr>
-            <w:r>
-              <w:rPr>
-                <w:b w:val="0"/>
-                <w:i w:val="0"/>
-                <w:smallCaps w:val="0"/>
-                <w:sz w:val="16"/>
-              </w:rPr>
-              <w:t>1.8</w:t>
-            </w:r>
-          </w:p>
-        </w:tc>
-        <w:tc>
-          <w:tcPr>
-            <w:tcW w:type="dxa" w:w="660"/>
+            <w:tcW w:type="dxa" w:w="625"/>
           </w:tcPr>
           <w:p>
             <w:pPr>
@@ -20616,7 +21074,29 @@
         </w:tc>
         <w:tc>
           <w:tcPr>
-            <w:tcW w:type="dxa" w:w="660"/>
+            <w:tcW w:type="dxa" w:w="1228"/>
+          </w:tcPr>
+          <w:p>
+            <w:pPr>
+              <w:keepNext/>
+              <w:keepLines/>
+              <w:spacing w:before="0" w:after="0"/>
+              <w:jc w:val="center"/>
+            </w:pPr>
+            <w:r>
+              <w:rPr>
+                <w:b w:val="0"/>
+                <w:i w:val="0"/>
+                <w:smallCaps w:val="0"/>
+                <w:sz w:val="16"/>
+              </w:rPr>
+              <w:t>0.930 / 0.966</w:t>
+            </w:r>
+          </w:p>
+        </w:tc>
+        <w:tc>
+          <w:tcPr>
+            <w:tcW w:type="dxa" w:w="625"/>
           </w:tcPr>
           <w:p>
             <w:pPr>
@@ -20638,7 +21118,7 @@
         </w:tc>
         <w:tc>
           <w:tcPr>
-            <w:tcW w:type="dxa" w:w="569"/>
+            <w:tcW w:type="dxa" w:w="539"/>
           </w:tcPr>
           <w:p>
             <w:pPr>
@@ -20660,7 +21140,7 @@
         </w:tc>
         <w:tc>
           <w:tcPr>
-            <w:tcW w:type="dxa" w:w="1930"/>
+            <w:tcW w:type="dxa" w:w="1830"/>
           </w:tcPr>
           <w:p>
             <w:pPr>
@@ -20682,7 +21162,7 @@
         </w:tc>
         <w:tc>
           <w:tcPr>
-            <w:tcW w:type="dxa" w:w="1113"/>
+            <w:tcW w:type="dxa" w:w="1055"/>
           </w:tcPr>
           <w:p>
             <w:pPr>
@@ -20709,7 +21189,7 @@
         </w:trPr>
         <w:tc>
           <w:tcPr>
-            <w:tcW w:type="dxa" w:w="3291"/>
+            <w:tcW w:type="dxa" w:w="3120"/>
           </w:tcPr>
           <w:p>
             <w:pPr>
@@ -20731,7 +21211,7 @@
         </w:tc>
         <w:tc>
           <w:tcPr>
-            <w:tcW w:type="dxa" w:w="637"/>
+            <w:tcW w:type="dxa" w:w="604"/>
           </w:tcPr>
           <w:p>
             <w:pPr>
@@ -20753,7 +21233,7 @@
         </w:tc>
         <w:tc>
           <w:tcPr>
-            <w:tcW w:type="dxa" w:w="478"/>
+            <w:tcW w:type="dxa" w:w="453"/>
           </w:tcPr>
           <w:p>
             <w:pPr>
@@ -20775,29 +21255,7 @@
         </w:tc>
         <w:tc>
           <w:tcPr>
-            <w:tcW w:type="dxa" w:w="741"/>
-          </w:tcPr>
-          <w:p>
-            <w:pPr>
-              <w:keepNext/>
-              <w:keepLines/>
-              <w:spacing w:before="0" w:after="0"/>
-              <w:jc w:val="center"/>
-            </w:pPr>
-            <w:r>
-              <w:rPr>
-                <w:b w:val="0"/>
-                <w:i w:val="0"/>
-                <w:smallCaps w:val="0"/>
-                <w:sz w:val="16"/>
-              </w:rPr>
-              <w:t>1.8</w:t>
-            </w:r>
-          </w:p>
-        </w:tc>
-        <w:tc>
-          <w:tcPr>
-            <w:tcW w:type="dxa" w:w="660"/>
+            <w:tcW w:type="dxa" w:w="625"/>
           </w:tcPr>
           <w:p>
             <w:pPr>
@@ -20819,7 +21277,29 @@
         </w:tc>
         <w:tc>
           <w:tcPr>
-            <w:tcW w:type="dxa" w:w="660"/>
+            <w:tcW w:type="dxa" w:w="1228"/>
+          </w:tcPr>
+          <w:p>
+            <w:pPr>
+              <w:keepNext/>
+              <w:keepLines/>
+              <w:spacing w:before="0" w:after="0"/>
+              <w:jc w:val="center"/>
+            </w:pPr>
+            <w:r>
+              <w:rPr>
+                <w:b w:val="0"/>
+                <w:i w:val="0"/>
+                <w:smallCaps w:val="0"/>
+                <w:sz w:val="16"/>
+              </w:rPr>
+              <w:t>0.943 / 0.979</w:t>
+            </w:r>
+          </w:p>
+        </w:tc>
+        <w:tc>
+          <w:tcPr>
+            <w:tcW w:type="dxa" w:w="625"/>
           </w:tcPr>
           <w:p>
             <w:pPr>
@@ -20841,7 +21321,7 @@
         </w:tc>
         <w:tc>
           <w:tcPr>
-            <w:tcW w:type="dxa" w:w="569"/>
+            <w:tcW w:type="dxa" w:w="539"/>
           </w:tcPr>
           <w:p>
             <w:pPr>
@@ -20863,7 +21343,7 @@
         </w:tc>
         <w:tc>
           <w:tcPr>
-            <w:tcW w:type="dxa" w:w="1930"/>
+            <w:tcW w:type="dxa" w:w="1830"/>
           </w:tcPr>
           <w:p>
             <w:pPr>
@@ -20885,7 +21365,7 @@
         </w:tc>
         <w:tc>
           <w:tcPr>
-            <w:tcW w:type="dxa" w:w="1113"/>
+            <w:tcW w:type="dxa" w:w="1055"/>
           </w:tcPr>
           <w:p>
             <w:pPr>
@@ -20912,7 +21392,7 @@
         </w:trPr>
         <w:tc>
           <w:tcPr>
-            <w:tcW w:type="dxa" w:w="3291"/>
+            <w:tcW w:type="dxa" w:w="3120"/>
           </w:tcPr>
           <w:p>
             <w:pPr>
@@ -20934,7 +21414,7 @@
         </w:tc>
         <w:tc>
           <w:tcPr>
-            <w:tcW w:type="dxa" w:w="637"/>
+            <w:tcW w:type="dxa" w:w="604"/>
           </w:tcPr>
           <w:p>
             <w:pPr>
@@ -20956,7 +21436,7 @@
         </w:tc>
         <w:tc>
           <w:tcPr>
-            <w:tcW w:type="dxa" w:w="478"/>
+            <w:tcW w:type="dxa" w:w="453"/>
           </w:tcPr>
           <w:p>
             <w:pPr>
@@ -20978,29 +21458,7 @@
         </w:tc>
         <w:tc>
           <w:tcPr>
-            <w:tcW w:type="dxa" w:w="741"/>
-          </w:tcPr>
-          <w:p>
-            <w:pPr>
-              <w:keepNext/>
-              <w:keepLines/>
-              <w:spacing w:before="0" w:after="0"/>
-              <w:jc w:val="center"/>
-            </w:pPr>
-            <w:r>
-              <w:rPr>
-                <w:b w:val="0"/>
-                <w:i w:val="0"/>
-                <w:smallCaps w:val="0"/>
-                <w:sz w:val="16"/>
-              </w:rPr>
-              <w:t>1.8</w:t>
-            </w:r>
-          </w:p>
-        </w:tc>
-        <w:tc>
-          <w:tcPr>
-            <w:tcW w:type="dxa" w:w="660"/>
+            <w:tcW w:type="dxa" w:w="625"/>
           </w:tcPr>
           <w:p>
             <w:pPr>
@@ -21022,7 +21480,29 @@
         </w:tc>
         <w:tc>
           <w:tcPr>
-            <w:tcW w:type="dxa" w:w="660"/>
+            <w:tcW w:type="dxa" w:w="1228"/>
+          </w:tcPr>
+          <w:p>
+            <w:pPr>
+              <w:keepNext/>
+              <w:keepLines/>
+              <w:spacing w:before="0" w:after="0"/>
+              <w:jc w:val="center"/>
+            </w:pPr>
+            <w:r>
+              <w:rPr>
+                <w:b w:val="0"/>
+                <w:i w:val="0"/>
+                <w:smallCaps w:val="0"/>
+                <w:sz w:val="16"/>
+              </w:rPr>
+              <w:t>0.927 / 0.970</w:t>
+            </w:r>
+          </w:p>
+        </w:tc>
+        <w:tc>
+          <w:tcPr>
+            <w:tcW w:type="dxa" w:w="625"/>
           </w:tcPr>
           <w:p>
             <w:pPr>
@@ -21044,7 +21524,7 @@
         </w:tc>
         <w:tc>
           <w:tcPr>
-            <w:tcW w:type="dxa" w:w="569"/>
+            <w:tcW w:type="dxa" w:w="539"/>
           </w:tcPr>
           <w:p>
             <w:pPr>
@@ -21066,7 +21546,7 @@
         </w:tc>
         <w:tc>
           <w:tcPr>
-            <w:tcW w:type="dxa" w:w="1930"/>
+            <w:tcW w:type="dxa" w:w="1830"/>
           </w:tcPr>
           <w:p>
             <w:pPr>
@@ -21088,7 +21568,7 @@
         </w:tc>
         <w:tc>
           <w:tcPr>
-            <w:tcW w:type="dxa" w:w="1113"/>
+            <w:tcW w:type="dxa" w:w="1055"/>
           </w:tcPr>
           <w:p>
             <w:pPr>
@@ -21115,7 +21595,7 @@
         </w:trPr>
         <w:tc>
           <w:tcPr>
-            <w:tcW w:type="dxa" w:w="3291"/>
+            <w:tcW w:type="dxa" w:w="3120"/>
           </w:tcPr>
           <w:p>
             <w:pPr>
@@ -21137,7 +21617,7 @@
         </w:tc>
         <w:tc>
           <w:tcPr>
-            <w:tcW w:type="dxa" w:w="637"/>
+            <w:tcW w:type="dxa" w:w="604"/>
           </w:tcPr>
           <w:p>
             <w:pPr>
@@ -21159,7 +21639,7 @@
         </w:tc>
         <w:tc>
           <w:tcPr>
-            <w:tcW w:type="dxa" w:w="478"/>
+            <w:tcW w:type="dxa" w:w="453"/>
           </w:tcPr>
           <w:p>
             <w:pPr>
@@ -21181,7 +21661,7 @@
         </w:tc>
         <w:tc>
           <w:tcPr>
-            <w:tcW w:type="dxa" w:w="741"/>
+            <w:tcW w:type="dxa" w:w="625"/>
           </w:tcPr>
           <w:p>
             <w:pPr>
@@ -21192,18 +21672,18 @@
             </w:pPr>
             <w:r>
               <w:rPr>
-                <w:b w:val="0"/>
-                <w:i w:val="0"/>
-                <w:smallCaps w:val="0"/>
-                <w:sz w:val="16"/>
-              </w:rPr>
-              <w:t>1.8</w:t>
-            </w:r>
-          </w:p>
-        </w:tc>
-        <w:tc>
-          <w:tcPr>
-            <w:tcW w:type="dxa" w:w="660"/>
+                <w:b/>
+                <w:i w:val="0"/>
+                <w:smallCaps w:val="0"/>
+                <w:sz w:val="16"/>
+              </w:rPr>
+              <w:t>99.19</w:t>
+            </w:r>
+          </w:p>
+        </w:tc>
+        <w:tc>
+          <w:tcPr>
+            <w:tcW w:type="dxa" w:w="1228"/>
           </w:tcPr>
           <w:p>
             <w:pPr>
@@ -21219,13 +21699,13 @@
                 <w:smallCaps w:val="0"/>
                 <w:sz w:val="16"/>
               </w:rPr>
-              <w:t>99.19</w:t>
-            </w:r>
-          </w:p>
-        </w:tc>
-        <w:tc>
-          <w:tcPr>
-            <w:tcW w:type="dxa" w:w="660"/>
+              <w:t>0.944 / 0.980</w:t>
+            </w:r>
+          </w:p>
+        </w:tc>
+        <w:tc>
+          <w:tcPr>
+            <w:tcW w:type="dxa" w:w="625"/>
           </w:tcPr>
           <w:p>
             <w:pPr>
@@ -21247,7 +21727,7 @@
         </w:tc>
         <w:tc>
           <w:tcPr>
-            <w:tcW w:type="dxa" w:w="569"/>
+            <w:tcW w:type="dxa" w:w="539"/>
           </w:tcPr>
           <w:p>
             <w:pPr>
@@ -21269,7 +21749,7 @@
         </w:tc>
         <w:tc>
           <w:tcPr>
-            <w:tcW w:type="dxa" w:w="1930"/>
+            <w:tcW w:type="dxa" w:w="1830"/>
           </w:tcPr>
           <w:p>
             <w:pPr>
@@ -21291,7 +21771,7 @@
         </w:tc>
         <w:tc>
           <w:tcPr>
-            <w:tcW w:type="dxa" w:w="1113"/>
+            <w:tcW w:type="dxa" w:w="1055"/>
           </w:tcPr>
           <w:p>
             <w:pPr>
@@ -21518,7 +21998,7 @@
           <w:smallCaps w:val="0"/>
           <w:sz w:val="20"/>
         </w:rPr>
-        <w:t xml:space="preserve"> The largest impairment is amplitude–phase coupling. Coupling-aware control recovers 0.55 dB at 2 bits and about 1 dB at 3–4 bits; a coupled element cannot reflect strongly at every phase, so a gap remains. The estimation side gains more (LMMSE removes the coupling bias), and the largest system-level effects are the RIS sizes needed for coverage: 2.25× the ideal element count at 60 GHz, and a 32 cm panel at 140 GHz once D-band transceiver limits are included.</w:t>
+        <w:t xml:space="preserve"> The largest impairment is amplitude–phase coupling. Coupling-aware control recovers 0.55 dB at 2 bits and about 1 dB at 3–4 bits; a coupled element cannot reflect strongly at every phase, so a gap remains. The estimation side gains more (LMMSE removes the coupling bias), and the largest system-level effects are the RIS sizes needed for coverage: 2.25× the ideal element count at 60 GHz, and a 24–32 cm panel at 140 GHz once D-band transceiver limits are included, depending mainly on the receiver noise figure.</w:t>
       </w:r>
     </w:p>
     <w:p>
@@ -21572,7 +22052,7 @@
           <w:smallCaps w:val="0"/>
           <w:sz w:val="20"/>
         </w:rPr>
-        <w:t xml:space="preserve"> Saleh and coupling coefficients are literature values, not measurements of a 60 GHz PA or RIS; Table II bounds the effect of the coupling strength. The obliquity exponent is assumed. The physical-layer results are simulated; the beam-prediction results use power sweeps only except in Tables XI–XII; the UAV locator assumes a sky background and is checked by inspection, not against labelled positions, which Scenario 23 does not provide; the sensing-aided tracker assumes the UAV's GPS reaches the base station within one sweep interval; the UAV height channel's unit is not documented consistently. The all-class macro-F1 at t + 3 (0.929) is limited by beams seen only once; more flights, not a different model, are needed to estimate it reliably. The latency model uses standard 5G NR FR2 timing, not the testbed's own sweep timing. The Table VIII figures are open-loop (they assume full-sweep history); Table IX gives the closed-loop figures. Effective spectral efficiency is reported at nominal SNRs because the dataset's powers are unitless. The D-band transceiver values are representative published figures, not a specific design.</w:t>
+        <w:t xml:space="preserve"> Saleh and coupling coefficients are literature values, not measurements of a 60 GHz PA or RIS; Table II bounds the effect of the coupling strength. The obliquity exponent is assumed. The physical-layer results are simulated; the beam-prediction results use power sweeps only except in Tables XI–XII; the UAV locator assumes a sky background and is checked by inspection and against GPS direction, not against labelled positions, which Scenario 23 does not provide (about 1% of frames are misdetected); the sensing-aided tracker assumes the UAV's GPS reaches the base station within one sweep interval; the UAV height channel's unit is not documented consistently. The all-class macro-F1 at t + 3 (0.929) is limited by beams seen only once; more flights, not a different model, are needed to estimate it reliably. The latency model uses standard 5G NR FR2 timing, not the testbed's own sweep timing. The Table VIII figures are open-loop (they assume full-sweep history); Table IX gives the closed-loop figures. Effective spectral efficiency is reported at nominal SNRs because the dataset's powers are unitless. The D-band transceiver values are representative published figures, not a specific design.</w:t>
       </w:r>
     </w:p>
     <w:p>
@@ -21607,7 +22087,7 @@
           <w:smallCaps w:val="0"/>
           <w:sz w:val="20"/>
         </w:rPr>
-        <w:t>We built a hardware-aware model of an RIS-assisted mmWave UAV link and used it, with real 60 GHz measurements, to evaluate beam management end to end. Hardware impairments cost 7.8 dB and 2.25× RIS elements at 60 GHz, and D-band transceiver limits push the 140 GHz panel to 32 cm; a position-parametric estimator matches perfect channel knowledge with 64× fewer pilots; Kalman-based prediction preserves 99.3% of the array gain at 500 ms latency; and AI-assisted reduced beam training with a learned beam-tie graph selects the exact optimal beam 99.3% of the time given full-sweep history and 97.2–99.3% in a closed-loop replay of 33 flights, with 1.05–1.31 ms of beam training per decision instead of 5 ms; with candidates from the UAV's GPS and its position in the camera image it reaches 99.2% with 0.56 ms and no periodic sweeps. Deep sequence models trained on measured-only data did not improve on the tie graph at equal budget. All reported metrics are evaluated under sequence-level cross-validation. UAV position raises pooled blind accuracy at a 0.4 s horizon by 1–4 points, a gain that is not significant across flights for the best model, and frozen generic camera features lower it. Future work will validate the camera locator against labelled UAV positions, add flights to estimate rare-beam performance, and use measured hardware coefficients.</w:t>
+        <w:t>We built a hardware-aware model of an RIS-assisted mmWave UAV link and used it, with real 60 GHz measurements, to evaluate beam management end to end. Hardware impairments cost 7.8 dB and 2.25× RIS elements at 60 GHz, and D-band transceiver limits push the 140 GHz panel to 24–32 cm, depending on the receiver noise figure; a position-parametric estimator matches perfect channel knowledge with 64× fewer pilots; Kalman-based prediction preserves 99.3% of the array gain at 500 ms latency; and AI-assisted reduced beam training with a learned beam-tie graph selects the exact optimal beam 99.3% of the time given full-sweep history and 97.2–99.3% in a closed-loop replay of 33 flights, with 1.05–1.31 ms of beam training per decision instead of 5 ms; with candidates from the UAV's GPS and its position in the camera image it reaches 99.2% (macro-F1 0.98 over beams with at least five samples) with 0.56 ms and no periodic sweeps. Deep sequence models trained on measured-only data did not improve on the tie graph at equal budget. All reported metrics are evaluated under sequence-level cross-validation. UAV position raises pooled blind accuracy at a 0.4 s horizon by 1–4 points, a gain that is not significant across flights for the best model, and frozen generic camera features lower it. Future work will validate the camera locator against labelled UAV positions, add flights to estimate rare-beam performance, and use measured hardware coefficients.</w:t>
       </w:r>
     </w:p>
     <w:p>
@@ -22498,7 +22978,7 @@
         </w:rPr>
         <w:t>[20]</w:t>
         <w:tab/>
-        <w:t xml:space="preserve">A. S. H. Ahmed </w:t>
+        <w:t xml:space="preserve">A. S. H. Ahmed, M. Seo, A. A. Farid, M. Urteaga, J. F. Buckwalter, and M. J. W. Rodwell, "A 140GHz power amplifier with 20.5dBm output power and 20.8% PAE in 250-nm InP HBT technology," in </w:t>
       </w:r>
       <w:r>
         <w:rPr>
@@ -22507,7 +22987,7 @@
           <w:smallCaps w:val="0"/>
           <w:sz w:val="16"/>
         </w:rPr>
-        <w:t>et al.</w:t>
+        <w:t>Proc. IEEE/MTT-S Int. Microw. Symp. (IMS)</w:t>
       </w:r>
       <w:r>
         <w:rPr>
@@ -22516,35 +22996,7 @@
           <w:smallCaps w:val="0"/>
           <w:sz w:val="16"/>
         </w:rPr>
-        <w:t xml:space="preserve">, "A 140GHz power amplifier with 20.5dBm output power and 20.8% PAE in 250-nm InP HBT technology," in </w:t>
-      </w:r>
-      <w:r>
-        <w:rPr>
-          <w:b w:val="0"/>
-          <w:i/>
-          <w:smallCaps w:val="0"/>
-          <w:sz w:val="16"/>
-        </w:rPr>
-        <w:t>Proc. IEEE IMS</w:t>
-      </w:r>
-      <w:r>
-        <w:rPr>
-          <w:b w:val="0"/>
-          <w:i w:val="0"/>
-          <w:smallCaps w:val="0"/>
-          <w:sz w:val="16"/>
-        </w:rPr>
-        <w:t xml:space="preserve">, 2020. </w:t>
-      </w:r>
-      <w:r>
-        <w:rPr>
-          <w:b/>
-          <w:i w:val="0"/>
-          <w:smallCaps w:val="0"/>
-          <w:sz w:val="16"/>
-          <w:highlight w:val="yellow"/>
-        </w:rPr>
-        <w:t>[VERIFY author list]</w:t>
+        <w:t>, Los Angeles, CA, USA, 2020, pp. 492–495.</w:t>
       </w:r>
     </w:p>
     <w:p>
@@ -22567,16 +23019,25 @@
         </w:rPr>
         <w:t>[21]</w:t>
         <w:tab/>
+        <w:t xml:space="preserve">E. Turkmen, A. Burak, A. Guner, I. Kalyoncu, M. Kaynak, and Y. Gurbuz, "A SiGe HBT D-band LNA with Butterworth response and noise reduction technique," </w:t>
       </w:r>
       <w:r>
         <w:rPr>
-          <w:b/>
+          <w:b w:val="0"/>
+          <w:i/>
+          <w:smallCaps w:val="0"/>
+          <w:sz w:val="16"/>
+        </w:rPr>
+        <w:t>IEEE Microw. Wireless Compon. Lett.</w:t>
+      </w:r>
+      <w:r>
+        <w:rPr>
+          <w:b w:val="0"/>
           <w:i w:val="0"/>
           <w:smallCaps w:val="0"/>
           <w:sz w:val="16"/>
-          <w:highlight w:val="yellow"/>
         </w:rPr>
-        <w:t>[VERIFY: cite a D-band (≈140 GHz) SiGe LNA with ≈10 dB noise figure; a 0.13 µm SiGe 5-stage amplifier with NF down to 10 dB was found but its full citation needs checking.]</w:t>
+        <w:t>, vol. 28, no. 6, pp. 524–526, 2018, doi: 10.1109/LMWC.2018.2831450.</w:t>
       </w:r>
     </w:p>
     <w:p>
@@ -22599,17 +23060,7 @@
         </w:rPr>
         <w:t>[22]</w:t>
         <w:tab/>
-        <w:t xml:space="preserve">3GPP TS 38.213, "NR; Physical layer procedures for control," Sec. 4.1 (SS/PBCH block candidate positions, case D: up to 64 SS/PBCH blocks per 5 ms half-frame at 120 kHz SCS). </w:t>
-      </w:r>
-      <w:r>
-        <w:rPr>
-          <w:b/>
-          <w:i w:val="0"/>
-          <w:smallCaps w:val="0"/>
-          <w:sz w:val="16"/>
-          <w:highlight w:val="yellow"/>
-        </w:rPr>
-        <w:t>[VERIFY: release and version; we could not confirm the latest version online.]</w:t>
+        <w:t>3GPP TS 38.213, "NR; Physical layer procedures for control," version 17.9.0, Release 17 (ETSI TS 138 213 V17.9.0, 2024-04), clause 4.1 (candidate SS/PBCH blocks, case D: 64 blocks per 5 ms half-frame at 120 kHz SCS).</w:t>
       </w:r>
     </w:p>
     <w:p>

</xml_diff>

<commit_message>
Paper: sensitivity to assumed PA back-off, obliquity exponent and D-band power (Sec. VI-A)
Co-Authored-By: Claude Opus 5.5 <noreply@anthropic.com>
</commit_message>
<xml_diff>
--- a/paper/revised_paper_ieee.docx
+++ b/paper/revised_paper_ieee.docx
@@ -3599,6 +3599,33 @@
     </w:p>
     <w:p>
       <w:pPr>
+        <w:keepNext w:val="0"/>
+        <w:keepLines w:val="0"/>
+        <w:spacing w:before="0" w:after="0"/>
+        <w:ind w:firstLine="288"/>
+        <w:jc w:val="both"/>
+      </w:pPr>
+      <w:r>
+        <w:rPr>
+          <w:b/>
+          <w:i w:val="0"/>
+          <w:smallCaps w:val="0"/>
+          <w:sz w:val="20"/>
+        </w:rPr>
+        <w:t>Sensitivity to assumed values.</w:t>
+      </w:r>
+      <w:r>
+        <w:rPr>
+          <w:b w:val="0"/>
+          <w:i w:val="0"/>
+          <w:smallCaps w:val="0"/>
+          <w:sz w:val="20"/>
+        </w:rPr>
+        <w:t xml:space="preserve"> Three further inputs are literature values or assumptions rather than measurements, so we vary each. (i) The Saleh coefficients are Saleh's travelling-wave-tube fit; how much they matter depends on how hard the PA is driven. From 3 to 12 dB input back-off the PA alone costs 2.6 to 0.4 dB at 50 m, and all impairments with coupling-aware control 7.8 to 6.9 dB, so amplitude–phase coupling remains the dominant impairment at every operating point. (ii) For element obliquity exponents from 0 (isotropic) to 2, the 60 GHz RIS needs 64×64 elements for full coverage with ideal hardware and 96×96 (24 cm) with realistic hardware, the same 2.25× as with the default 1.5; only a strongly directive element (exponent 3) changes it, to 80×80 and 112×112 (1.96×). (iii) Around the assumed 14 dBm D-band average power, 11 and 17 dBm move the 140 GHz panel to 36 and 28 cm (NF 10 dB).</w:t>
+      </w:r>
+    </w:p>
+    <w:p>
+      <w:pPr>
         <w:sectPr>
           <w:type w:val="continuous"/>
           <w:pgSz w:w="12240" w:h="15840"/>

</xml_diff>

<commit_message>
Paper figures and docs: system overview (new Fig. 1), 140 GHz NF panel, ridge tracker; CHANGELOG
- Fig. 1: block diagram of the hardware-aware link and the sensing-aided beam loop
- Fig. 3 adds 140 GHz availability vs aperture for receiver NF 6/7/10 dB
- Fig. 4 adds the learned ridge predictor from Table VI
- All later figures renumbered (+1); captions updated
- README: update log moved to CHANGELOG.md; test count; requirements complete

Co-Authored-By: Claude Opus 5.5 <noreply@anthropic.com>
</commit_message>
<xml_diff>
--- a/paper/revised_paper_ieee.docx
+++ b/paper/revised_paper_ieee.docx
@@ -353,6 +353,142 @@
         </w:rPr>
         <w:t>II. System Model</w:t>
       </w:r>
+    </w:p>
+    <w:p>
+      <w:pPr>
+        <w:keepNext w:val="0"/>
+        <w:keepLines w:val="0"/>
+        <w:spacing w:before="0" w:after="0"/>
+        <w:ind w:firstLine="288"/>
+        <w:jc w:val="both"/>
+      </w:pPr>
+      <w:r>
+        <w:rPr>
+          <w:b w:val="0"/>
+          <w:i w:val="0"/>
+          <w:smallCaps w:val="0"/>
+          <w:sz w:val="20"/>
+        </w:rPr>
+        <w:t>Fig. 1 summarises the two parts of this work: a hardware-aware model of the RIS-assisted link (Secs. II–IV), evaluated in simulation, and beam management on real 60 GHz measurements (Secs. V–VI), where sensing proposes candidate beams that are then measured.</w:t>
+      </w:r>
+    </w:p>
+    <w:p>
+      <w:pPr>
+        <w:sectPr>
+          <w:type w:val="continuous"/>
+          <w:pgSz w:w="12240" w:h="15840"/>
+          <w:pgMar w:top="1080" w:right="900" w:bottom="1440" w:left="900" w:header="720" w:footer="720" w:gutter="0"/>
+          <w:cols w:space="360" w:num="2"/>
+          <w:docGrid w:linePitch="360"/>
+        </w:sectPr>
+      </w:pPr>
+    </w:p>
+    <w:tbl>
+      <w:tblPr>
+        <w:tblW w:type="auto" w:w="0"/>
+        <w:jc w:val="center"/>
+        <w:tblLook w:firstColumn="1" w:firstRow="1" w:lastColumn="0" w:lastRow="0" w:noHBand="0" w:noVBand="1" w:val="04A0"/>
+      </w:tblPr>
+      <w:tblGrid>
+        <w:gridCol w:w="10440"/>
+      </w:tblGrid>
+      <w:tr>
+        <w:trPr>
+          <w:cantSplit/>
+        </w:trPr>
+        <w:tc>
+          <w:tcPr>
+            <w:tcW w:type="dxa" w:w="10440"/>
+          </w:tcPr>
+          <w:p>
+            <w:pPr>
+              <w:keepNext w:val="0"/>
+              <w:keepLines w:val="0"/>
+              <w:spacing w:before="80" w:after="0"/>
+              <w:jc w:val="center"/>
+            </w:pPr>
+            <w:r>
+              <w:drawing>
+                <wp:inline xmlns:a="http://schemas.openxmlformats.org/drawingml/2006/main" xmlns:pic="http://schemas.openxmlformats.org/drawingml/2006/picture">
+                  <wp:extent cx="5943600" cy="2568396"/>
+                  <wp:docPr id="1" name="Picture 1"/>
+                  <wp:cNvGraphicFramePr>
+                    <a:graphicFrameLocks noChangeAspect="1"/>
+                  </wp:cNvGraphicFramePr>
+                  <a:graphic>
+                    <a:graphicData uri="http://schemas.openxmlformats.org/drawingml/2006/picture">
+                      <pic:pic>
+                        <pic:nvPicPr>
+                          <pic:cNvPr id="0" name="fig_system.png"/>
+                          <pic:cNvPicPr/>
+                        </pic:nvPicPr>
+                        <pic:blipFill>
+                          <a:blip r:embed="rId9"/>
+                          <a:stretch>
+                            <a:fillRect/>
+                          </a:stretch>
+                        </pic:blipFill>
+                        <pic:spPr>
+                          <a:xfrm>
+                            <a:off x="0" y="0"/>
+                            <a:ext cx="5943600" cy="2568396"/>
+                          </a:xfrm>
+                          <a:prstGeom prst="rect"/>
+                        </pic:spPr>
+                      </pic:pic>
+                    </a:graphicData>
+                  </a:graphic>
+                </wp:inline>
+              </w:drawing>
+            </w:r>
+          </w:p>
+          <w:p>
+            <w:pPr>
+              <w:keepNext w:val="0"/>
+              <w:keepLines w:val="0"/>
+              <w:spacing w:before="0" w:after="120"/>
+              <w:jc w:val="center"/>
+            </w:pPr>
+            <w:r>
+              <w:rPr>
+                <w:b w:val="0"/>
+                <w:i w:val="0"/>
+                <w:smallCaps w:val="0"/>
+                <w:sz w:val="16"/>
+              </w:rPr>
+              <w:t xml:space="preserve">Fig. 1. </w:t>
+            </w:r>
+            <w:r>
+              <w:rPr>
+                <w:b w:val="0"/>
+                <w:i w:val="0"/>
+                <w:smallCaps w:val="0"/>
+                <w:sz w:val="16"/>
+              </w:rPr>
+              <w:t>System overview. Top: the simulated hardware-aware link, from the BS power amplifier through the impaired RIS to the UAV, and channel estimation. Bottom: the sensing-aided beam-management loop evaluated on DeepSense Scenario 23; the camera and GPS of the previous step propose candidates, the base station measures them with SSB beams, keeps the strongest, and sweeps all 64 beams only on beam loss.</w:t>
+            </w:r>
+          </w:p>
+        </w:tc>
+      </w:tr>
+    </w:tbl>
+    <w:p>
+      <w:pPr>
+        <w:keepNext w:val="0"/>
+        <w:keepLines w:val="0"/>
+        <w:spacing w:before="0" w:after="40"/>
+        <w:jc w:val="both"/>
+      </w:pPr>
+    </w:p>
+    <w:p>
+      <w:pPr>
+        <w:sectPr>
+          <w:type w:val="continuous"/>
+          <w:pgSz w:w="12240" w:h="15840"/>
+          <w:pgMar w:top="1080" w:right="900" w:bottom="1440" w:left="900" w:header="720" w:footer="720" w:gutter="0"/>
+          <w:cols w:space="360" w:num="1"/>
+          <w:docGrid w:linePitch="360"/>
+        </w:sectPr>
+      </w:pPr>
     </w:p>
     <w:p>
       <w:pPr>
@@ -2352,7 +2488,7 @@
           <w:smallCaps w:val="0"/>
           <w:sz w:val="20"/>
         </w:rPr>
-        <w:t xml:space="preserve"> (Fig. 1): amplitude–phase coupling 5.51 dB, PA nonlinearity 1.46 dB, S11 mismatch 0.92 dB, 2-bit quantization 0.91 dB and phase noise 0.03 dB.</w:t>
+        <w:t xml:space="preserve"> (Fig. 2): amplitude–phase coupling 5.51 dB, PA nonlinearity 1.46 dB, S11 mismatch 0.92 dB, 2-bit quantization 0.91 dB and phase noise 0.03 dB.</w:t>
       </w:r>
     </w:p>
     <w:tbl>
@@ -2383,7 +2519,7 @@
               <w:drawing>
                 <wp:inline xmlns:a="http://schemas.openxmlformats.org/drawingml/2006/main" xmlns:pic="http://schemas.openxmlformats.org/drawingml/2006/picture">
                   <wp:extent cx="3108960" cy="1391545"/>
-                  <wp:docPr id="1" name="Picture 1"/>
+                  <wp:docPr id="2" name="Picture 2"/>
                   <wp:cNvGraphicFramePr>
                     <a:graphicFrameLocks noChangeAspect="1"/>
                   </wp:cNvGraphicFramePr>
@@ -2395,7 +2531,7 @@
                           <pic:cNvPicPr/>
                         </pic:nvPicPr>
                         <pic:blipFill>
-                          <a:blip r:embed="rId9"/>
+                          <a:blip r:embed="rId10"/>
                           <a:stretch>
                             <a:fillRect/>
                           </a:stretch>
@@ -2428,7 +2564,7 @@
                 <w:smallCaps w:val="0"/>
                 <w:sz w:val="16"/>
               </w:rPr>
-              <w:t xml:space="preserve">Fig. 1. </w:t>
+              <w:t xml:space="preserve">Fig. 2. </w:t>
             </w:r>
             <w:r>
               <w:rPr>
@@ -3471,8 +3607,19 @@
           <w:smallCaps w:val="0"/>
           <w:sz w:val="20"/>
         </w:rPr>
-        <w:t>Impairments change how large the RIS must be (Fig. 2). Over a 20 → 320 m flight, a 64×64 RIS gives 100% availability (SNDR ≥ 0 dB) with ideal hardware but only 57% with realistic hardware; a 96×96 RIS (24 cm) restores 100%. The hardware cost is therefore about 2.25× in element count.</w:t>
+        <w:t>Impairments change how large the RIS must be (Fig. 3). Over a 20 → 320 m flight, a 64×64 RIS gives 100% availability (SNDR ≥ 0 dB) with ideal hardware but only 57% with realistic hardware; a 96×96 RIS (24 cm) restores 100%. The hardware cost is therefore about 2.25× in element count.</w:t>
       </w:r>
+    </w:p>
+    <w:p>
+      <w:pPr>
+        <w:sectPr>
+          <w:type w:val="continuous"/>
+          <w:pgSz w:w="12240" w:h="15840"/>
+          <w:pgMar w:top="1080" w:right="900" w:bottom="1440" w:left="900" w:header="720" w:footer="720" w:gutter="0"/>
+          <w:cols w:space="360" w:num="2"/>
+          <w:docGrid w:linePitch="360"/>
+        </w:sectPr>
+      </w:pPr>
     </w:p>
     <w:tbl>
       <w:tblPr>
@@ -3501,8 +3648,8 @@
             <w:r>
               <w:drawing>
                 <wp:inline xmlns:a="http://schemas.openxmlformats.org/drawingml/2006/main" xmlns:pic="http://schemas.openxmlformats.org/drawingml/2006/picture">
-                  <wp:extent cx="3108960" cy="2011179"/>
-                  <wp:docPr id="2" name="Picture 2"/>
+                  <wp:extent cx="5943600" cy="1938502"/>
+                  <wp:docPr id="3" name="Picture 3"/>
                   <wp:cNvGraphicFramePr>
                     <a:graphicFrameLocks noChangeAspect="1"/>
                   </wp:cNvGraphicFramePr>
@@ -3514,7 +3661,7 @@
                           <pic:cNvPicPr/>
                         </pic:nvPicPr>
                         <pic:blipFill>
-                          <a:blip r:embed="rId10"/>
+                          <a:blip r:embed="rId11"/>
                           <a:stretch>
                             <a:fillRect/>
                           </a:stretch>
@@ -3522,7 +3669,7 @@
                         <pic:spPr>
                           <a:xfrm>
                             <a:off x="0" y="0"/>
-                            <a:ext cx="3108960" cy="2011179"/>
+                            <a:ext cx="5943600" cy="1938502"/>
                           </a:xfrm>
                           <a:prstGeom prst="rect"/>
                         </pic:spPr>
@@ -3547,16 +3694,16 @@
                 <w:smallCaps w:val="0"/>
                 <w:sz w:val="16"/>
               </w:rPr>
-              <w:t xml:space="preserve">Fig. 2. </w:t>
-            </w:r>
-            <w:r>
-              <w:rPr>
-                <w:b w:val="0"/>
-                <w:i w:val="0"/>
-                <w:smallCaps w:val="0"/>
-                <w:sz w:val="16"/>
-              </w:rPr>
-              <w:t>Link availability over the flight versus RIS size.</w:t>
+              <w:t xml:space="preserve">Fig. 3. </w:t>
+            </w:r>
+            <w:r>
+              <w:rPr>
+                <w:b w:val="0"/>
+                <w:i w:val="0"/>
+                <w:smallCaps w:val="0"/>
+                <w:sz w:val="16"/>
+              </w:rPr>
+              <w:t>Link availability over the flight versus RIS size. Left: 60 GHz, ideal versus realistic hardware with coupling-aware control. Right: 140 GHz with D-band transceiver hardware, realistic RIS, for receiver noise figures of 6, 7 and 10 dB (dashed: ideal hardware).</w:t>
             </w:r>
           </w:p>
         </w:tc>
@@ -3568,6 +3715,17 @@
         <w:keepLines w:val="0"/>
         <w:spacing w:before="0" w:after="40"/>
         <w:jc w:val="both"/>
+      </w:pPr>
+    </w:p>
+    <w:p>
+      <w:pPr>
+        <w:sectPr>
+          <w:type w:val="continuous"/>
+          <w:pgSz w:w="12240" w:h="15840"/>
+          <w:pgMar w:top="1080" w:right="900" w:bottom="1440" w:left="900" w:header="720" w:footer="720" w:gutter="0"/>
+          <w:cols w:space="360" w:num="1"/>
+          <w:docGrid w:linePitch="360"/>
+        </w:sectPr>
       </w:pPr>
     </w:p>
     <w:p>
@@ -5695,7 +5853,7 @@
           <w:smallCaps w:val="0"/>
           <w:sz w:val="20"/>
         </w:rPr>
-        <w:t>Every predictor shows a mean absolute phase error of 89–92°, the value an unaligned phase profile would give, yet the delivered gain (6) ranges from 63% to 100% (Table VI, Fig. 3). The phase-error metric therefore cannot rank controllers. Prediction matters at realistic latencies: at 500 ms the Kalman filter delivers 99.3% of the ideal gain (5th percentile 97.4%), the learned ridge predictor 98.8%, constant velocity 71.4% and persistence 63.0%. All predictors run in under 0.1 ms per step.</w:t>
+        <w:t>Every predictor shows a mean absolute phase error of 89–92°, the value an unaligned phase profile would give, yet the delivered gain (6) ranges from 63% to 100% (Table VI, Fig. 4). The phase-error metric therefore cannot rank controllers. Prediction matters at realistic latencies: at 500 ms the Kalman filter delivers 99.3% of the ideal gain (5th percentile 97.4%), the learned ridge predictor 98.8%, constant velocity 71.4% and persistence 63.0%. All predictors run in under 0.1 ms per step.</w:t>
       </w:r>
     </w:p>
     <w:p>
@@ -6266,7 +6424,7 @@
               <w:drawing>
                 <wp:inline xmlns:a="http://schemas.openxmlformats.org/drawingml/2006/main" xmlns:pic="http://schemas.openxmlformats.org/drawingml/2006/picture">
                   <wp:extent cx="3108960" cy="2080800"/>
-                  <wp:docPr id="3" name="Picture 3"/>
+                  <wp:docPr id="4" name="Picture 4"/>
                   <wp:cNvGraphicFramePr>
                     <a:graphicFrameLocks noChangeAspect="1"/>
                   </wp:cNvGraphicFramePr>
@@ -6278,7 +6436,7 @@
                           <pic:cNvPicPr/>
                         </pic:nvPicPr>
                         <pic:blipFill>
-                          <a:blip r:embed="rId11"/>
+                          <a:blip r:embed="rId12"/>
                           <a:stretch>
                             <a:fillRect/>
                           </a:stretch>
@@ -6311,16 +6469,16 @@
                 <w:smallCaps w:val="0"/>
                 <w:sz w:val="16"/>
               </w:rPr>
-              <w:t xml:space="preserve">Fig. 3. </w:t>
-            </w:r>
-            <w:r>
-              <w:rPr>
-                <w:b w:val="0"/>
-                <w:i w:val="0"/>
-                <w:smallCaps w:val="0"/>
-                <w:sz w:val="16"/>
-              </w:rPr>
-              <w:t>Delivered array gain versus prediction horizon.</w:t>
+              <w:t xml:space="preserve">Fig. 4. </w:t>
+            </w:r>
+            <w:r>
+              <w:rPr>
+                <w:b w:val="0"/>
+                <w:i w:val="0"/>
+                <w:smallCaps w:val="0"/>
+                <w:sz w:val="16"/>
+              </w:rPr>
+              <w:t>Delivered array gain versus prediction horizon (held-out trajectories); the Kalman and the learned ridge predictors overlap above 98.8%.</w:t>
             </w:r>
           </w:p>
         </w:tc>
@@ -8326,7 +8484,7 @@
           <w:smallCaps w:val="0"/>
           <w:sz w:val="20"/>
         </w:rPr>
-        <w:t xml:space="preserve"> (Table VIII, Fig. 4). Measuring a handful of predicted beams resolves the near-ties that blind prediction cannot. At t + 1, the GRU ensemble with the tie graph selects the exact optimal beam 99.3% of the time with macro-F1 0.961 over all 56 classes, measuring 7 of 64 beams in 0.55 ms; the 95% interval of exact top-1 lies above 95%. At t + 3, the same scheme reaches 99.1% exact top-1 and macro-F1 0.974 over beams with at least five samples, with 11.7 beams. The single-burst variant reaches 98.9% / 0.971 in 1.22 ms. Every scheme in Table VIII also keeps at least 99.5% of decisions within the 0.25 dB noise floor and at least 99.8% of the best beam's power.</w:t>
+        <w:t xml:space="preserve"> (Table VIII, Fig. 5). Measuring a handful of predicted beams resolves the near-ties that blind prediction cannot. At t + 1, the GRU ensemble with the tie graph selects the exact optimal beam 99.3% of the time with macro-F1 0.961 over all 56 classes, measuring 7 of 64 beams in 0.55 ms; the 95% interval of exact top-1 lies above 95%. At t + 3, the same scheme reaches 99.1% exact top-1 and macro-F1 0.974 over beams with at least five samples, with 11.7 beams. The single-burst variant reaches 98.9% / 0.971 in 1.22 ms. Every scheme in Table VIII also keeps at least 99.5% of decisions within the 0.25 dB noise floor and at least 99.8% of the best beam's power.</w:t>
       </w:r>
     </w:p>
     <w:p>
@@ -10068,7 +10226,7 @@
               <w:drawing>
                 <wp:inline xmlns:a="http://schemas.openxmlformats.org/drawingml/2006/main" xmlns:pic="http://schemas.openxmlformats.org/drawingml/2006/picture">
                   <wp:extent cx="5943600" cy="3725413"/>
-                  <wp:docPr id="4" name="Picture 4"/>
+                  <wp:docPr id="5" name="Picture 5"/>
                   <wp:cNvGraphicFramePr>
                     <a:graphicFrameLocks noChangeAspect="1"/>
                   </wp:cNvGraphicFramePr>
@@ -10080,7 +10238,7 @@
                           <pic:cNvPicPr/>
                         </pic:nvPicPr>
                         <pic:blipFill>
-                          <a:blip r:embed="rId12"/>
+                          <a:blip r:embed="rId13"/>
                           <a:stretch>
                             <a:fillRect/>
                           </a:stretch>
@@ -10113,7 +10271,7 @@
                 <w:smallCaps w:val="0"/>
                 <w:sz w:val="16"/>
               </w:rPr>
-              <w:t xml:space="preserve">Fig. 4. </w:t>
+              <w:t xml:space="preserve">Fig. 5. </w:t>
             </w:r>
             <w:r>
               <w:rPr>
@@ -10189,7 +10347,7 @@
           <w:smallCaps w:val="0"/>
           <w:sz w:val="20"/>
         </w:rPr>
-        <w:t xml:space="preserve"> (Fig. 5). Calibrated for 95% exact top-1, the rank-based set reaches 96.1% with 3 beams at t + 1 (worst held-out fold 95.3%) and 95.5% with 5.4 beams at t + 3 (worst fold 92.7%); for a 99% target, 99.2% with 6.2 beams and 99.0% with 17.4 beams. Coverage tracks the target on average, but a single flight group can fall short by up to 2.3 points, which is the cost of non-exchangeable flights. Adaptive sets over-cover (98.8% for a 95% target at t + 1) with a 95th-percentile size of 41–56 beams, which is worse for worst-case latency.</w:t>
+        <w:t xml:space="preserve"> (Fig. 6). Calibrated for 95% exact top-1, the rank-based set reaches 96.1% with 3 beams at t + 1 (worst held-out fold 95.3%) and 95.5% with 5.4 beams at t + 3 (worst fold 92.7%); for a 99% target, 99.2% with 6.2 beams and 99.0% with 17.4 beams. Coverage tracks the target on average, but a single flight group can fall short by up to 2.3 points, which is the cost of non-exchangeable flights. Adaptive sets over-cover (98.8% for a 95% target at t + 1) with a 95th-percentile size of 41–56 beams, which is worse for worst-case latency.</w:t>
       </w:r>
     </w:p>
     <w:p>
@@ -10231,7 +10389,7 @@
               <w:drawing>
                 <wp:inline xmlns:a="http://schemas.openxmlformats.org/drawingml/2006/main" xmlns:pic="http://schemas.openxmlformats.org/drawingml/2006/picture">
                   <wp:extent cx="5943600" cy="1938502"/>
-                  <wp:docPr id="5" name="Picture 5"/>
+                  <wp:docPr id="6" name="Picture 6"/>
                   <wp:cNvGraphicFramePr>
                     <a:graphicFrameLocks noChangeAspect="1"/>
                   </wp:cNvGraphicFramePr>
@@ -10243,7 +10401,7 @@
                           <pic:cNvPicPr/>
                         </pic:nvPicPr>
                         <pic:blipFill>
-                          <a:blip r:embed="rId13"/>
+                          <a:blip r:embed="rId14"/>
                           <a:stretch>
                             <a:fillRect/>
                           </a:stretch>
@@ -10276,7 +10434,7 @@
                 <w:smallCaps w:val="0"/>
                 <w:sz w:val="16"/>
               </w:rPr>
-              <w:t xml:space="preserve">Fig. 5. </w:t>
+              <w:t xml:space="preserve">Fig. 6. </w:t>
             </w:r>
             <w:r>
               <w:rPr>
@@ -11268,7 +11426,7 @@
           <w:smallCaps w:val="0"/>
           <w:sz w:val="20"/>
         </w:rPr>
-        <w:t xml:space="preserve"> (Table X, Fig. 6). At equal budget, every learned model is below the tie graph. With two extra beams, the tracker with six tie partners reaches 99.16% exact top-1 at 1.18 ms, while the ten models reach 98.17–98.71%; with four extra beams, 99.28% against 98.59–98.83%. The models differ from each other by at most 0.6 points, so architecture and the training settings we varied matter little. The configuration selected on validation flights (the Transformer, 91.9% validation top-4) is not better on test than the others. The extra beams of every model still help over the four-partner tracker (97.15%), so the models learn useful structure, but the tie graph already captures it. For latency, the MLP is fastest (0.11 ms fp32); dynamic int8 quantization made every model slower on this CPU and is not supported for the Transformer encoder in our PyTorch version. Inference runs between steps, off the beam-training critical path.</w:t>
+        <w:t xml:space="preserve"> (Table X, Fig. 7). At equal budget, every learned model is below the tie graph. With two extra beams, the tracker with six tie partners reaches 99.16% exact top-1 at 1.18 ms, while the ten models reach 98.17–98.71%; with four extra beams, 99.28% against 98.59–98.83%. The models differ from each other by at most 0.6 points, so architecture and the training settings we varied matter little. The configuration selected on validation flights (the Transformer, 91.9% validation top-4) is not better on test than the others. The extra beams of every model still help over the four-partner tracker (97.15%), so the models learn useful structure, but the tie graph already captures it. For latency, the MLP is fastest (0.11 ms fp32); dynamic int8 quantization made every model slower on this CPU and is not supported for the Transformer encoder in our PyTorch version. Inference runs between steps, off the beam-training critical path.</w:t>
       </w:r>
     </w:p>
     <w:p>
@@ -13060,7 +13218,7 @@
               <w:drawing>
                 <wp:inline xmlns:a="http://schemas.openxmlformats.org/drawingml/2006/main" xmlns:pic="http://schemas.openxmlformats.org/drawingml/2006/picture">
                   <wp:extent cx="5943600" cy="2118228"/>
-                  <wp:docPr id="6" name="Picture 6"/>
+                  <wp:docPr id="7" name="Picture 7"/>
                   <wp:cNvGraphicFramePr>
                     <a:graphicFrameLocks noChangeAspect="1"/>
                   </wp:cNvGraphicFramePr>
@@ -13072,7 +13230,7 @@
                           <pic:cNvPicPr/>
                         </pic:nvPicPr>
                         <pic:blipFill>
-                          <a:blip r:embed="rId14"/>
+                          <a:blip r:embed="rId15"/>
                           <a:stretch>
                             <a:fillRect/>
                           </a:stretch>
@@ -13105,7 +13263,7 @@
                 <w:smallCaps w:val="0"/>
                 <w:sz w:val="16"/>
               </w:rPr>
-              <w:t xml:space="preserve">Fig. 6. </w:t>
+              <w:t xml:space="preserve">Fig. 7. </w:t>
             </w:r>
             <w:r>
               <w:rPr>
@@ -13163,7 +13321,7 @@
           <w:smallCaps w:val="0"/>
           <w:sz w:val="20"/>
         </w:rPr>
-        <w:t xml:space="preserve"> (Tables XI–XII, Fig. 7). The full Scenario 23 release adds, for every sample, the UAV's GPS position, speed, velocity components, height, pitch and roll. We convert the GPS fix to east/north offsets from the base station and its bearing, append these and the raw kinematic channels to every step of each model's input window, and repeat the blind-prediction study with the same folds. All other tables use power sweeps only, so that they can be reproduced from the beam CSV shipped with the repository. The height channel ranges from 31 to 391 while the UAV–BS distance is at most 120 m, so its unit or reference is not documented consistently; the models standardise it, but we do not interpret it physically.</w:t>
+        <w:t xml:space="preserve"> (Tables XI–XII, Fig. 8). The full Scenario 23 release adds, for every sample, the UAV's GPS position, speed, velocity components, height, pitch and roll. We convert the GPS fix to east/north offsets from the base station and its bearing, append these and the raw kinematic channels to every step of each model's input window, and repeat the blind-prediction study with the same folds. All other tables use power sweeps only, so that they can be reproduced from the beam CSV shipped with the repository. The height channel ranges from 31 to 391 while the UAV–BS distance is at most 120 m, so its unit or reference is not documented consistently; the models standardise it, but we do not interpret it physically.</w:t>
       </w:r>
     </w:p>
     <w:p>
@@ -16379,7 +16537,7 @@
               <w:drawing>
                 <wp:inline xmlns:a="http://schemas.openxmlformats.org/drawingml/2006/main" xmlns:pic="http://schemas.openxmlformats.org/drawingml/2006/picture">
                   <wp:extent cx="5943600" cy="1935655"/>
-                  <wp:docPr id="7" name="Picture 7"/>
+                  <wp:docPr id="8" name="Picture 8"/>
                   <wp:cNvGraphicFramePr>
                     <a:graphicFrameLocks noChangeAspect="1"/>
                   </wp:cNvGraphicFramePr>
@@ -16391,7 +16549,7 @@
                           <pic:cNvPicPr/>
                         </pic:nvPicPr>
                         <pic:blipFill>
-                          <a:blip r:embed="rId15"/>
+                          <a:blip r:embed="rId16"/>
                           <a:stretch>
                             <a:fillRect/>
                           </a:stretch>
@@ -16424,7 +16582,7 @@
                 <w:smallCaps w:val="0"/>
                 <w:sz w:val="16"/>
               </w:rPr>
-              <w:t xml:space="preserve">Fig. 7. </w:t>
+              <w:t xml:space="preserve">Fig. 8. </w:t>
             </w:r>
             <w:r>
               <w:rPr>
@@ -16509,7 +16667,7 @@
           <w:smallCaps w:val="0"/>
           <w:sz w:val="20"/>
         </w:rPr>
-        <w:t xml:space="preserve"> (Table XIII, Fig. 8). Across the 33 replayed flights, the tie-graph tracker (four partners, full sweep every 8 steps) loses 2.8 points of exact top-1 against a full sweep every step on 27 flights and ties on 6, yet gains 2.6 points of effective spectral efficiency at 10 dB on 32 of 33 flights, because it spends 1.05 instead of 5 ms on training. Six partners improve exact top-1 by 2.0 points over four on 26 flights and lose on none; eight add nothing significant over six. Periodic sweeps every 4 instead of 8 steps buy 0.65 points of accuracy for 0.33 points of efficiency. Loss-triggered sweeps with six partners improve the median flight (22 better, 4 worse) but lose heavily on a few, so the pooled difference is negative with a CI that includes zero; this policy is not uniformly better.</w:t>
+        <w:t xml:space="preserve"> (Table XIII, Fig. 9). Across the 33 replayed flights, the tie-graph tracker (four partners, full sweep every 8 steps) loses 2.8 points of exact top-1 against a full sweep every step on 27 flights and ties on 6, yet gains 2.6 points of effective spectral efficiency at 10 dB on 32 of 33 flights, because it spends 1.05 instead of 5 ms on training. Six partners improve exact top-1 by 2.0 points over four on 26 flights and lose on none; eight add nothing significant over six. Periodic sweeps every 4 instead of 8 steps buy 0.65 points of accuracy for 0.33 points of efficiency. Loss-triggered sweeps with six partners improve the median flight (22 better, 4 worse) but lose heavily on a few, so the pooled difference is negative with a CI that includes zero; this policy is not uniformly better.</w:t>
       </w:r>
     </w:p>
     <w:p>
@@ -19364,7 +19522,7 @@
               <w:drawing>
                 <wp:inline xmlns:a="http://schemas.openxmlformats.org/drawingml/2006/main" xmlns:pic="http://schemas.openxmlformats.org/drawingml/2006/picture">
                   <wp:extent cx="5943600" cy="2223873"/>
-                  <wp:docPr id="8" name="Picture 8"/>
+                  <wp:docPr id="9" name="Picture 9"/>
                   <wp:cNvGraphicFramePr>
                     <a:graphicFrameLocks noChangeAspect="1"/>
                   </wp:cNvGraphicFramePr>
@@ -19376,7 +19534,7 @@
                           <pic:cNvPicPr/>
                         </pic:nvPicPr>
                         <pic:blipFill>
-                          <a:blip r:embed="rId16"/>
+                          <a:blip r:embed="rId17"/>
                           <a:stretch>
                             <a:fillRect/>
                           </a:stretch>
@@ -19409,7 +19567,7 @@
                 <w:smallCaps w:val="0"/>
                 <w:sz w:val="16"/>
               </w:rPr>
-              <w:t xml:space="preserve">Fig. 8. </w:t>
+              <w:t xml:space="preserve">Fig. 9. </w:t>
             </w:r>
             <w:r>
               <w:rPr>
@@ -19467,7 +19625,7 @@
           <w:smallCaps w:val="0"/>
           <w:sz w:val="20"/>
         </w:rPr>
-        <w:t xml:space="preserve"> (Table XIV, Fig. 9). Side information that does not help blind prediction can still help the tracker, because there it only has to propose candidates that are then measured. In the closed-loop replay of Table IX we add, at every step, the top k beams of a random forest that maps the previous step's sensing (UAV pixel, GPS, or both) to the current best beam. Using the previous frame keeps the predictor causal and leaves one sweep interval for image processing. The predictor and the tie graph are fitted on the other folds' flights. The extra candidates replace the periodic full sweeps: a full sweep now follows only a beam loss.</w:t>
+        <w:t xml:space="preserve"> (Table XIV, Fig. 10). Side information that does not help blind prediction can still help the tracker, because there it only has to propose candidates that are then measured. In the closed-loop replay of Table IX we add, at every step, the top k beams of a random forest that maps the previous step's sensing (UAV pixel, GPS, or both) to the current best beam. Using the previous frame keeps the predictor causal and leaves one sweep interval for image processing. The predictor and the tie graph are fitted on the other folds' flights. The extra candidates replace the periodic full sweeps: a full sweep now follows only a beam loss.</w:t>
       </w:r>
     </w:p>
     <w:p>
@@ -21878,7 +22036,7 @@
               <w:drawing>
                 <wp:inline xmlns:a="http://schemas.openxmlformats.org/drawingml/2006/main" xmlns:pic="http://schemas.openxmlformats.org/drawingml/2006/picture">
                   <wp:extent cx="5943600" cy="2226003"/>
-                  <wp:docPr id="9" name="Picture 9"/>
+                  <wp:docPr id="10" name="Picture 10"/>
                   <wp:cNvGraphicFramePr>
                     <a:graphicFrameLocks noChangeAspect="1"/>
                   </wp:cNvGraphicFramePr>
@@ -21890,7 +22048,7 @@
                           <pic:cNvPicPr/>
                         </pic:nvPicPr>
                         <pic:blipFill>
-                          <a:blip r:embed="rId17"/>
+                          <a:blip r:embed="rId18"/>
                           <a:stretch>
                             <a:fillRect/>
                           </a:stretch>
@@ -21923,7 +22081,7 @@
                 <w:smallCaps w:val="0"/>
                 <w:sz w:val="16"/>
               </w:rPr>
-              <w:t xml:space="preserve">Fig. 9. </w:t>
+              <w:t xml:space="preserve">Fig. 10. </w:t>
             </w:r>
             <w:r>
               <w:rPr>

</xml_diff>

<commit_message>
Table VII: show the measurement-noise bound and exact top-1 as % of it
Co-Authored-By: Claude Opus 5.5 <noreply@anthropic.com>
</commit_message>
<xml_diff>
--- a/paper/revised_paper_ieee.docx
+++ b/paper/revised_paper_ieee.docx
@@ -6578,7 +6578,7 @@
           <w:smallCaps/>
           <w:sz w:val="16"/>
         </w:rPr>
-        <w:t>Blind beam prediction, GroupKFold over 35 sequences</w:t>
+        <w:t>Blind beam prediction (no beam measured at the predicted time), GroupKFold over 35 sequences. Exact top-1 and macro-F1 are bounded by measurement noise: the last row is a non-causal oracle that sees the sweeps on both sides of the predicted one. In parentheses: exact top-1 as % of that bound. The deployed task, which measures a few beams, is in Tables VIII–X and XIV (best schemes: exact top-1 about 99%)</w:t>
       </w:r>
     </w:p>
     <w:tbl>
@@ -6597,14 +6597,14 @@
         </w:tblCellMar>
       </w:tblPr>
       <w:tblGrid>
-        <w:gridCol w:w="786"/>
-        <w:gridCol w:w="2048"/>
-        <w:gridCol w:w="1272"/>
-        <w:gridCol w:w="2145"/>
-        <w:gridCol w:w="592"/>
-        <w:gridCol w:w="1175"/>
-        <w:gridCol w:w="1175"/>
-        <w:gridCol w:w="883"/>
+        <w:gridCol w:w="831"/>
+        <w:gridCol w:w="4304"/>
+        <w:gridCol w:w="728"/>
+        <w:gridCol w:w="933"/>
+        <w:gridCol w:w="626"/>
+        <w:gridCol w:w="626"/>
+        <w:gridCol w:w="1094"/>
+        <w:gridCol w:w="933"/>
       </w:tblGrid>
       <w:tr>
         <w:trPr>
@@ -6612,7 +6612,7 @@
         </w:trPr>
         <w:tc>
           <w:tcPr>
-            <w:tcW w:type="dxa" w:w="787"/>
+            <w:tcW w:type="dxa" w:w="831"/>
             <w:tcBorders>
               <w:bottom w:val="single" w:sz="4" w:color="000000"/>
             </w:tcBorders>
@@ -6637,7 +6637,7 @@
         </w:tc>
         <w:tc>
           <w:tcPr>
-            <w:tcW w:type="dxa" w:w="2049"/>
+            <w:tcW w:type="dxa" w:w="4305"/>
             <w:tcBorders>
               <w:bottom w:val="single" w:sz="4" w:color="000000"/>
             </w:tcBorders>
@@ -6662,7 +6662,7 @@
         </w:tc>
         <w:tc>
           <w:tcPr>
-            <w:tcW w:type="dxa" w:w="1272"/>
+            <w:tcW w:type="dxa" w:w="729"/>
             <w:tcBorders>
               <w:bottom w:val="single" w:sz="4" w:color="000000"/>
             </w:tcBorders>
@@ -6687,7 +6687,7 @@
         </w:tc>
         <w:tc>
           <w:tcPr>
-            <w:tcW w:type="dxa" w:w="2146"/>
+            <w:tcW w:type="dxa" w:w="934"/>
             <w:tcBorders>
               <w:bottom w:val="single" w:sz="4" w:color="000000"/>
             </w:tcBorders>
@@ -6712,7 +6712,7 @@
         </w:tc>
         <w:tc>
           <w:tcPr>
-            <w:tcW w:type="dxa" w:w="593"/>
+            <w:tcW w:type="dxa" w:w="626"/>
             <w:tcBorders>
               <w:bottom w:val="single" w:sz="4" w:color="000000"/>
             </w:tcBorders>
@@ -6737,7 +6737,7 @@
         </w:tc>
         <w:tc>
           <w:tcPr>
-            <w:tcW w:type="dxa" w:w="1175"/>
+            <w:tcW w:type="dxa" w:w="626"/>
             <w:tcBorders>
               <w:bottom w:val="single" w:sz="4" w:color="000000"/>
             </w:tcBorders>
@@ -6762,7 +6762,7 @@
         </w:tc>
         <w:tc>
           <w:tcPr>
-            <w:tcW w:type="dxa" w:w="1175"/>
+            <w:tcW w:type="dxa" w:w="1094"/>
             <w:tcBorders>
               <w:bottom w:val="single" w:sz="4" w:color="000000"/>
             </w:tcBorders>
@@ -6787,7 +6787,7 @@
         </w:tc>
         <w:tc>
           <w:tcPr>
-            <w:tcW w:type="dxa" w:w="884"/>
+            <w:tcW w:type="dxa" w:w="934"/>
             <w:tcBorders>
               <w:bottom w:val="single" w:sz="4" w:color="000000"/>
             </w:tcBorders>
@@ -6817,7 +6817,7 @@
         </w:trPr>
         <w:tc>
           <w:tcPr>
-            <w:tcW w:type="dxa" w:w="787"/>
+            <w:tcW w:type="dxa" w:w="831"/>
           </w:tcPr>
           <w:p>
             <w:pPr>
@@ -6839,7 +6839,7 @@
         </w:tc>
         <w:tc>
           <w:tcPr>
-            <w:tcW w:type="dxa" w:w="2049"/>
+            <w:tcW w:type="dxa" w:w="4305"/>
           </w:tcPr>
           <w:p>
             <w:pPr>
@@ -6861,7 +6861,7 @@
         </w:tc>
         <w:tc>
           <w:tcPr>
-            <w:tcW w:type="dxa" w:w="1272"/>
+            <w:tcW w:type="dxa" w:w="729"/>
           </w:tcPr>
           <w:p>
             <w:pPr>
@@ -6883,7 +6883,7 @@
         </w:tc>
         <w:tc>
           <w:tcPr>
-            <w:tcW w:type="dxa" w:w="2146"/>
+            <w:tcW w:type="dxa" w:w="934"/>
           </w:tcPr>
           <w:p>
             <w:pPr>
@@ -6905,7 +6905,7 @@
         </w:tc>
         <w:tc>
           <w:tcPr>
-            <w:tcW w:type="dxa" w:w="593"/>
+            <w:tcW w:type="dxa" w:w="626"/>
           </w:tcPr>
           <w:p>
             <w:pPr>
@@ -6927,7 +6927,7 @@
         </w:tc>
         <w:tc>
           <w:tcPr>
-            <w:tcW w:type="dxa" w:w="1175"/>
+            <w:tcW w:type="dxa" w:w="626"/>
           </w:tcPr>
           <w:p>
             <w:pPr>
@@ -6949,29 +6949,29 @@
         </w:tc>
         <w:tc>
           <w:tcPr>
-            <w:tcW w:type="dxa" w:w="1175"/>
-          </w:tcPr>
-          <w:p>
-            <w:pPr>
-              <w:keepNext/>
-              <w:keepLines/>
-              <w:spacing w:before="0" w:after="0"/>
-              <w:jc w:val="center"/>
-            </w:pPr>
-            <w:r>
-              <w:rPr>
-                <w:b w:val="0"/>
-                <w:i w:val="0"/>
-                <w:smallCaps w:val="0"/>
-                <w:sz w:val="16"/>
-              </w:rPr>
-              <w:t>69.2</w:t>
-            </w:r>
-          </w:p>
-        </w:tc>
-        <w:tc>
-          <w:tcPr>
-            <w:tcW w:type="dxa" w:w="884"/>
+            <w:tcW w:type="dxa" w:w="1094"/>
+          </w:tcPr>
+          <w:p>
+            <w:pPr>
+              <w:keepNext/>
+              <w:keepLines/>
+              <w:spacing w:before="0" w:after="0"/>
+              <w:jc w:val="center"/>
+            </w:pPr>
+            <w:r>
+              <w:rPr>
+                <w:b w:val="0"/>
+                <w:i w:val="0"/>
+                <w:smallCaps w:val="0"/>
+                <w:sz w:val="16"/>
+              </w:rPr>
+              <w:t>69.2 (88%)</w:t>
+            </w:r>
+          </w:p>
+        </w:tc>
+        <w:tc>
+          <w:tcPr>
+            <w:tcW w:type="dxa" w:w="934"/>
           </w:tcPr>
           <w:p>
             <w:pPr>
@@ -6998,7 +6998,7 @@
         </w:trPr>
         <w:tc>
           <w:tcPr>
-            <w:tcW w:type="dxa" w:w="787"/>
+            <w:tcW w:type="dxa" w:w="831"/>
           </w:tcPr>
           <w:p>
             <w:pPr>
@@ -7020,7 +7020,7 @@
         </w:tc>
         <w:tc>
           <w:tcPr>
-            <w:tcW w:type="dxa" w:w="2049"/>
+            <w:tcW w:type="dxa" w:w="4305"/>
           </w:tcPr>
           <w:p>
             <w:pPr>
@@ -7042,7 +7042,7 @@
         </w:tc>
         <w:tc>
           <w:tcPr>
-            <w:tcW w:type="dxa" w:w="1272"/>
+            <w:tcW w:type="dxa" w:w="729"/>
           </w:tcPr>
           <w:p>
             <w:pPr>
@@ -7064,7 +7064,7 @@
         </w:tc>
         <w:tc>
           <w:tcPr>
-            <w:tcW w:type="dxa" w:w="2146"/>
+            <w:tcW w:type="dxa" w:w="934"/>
           </w:tcPr>
           <w:p>
             <w:pPr>
@@ -7086,7 +7086,7 @@
         </w:tc>
         <w:tc>
           <w:tcPr>
-            <w:tcW w:type="dxa" w:w="593"/>
+            <w:tcW w:type="dxa" w:w="626"/>
           </w:tcPr>
           <w:p>
             <w:pPr>
@@ -7108,7 +7108,7 @@
         </w:tc>
         <w:tc>
           <w:tcPr>
-            <w:tcW w:type="dxa" w:w="1175"/>
+            <w:tcW w:type="dxa" w:w="626"/>
           </w:tcPr>
           <w:p>
             <w:pPr>
@@ -7130,29 +7130,29 @@
         </w:tc>
         <w:tc>
           <w:tcPr>
-            <w:tcW w:type="dxa" w:w="1175"/>
-          </w:tcPr>
-          <w:p>
-            <w:pPr>
-              <w:keepNext/>
-              <w:keepLines/>
-              <w:spacing w:before="0" w:after="0"/>
-              <w:jc w:val="center"/>
-            </w:pPr>
-            <w:r>
-              <w:rPr>
-                <w:b w:val="0"/>
-                <w:i w:val="0"/>
-                <w:smallCaps w:val="0"/>
-                <w:sz w:val="16"/>
-              </w:rPr>
-              <w:t>70.4</w:t>
-            </w:r>
-          </w:p>
-        </w:tc>
-        <w:tc>
-          <w:tcPr>
-            <w:tcW w:type="dxa" w:w="884"/>
+            <w:tcW w:type="dxa" w:w="1094"/>
+          </w:tcPr>
+          <w:p>
+            <w:pPr>
+              <w:keepNext/>
+              <w:keepLines/>
+              <w:spacing w:before="0" w:after="0"/>
+              <w:jc w:val="center"/>
+            </w:pPr>
+            <w:r>
+              <w:rPr>
+                <w:b w:val="0"/>
+                <w:i w:val="0"/>
+                <w:smallCaps w:val="0"/>
+                <w:sz w:val="16"/>
+              </w:rPr>
+              <w:t>70.4 (89%)</w:t>
+            </w:r>
+          </w:p>
+        </w:tc>
+        <w:tc>
+          <w:tcPr>
+            <w:tcW w:type="dxa" w:w="934"/>
           </w:tcPr>
           <w:p>
             <w:pPr>
@@ -7179,7 +7179,7 @@
         </w:trPr>
         <w:tc>
           <w:tcPr>
-            <w:tcW w:type="dxa" w:w="787"/>
+            <w:tcW w:type="dxa" w:w="831"/>
           </w:tcPr>
           <w:p>
             <w:pPr>
@@ -7201,7 +7201,7 @@
         </w:tc>
         <w:tc>
           <w:tcPr>
-            <w:tcW w:type="dxa" w:w="2049"/>
+            <w:tcW w:type="dxa" w:w="4305"/>
           </w:tcPr>
           <w:p>
             <w:pPr>
@@ -7223,7 +7223,7 @@
         </w:tc>
         <w:tc>
           <w:tcPr>
-            <w:tcW w:type="dxa" w:w="1272"/>
+            <w:tcW w:type="dxa" w:w="729"/>
           </w:tcPr>
           <w:p>
             <w:pPr>
@@ -7245,7 +7245,7 @@
         </w:tc>
         <w:tc>
           <w:tcPr>
-            <w:tcW w:type="dxa" w:w="2146"/>
+            <w:tcW w:type="dxa" w:w="934"/>
           </w:tcPr>
           <w:p>
             <w:pPr>
@@ -7267,7 +7267,7 @@
         </w:tc>
         <w:tc>
           <w:tcPr>
-            <w:tcW w:type="dxa" w:w="593"/>
+            <w:tcW w:type="dxa" w:w="626"/>
           </w:tcPr>
           <w:p>
             <w:pPr>
@@ -7289,7 +7289,7 @@
         </w:tc>
         <w:tc>
           <w:tcPr>
-            <w:tcW w:type="dxa" w:w="1175"/>
+            <w:tcW w:type="dxa" w:w="626"/>
           </w:tcPr>
           <w:p>
             <w:pPr>
@@ -7311,29 +7311,29 @@
         </w:tc>
         <w:tc>
           <w:tcPr>
-            <w:tcW w:type="dxa" w:w="1175"/>
-          </w:tcPr>
-          <w:p>
-            <w:pPr>
-              <w:keepNext/>
-              <w:keepLines/>
-              <w:spacing w:before="0" w:after="0"/>
-              <w:jc w:val="center"/>
-            </w:pPr>
-            <w:r>
-              <w:rPr>
-                <w:b w:val="0"/>
-                <w:i w:val="0"/>
-                <w:smallCaps w:val="0"/>
-                <w:sz w:val="16"/>
-              </w:rPr>
-              <w:t>70.9</w:t>
-            </w:r>
-          </w:p>
-        </w:tc>
-        <w:tc>
-          <w:tcPr>
-            <w:tcW w:type="dxa" w:w="884"/>
+            <w:tcW w:type="dxa" w:w="1094"/>
+          </w:tcPr>
+          <w:p>
+            <w:pPr>
+              <w:keepNext/>
+              <w:keepLines/>
+              <w:spacing w:before="0" w:after="0"/>
+              <w:jc w:val="center"/>
+            </w:pPr>
+            <w:r>
+              <w:rPr>
+                <w:b w:val="0"/>
+                <w:i w:val="0"/>
+                <w:smallCaps w:val="0"/>
+                <w:sz w:val="16"/>
+              </w:rPr>
+              <w:t>70.9 (90%)</w:t>
+            </w:r>
+          </w:p>
+        </w:tc>
+        <w:tc>
+          <w:tcPr>
+            <w:tcW w:type="dxa" w:w="934"/>
           </w:tcPr>
           <w:p>
             <w:pPr>
@@ -7360,7 +7360,7 @@
         </w:trPr>
         <w:tc>
           <w:tcPr>
-            <w:tcW w:type="dxa" w:w="787"/>
+            <w:tcW w:type="dxa" w:w="831"/>
           </w:tcPr>
           <w:p>
             <w:pPr>
@@ -7382,7 +7382,7 @@
         </w:tc>
         <w:tc>
           <w:tcPr>
-            <w:tcW w:type="dxa" w:w="2049"/>
+            <w:tcW w:type="dxa" w:w="4305"/>
           </w:tcPr>
           <w:p>
             <w:pPr>
@@ -7404,7 +7404,7 @@
         </w:tc>
         <w:tc>
           <w:tcPr>
-            <w:tcW w:type="dxa" w:w="1272"/>
+            <w:tcW w:type="dxa" w:w="729"/>
           </w:tcPr>
           <w:p>
             <w:pPr>
@@ -7426,7 +7426,7 @@
         </w:tc>
         <w:tc>
           <w:tcPr>
-            <w:tcW w:type="dxa" w:w="2146"/>
+            <w:tcW w:type="dxa" w:w="934"/>
           </w:tcPr>
           <w:p>
             <w:pPr>
@@ -7448,7 +7448,7 @@
         </w:tc>
         <w:tc>
           <w:tcPr>
-            <w:tcW w:type="dxa" w:w="593"/>
+            <w:tcW w:type="dxa" w:w="626"/>
           </w:tcPr>
           <w:p>
             <w:pPr>
@@ -7470,7 +7470,7 @@
         </w:tc>
         <w:tc>
           <w:tcPr>
-            <w:tcW w:type="dxa" w:w="1175"/>
+            <w:tcW w:type="dxa" w:w="626"/>
           </w:tcPr>
           <w:p>
             <w:pPr>
@@ -7492,29 +7492,29 @@
         </w:tc>
         <w:tc>
           <w:tcPr>
-            <w:tcW w:type="dxa" w:w="1175"/>
-          </w:tcPr>
-          <w:p>
-            <w:pPr>
-              <w:keepNext/>
-              <w:keepLines/>
-              <w:spacing w:before="0" w:after="0"/>
-              <w:jc w:val="center"/>
-            </w:pPr>
-            <w:r>
-              <w:rPr>
-                <w:b w:val="0"/>
-                <w:i w:val="0"/>
-                <w:smallCaps w:val="0"/>
-                <w:sz w:val="16"/>
-              </w:rPr>
-              <w:t>70.9</w:t>
-            </w:r>
-          </w:p>
-        </w:tc>
-        <w:tc>
-          <w:tcPr>
-            <w:tcW w:type="dxa" w:w="884"/>
+            <w:tcW w:type="dxa" w:w="1094"/>
+          </w:tcPr>
+          <w:p>
+            <w:pPr>
+              <w:keepNext/>
+              <w:keepLines/>
+              <w:spacing w:before="0" w:after="0"/>
+              <w:jc w:val="center"/>
+            </w:pPr>
+            <w:r>
+              <w:rPr>
+                <w:b w:val="0"/>
+                <w:i w:val="0"/>
+                <w:smallCaps w:val="0"/>
+                <w:sz w:val="16"/>
+              </w:rPr>
+              <w:t>70.9 (90%)</w:t>
+            </w:r>
+          </w:p>
+        </w:tc>
+        <w:tc>
+          <w:tcPr>
+            <w:tcW w:type="dxa" w:w="934"/>
           </w:tcPr>
           <w:p>
             <w:pPr>
@@ -7541,7 +7541,7 @@
         </w:trPr>
         <w:tc>
           <w:tcPr>
-            <w:tcW w:type="dxa" w:w="787"/>
+            <w:tcW w:type="dxa" w:w="831"/>
           </w:tcPr>
           <w:p>
             <w:pPr>
@@ -7563,7 +7563,7 @@
         </w:tc>
         <w:tc>
           <w:tcPr>
-            <w:tcW w:type="dxa" w:w="2049"/>
+            <w:tcW w:type="dxa" w:w="4305"/>
           </w:tcPr>
           <w:p>
             <w:pPr>
@@ -7585,7 +7585,7 @@
         </w:tc>
         <w:tc>
           <w:tcPr>
-            <w:tcW w:type="dxa" w:w="1272"/>
+            <w:tcW w:type="dxa" w:w="729"/>
           </w:tcPr>
           <w:p>
             <w:pPr>
@@ -7607,7 +7607,7 @@
         </w:tc>
         <w:tc>
           <w:tcPr>
-            <w:tcW w:type="dxa" w:w="2146"/>
+            <w:tcW w:type="dxa" w:w="934"/>
           </w:tcPr>
           <w:p>
             <w:pPr>
@@ -7629,7 +7629,7 @@
         </w:tc>
         <w:tc>
           <w:tcPr>
-            <w:tcW w:type="dxa" w:w="593"/>
+            <w:tcW w:type="dxa" w:w="626"/>
           </w:tcPr>
           <w:p>
             <w:pPr>
@@ -7651,7 +7651,7 @@
         </w:tc>
         <w:tc>
           <w:tcPr>
-            <w:tcW w:type="dxa" w:w="1175"/>
+            <w:tcW w:type="dxa" w:w="626"/>
           </w:tcPr>
           <w:p>
             <w:pPr>
@@ -7673,7 +7673,7 @@
         </w:tc>
         <w:tc>
           <w:tcPr>
-            <w:tcW w:type="dxa" w:w="1175"/>
+            <w:tcW w:type="dxa" w:w="1094"/>
           </w:tcPr>
           <w:p>
             <w:pPr>
@@ -7689,13 +7689,13 @@
                 <w:smallCaps w:val="0"/>
                 <w:sz w:val="16"/>
               </w:rPr>
-              <w:t>72.1</w:t>
-            </w:r>
-          </w:p>
-        </w:tc>
-        <w:tc>
-          <w:tcPr>
-            <w:tcW w:type="dxa" w:w="884"/>
+              <w:t>72.1 (91%)</w:t>
+            </w:r>
+          </w:p>
+        </w:tc>
+        <w:tc>
+          <w:tcPr>
+            <w:tcW w:type="dxa" w:w="934"/>
           </w:tcPr>
           <w:p>
             <w:pPr>
@@ -7722,7 +7722,7 @@
         </w:trPr>
         <w:tc>
           <w:tcPr>
-            <w:tcW w:type="dxa" w:w="787"/>
+            <w:tcW w:type="dxa" w:w="831"/>
           </w:tcPr>
           <w:p>
             <w:pPr>
@@ -7744,7 +7744,7 @@
         </w:tc>
         <w:tc>
           <w:tcPr>
-            <w:tcW w:type="dxa" w:w="2049"/>
+            <w:tcW w:type="dxa" w:w="4305"/>
           </w:tcPr>
           <w:p>
             <w:pPr>
@@ -7766,7 +7766,7 @@
         </w:tc>
         <w:tc>
           <w:tcPr>
-            <w:tcW w:type="dxa" w:w="1272"/>
+            <w:tcW w:type="dxa" w:w="729"/>
           </w:tcPr>
           <w:p>
             <w:pPr>
@@ -7788,7 +7788,7 @@
         </w:tc>
         <w:tc>
           <w:tcPr>
-            <w:tcW w:type="dxa" w:w="2146"/>
+            <w:tcW w:type="dxa" w:w="934"/>
           </w:tcPr>
           <w:p>
             <w:pPr>
@@ -7810,7 +7810,7 @@
         </w:tc>
         <w:tc>
           <w:tcPr>
-            <w:tcW w:type="dxa" w:w="593"/>
+            <w:tcW w:type="dxa" w:w="626"/>
           </w:tcPr>
           <w:p>
             <w:pPr>
@@ -7832,7 +7832,7 @@
         </w:tc>
         <w:tc>
           <w:tcPr>
-            <w:tcW w:type="dxa" w:w="1175"/>
+            <w:tcW w:type="dxa" w:w="626"/>
           </w:tcPr>
           <w:p>
             <w:pPr>
@@ -7854,29 +7854,29 @@
         </w:tc>
         <w:tc>
           <w:tcPr>
-            <w:tcW w:type="dxa" w:w="1175"/>
-          </w:tcPr>
-          <w:p>
-            <w:pPr>
-              <w:keepNext/>
-              <w:keepLines/>
-              <w:spacing w:before="0" w:after="0"/>
-              <w:jc w:val="center"/>
-            </w:pPr>
-            <w:r>
-              <w:rPr>
-                <w:b w:val="0"/>
-                <w:i w:val="0"/>
-                <w:smallCaps w:val="0"/>
-                <w:sz w:val="16"/>
-              </w:rPr>
-              <w:t>53.3</w:t>
-            </w:r>
-          </w:p>
-        </w:tc>
-        <w:tc>
-          <w:tcPr>
-            <w:tcW w:type="dxa" w:w="884"/>
+            <w:tcW w:type="dxa" w:w="1094"/>
+          </w:tcPr>
+          <w:p>
+            <w:pPr>
+              <w:keepNext/>
+              <w:keepLines/>
+              <w:spacing w:before="0" w:after="0"/>
+              <w:jc w:val="center"/>
+            </w:pPr>
+            <w:r>
+              <w:rPr>
+                <w:b w:val="0"/>
+                <w:i w:val="0"/>
+                <w:smallCaps w:val="0"/>
+                <w:sz w:val="16"/>
+              </w:rPr>
+              <w:t>53.3 (67%)</w:t>
+            </w:r>
+          </w:p>
+        </w:tc>
+        <w:tc>
+          <w:tcPr>
+            <w:tcW w:type="dxa" w:w="934"/>
           </w:tcPr>
           <w:p>
             <w:pPr>
@@ -7903,7 +7903,7 @@
         </w:trPr>
         <w:tc>
           <w:tcPr>
-            <w:tcW w:type="dxa" w:w="787"/>
+            <w:tcW w:type="dxa" w:w="831"/>
           </w:tcPr>
           <w:p>
             <w:pPr>
@@ -7925,7 +7925,7 @@
         </w:tc>
         <w:tc>
           <w:tcPr>
-            <w:tcW w:type="dxa" w:w="2049"/>
+            <w:tcW w:type="dxa" w:w="4305"/>
           </w:tcPr>
           <w:p>
             <w:pPr>
@@ -7947,7 +7947,7 @@
         </w:tc>
         <w:tc>
           <w:tcPr>
-            <w:tcW w:type="dxa" w:w="1272"/>
+            <w:tcW w:type="dxa" w:w="729"/>
           </w:tcPr>
           <w:p>
             <w:pPr>
@@ -7969,7 +7969,7 @@
         </w:tc>
         <w:tc>
           <w:tcPr>
-            <w:tcW w:type="dxa" w:w="2146"/>
+            <w:tcW w:type="dxa" w:w="934"/>
           </w:tcPr>
           <w:p>
             <w:pPr>
@@ -7991,7 +7991,7 @@
         </w:tc>
         <w:tc>
           <w:tcPr>
-            <w:tcW w:type="dxa" w:w="593"/>
+            <w:tcW w:type="dxa" w:w="626"/>
           </w:tcPr>
           <w:p>
             <w:pPr>
@@ -8013,7 +8013,7 @@
         </w:tc>
         <w:tc>
           <w:tcPr>
-            <w:tcW w:type="dxa" w:w="1175"/>
+            <w:tcW w:type="dxa" w:w="626"/>
           </w:tcPr>
           <w:p>
             <w:pPr>
@@ -8035,29 +8035,29 @@
         </w:tc>
         <w:tc>
           <w:tcPr>
-            <w:tcW w:type="dxa" w:w="1175"/>
-          </w:tcPr>
-          <w:p>
-            <w:pPr>
-              <w:keepNext/>
-              <w:keepLines/>
-              <w:spacing w:before="0" w:after="0"/>
-              <w:jc w:val="center"/>
-            </w:pPr>
-            <w:r>
-              <w:rPr>
-                <w:b w:val="0"/>
-                <w:i w:val="0"/>
-                <w:smallCaps w:val="0"/>
-                <w:sz w:val="16"/>
-              </w:rPr>
-              <w:t>49.5</w:t>
-            </w:r>
-          </w:p>
-        </w:tc>
-        <w:tc>
-          <w:tcPr>
-            <w:tcW w:type="dxa" w:w="884"/>
+            <w:tcW w:type="dxa" w:w="1094"/>
+          </w:tcPr>
+          <w:p>
+            <w:pPr>
+              <w:keepNext/>
+              <w:keepLines/>
+              <w:spacing w:before="0" w:after="0"/>
+              <w:jc w:val="center"/>
+            </w:pPr>
+            <w:r>
+              <w:rPr>
+                <w:b w:val="0"/>
+                <w:i w:val="0"/>
+                <w:smallCaps w:val="0"/>
+                <w:sz w:val="16"/>
+              </w:rPr>
+              <w:t>49.5 (63%)</w:t>
+            </w:r>
+          </w:p>
+        </w:tc>
+        <w:tc>
+          <w:tcPr>
+            <w:tcW w:type="dxa" w:w="934"/>
           </w:tcPr>
           <w:p>
             <w:pPr>
@@ -8084,7 +8084,7 @@
         </w:trPr>
         <w:tc>
           <w:tcPr>
-            <w:tcW w:type="dxa" w:w="787"/>
+            <w:tcW w:type="dxa" w:w="831"/>
           </w:tcPr>
           <w:p>
             <w:pPr>
@@ -8106,7 +8106,7 @@
         </w:tc>
         <w:tc>
           <w:tcPr>
-            <w:tcW w:type="dxa" w:w="2049"/>
+            <w:tcW w:type="dxa" w:w="4305"/>
           </w:tcPr>
           <w:p>
             <w:pPr>
@@ -8128,7 +8128,7 @@
         </w:tc>
         <w:tc>
           <w:tcPr>
-            <w:tcW w:type="dxa" w:w="1272"/>
+            <w:tcW w:type="dxa" w:w="729"/>
           </w:tcPr>
           <w:p>
             <w:pPr>
@@ -8150,7 +8150,7 @@
         </w:tc>
         <w:tc>
           <w:tcPr>
-            <w:tcW w:type="dxa" w:w="2146"/>
+            <w:tcW w:type="dxa" w:w="934"/>
           </w:tcPr>
           <w:p>
             <w:pPr>
@@ -8172,7 +8172,7 @@
         </w:tc>
         <w:tc>
           <w:tcPr>
-            <w:tcW w:type="dxa" w:w="593"/>
+            <w:tcW w:type="dxa" w:w="626"/>
           </w:tcPr>
           <w:p>
             <w:pPr>
@@ -8194,7 +8194,7 @@
         </w:tc>
         <w:tc>
           <w:tcPr>
-            <w:tcW w:type="dxa" w:w="1175"/>
+            <w:tcW w:type="dxa" w:w="626"/>
           </w:tcPr>
           <w:p>
             <w:pPr>
@@ -8216,29 +8216,29 @@
         </w:tc>
         <w:tc>
           <w:tcPr>
-            <w:tcW w:type="dxa" w:w="1175"/>
-          </w:tcPr>
-          <w:p>
-            <w:pPr>
-              <w:keepNext/>
-              <w:keepLines/>
-              <w:spacing w:before="0" w:after="0"/>
-              <w:jc w:val="center"/>
-            </w:pPr>
-            <w:r>
-              <w:rPr>
-                <w:b w:val="0"/>
-                <w:i w:val="0"/>
-                <w:smallCaps w:val="0"/>
-                <w:sz w:val="16"/>
-              </w:rPr>
-              <w:t>55.3</w:t>
-            </w:r>
-          </w:p>
-        </w:tc>
-        <w:tc>
-          <w:tcPr>
-            <w:tcW w:type="dxa" w:w="884"/>
+            <w:tcW w:type="dxa" w:w="1094"/>
+          </w:tcPr>
+          <w:p>
+            <w:pPr>
+              <w:keepNext/>
+              <w:keepLines/>
+              <w:spacing w:before="0" w:after="0"/>
+              <w:jc w:val="center"/>
+            </w:pPr>
+            <w:r>
+              <w:rPr>
+                <w:b w:val="0"/>
+                <w:i w:val="0"/>
+                <w:smallCaps w:val="0"/>
+                <w:sz w:val="16"/>
+              </w:rPr>
+              <w:t>55.3 (70%)</w:t>
+            </w:r>
+          </w:p>
+        </w:tc>
+        <w:tc>
+          <w:tcPr>
+            <w:tcW w:type="dxa" w:w="934"/>
           </w:tcPr>
           <w:p>
             <w:pPr>
@@ -8265,7 +8265,188 @@
         </w:trPr>
         <w:tc>
           <w:tcPr>
-            <w:tcW w:type="dxa" w:w="787"/>
+            <w:tcW w:type="dxa" w:w="831"/>
+          </w:tcPr>
+          <w:p>
+            <w:pPr>
+              <w:keepNext/>
+              <w:keepLines/>
+              <w:spacing w:before="0" w:after="0"/>
+              <w:jc w:val="left"/>
+            </w:pPr>
+            <w:r>
+              <w:rPr>
+                <w:b w:val="0"/>
+                <w:i w:val="0"/>
+                <w:smallCaps w:val="0"/>
+                <w:sz w:val="16"/>
+              </w:rPr>
+              <w:t>t+3</w:t>
+            </w:r>
+          </w:p>
+        </w:tc>
+        <w:tc>
+          <w:tcPr>
+            <w:tcW w:type="dxa" w:w="4305"/>
+          </w:tcPr>
+          <w:p>
+            <w:pPr>
+              <w:keepNext/>
+              <w:keepLines/>
+              <w:spacing w:before="0" w:after="0"/>
+              <w:jc w:val="left"/>
+            </w:pPr>
+            <w:r>
+              <w:rPr>
+                <w:b/>
+                <w:i w:val="0"/>
+                <w:smallCaps w:val="0"/>
+                <w:sz w:val="16"/>
+              </w:rPr>
+              <w:t>GRU ensemble, augmented</w:t>
+            </w:r>
+          </w:p>
+        </w:tc>
+        <w:tc>
+          <w:tcPr>
+            <w:tcW w:type="dxa" w:w="729"/>
+          </w:tcPr>
+          <w:p>
+            <w:pPr>
+              <w:keepNext/>
+              <w:keepLines/>
+              <w:spacing w:before="0" w:after="0"/>
+              <w:jc w:val="center"/>
+            </w:pPr>
+            <w:r>
+              <w:rPr>
+                <w:b/>
+                <w:i w:val="0"/>
+                <w:smallCaps w:val="0"/>
+                <w:sz w:val="16"/>
+              </w:rPr>
+              <w:t>86.0</w:t>
+            </w:r>
+          </w:p>
+        </w:tc>
+        <w:tc>
+          <w:tcPr>
+            <w:tcW w:type="dxa" w:w="934"/>
+          </w:tcPr>
+          <w:p>
+            <w:pPr>
+              <w:keepNext/>
+              <w:keepLines/>
+              <w:spacing w:before="0" w:after="0"/>
+              <w:jc w:val="center"/>
+            </w:pPr>
+            <w:r>
+              <w:rPr>
+                <w:b/>
+                <w:i w:val="0"/>
+                <w:smallCaps w:val="0"/>
+                <w:sz w:val="16"/>
+              </w:rPr>
+              <w:t>75.5</w:t>
+            </w:r>
+          </w:p>
+        </w:tc>
+        <w:tc>
+          <w:tcPr>
+            <w:tcW w:type="dxa" w:w="626"/>
+          </w:tcPr>
+          <w:p>
+            <w:pPr>
+              <w:keepNext/>
+              <w:keepLines/>
+              <w:spacing w:before="0" w:after="0"/>
+              <w:jc w:val="center"/>
+            </w:pPr>
+            <w:r>
+              <w:rPr>
+                <w:b/>
+                <w:i w:val="0"/>
+                <w:smallCaps w:val="0"/>
+                <w:sz w:val="16"/>
+              </w:rPr>
+              <w:t>86.9</w:t>
+            </w:r>
+          </w:p>
+        </w:tc>
+        <w:tc>
+          <w:tcPr>
+            <w:tcW w:type="dxa" w:w="626"/>
+          </w:tcPr>
+          <w:p>
+            <w:pPr>
+              <w:keepNext/>
+              <w:keepLines/>
+              <w:spacing w:before="0" w:after="0"/>
+              <w:jc w:val="center"/>
+            </w:pPr>
+            <w:r>
+              <w:rPr>
+                <w:b/>
+                <w:i w:val="0"/>
+                <w:smallCaps w:val="0"/>
+                <w:sz w:val="16"/>
+              </w:rPr>
+              <w:t>96.8</w:t>
+            </w:r>
+          </w:p>
+        </w:tc>
+        <w:tc>
+          <w:tcPr>
+            <w:tcW w:type="dxa" w:w="1094"/>
+          </w:tcPr>
+          <w:p>
+            <w:pPr>
+              <w:keepNext/>
+              <w:keepLines/>
+              <w:spacing w:before="0" w:after="0"/>
+              <w:jc w:val="center"/>
+            </w:pPr>
+            <w:r>
+              <w:rPr>
+                <w:b/>
+                <w:i w:val="0"/>
+                <w:smallCaps w:val="0"/>
+                <w:sz w:val="16"/>
+              </w:rPr>
+              <w:t>56.7 (72%)</w:t>
+            </w:r>
+          </w:p>
+        </w:tc>
+        <w:tc>
+          <w:tcPr>
+            <w:tcW w:type="dxa" w:w="934"/>
+          </w:tcPr>
+          <w:p>
+            <w:pPr>
+              <w:keepNext/>
+              <w:keepLines/>
+              <w:spacing w:before="0" w:after="0"/>
+              <w:jc w:val="center"/>
+            </w:pPr>
+            <w:r>
+              <w:rPr>
+                <w:b/>
+                <w:i w:val="0"/>
+                <w:smallCaps w:val="0"/>
+                <w:sz w:val="16"/>
+              </w:rPr>
+              <w:t>0.28</w:t>
+            </w:r>
+          </w:p>
+        </w:tc>
+      </w:tr>
+      <w:tr>
+        <w:trPr>
+          <w:cantSplit/>
+        </w:trPr>
+        <w:tc>
+          <w:tcPr>
+            <w:tcW w:type="dxa" w:w="831"/>
           </w:tcPr>
           <w:p>
             <w:pPr>
@@ -8281,13 +8462,13 @@
                 <w:smallCaps w:val="0"/>
                 <w:sz w:val="16"/>
               </w:rPr>
-              <w:t>t+3</w:t>
-            </w:r>
-          </w:p>
-        </w:tc>
-        <w:tc>
-          <w:tcPr>
-            <w:tcW w:type="dxa" w:w="2049"/>
+              <w:t>any</w:t>
+            </w:r>
+          </w:p>
+        </w:tc>
+        <w:tc>
+          <w:tcPr>
+            <w:tcW w:type="dxa" w:w="4305"/>
           </w:tcPr>
           <w:p>
             <w:pPr>
@@ -8298,18 +8479,18 @@
             </w:pPr>
             <w:r>
               <w:rPr>
-                <w:b/>
-                <w:i w:val="0"/>
-                <w:smallCaps w:val="0"/>
-                <w:sz w:val="16"/>
-              </w:rPr>
-              <w:t>GRU ensemble, augmented</w:t>
-            </w:r>
-          </w:p>
-        </w:tc>
-        <w:tc>
-          <w:tcPr>
-            <w:tcW w:type="dxa" w:w="1272"/>
+                <w:b w:val="0"/>
+                <w:i/>
+                <w:smallCaps w:val="0"/>
+                <w:sz w:val="16"/>
+              </w:rPr>
+              <w:t>Noise bound: oracle with sweeps t − 1 and t + 1</w:t>
+            </w:r>
+          </w:p>
+        </w:tc>
+        <w:tc>
+          <w:tcPr>
+            <w:tcW w:type="dxa" w:w="729"/>
           </w:tcPr>
           <w:p>
             <w:pPr>
@@ -8320,18 +8501,18 @@
             </w:pPr>
             <w:r>
               <w:rPr>
-                <w:b/>
-                <w:i w:val="0"/>
-                <w:smallCaps w:val="0"/>
-                <w:sz w:val="16"/>
-              </w:rPr>
-              <w:t>86.0</w:t>
-            </w:r>
-          </w:p>
-        </w:tc>
-        <w:tc>
-          <w:tcPr>
-            <w:tcW w:type="dxa" w:w="2146"/>
+                <w:b w:val="0"/>
+                <w:i w:val="0"/>
+                <w:smallCaps w:val="0"/>
+                <w:sz w:val="16"/>
+              </w:rPr>
+              <w:t>–</w:t>
+            </w:r>
+          </w:p>
+        </w:tc>
+        <w:tc>
+          <w:tcPr>
+            <w:tcW w:type="dxa" w:w="934"/>
           </w:tcPr>
           <w:p>
             <w:pPr>
@@ -8342,18 +8523,18 @@
             </w:pPr>
             <w:r>
               <w:rPr>
-                <w:b/>
-                <w:i w:val="0"/>
-                <w:smallCaps w:val="0"/>
-                <w:sz w:val="16"/>
-              </w:rPr>
-              <w:t>75.5</w:t>
-            </w:r>
-          </w:p>
-        </w:tc>
-        <w:tc>
-          <w:tcPr>
-            <w:tcW w:type="dxa" w:w="593"/>
+                <w:b w:val="0"/>
+                <w:i w:val="0"/>
+                <w:smallCaps w:val="0"/>
+                <w:sz w:val="16"/>
+              </w:rPr>
+              <w:t>–</w:t>
+            </w:r>
+          </w:p>
+        </w:tc>
+        <w:tc>
+          <w:tcPr>
+            <w:tcW w:type="dxa" w:w="626"/>
           </w:tcPr>
           <w:p>
             <w:pPr>
@@ -8364,18 +8545,18 @@
             </w:pPr>
             <w:r>
               <w:rPr>
-                <w:b/>
-                <w:i w:val="0"/>
-                <w:smallCaps w:val="0"/>
-                <w:sz w:val="16"/>
-              </w:rPr>
-              <w:t>86.9</w:t>
-            </w:r>
-          </w:p>
-        </w:tc>
-        <w:tc>
-          <w:tcPr>
-            <w:tcW w:type="dxa" w:w="1175"/>
+                <w:b w:val="0"/>
+                <w:i w:val="0"/>
+                <w:smallCaps w:val="0"/>
+                <w:sz w:val="16"/>
+              </w:rPr>
+              <w:t>–</w:t>
+            </w:r>
+          </w:p>
+        </w:tc>
+        <w:tc>
+          <w:tcPr>
+            <w:tcW w:type="dxa" w:w="626"/>
           </w:tcPr>
           <w:p>
             <w:pPr>
@@ -8386,18 +8567,18 @@
             </w:pPr>
             <w:r>
               <w:rPr>
-                <w:b/>
-                <w:i w:val="0"/>
-                <w:smallCaps w:val="0"/>
-                <w:sz w:val="16"/>
-              </w:rPr>
-              <w:t>96.8</w:t>
-            </w:r>
-          </w:p>
-        </w:tc>
-        <w:tc>
-          <w:tcPr>
-            <w:tcW w:type="dxa" w:w="1175"/>
+                <w:b w:val="0"/>
+                <w:i w:val="0"/>
+                <w:smallCaps w:val="0"/>
+                <w:sz w:val="16"/>
+              </w:rPr>
+              <w:t>–</w:t>
+            </w:r>
+          </w:p>
+        </w:tc>
+        <w:tc>
+          <w:tcPr>
+            <w:tcW w:type="dxa" w:w="1094"/>
           </w:tcPr>
           <w:p>
             <w:pPr>
@@ -8408,18 +8589,18 @@
             </w:pPr>
             <w:r>
               <w:rPr>
-                <w:b/>
-                <w:i w:val="0"/>
-                <w:smallCaps w:val="0"/>
-                <w:sz w:val="16"/>
-              </w:rPr>
-              <w:t>56.7</w:t>
-            </w:r>
-          </w:p>
-        </w:tc>
-        <w:tc>
-          <w:tcPr>
-            <w:tcW w:type="dxa" w:w="884"/>
+                <w:b w:val="0"/>
+                <w:i/>
+                <w:smallCaps w:val="0"/>
+                <w:sz w:val="16"/>
+              </w:rPr>
+              <w:t>79.0 (100%)</w:t>
+            </w:r>
+          </w:p>
+        </w:tc>
+        <w:tc>
+          <w:tcPr>
+            <w:tcW w:type="dxa" w:w="934"/>
           </w:tcPr>
           <w:p>
             <w:pPr>
@@ -8430,12 +8611,12 @@
             </w:pPr>
             <w:r>
               <w:rPr>
-                <w:b/>
-                <w:i w:val="0"/>
-                <w:smallCaps w:val="0"/>
-                <w:sz w:val="16"/>
-              </w:rPr>
-              <w:t>0.28</w:t>
+                <w:b w:val="0"/>
+                <w:i/>
+                <w:smallCaps w:val="0"/>
+                <w:sz w:val="16"/>
+              </w:rPr>
+              <w:t>0.59</w:t>
             </w:r>
           </w:p>
         </w:tc>

</xml_diff>

<commit_message>
Blind exact prediction: decisive vs near-tie split (94.1% on decisive labels), fused GRU+sweep, Table VII
- blind_prediction_analysis.py: exact top-1 by label decisiveness with flight-bootstrap CIs; nested fusion
- Table VII: Decisive / Near-tie columns, fused rows, per-column bold, noise-bound row
- Paper paragraph 'Where blind exact prediction fails'; README and CHANGELOG

Co-Authored-By: Claude Opus 5.5 <noreply@anthropic.com>
</commit_message>
<xml_diff>
--- a/paper/revised_paper_ieee.docx
+++ b/paper/revised_paper_ieee.docx
@@ -6578,7 +6578,7 @@
           <w:smallCaps/>
           <w:sz w:val="16"/>
         </w:rPr>
-        <w:t>Blind beam prediction (no beam measured at the predicted time), GroupKFold over 35 sequences. Exact top-1 and macro-F1 are bounded by measurement noise: the last row is a non-causal oracle that sees the sweeps on both sides of the predicted one. In parentheses: exact top-1 as % of that bound. The deployed task, which measures a few beams, is in Tables VIII–X and XIV (best schemes: exact top-1 about 99%)</w:t>
+        <w:t>Blind beam prediction (no beam measured at the predicted time), GroupKFold over 35 sequences. Exact top-1 and macro-F1 are bounded by measurement noise: the last row is a non-causal oracle that sees the sweeps on both sides of the predicted one. In parentheses: exact top-1 as % of that bound. Decisive / near-tie: exact top-1 on samples whose best beam leads the runner-up by more than the 0.25 dB noise floor (25% of samples) and on the other 75%. The deployed task, which measures a few beams, is in Tables VIII–X and XIV (best schemes: exact top-1 about 99%)</w:t>
       </w:r>
     </w:p>
     <w:tbl>
@@ -6597,14 +6597,16 @@
         </w:tblCellMar>
       </w:tblPr>
       <w:tblGrid>
-        <w:gridCol w:w="831"/>
-        <w:gridCol w:w="4304"/>
-        <w:gridCol w:w="728"/>
-        <w:gridCol w:w="933"/>
-        <w:gridCol w:w="626"/>
-        <w:gridCol w:w="626"/>
-        <w:gridCol w:w="1094"/>
-        <w:gridCol w:w="933"/>
+        <w:gridCol w:w="796"/>
+        <w:gridCol w:w="2757"/>
+        <w:gridCol w:w="698"/>
+        <w:gridCol w:w="894"/>
+        <w:gridCol w:w="600"/>
+        <w:gridCol w:w="600"/>
+        <w:gridCol w:w="1048"/>
+        <w:gridCol w:w="894"/>
+        <w:gridCol w:w="894"/>
+        <w:gridCol w:w="894"/>
       </w:tblGrid>
       <w:tr>
         <w:trPr>
@@ -6612,7 +6614,7 @@
         </w:trPr>
         <w:tc>
           <w:tcPr>
-            <w:tcW w:type="dxa" w:w="831"/>
+            <w:tcW w:type="dxa" w:w="797"/>
             <w:tcBorders>
               <w:bottom w:val="single" w:sz="4" w:color="000000"/>
             </w:tcBorders>
@@ -6637,7 +6639,7 @@
         </w:tc>
         <w:tc>
           <w:tcPr>
-            <w:tcW w:type="dxa" w:w="4305"/>
+            <w:tcW w:type="dxa" w:w="2757"/>
             <w:tcBorders>
               <w:bottom w:val="single" w:sz="4" w:color="000000"/>
             </w:tcBorders>
@@ -6662,7 +6664,7 @@
         </w:tc>
         <w:tc>
           <w:tcPr>
-            <w:tcW w:type="dxa" w:w="729"/>
+            <w:tcW w:type="dxa" w:w="698"/>
             <w:tcBorders>
               <w:bottom w:val="single" w:sz="4" w:color="000000"/>
             </w:tcBorders>
@@ -6687,7 +6689,7 @@
         </w:tc>
         <w:tc>
           <w:tcPr>
-            <w:tcW w:type="dxa" w:w="934"/>
+            <w:tcW w:type="dxa" w:w="895"/>
             <w:tcBorders>
               <w:bottom w:val="single" w:sz="4" w:color="000000"/>
             </w:tcBorders>
@@ -6712,7 +6714,7 @@
         </w:tc>
         <w:tc>
           <w:tcPr>
-            <w:tcW w:type="dxa" w:w="626"/>
+            <w:tcW w:type="dxa" w:w="600"/>
             <w:tcBorders>
               <w:bottom w:val="single" w:sz="4" w:color="000000"/>
             </w:tcBorders>
@@ -6737,7 +6739,7 @@
         </w:tc>
         <w:tc>
           <w:tcPr>
-            <w:tcW w:type="dxa" w:w="626"/>
+            <w:tcW w:type="dxa" w:w="600"/>
             <w:tcBorders>
               <w:bottom w:val="single" w:sz="4" w:color="000000"/>
             </w:tcBorders>
@@ -6762,7 +6764,7 @@
         </w:tc>
         <w:tc>
           <w:tcPr>
-            <w:tcW w:type="dxa" w:w="1094"/>
+            <w:tcW w:type="dxa" w:w="1049"/>
             <w:tcBorders>
               <w:bottom w:val="single" w:sz="4" w:color="000000"/>
             </w:tcBorders>
@@ -6787,7 +6789,7 @@
         </w:tc>
         <w:tc>
           <w:tcPr>
-            <w:tcW w:type="dxa" w:w="934"/>
+            <w:tcW w:type="dxa" w:w="895"/>
             <w:tcBorders>
               <w:bottom w:val="single" w:sz="4" w:color="000000"/>
             </w:tcBorders>
@@ -6807,6 +6809,56 @@
                 <w:sz w:val="16"/>
               </w:rPr>
               <w:t>Macro-F1</w:t>
+            </w:r>
+          </w:p>
+        </w:tc>
+        <w:tc>
+          <w:tcPr>
+            <w:tcW w:type="dxa" w:w="895"/>
+            <w:tcBorders>
+              <w:bottom w:val="single" w:sz="4" w:color="000000"/>
+            </w:tcBorders>
+          </w:tcPr>
+          <w:p>
+            <w:pPr>
+              <w:keepNext/>
+              <w:keepLines/>
+              <w:spacing w:before="0" w:after="0"/>
+              <w:jc w:val="center"/>
+            </w:pPr>
+            <w:r>
+              <w:rPr>
+                <w:b/>
+                <w:i w:val="0"/>
+                <w:smallCaps w:val="0"/>
+                <w:sz w:val="16"/>
+              </w:rPr>
+              <w:t>Decisive</w:t>
+            </w:r>
+          </w:p>
+        </w:tc>
+        <w:tc>
+          <w:tcPr>
+            <w:tcW w:type="dxa" w:w="895"/>
+            <w:tcBorders>
+              <w:bottom w:val="single" w:sz="4" w:color="000000"/>
+            </w:tcBorders>
+          </w:tcPr>
+          <w:p>
+            <w:pPr>
+              <w:keepNext/>
+              <w:keepLines/>
+              <w:spacing w:before="0" w:after="0"/>
+              <w:jc w:val="center"/>
+            </w:pPr>
+            <w:r>
+              <w:rPr>
+                <w:b/>
+                <w:i w:val="0"/>
+                <w:smallCaps w:val="0"/>
+                <w:sz w:val="16"/>
+              </w:rPr>
+              <w:t>Near-tie</w:t>
             </w:r>
           </w:p>
         </w:tc>
@@ -6817,7 +6869,7 @@
         </w:trPr>
         <w:tc>
           <w:tcPr>
-            <w:tcW w:type="dxa" w:w="831"/>
+            <w:tcW w:type="dxa" w:w="797"/>
           </w:tcPr>
           <w:p>
             <w:pPr>
@@ -6839,7 +6891,7 @@
         </w:tc>
         <w:tc>
           <w:tcPr>
-            <w:tcW w:type="dxa" w:w="4305"/>
+            <w:tcW w:type="dxa" w:w="2757"/>
           </w:tcPr>
           <w:p>
             <w:pPr>
@@ -6861,7 +6913,7 @@
         </w:tc>
         <w:tc>
           <w:tcPr>
-            <w:tcW w:type="dxa" w:w="729"/>
+            <w:tcW w:type="dxa" w:w="698"/>
           </w:tcPr>
           <w:p>
             <w:pPr>
@@ -6883,7 +6935,7 @@
         </w:tc>
         <w:tc>
           <w:tcPr>
-            <w:tcW w:type="dxa" w:w="934"/>
+            <w:tcW w:type="dxa" w:w="895"/>
           </w:tcPr>
           <w:p>
             <w:pPr>
@@ -6905,7 +6957,7 @@
         </w:tc>
         <w:tc>
           <w:tcPr>
-            <w:tcW w:type="dxa" w:w="626"/>
+            <w:tcW w:type="dxa" w:w="600"/>
           </w:tcPr>
           <w:p>
             <w:pPr>
@@ -6927,7 +6979,7 @@
         </w:tc>
         <w:tc>
           <w:tcPr>
-            <w:tcW w:type="dxa" w:w="626"/>
+            <w:tcW w:type="dxa" w:w="600"/>
           </w:tcPr>
           <w:p>
             <w:pPr>
@@ -6949,7 +7001,7 @@
         </w:tc>
         <w:tc>
           <w:tcPr>
-            <w:tcW w:type="dxa" w:w="1094"/>
+            <w:tcW w:type="dxa" w:w="1049"/>
           </w:tcPr>
           <w:p>
             <w:pPr>
@@ -6971,7 +7023,7 @@
         </w:tc>
         <w:tc>
           <w:tcPr>
-            <w:tcW w:type="dxa" w:w="934"/>
+            <w:tcW w:type="dxa" w:w="895"/>
           </w:tcPr>
           <w:p>
             <w:pPr>
@@ -6988,6 +7040,50 @@
                 <w:sz w:val="16"/>
               </w:rPr>
               <w:t>0.45</w:t>
+            </w:r>
+          </w:p>
+        </w:tc>
+        <w:tc>
+          <w:tcPr>
+            <w:tcW w:type="dxa" w:w="895"/>
+          </w:tcPr>
+          <w:p>
+            <w:pPr>
+              <w:keepNext/>
+              <w:keepLines/>
+              <w:spacing w:before="0" w:after="0"/>
+              <w:jc w:val="center"/>
+            </w:pPr>
+            <w:r>
+              <w:rPr>
+                <w:b w:val="0"/>
+                <w:i w:val="0"/>
+                <w:smallCaps w:val="0"/>
+                <w:sz w:val="16"/>
+              </w:rPr>
+              <w:t>89.8</w:t>
+            </w:r>
+          </w:p>
+        </w:tc>
+        <w:tc>
+          <w:tcPr>
+            <w:tcW w:type="dxa" w:w="895"/>
+          </w:tcPr>
+          <w:p>
+            <w:pPr>
+              <w:keepNext/>
+              <w:keepLines/>
+              <w:spacing w:before="0" w:after="0"/>
+              <w:jc w:val="center"/>
+            </w:pPr>
+            <w:r>
+              <w:rPr>
+                <w:b w:val="0"/>
+                <w:i w:val="0"/>
+                <w:smallCaps w:val="0"/>
+                <w:sz w:val="16"/>
+              </w:rPr>
+              <w:t>62.3</w:t>
             </w:r>
           </w:p>
         </w:tc>
@@ -6998,7 +7094,7 @@
         </w:trPr>
         <w:tc>
           <w:tcPr>
-            <w:tcW w:type="dxa" w:w="831"/>
+            <w:tcW w:type="dxa" w:w="797"/>
           </w:tcPr>
           <w:p>
             <w:pPr>
@@ -7020,7 +7116,7 @@
         </w:tc>
         <w:tc>
           <w:tcPr>
-            <w:tcW w:type="dxa" w:w="4305"/>
+            <w:tcW w:type="dxa" w:w="2757"/>
           </w:tcPr>
           <w:p>
             <w:pPr>
@@ -7042,7 +7138,7 @@
         </w:tc>
         <w:tc>
           <w:tcPr>
-            <w:tcW w:type="dxa" w:w="729"/>
+            <w:tcW w:type="dxa" w:w="698"/>
           </w:tcPr>
           <w:p>
             <w:pPr>
@@ -7064,7 +7160,7 @@
         </w:tc>
         <w:tc>
           <w:tcPr>
-            <w:tcW w:type="dxa" w:w="934"/>
+            <w:tcW w:type="dxa" w:w="895"/>
           </w:tcPr>
           <w:p>
             <w:pPr>
@@ -7086,7 +7182,7 @@
         </w:tc>
         <w:tc>
           <w:tcPr>
-            <w:tcW w:type="dxa" w:w="626"/>
+            <w:tcW w:type="dxa" w:w="600"/>
           </w:tcPr>
           <w:p>
             <w:pPr>
@@ -7108,7 +7204,7 @@
         </w:tc>
         <w:tc>
           <w:tcPr>
-            <w:tcW w:type="dxa" w:w="626"/>
+            <w:tcW w:type="dxa" w:w="600"/>
           </w:tcPr>
           <w:p>
             <w:pPr>
@@ -7130,7 +7226,7 @@
         </w:tc>
         <w:tc>
           <w:tcPr>
-            <w:tcW w:type="dxa" w:w="1094"/>
+            <w:tcW w:type="dxa" w:w="1049"/>
           </w:tcPr>
           <w:p>
             <w:pPr>
@@ -7152,7 +7248,7 @@
         </w:tc>
         <w:tc>
           <w:tcPr>
-            <w:tcW w:type="dxa" w:w="934"/>
+            <w:tcW w:type="dxa" w:w="895"/>
           </w:tcPr>
           <w:p>
             <w:pPr>
@@ -7169,6 +7265,50 @@
                 <w:sz w:val="16"/>
               </w:rPr>
               <w:t>0.41</w:t>
+            </w:r>
+          </w:p>
+        </w:tc>
+        <w:tc>
+          <w:tcPr>
+            <w:tcW w:type="dxa" w:w="895"/>
+          </w:tcPr>
+          <w:p>
+            <w:pPr>
+              <w:keepNext/>
+              <w:keepLines/>
+              <w:spacing w:before="0" w:after="0"/>
+              <w:jc w:val="center"/>
+            </w:pPr>
+            <w:r>
+              <w:rPr>
+                <w:b w:val="0"/>
+                <w:i w:val="0"/>
+                <w:smallCaps w:val="0"/>
+                <w:sz w:val="16"/>
+              </w:rPr>
+              <w:t>–</w:t>
+            </w:r>
+          </w:p>
+        </w:tc>
+        <w:tc>
+          <w:tcPr>
+            <w:tcW w:type="dxa" w:w="895"/>
+          </w:tcPr>
+          <w:p>
+            <w:pPr>
+              <w:keepNext/>
+              <w:keepLines/>
+              <w:spacing w:before="0" w:after="0"/>
+              <w:jc w:val="center"/>
+            </w:pPr>
+            <w:r>
+              <w:rPr>
+                <w:b w:val="0"/>
+                <w:i w:val="0"/>
+                <w:smallCaps w:val="0"/>
+                <w:sz w:val="16"/>
+              </w:rPr>
+              <w:t>–</w:t>
             </w:r>
           </w:p>
         </w:tc>
@@ -7179,7 +7319,7 @@
         </w:trPr>
         <w:tc>
           <w:tcPr>
-            <w:tcW w:type="dxa" w:w="831"/>
+            <w:tcW w:type="dxa" w:w="797"/>
           </w:tcPr>
           <w:p>
             <w:pPr>
@@ -7201,7 +7341,7 @@
         </w:tc>
         <w:tc>
           <w:tcPr>
-            <w:tcW w:type="dxa" w:w="4305"/>
+            <w:tcW w:type="dxa" w:w="2757"/>
           </w:tcPr>
           <w:p>
             <w:pPr>
@@ -7223,7 +7363,7 @@
         </w:tc>
         <w:tc>
           <w:tcPr>
-            <w:tcW w:type="dxa" w:w="729"/>
+            <w:tcW w:type="dxa" w:w="698"/>
           </w:tcPr>
           <w:p>
             <w:pPr>
@@ -7245,7 +7385,7 @@
         </w:tc>
         <w:tc>
           <w:tcPr>
-            <w:tcW w:type="dxa" w:w="934"/>
+            <w:tcW w:type="dxa" w:w="895"/>
           </w:tcPr>
           <w:p>
             <w:pPr>
@@ -7267,7 +7407,7 @@
         </w:tc>
         <w:tc>
           <w:tcPr>
-            <w:tcW w:type="dxa" w:w="626"/>
+            <w:tcW w:type="dxa" w:w="600"/>
           </w:tcPr>
           <w:p>
             <w:pPr>
@@ -7289,7 +7429,7 @@
         </w:tc>
         <w:tc>
           <w:tcPr>
-            <w:tcW w:type="dxa" w:w="626"/>
+            <w:tcW w:type="dxa" w:w="600"/>
           </w:tcPr>
           <w:p>
             <w:pPr>
@@ -7311,7 +7451,7 @@
         </w:tc>
         <w:tc>
           <w:tcPr>
-            <w:tcW w:type="dxa" w:w="1094"/>
+            <w:tcW w:type="dxa" w:w="1049"/>
           </w:tcPr>
           <w:p>
             <w:pPr>
@@ -7333,7 +7473,7 @@
         </w:tc>
         <w:tc>
           <w:tcPr>
-            <w:tcW w:type="dxa" w:w="934"/>
+            <w:tcW w:type="dxa" w:w="895"/>
           </w:tcPr>
           <w:p>
             <w:pPr>
@@ -7350,6 +7490,50 @@
                 <w:sz w:val="16"/>
               </w:rPr>
               <w:t>0.41</w:t>
+            </w:r>
+          </w:p>
+        </w:tc>
+        <w:tc>
+          <w:tcPr>
+            <w:tcW w:type="dxa" w:w="895"/>
+          </w:tcPr>
+          <w:p>
+            <w:pPr>
+              <w:keepNext/>
+              <w:keepLines/>
+              <w:spacing w:before="0" w:after="0"/>
+              <w:jc w:val="center"/>
+            </w:pPr>
+            <w:r>
+              <w:rPr>
+                <w:b w:val="0"/>
+                <w:i w:val="0"/>
+                <w:smallCaps w:val="0"/>
+                <w:sz w:val="16"/>
+              </w:rPr>
+              <w:t>93.1</w:t>
+            </w:r>
+          </w:p>
+        </w:tc>
+        <w:tc>
+          <w:tcPr>
+            <w:tcW w:type="dxa" w:w="895"/>
+          </w:tcPr>
+          <w:p>
+            <w:pPr>
+              <w:keepNext/>
+              <w:keepLines/>
+              <w:spacing w:before="0" w:after="0"/>
+              <w:jc w:val="center"/>
+            </w:pPr>
+            <w:r>
+              <w:rPr>
+                <w:b w:val="0"/>
+                <w:i w:val="0"/>
+                <w:smallCaps w:val="0"/>
+                <w:sz w:val="16"/>
+              </w:rPr>
+              <w:t>63.5</w:t>
             </w:r>
           </w:p>
         </w:tc>
@@ -7360,7 +7544,7 @@
         </w:trPr>
         <w:tc>
           <w:tcPr>
-            <w:tcW w:type="dxa" w:w="831"/>
+            <w:tcW w:type="dxa" w:w="797"/>
           </w:tcPr>
           <w:p>
             <w:pPr>
@@ -7382,7 +7566,7 @@
         </w:tc>
         <w:tc>
           <w:tcPr>
-            <w:tcW w:type="dxa" w:w="4305"/>
+            <w:tcW w:type="dxa" w:w="2757"/>
           </w:tcPr>
           <w:p>
             <w:pPr>
@@ -7404,7 +7588,7 @@
         </w:tc>
         <w:tc>
           <w:tcPr>
-            <w:tcW w:type="dxa" w:w="729"/>
+            <w:tcW w:type="dxa" w:w="698"/>
           </w:tcPr>
           <w:p>
             <w:pPr>
@@ -7426,7 +7610,7 @@
         </w:tc>
         <w:tc>
           <w:tcPr>
-            <w:tcW w:type="dxa" w:w="934"/>
+            <w:tcW w:type="dxa" w:w="895"/>
           </w:tcPr>
           <w:p>
             <w:pPr>
@@ -7448,7 +7632,7 @@
         </w:tc>
         <w:tc>
           <w:tcPr>
-            <w:tcW w:type="dxa" w:w="626"/>
+            <w:tcW w:type="dxa" w:w="600"/>
           </w:tcPr>
           <w:p>
             <w:pPr>
@@ -7470,7 +7654,7 @@
         </w:tc>
         <w:tc>
           <w:tcPr>
-            <w:tcW w:type="dxa" w:w="626"/>
+            <w:tcW w:type="dxa" w:w="600"/>
           </w:tcPr>
           <w:p>
             <w:pPr>
@@ -7492,7 +7676,7 @@
         </w:tc>
         <w:tc>
           <w:tcPr>
-            <w:tcW w:type="dxa" w:w="1094"/>
+            <w:tcW w:type="dxa" w:w="1049"/>
           </w:tcPr>
           <w:p>
             <w:pPr>
@@ -7514,7 +7698,7 @@
         </w:tc>
         <w:tc>
           <w:tcPr>
-            <w:tcW w:type="dxa" w:w="934"/>
+            <w:tcW w:type="dxa" w:w="895"/>
           </w:tcPr>
           <w:p>
             <w:pPr>
@@ -7531,6 +7715,50 @@
                 <w:sz w:val="16"/>
               </w:rPr>
               <w:t>0.45</w:t>
+            </w:r>
+          </w:p>
+        </w:tc>
+        <w:tc>
+          <w:tcPr>
+            <w:tcW w:type="dxa" w:w="895"/>
+          </w:tcPr>
+          <w:p>
+            <w:pPr>
+              <w:keepNext/>
+              <w:keepLines/>
+              <w:spacing w:before="0" w:after="0"/>
+              <w:jc w:val="center"/>
+            </w:pPr>
+            <w:r>
+              <w:rPr>
+                <w:b/>
+                <w:i w:val="0"/>
+                <w:smallCaps w:val="0"/>
+                <w:sz w:val="16"/>
+              </w:rPr>
+              <w:t>94.7</w:t>
+            </w:r>
+          </w:p>
+        </w:tc>
+        <w:tc>
+          <w:tcPr>
+            <w:tcW w:type="dxa" w:w="895"/>
+          </w:tcPr>
+          <w:p>
+            <w:pPr>
+              <w:keepNext/>
+              <w:keepLines/>
+              <w:spacing w:before="0" w:after="0"/>
+              <w:jc w:val="center"/>
+            </w:pPr>
+            <w:r>
+              <w:rPr>
+                <w:b w:val="0"/>
+                <w:i w:val="0"/>
+                <w:smallCaps w:val="0"/>
+                <w:sz w:val="16"/>
+              </w:rPr>
+              <w:t>63.0</w:t>
             </w:r>
           </w:p>
         </w:tc>
@@ -7541,7 +7769,7 @@
         </w:trPr>
         <w:tc>
           <w:tcPr>
-            <w:tcW w:type="dxa" w:w="831"/>
+            <w:tcW w:type="dxa" w:w="797"/>
           </w:tcPr>
           <w:p>
             <w:pPr>
@@ -7563,7 +7791,7 @@
         </w:tc>
         <w:tc>
           <w:tcPr>
-            <w:tcW w:type="dxa" w:w="4305"/>
+            <w:tcW w:type="dxa" w:w="2757"/>
           </w:tcPr>
           <w:p>
             <w:pPr>
@@ -7579,13 +7807,13 @@
                 <w:smallCaps w:val="0"/>
                 <w:sz w:val="16"/>
               </w:rPr>
-              <w:t>GRU ensemble, augmented</w:t>
-            </w:r>
-          </w:p>
-        </w:tc>
-        <w:tc>
-          <w:tcPr>
-            <w:tcW w:type="dxa" w:w="729"/>
+              <w:t>GRU ens., augmented</w:t>
+            </w:r>
+          </w:p>
+        </w:tc>
+        <w:tc>
+          <w:tcPr>
+            <w:tcW w:type="dxa" w:w="698"/>
           </w:tcPr>
           <w:p>
             <w:pPr>
@@ -7607,7 +7835,7 @@
         </w:tc>
         <w:tc>
           <w:tcPr>
-            <w:tcW w:type="dxa" w:w="934"/>
+            <w:tcW w:type="dxa" w:w="895"/>
           </w:tcPr>
           <w:p>
             <w:pPr>
@@ -7629,7 +7857,29 @@
         </w:tc>
         <w:tc>
           <w:tcPr>
-            <w:tcW w:type="dxa" w:w="626"/>
+            <w:tcW w:type="dxa" w:w="600"/>
+          </w:tcPr>
+          <w:p>
+            <w:pPr>
+              <w:keepNext/>
+              <w:keepLines/>
+              <w:spacing w:before="0" w:after="0"/>
+              <w:jc w:val="center"/>
+            </w:pPr>
+            <w:r>
+              <w:rPr>
+                <w:b w:val="0"/>
+                <w:i w:val="0"/>
+                <w:smallCaps w:val="0"/>
+                <w:sz w:val="16"/>
+              </w:rPr>
+              <w:t>96.1</w:t>
+            </w:r>
+          </w:p>
+        </w:tc>
+        <w:tc>
+          <w:tcPr>
+            <w:tcW w:type="dxa" w:w="600"/>
           </w:tcPr>
           <w:p>
             <w:pPr>
@@ -7645,46 +7895,24 @@
                 <w:smallCaps w:val="0"/>
                 <w:sz w:val="16"/>
               </w:rPr>
-              <w:t>96.1</w:t>
-            </w:r>
-          </w:p>
-        </w:tc>
-        <w:tc>
-          <w:tcPr>
-            <w:tcW w:type="dxa" w:w="626"/>
-          </w:tcPr>
-          <w:p>
-            <w:pPr>
-              <w:keepNext/>
-              <w:keepLines/>
-              <w:spacing w:before="0" w:after="0"/>
-              <w:jc w:val="center"/>
-            </w:pPr>
-            <w:r>
-              <w:rPr>
-                <w:b/>
-                <w:i w:val="0"/>
-                <w:smallCaps w:val="0"/>
-                <w:sz w:val="16"/>
-              </w:rPr>
               <w:t>99.1</w:t>
             </w:r>
           </w:p>
         </w:tc>
         <w:tc>
           <w:tcPr>
-            <w:tcW w:type="dxa" w:w="1094"/>
-          </w:tcPr>
-          <w:p>
-            <w:pPr>
-              <w:keepNext/>
-              <w:keepLines/>
-              <w:spacing w:before="0" w:after="0"/>
-              <w:jc w:val="center"/>
-            </w:pPr>
-            <w:r>
-              <w:rPr>
-                <w:b/>
+            <w:tcW w:type="dxa" w:w="1049"/>
+          </w:tcPr>
+          <w:p>
+            <w:pPr>
+              <w:keepNext/>
+              <w:keepLines/>
+              <w:spacing w:before="0" w:after="0"/>
+              <w:jc w:val="center"/>
+            </w:pPr>
+            <w:r>
+              <w:rPr>
+                <w:b w:val="0"/>
                 <w:i w:val="0"/>
                 <w:smallCaps w:val="0"/>
                 <w:sz w:val="16"/>
@@ -7695,23 +7923,67 @@
         </w:tc>
         <w:tc>
           <w:tcPr>
-            <w:tcW w:type="dxa" w:w="934"/>
-          </w:tcPr>
-          <w:p>
-            <w:pPr>
-              <w:keepNext/>
-              <w:keepLines/>
-              <w:spacing w:before="0" w:after="0"/>
-              <w:jc w:val="center"/>
-            </w:pPr>
-            <w:r>
-              <w:rPr>
-                <w:b/>
+            <w:tcW w:type="dxa" w:w="895"/>
+          </w:tcPr>
+          <w:p>
+            <w:pPr>
+              <w:keepNext/>
+              <w:keepLines/>
+              <w:spacing w:before="0" w:after="0"/>
+              <w:jc w:val="center"/>
+            </w:pPr>
+            <w:r>
+              <w:rPr>
+                <w:b w:val="0"/>
                 <w:i w:val="0"/>
                 <w:smallCaps w:val="0"/>
                 <w:sz w:val="16"/>
               </w:rPr>
               <w:t>0.48</w:t>
+            </w:r>
+          </w:p>
+        </w:tc>
+        <w:tc>
+          <w:tcPr>
+            <w:tcW w:type="dxa" w:w="895"/>
+          </w:tcPr>
+          <w:p>
+            <w:pPr>
+              <w:keepNext/>
+              <w:keepLines/>
+              <w:spacing w:before="0" w:after="0"/>
+              <w:jc w:val="center"/>
+            </w:pPr>
+            <w:r>
+              <w:rPr>
+                <w:b w:val="0"/>
+                <w:i w:val="0"/>
+                <w:smallCaps w:val="0"/>
+                <w:sz w:val="16"/>
+              </w:rPr>
+              <w:t>94.1</w:t>
+            </w:r>
+          </w:p>
+        </w:tc>
+        <w:tc>
+          <w:tcPr>
+            <w:tcW w:type="dxa" w:w="895"/>
+          </w:tcPr>
+          <w:p>
+            <w:pPr>
+              <w:keepNext/>
+              <w:keepLines/>
+              <w:spacing w:before="0" w:after="0"/>
+              <w:jc w:val="center"/>
+            </w:pPr>
+            <w:r>
+              <w:rPr>
+                <w:b w:val="0"/>
+                <w:i w:val="0"/>
+                <w:smallCaps w:val="0"/>
+                <w:sz w:val="16"/>
+              </w:rPr>
+              <w:t>64.7</w:t>
             </w:r>
           </w:p>
         </w:tc>
@@ -7722,7 +7994,7 @@
         </w:trPr>
         <w:tc>
           <w:tcPr>
-            <w:tcW w:type="dxa" w:w="831"/>
+            <w:tcW w:type="dxa" w:w="797"/>
           </w:tcPr>
           <w:p>
             <w:pPr>
@@ -7738,13 +8010,13 @@
                 <w:smallCaps w:val="0"/>
                 <w:sz w:val="16"/>
               </w:rPr>
-              <w:t>t+3</w:t>
-            </w:r>
-          </w:p>
-        </w:tc>
-        <w:tc>
-          <w:tcPr>
-            <w:tcW w:type="dxa" w:w="4305"/>
+              <w:t>t+1</w:t>
+            </w:r>
+          </w:p>
+        </w:tc>
+        <w:tc>
+          <w:tcPr>
+            <w:tcW w:type="dxa" w:w="2757"/>
           </w:tcPr>
           <w:p>
             <w:pPr>
@@ -7760,139 +8032,183 @@
                 <w:smallCaps w:val="0"/>
                 <w:sz w:val="16"/>
               </w:rPr>
-              <w:t>Persistence</w:t>
-            </w:r>
-          </w:p>
-        </w:tc>
-        <w:tc>
-          <w:tcPr>
-            <w:tcW w:type="dxa" w:w="729"/>
-          </w:tcPr>
-          <w:p>
-            <w:pPr>
-              <w:keepNext/>
-              <w:keepLines/>
-              <w:spacing w:before="0" w:after="0"/>
-              <w:jc w:val="center"/>
-            </w:pPr>
-            <w:r>
-              <w:rPr>
-                <w:b w:val="0"/>
-                <w:i w:val="0"/>
-                <w:smallCaps w:val="0"/>
-                <w:sz w:val="16"/>
-              </w:rPr>
-              <w:t>78.1</w:t>
-            </w:r>
-          </w:p>
-        </w:tc>
-        <w:tc>
-          <w:tcPr>
-            <w:tcW w:type="dxa" w:w="934"/>
-          </w:tcPr>
-          <w:p>
-            <w:pPr>
-              <w:keepNext/>
-              <w:keepLines/>
-              <w:spacing w:before="0" w:after="0"/>
-              <w:jc w:val="center"/>
-            </w:pPr>
-            <w:r>
-              <w:rPr>
-                <w:b w:val="0"/>
-                <w:i w:val="0"/>
-                <w:smallCaps w:val="0"/>
-                <w:sz w:val="16"/>
-              </w:rPr>
-              <w:t>66.1</w:t>
-            </w:r>
-          </w:p>
-        </w:tc>
-        <w:tc>
-          <w:tcPr>
-            <w:tcW w:type="dxa" w:w="626"/>
-          </w:tcPr>
-          <w:p>
-            <w:pPr>
-              <w:keepNext/>
-              <w:keepLines/>
-              <w:spacing w:before="0" w:after="0"/>
-              <w:jc w:val="center"/>
-            </w:pPr>
-            <w:r>
-              <w:rPr>
-                <w:b w:val="0"/>
-                <w:i w:val="0"/>
-                <w:smallCaps w:val="0"/>
-                <w:sz w:val="16"/>
-              </w:rPr>
-              <w:t>80.3</w:t>
-            </w:r>
-          </w:p>
-        </w:tc>
-        <w:tc>
-          <w:tcPr>
-            <w:tcW w:type="dxa" w:w="626"/>
-          </w:tcPr>
-          <w:p>
-            <w:pPr>
-              <w:keepNext/>
-              <w:keepLines/>
-              <w:spacing w:before="0" w:after="0"/>
-              <w:jc w:val="center"/>
-            </w:pPr>
-            <w:r>
-              <w:rPr>
-                <w:b w:val="0"/>
-                <w:i w:val="0"/>
-                <w:smallCaps w:val="0"/>
-                <w:sz w:val="16"/>
-              </w:rPr>
-              <w:t>93.7</w:t>
-            </w:r>
-          </w:p>
-        </w:tc>
-        <w:tc>
-          <w:tcPr>
-            <w:tcW w:type="dxa" w:w="1094"/>
-          </w:tcPr>
-          <w:p>
-            <w:pPr>
-              <w:keepNext/>
-              <w:keepLines/>
-              <w:spacing w:before="0" w:after="0"/>
-              <w:jc w:val="center"/>
-            </w:pPr>
-            <w:r>
-              <w:rPr>
-                <w:b w:val="0"/>
-                <w:i w:val="0"/>
-                <w:smallCaps w:val="0"/>
-                <w:sz w:val="16"/>
-              </w:rPr>
-              <w:t>53.3 (67%)</w:t>
-            </w:r>
-          </w:p>
-        </w:tc>
-        <w:tc>
-          <w:tcPr>
-            <w:tcW w:type="dxa" w:w="934"/>
-          </w:tcPr>
-          <w:p>
-            <w:pPr>
-              <w:keepNext/>
-              <w:keepLines/>
-              <w:spacing w:before="0" w:after="0"/>
-              <w:jc w:val="center"/>
-            </w:pPr>
-            <w:r>
-              <w:rPr>
-                <w:b w:val="0"/>
-                <w:i w:val="0"/>
-                <w:smallCaps w:val="0"/>
-                <w:sz w:val="16"/>
-              </w:rPr>
-              <w:t>0.26</w:t>
+              <w:t>GRU ens. + sweep, fused</w:t>
+            </w:r>
+          </w:p>
+        </w:tc>
+        <w:tc>
+          <w:tcPr>
+            <w:tcW w:type="dxa" w:w="698"/>
+          </w:tcPr>
+          <w:p>
+            <w:pPr>
+              <w:keepNext/>
+              <w:keepLines/>
+              <w:spacing w:before="0" w:after="0"/>
+              <w:jc w:val="center"/>
+            </w:pPr>
+            <w:r>
+              <w:rPr>
+                <w:b w:val="0"/>
+                <w:i w:val="0"/>
+                <w:smallCaps w:val="0"/>
+                <w:sz w:val="16"/>
+              </w:rPr>
+              <w:t>96.3</w:t>
+            </w:r>
+          </w:p>
+        </w:tc>
+        <w:tc>
+          <w:tcPr>
+            <w:tcW w:type="dxa" w:w="895"/>
+          </w:tcPr>
+          <w:p>
+            <w:pPr>
+              <w:keepNext/>
+              <w:keepLines/>
+              <w:spacing w:before="0" w:after="0"/>
+              <w:jc w:val="center"/>
+            </w:pPr>
+            <w:r>
+              <w:rPr>
+                <w:b w:val="0"/>
+                <w:i w:val="0"/>
+                <w:smallCaps w:val="0"/>
+                <w:sz w:val="16"/>
+              </w:rPr>
+              <w:t>90.9</w:t>
+            </w:r>
+          </w:p>
+        </w:tc>
+        <w:tc>
+          <w:tcPr>
+            <w:tcW w:type="dxa" w:w="600"/>
+          </w:tcPr>
+          <w:p>
+            <w:pPr>
+              <w:keepNext/>
+              <w:keepLines/>
+              <w:spacing w:before="0" w:after="0"/>
+              <w:jc w:val="center"/>
+            </w:pPr>
+            <w:r>
+              <w:rPr>
+                <w:b/>
+                <w:i w:val="0"/>
+                <w:smallCaps w:val="0"/>
+                <w:sz w:val="16"/>
+              </w:rPr>
+              <w:t>96.3</w:t>
+            </w:r>
+          </w:p>
+        </w:tc>
+        <w:tc>
+          <w:tcPr>
+            <w:tcW w:type="dxa" w:w="600"/>
+          </w:tcPr>
+          <w:p>
+            <w:pPr>
+              <w:keepNext/>
+              <w:keepLines/>
+              <w:spacing w:before="0" w:after="0"/>
+              <w:jc w:val="center"/>
+            </w:pPr>
+            <w:r>
+              <w:rPr>
+                <w:b/>
+                <w:i w:val="0"/>
+                <w:smallCaps w:val="0"/>
+                <w:sz w:val="16"/>
+              </w:rPr>
+              <w:t>99.1</w:t>
+            </w:r>
+          </w:p>
+        </w:tc>
+        <w:tc>
+          <w:tcPr>
+            <w:tcW w:type="dxa" w:w="1049"/>
+          </w:tcPr>
+          <w:p>
+            <w:pPr>
+              <w:keepNext/>
+              <w:keepLines/>
+              <w:spacing w:before="0" w:after="0"/>
+              <w:jc w:val="center"/>
+            </w:pPr>
+            <w:r>
+              <w:rPr>
+                <w:b/>
+                <w:i w:val="0"/>
+                <w:smallCaps w:val="0"/>
+                <w:sz w:val="16"/>
+              </w:rPr>
+              <w:t>72.4 (92%)</w:t>
+            </w:r>
+          </w:p>
+        </w:tc>
+        <w:tc>
+          <w:tcPr>
+            <w:tcW w:type="dxa" w:w="895"/>
+          </w:tcPr>
+          <w:p>
+            <w:pPr>
+              <w:keepNext/>
+              <w:keepLines/>
+              <w:spacing w:before="0" w:after="0"/>
+              <w:jc w:val="center"/>
+            </w:pPr>
+            <w:r>
+              <w:rPr>
+                <w:b/>
+                <w:i w:val="0"/>
+                <w:smallCaps w:val="0"/>
+                <w:sz w:val="16"/>
+              </w:rPr>
+              <w:t>0.49</w:t>
+            </w:r>
+          </w:p>
+        </w:tc>
+        <w:tc>
+          <w:tcPr>
+            <w:tcW w:type="dxa" w:w="895"/>
+          </w:tcPr>
+          <w:p>
+            <w:pPr>
+              <w:keepNext/>
+              <w:keepLines/>
+              <w:spacing w:before="0" w:after="0"/>
+              <w:jc w:val="center"/>
+            </w:pPr>
+            <w:r>
+              <w:rPr>
+                <w:b w:val="0"/>
+                <w:i w:val="0"/>
+                <w:smallCaps w:val="0"/>
+                <w:sz w:val="16"/>
+              </w:rPr>
+              <w:t>94.0</w:t>
+            </w:r>
+          </w:p>
+        </w:tc>
+        <w:tc>
+          <w:tcPr>
+            <w:tcW w:type="dxa" w:w="895"/>
+          </w:tcPr>
+          <w:p>
+            <w:pPr>
+              <w:keepNext/>
+              <w:keepLines/>
+              <w:spacing w:before="0" w:after="0"/>
+              <w:jc w:val="center"/>
+            </w:pPr>
+            <w:r>
+              <w:rPr>
+                <w:b/>
+                <w:i w:val="0"/>
+                <w:smallCaps w:val="0"/>
+                <w:sz w:val="16"/>
+              </w:rPr>
+              <w:t>65.3</w:t>
             </w:r>
           </w:p>
         </w:tc>
@@ -7903,7 +8219,7 @@
         </w:trPr>
         <w:tc>
           <w:tcPr>
-            <w:tcW w:type="dxa" w:w="831"/>
+            <w:tcW w:type="dxa" w:w="797"/>
           </w:tcPr>
           <w:p>
             <w:pPr>
@@ -7925,7 +8241,7 @@
         </w:tc>
         <w:tc>
           <w:tcPr>
-            <w:tcW w:type="dxa" w:w="4305"/>
+            <w:tcW w:type="dxa" w:w="2757"/>
           </w:tcPr>
           <w:p>
             <w:pPr>
@@ -7941,139 +8257,183 @@
                 <w:smallCaps w:val="0"/>
                 <w:sz w:val="16"/>
               </w:rPr>
-              <w:t>GRU, hard label</w:t>
-            </w:r>
-          </w:p>
-        </w:tc>
-        <w:tc>
-          <w:tcPr>
-            <w:tcW w:type="dxa" w:w="729"/>
-          </w:tcPr>
-          <w:p>
-            <w:pPr>
-              <w:keepNext/>
-              <w:keepLines/>
-              <w:spacing w:before="0" w:after="0"/>
-              <w:jc w:val="center"/>
-            </w:pPr>
-            <w:r>
-              <w:rPr>
-                <w:b w:val="0"/>
-                <w:i w:val="0"/>
-                <w:smallCaps w:val="0"/>
-                <w:sz w:val="16"/>
-              </w:rPr>
-              <w:t>73.2</w:t>
-            </w:r>
-          </w:p>
-        </w:tc>
-        <w:tc>
-          <w:tcPr>
-            <w:tcW w:type="dxa" w:w="934"/>
-          </w:tcPr>
-          <w:p>
-            <w:pPr>
-              <w:keepNext/>
-              <w:keepLines/>
-              <w:spacing w:before="0" w:after="0"/>
-              <w:jc w:val="center"/>
-            </w:pPr>
-            <w:r>
-              <w:rPr>
-                <w:b w:val="0"/>
-                <w:i w:val="0"/>
-                <w:smallCaps w:val="0"/>
-                <w:sz w:val="16"/>
-              </w:rPr>
-              <w:t>57.9</w:t>
-            </w:r>
-          </w:p>
-        </w:tc>
-        <w:tc>
-          <w:tcPr>
-            <w:tcW w:type="dxa" w:w="626"/>
-          </w:tcPr>
-          <w:p>
-            <w:pPr>
-              <w:keepNext/>
-              <w:keepLines/>
-              <w:spacing w:before="0" w:after="0"/>
-              <w:jc w:val="center"/>
-            </w:pPr>
-            <w:r>
-              <w:rPr>
-                <w:b w:val="0"/>
-                <w:i w:val="0"/>
-                <w:smallCaps w:val="0"/>
-                <w:sz w:val="16"/>
-              </w:rPr>
-              <w:t>80.6</w:t>
-            </w:r>
-          </w:p>
-        </w:tc>
-        <w:tc>
-          <w:tcPr>
-            <w:tcW w:type="dxa" w:w="626"/>
-          </w:tcPr>
-          <w:p>
-            <w:pPr>
-              <w:keepNext/>
-              <w:keepLines/>
-              <w:spacing w:before="0" w:after="0"/>
-              <w:jc w:val="center"/>
-            </w:pPr>
-            <w:r>
-              <w:rPr>
-                <w:b w:val="0"/>
-                <w:i w:val="0"/>
-                <w:smallCaps w:val="0"/>
-                <w:sz w:val="16"/>
-              </w:rPr>
-              <w:t>93.1</w:t>
-            </w:r>
-          </w:p>
-        </w:tc>
-        <w:tc>
-          <w:tcPr>
-            <w:tcW w:type="dxa" w:w="1094"/>
-          </w:tcPr>
-          <w:p>
-            <w:pPr>
-              <w:keepNext/>
-              <w:keepLines/>
-              <w:spacing w:before="0" w:after="0"/>
-              <w:jc w:val="center"/>
-            </w:pPr>
-            <w:r>
-              <w:rPr>
-                <w:b w:val="0"/>
-                <w:i w:val="0"/>
-                <w:smallCaps w:val="0"/>
-                <w:sz w:val="16"/>
-              </w:rPr>
-              <w:t>49.5 (63%)</w:t>
-            </w:r>
-          </w:p>
-        </w:tc>
-        <w:tc>
-          <w:tcPr>
-            <w:tcW w:type="dxa" w:w="934"/>
-          </w:tcPr>
-          <w:p>
-            <w:pPr>
-              <w:keepNext/>
-              <w:keepLines/>
-              <w:spacing w:before="0" w:after="0"/>
-              <w:jc w:val="center"/>
-            </w:pPr>
-            <w:r>
-              <w:rPr>
-                <w:b w:val="0"/>
-                <w:i w:val="0"/>
-                <w:smallCaps w:val="0"/>
-                <w:sz w:val="16"/>
-              </w:rPr>
-              <w:t>0.21</w:t>
+              <w:t>Persistence</w:t>
+            </w:r>
+          </w:p>
+        </w:tc>
+        <w:tc>
+          <w:tcPr>
+            <w:tcW w:type="dxa" w:w="698"/>
+          </w:tcPr>
+          <w:p>
+            <w:pPr>
+              <w:keepNext/>
+              <w:keepLines/>
+              <w:spacing w:before="0" w:after="0"/>
+              <w:jc w:val="center"/>
+            </w:pPr>
+            <w:r>
+              <w:rPr>
+                <w:b w:val="0"/>
+                <w:i w:val="0"/>
+                <w:smallCaps w:val="0"/>
+                <w:sz w:val="16"/>
+              </w:rPr>
+              <w:t>78.1</w:t>
+            </w:r>
+          </w:p>
+        </w:tc>
+        <w:tc>
+          <w:tcPr>
+            <w:tcW w:type="dxa" w:w="895"/>
+          </w:tcPr>
+          <w:p>
+            <w:pPr>
+              <w:keepNext/>
+              <w:keepLines/>
+              <w:spacing w:before="0" w:after="0"/>
+              <w:jc w:val="center"/>
+            </w:pPr>
+            <w:r>
+              <w:rPr>
+                <w:b w:val="0"/>
+                <w:i w:val="0"/>
+                <w:smallCaps w:val="0"/>
+                <w:sz w:val="16"/>
+              </w:rPr>
+              <w:t>66.1</w:t>
+            </w:r>
+          </w:p>
+        </w:tc>
+        <w:tc>
+          <w:tcPr>
+            <w:tcW w:type="dxa" w:w="600"/>
+          </w:tcPr>
+          <w:p>
+            <w:pPr>
+              <w:keepNext/>
+              <w:keepLines/>
+              <w:spacing w:before="0" w:after="0"/>
+              <w:jc w:val="center"/>
+            </w:pPr>
+            <w:r>
+              <w:rPr>
+                <w:b w:val="0"/>
+                <w:i w:val="0"/>
+                <w:smallCaps w:val="0"/>
+                <w:sz w:val="16"/>
+              </w:rPr>
+              <w:t>80.3</w:t>
+            </w:r>
+          </w:p>
+        </w:tc>
+        <w:tc>
+          <w:tcPr>
+            <w:tcW w:type="dxa" w:w="600"/>
+          </w:tcPr>
+          <w:p>
+            <w:pPr>
+              <w:keepNext/>
+              <w:keepLines/>
+              <w:spacing w:before="0" w:after="0"/>
+              <w:jc w:val="center"/>
+            </w:pPr>
+            <w:r>
+              <w:rPr>
+                <w:b w:val="0"/>
+                <w:i w:val="0"/>
+                <w:smallCaps w:val="0"/>
+                <w:sz w:val="16"/>
+              </w:rPr>
+              <w:t>93.7</w:t>
+            </w:r>
+          </w:p>
+        </w:tc>
+        <w:tc>
+          <w:tcPr>
+            <w:tcW w:type="dxa" w:w="1049"/>
+          </w:tcPr>
+          <w:p>
+            <w:pPr>
+              <w:keepNext/>
+              <w:keepLines/>
+              <w:spacing w:before="0" w:after="0"/>
+              <w:jc w:val="center"/>
+            </w:pPr>
+            <w:r>
+              <w:rPr>
+                <w:b w:val="0"/>
+                <w:i w:val="0"/>
+                <w:smallCaps w:val="0"/>
+                <w:sz w:val="16"/>
+              </w:rPr>
+              <w:t>53.3 (67%)</w:t>
+            </w:r>
+          </w:p>
+        </w:tc>
+        <w:tc>
+          <w:tcPr>
+            <w:tcW w:type="dxa" w:w="895"/>
+          </w:tcPr>
+          <w:p>
+            <w:pPr>
+              <w:keepNext/>
+              <w:keepLines/>
+              <w:spacing w:before="0" w:after="0"/>
+              <w:jc w:val="center"/>
+            </w:pPr>
+            <w:r>
+              <w:rPr>
+                <w:b w:val="0"/>
+                <w:i w:val="0"/>
+                <w:smallCaps w:val="0"/>
+                <w:sz w:val="16"/>
+              </w:rPr>
+              <w:t>0.26</w:t>
+            </w:r>
+          </w:p>
+        </w:tc>
+        <w:tc>
+          <w:tcPr>
+            <w:tcW w:type="dxa" w:w="895"/>
+          </w:tcPr>
+          <w:p>
+            <w:pPr>
+              <w:keepNext/>
+              <w:keepLines/>
+              <w:spacing w:before="0" w:after="0"/>
+              <w:jc w:val="center"/>
+            </w:pPr>
+            <w:r>
+              <w:rPr>
+                <w:b w:val="0"/>
+                <w:i w:val="0"/>
+                <w:smallCaps w:val="0"/>
+                <w:sz w:val="16"/>
+              </w:rPr>
+              <w:t>69.2</w:t>
+            </w:r>
+          </w:p>
+        </w:tc>
+        <w:tc>
+          <w:tcPr>
+            <w:tcW w:type="dxa" w:w="895"/>
+          </w:tcPr>
+          <w:p>
+            <w:pPr>
+              <w:keepNext/>
+              <w:keepLines/>
+              <w:spacing w:before="0" w:after="0"/>
+              <w:jc w:val="center"/>
+            </w:pPr>
+            <w:r>
+              <w:rPr>
+                <w:b w:val="0"/>
+                <w:i w:val="0"/>
+                <w:smallCaps w:val="0"/>
+                <w:sz w:val="16"/>
+              </w:rPr>
+              <w:t>47.9</w:t>
             </w:r>
           </w:p>
         </w:tc>
@@ -8084,7 +8444,7 @@
         </w:trPr>
         <w:tc>
           <w:tcPr>
-            <w:tcW w:type="dxa" w:w="831"/>
+            <w:tcW w:type="dxa" w:w="797"/>
           </w:tcPr>
           <w:p>
             <w:pPr>
@@ -8106,7 +8466,7 @@
         </w:tc>
         <w:tc>
           <w:tcPr>
-            <w:tcW w:type="dxa" w:w="4305"/>
+            <w:tcW w:type="dxa" w:w="2757"/>
           </w:tcPr>
           <w:p>
             <w:pPr>
@@ -8122,139 +8482,183 @@
                 <w:smallCaps w:val="0"/>
                 <w:sz w:val="16"/>
               </w:rPr>
-              <w:t>GRU, soft target</w:t>
-            </w:r>
-          </w:p>
-        </w:tc>
-        <w:tc>
-          <w:tcPr>
-            <w:tcW w:type="dxa" w:w="729"/>
-          </w:tcPr>
-          <w:p>
-            <w:pPr>
-              <w:keepNext/>
-              <w:keepLines/>
-              <w:spacing w:before="0" w:after="0"/>
-              <w:jc w:val="center"/>
-            </w:pPr>
-            <w:r>
-              <w:rPr>
-                <w:b w:val="0"/>
-                <w:i w:val="0"/>
-                <w:smallCaps w:val="0"/>
-                <w:sz w:val="16"/>
-              </w:rPr>
-              <w:t>81.1</w:t>
-            </w:r>
-          </w:p>
-        </w:tc>
-        <w:tc>
-          <w:tcPr>
-            <w:tcW w:type="dxa" w:w="934"/>
-          </w:tcPr>
-          <w:p>
-            <w:pPr>
-              <w:keepNext/>
-              <w:keepLines/>
-              <w:spacing w:before="0" w:after="0"/>
-              <w:jc w:val="center"/>
-            </w:pPr>
-            <w:r>
-              <w:rPr>
-                <w:b w:val="0"/>
-                <w:i w:val="0"/>
-                <w:smallCaps w:val="0"/>
-                <w:sz w:val="16"/>
-              </w:rPr>
-              <w:t>65.8</w:t>
-            </w:r>
-          </w:p>
-        </w:tc>
-        <w:tc>
-          <w:tcPr>
-            <w:tcW w:type="dxa" w:w="626"/>
-          </w:tcPr>
-          <w:p>
-            <w:pPr>
-              <w:keepNext/>
-              <w:keepLines/>
-              <w:spacing w:before="0" w:after="0"/>
-              <w:jc w:val="center"/>
-            </w:pPr>
-            <w:r>
-              <w:rPr>
-                <w:b w:val="0"/>
-                <w:i w:val="0"/>
-                <w:smallCaps w:val="0"/>
-                <w:sz w:val="16"/>
-              </w:rPr>
-              <w:t>84.8</w:t>
-            </w:r>
-          </w:p>
-        </w:tc>
-        <w:tc>
-          <w:tcPr>
-            <w:tcW w:type="dxa" w:w="626"/>
-          </w:tcPr>
-          <w:p>
-            <w:pPr>
-              <w:keepNext/>
-              <w:keepLines/>
-              <w:spacing w:before="0" w:after="0"/>
-              <w:jc w:val="center"/>
-            </w:pPr>
-            <w:r>
-              <w:rPr>
-                <w:b w:val="0"/>
-                <w:i w:val="0"/>
-                <w:smallCaps w:val="0"/>
-                <w:sz w:val="16"/>
-              </w:rPr>
-              <w:t>95.5</w:t>
-            </w:r>
-          </w:p>
-        </w:tc>
-        <w:tc>
-          <w:tcPr>
-            <w:tcW w:type="dxa" w:w="1094"/>
-          </w:tcPr>
-          <w:p>
-            <w:pPr>
-              <w:keepNext/>
-              <w:keepLines/>
-              <w:spacing w:before="0" w:after="0"/>
-              <w:jc w:val="center"/>
-            </w:pPr>
-            <w:r>
-              <w:rPr>
-                <w:b w:val="0"/>
-                <w:i w:val="0"/>
-                <w:smallCaps w:val="0"/>
-                <w:sz w:val="16"/>
-              </w:rPr>
-              <w:t>55.3 (70%)</w:t>
-            </w:r>
-          </w:p>
-        </w:tc>
-        <w:tc>
-          <w:tcPr>
-            <w:tcW w:type="dxa" w:w="934"/>
-          </w:tcPr>
-          <w:p>
-            <w:pPr>
-              <w:keepNext/>
-              <w:keepLines/>
-              <w:spacing w:before="0" w:after="0"/>
-              <w:jc w:val="center"/>
-            </w:pPr>
-            <w:r>
-              <w:rPr>
-                <w:b w:val="0"/>
-                <w:i w:val="0"/>
-                <w:smallCaps w:val="0"/>
-                <w:sz w:val="16"/>
-              </w:rPr>
-              <w:t>0.24</w:t>
+              <w:t>GRU, hard label</w:t>
+            </w:r>
+          </w:p>
+        </w:tc>
+        <w:tc>
+          <w:tcPr>
+            <w:tcW w:type="dxa" w:w="698"/>
+          </w:tcPr>
+          <w:p>
+            <w:pPr>
+              <w:keepNext/>
+              <w:keepLines/>
+              <w:spacing w:before="0" w:after="0"/>
+              <w:jc w:val="center"/>
+            </w:pPr>
+            <w:r>
+              <w:rPr>
+                <w:b w:val="0"/>
+                <w:i w:val="0"/>
+                <w:smallCaps w:val="0"/>
+                <w:sz w:val="16"/>
+              </w:rPr>
+              <w:t>73.2</w:t>
+            </w:r>
+          </w:p>
+        </w:tc>
+        <w:tc>
+          <w:tcPr>
+            <w:tcW w:type="dxa" w:w="895"/>
+          </w:tcPr>
+          <w:p>
+            <w:pPr>
+              <w:keepNext/>
+              <w:keepLines/>
+              <w:spacing w:before="0" w:after="0"/>
+              <w:jc w:val="center"/>
+            </w:pPr>
+            <w:r>
+              <w:rPr>
+                <w:b w:val="0"/>
+                <w:i w:val="0"/>
+                <w:smallCaps w:val="0"/>
+                <w:sz w:val="16"/>
+              </w:rPr>
+              <w:t>57.9</w:t>
+            </w:r>
+          </w:p>
+        </w:tc>
+        <w:tc>
+          <w:tcPr>
+            <w:tcW w:type="dxa" w:w="600"/>
+          </w:tcPr>
+          <w:p>
+            <w:pPr>
+              <w:keepNext/>
+              <w:keepLines/>
+              <w:spacing w:before="0" w:after="0"/>
+              <w:jc w:val="center"/>
+            </w:pPr>
+            <w:r>
+              <w:rPr>
+                <w:b w:val="0"/>
+                <w:i w:val="0"/>
+                <w:smallCaps w:val="0"/>
+                <w:sz w:val="16"/>
+              </w:rPr>
+              <w:t>80.6</w:t>
+            </w:r>
+          </w:p>
+        </w:tc>
+        <w:tc>
+          <w:tcPr>
+            <w:tcW w:type="dxa" w:w="600"/>
+          </w:tcPr>
+          <w:p>
+            <w:pPr>
+              <w:keepNext/>
+              <w:keepLines/>
+              <w:spacing w:before="0" w:after="0"/>
+              <w:jc w:val="center"/>
+            </w:pPr>
+            <w:r>
+              <w:rPr>
+                <w:b w:val="0"/>
+                <w:i w:val="0"/>
+                <w:smallCaps w:val="0"/>
+                <w:sz w:val="16"/>
+              </w:rPr>
+              <w:t>93.1</w:t>
+            </w:r>
+          </w:p>
+        </w:tc>
+        <w:tc>
+          <w:tcPr>
+            <w:tcW w:type="dxa" w:w="1049"/>
+          </w:tcPr>
+          <w:p>
+            <w:pPr>
+              <w:keepNext/>
+              <w:keepLines/>
+              <w:spacing w:before="0" w:after="0"/>
+              <w:jc w:val="center"/>
+            </w:pPr>
+            <w:r>
+              <w:rPr>
+                <w:b w:val="0"/>
+                <w:i w:val="0"/>
+                <w:smallCaps w:val="0"/>
+                <w:sz w:val="16"/>
+              </w:rPr>
+              <w:t>49.5 (63%)</w:t>
+            </w:r>
+          </w:p>
+        </w:tc>
+        <w:tc>
+          <w:tcPr>
+            <w:tcW w:type="dxa" w:w="895"/>
+          </w:tcPr>
+          <w:p>
+            <w:pPr>
+              <w:keepNext/>
+              <w:keepLines/>
+              <w:spacing w:before="0" w:after="0"/>
+              <w:jc w:val="center"/>
+            </w:pPr>
+            <w:r>
+              <w:rPr>
+                <w:b w:val="0"/>
+                <w:i w:val="0"/>
+                <w:smallCaps w:val="0"/>
+                <w:sz w:val="16"/>
+              </w:rPr>
+              <w:t>0.21</w:t>
+            </w:r>
+          </w:p>
+        </w:tc>
+        <w:tc>
+          <w:tcPr>
+            <w:tcW w:type="dxa" w:w="895"/>
+          </w:tcPr>
+          <w:p>
+            <w:pPr>
+              <w:keepNext/>
+              <w:keepLines/>
+              <w:spacing w:before="0" w:after="0"/>
+              <w:jc w:val="center"/>
+            </w:pPr>
+            <w:r>
+              <w:rPr>
+                <w:b w:val="0"/>
+                <w:i w:val="0"/>
+                <w:smallCaps w:val="0"/>
+                <w:sz w:val="16"/>
+              </w:rPr>
+              <w:t>73.6</w:t>
+            </w:r>
+          </w:p>
+        </w:tc>
+        <w:tc>
+          <w:tcPr>
+            <w:tcW w:type="dxa" w:w="895"/>
+          </w:tcPr>
+          <w:p>
+            <w:pPr>
+              <w:keepNext/>
+              <w:keepLines/>
+              <w:spacing w:before="0" w:after="0"/>
+              <w:jc w:val="center"/>
+            </w:pPr>
+            <w:r>
+              <w:rPr>
+                <w:b w:val="0"/>
+                <w:i w:val="0"/>
+                <w:smallCaps w:val="0"/>
+                <w:sz w:val="16"/>
+              </w:rPr>
+              <w:t>41.5</w:t>
             </w:r>
           </w:p>
         </w:tc>
@@ -8265,7 +8669,7 @@
         </w:trPr>
         <w:tc>
           <w:tcPr>
-            <w:tcW w:type="dxa" w:w="831"/>
+            <w:tcW w:type="dxa" w:w="797"/>
           </w:tcPr>
           <w:p>
             <w:pPr>
@@ -8287,7 +8691,7 @@
         </w:tc>
         <w:tc>
           <w:tcPr>
-            <w:tcW w:type="dxa" w:w="4305"/>
+            <w:tcW w:type="dxa" w:w="2757"/>
           </w:tcPr>
           <w:p>
             <w:pPr>
@@ -8298,144 +8702,188 @@
             </w:pPr>
             <w:r>
               <w:rPr>
-                <w:b/>
-                <w:i w:val="0"/>
-                <w:smallCaps w:val="0"/>
-                <w:sz w:val="16"/>
-              </w:rPr>
-              <w:t>GRU ensemble, augmented</w:t>
-            </w:r>
-          </w:p>
-        </w:tc>
-        <w:tc>
-          <w:tcPr>
-            <w:tcW w:type="dxa" w:w="729"/>
-          </w:tcPr>
-          <w:p>
-            <w:pPr>
-              <w:keepNext/>
-              <w:keepLines/>
-              <w:spacing w:before="0" w:after="0"/>
-              <w:jc w:val="center"/>
-            </w:pPr>
-            <w:r>
-              <w:rPr>
-                <w:b/>
-                <w:i w:val="0"/>
-                <w:smallCaps w:val="0"/>
-                <w:sz w:val="16"/>
-              </w:rPr>
-              <w:t>86.0</w:t>
-            </w:r>
-          </w:p>
-        </w:tc>
-        <w:tc>
-          <w:tcPr>
-            <w:tcW w:type="dxa" w:w="934"/>
-          </w:tcPr>
-          <w:p>
-            <w:pPr>
-              <w:keepNext/>
-              <w:keepLines/>
-              <w:spacing w:before="0" w:after="0"/>
-              <w:jc w:val="center"/>
-            </w:pPr>
-            <w:r>
-              <w:rPr>
-                <w:b/>
-                <w:i w:val="0"/>
-                <w:smallCaps w:val="0"/>
-                <w:sz w:val="16"/>
-              </w:rPr>
-              <w:t>75.5</w:t>
-            </w:r>
-          </w:p>
-        </w:tc>
-        <w:tc>
-          <w:tcPr>
-            <w:tcW w:type="dxa" w:w="626"/>
-          </w:tcPr>
-          <w:p>
-            <w:pPr>
-              <w:keepNext/>
-              <w:keepLines/>
-              <w:spacing w:before="0" w:after="0"/>
-              <w:jc w:val="center"/>
-            </w:pPr>
-            <w:r>
-              <w:rPr>
-                <w:b/>
-                <w:i w:val="0"/>
-                <w:smallCaps w:val="0"/>
-                <w:sz w:val="16"/>
-              </w:rPr>
-              <w:t>86.9</w:t>
-            </w:r>
-          </w:p>
-        </w:tc>
-        <w:tc>
-          <w:tcPr>
-            <w:tcW w:type="dxa" w:w="626"/>
-          </w:tcPr>
-          <w:p>
-            <w:pPr>
-              <w:keepNext/>
-              <w:keepLines/>
-              <w:spacing w:before="0" w:after="0"/>
-              <w:jc w:val="center"/>
-            </w:pPr>
-            <w:r>
-              <w:rPr>
-                <w:b/>
-                <w:i w:val="0"/>
-                <w:smallCaps w:val="0"/>
-                <w:sz w:val="16"/>
-              </w:rPr>
-              <w:t>96.8</w:t>
-            </w:r>
-          </w:p>
-        </w:tc>
-        <w:tc>
-          <w:tcPr>
-            <w:tcW w:type="dxa" w:w="1094"/>
-          </w:tcPr>
-          <w:p>
-            <w:pPr>
-              <w:keepNext/>
-              <w:keepLines/>
-              <w:spacing w:before="0" w:after="0"/>
-              <w:jc w:val="center"/>
-            </w:pPr>
-            <w:r>
-              <w:rPr>
-                <w:b/>
-                <w:i w:val="0"/>
-                <w:smallCaps w:val="0"/>
-                <w:sz w:val="16"/>
-              </w:rPr>
-              <w:t>56.7 (72%)</w:t>
-            </w:r>
-          </w:p>
-        </w:tc>
-        <w:tc>
-          <w:tcPr>
-            <w:tcW w:type="dxa" w:w="934"/>
-          </w:tcPr>
-          <w:p>
-            <w:pPr>
-              <w:keepNext/>
-              <w:keepLines/>
-              <w:spacing w:before="0" w:after="0"/>
-              <w:jc w:val="center"/>
-            </w:pPr>
-            <w:r>
-              <w:rPr>
-                <w:b/>
-                <w:i w:val="0"/>
-                <w:smallCaps w:val="0"/>
-                <w:sz w:val="16"/>
-              </w:rPr>
-              <w:t>0.28</w:t>
+                <w:b w:val="0"/>
+                <w:i w:val="0"/>
+                <w:smallCaps w:val="0"/>
+                <w:sz w:val="16"/>
+              </w:rPr>
+              <w:t>GRU, soft target</w:t>
+            </w:r>
+          </w:p>
+        </w:tc>
+        <w:tc>
+          <w:tcPr>
+            <w:tcW w:type="dxa" w:w="698"/>
+          </w:tcPr>
+          <w:p>
+            <w:pPr>
+              <w:keepNext/>
+              <w:keepLines/>
+              <w:spacing w:before="0" w:after="0"/>
+              <w:jc w:val="center"/>
+            </w:pPr>
+            <w:r>
+              <w:rPr>
+                <w:b w:val="0"/>
+                <w:i w:val="0"/>
+                <w:smallCaps w:val="0"/>
+                <w:sz w:val="16"/>
+              </w:rPr>
+              <w:t>81.1</w:t>
+            </w:r>
+          </w:p>
+        </w:tc>
+        <w:tc>
+          <w:tcPr>
+            <w:tcW w:type="dxa" w:w="895"/>
+          </w:tcPr>
+          <w:p>
+            <w:pPr>
+              <w:keepNext/>
+              <w:keepLines/>
+              <w:spacing w:before="0" w:after="0"/>
+              <w:jc w:val="center"/>
+            </w:pPr>
+            <w:r>
+              <w:rPr>
+                <w:b w:val="0"/>
+                <w:i w:val="0"/>
+                <w:smallCaps w:val="0"/>
+                <w:sz w:val="16"/>
+              </w:rPr>
+              <w:t>65.8</w:t>
+            </w:r>
+          </w:p>
+        </w:tc>
+        <w:tc>
+          <w:tcPr>
+            <w:tcW w:type="dxa" w:w="600"/>
+          </w:tcPr>
+          <w:p>
+            <w:pPr>
+              <w:keepNext/>
+              <w:keepLines/>
+              <w:spacing w:before="0" w:after="0"/>
+              <w:jc w:val="center"/>
+            </w:pPr>
+            <w:r>
+              <w:rPr>
+                <w:b w:val="0"/>
+                <w:i w:val="0"/>
+                <w:smallCaps w:val="0"/>
+                <w:sz w:val="16"/>
+              </w:rPr>
+              <w:t>84.8</w:t>
+            </w:r>
+          </w:p>
+        </w:tc>
+        <w:tc>
+          <w:tcPr>
+            <w:tcW w:type="dxa" w:w="600"/>
+          </w:tcPr>
+          <w:p>
+            <w:pPr>
+              <w:keepNext/>
+              <w:keepLines/>
+              <w:spacing w:before="0" w:after="0"/>
+              <w:jc w:val="center"/>
+            </w:pPr>
+            <w:r>
+              <w:rPr>
+                <w:b w:val="0"/>
+                <w:i w:val="0"/>
+                <w:smallCaps w:val="0"/>
+                <w:sz w:val="16"/>
+              </w:rPr>
+              <w:t>95.5</w:t>
+            </w:r>
+          </w:p>
+        </w:tc>
+        <w:tc>
+          <w:tcPr>
+            <w:tcW w:type="dxa" w:w="1049"/>
+          </w:tcPr>
+          <w:p>
+            <w:pPr>
+              <w:keepNext/>
+              <w:keepLines/>
+              <w:spacing w:before="0" w:after="0"/>
+              <w:jc w:val="center"/>
+            </w:pPr>
+            <w:r>
+              <w:rPr>
+                <w:b w:val="0"/>
+                <w:i w:val="0"/>
+                <w:smallCaps w:val="0"/>
+                <w:sz w:val="16"/>
+              </w:rPr>
+              <w:t>55.3 (70%)</w:t>
+            </w:r>
+          </w:p>
+        </w:tc>
+        <w:tc>
+          <w:tcPr>
+            <w:tcW w:type="dxa" w:w="895"/>
+          </w:tcPr>
+          <w:p>
+            <w:pPr>
+              <w:keepNext/>
+              <w:keepLines/>
+              <w:spacing w:before="0" w:after="0"/>
+              <w:jc w:val="center"/>
+            </w:pPr>
+            <w:r>
+              <w:rPr>
+                <w:b w:val="0"/>
+                <w:i w:val="0"/>
+                <w:smallCaps w:val="0"/>
+                <w:sz w:val="16"/>
+              </w:rPr>
+              <w:t>0.24</w:t>
+            </w:r>
+          </w:p>
+        </w:tc>
+        <w:tc>
+          <w:tcPr>
+            <w:tcW w:type="dxa" w:w="895"/>
+          </w:tcPr>
+          <w:p>
+            <w:pPr>
+              <w:keepNext/>
+              <w:keepLines/>
+              <w:spacing w:before="0" w:after="0"/>
+              <w:jc w:val="center"/>
+            </w:pPr>
+            <w:r>
+              <w:rPr>
+                <w:b w:val="0"/>
+                <w:i w:val="0"/>
+                <w:smallCaps w:val="0"/>
+                <w:sz w:val="16"/>
+              </w:rPr>
+              <w:t>78.6</w:t>
+            </w:r>
+          </w:p>
+        </w:tc>
+        <w:tc>
+          <w:tcPr>
+            <w:tcW w:type="dxa" w:w="895"/>
+          </w:tcPr>
+          <w:p>
+            <w:pPr>
+              <w:keepNext/>
+              <w:keepLines/>
+              <w:spacing w:before="0" w:after="0"/>
+              <w:jc w:val="center"/>
+            </w:pPr>
+            <w:r>
+              <w:rPr>
+                <w:b w:val="0"/>
+                <w:i w:val="0"/>
+                <w:smallCaps w:val="0"/>
+                <w:sz w:val="16"/>
+              </w:rPr>
+              <w:t>47.5</w:t>
             </w:r>
           </w:p>
         </w:tc>
@@ -8446,7 +8894,457 @@
         </w:trPr>
         <w:tc>
           <w:tcPr>
-            <w:tcW w:type="dxa" w:w="831"/>
+            <w:tcW w:type="dxa" w:w="797"/>
+          </w:tcPr>
+          <w:p>
+            <w:pPr>
+              <w:keepNext/>
+              <w:keepLines/>
+              <w:spacing w:before="0" w:after="0"/>
+              <w:jc w:val="left"/>
+            </w:pPr>
+            <w:r>
+              <w:rPr>
+                <w:b w:val="0"/>
+                <w:i w:val="0"/>
+                <w:smallCaps w:val="0"/>
+                <w:sz w:val="16"/>
+              </w:rPr>
+              <w:t>t+3</w:t>
+            </w:r>
+          </w:p>
+        </w:tc>
+        <w:tc>
+          <w:tcPr>
+            <w:tcW w:type="dxa" w:w="2757"/>
+          </w:tcPr>
+          <w:p>
+            <w:pPr>
+              <w:keepNext/>
+              <w:keepLines/>
+              <w:spacing w:before="0" w:after="0"/>
+              <w:jc w:val="left"/>
+            </w:pPr>
+            <w:r>
+              <w:rPr>
+                <w:b/>
+                <w:i w:val="0"/>
+                <w:smallCaps w:val="0"/>
+                <w:sz w:val="16"/>
+              </w:rPr>
+              <w:t>GRU ens., augmented</w:t>
+            </w:r>
+          </w:p>
+        </w:tc>
+        <w:tc>
+          <w:tcPr>
+            <w:tcW w:type="dxa" w:w="698"/>
+          </w:tcPr>
+          <w:p>
+            <w:pPr>
+              <w:keepNext/>
+              <w:keepLines/>
+              <w:spacing w:before="0" w:after="0"/>
+              <w:jc w:val="center"/>
+            </w:pPr>
+            <w:r>
+              <w:rPr>
+                <w:b/>
+                <w:i w:val="0"/>
+                <w:smallCaps w:val="0"/>
+                <w:sz w:val="16"/>
+              </w:rPr>
+              <w:t>86.0</w:t>
+            </w:r>
+          </w:p>
+        </w:tc>
+        <w:tc>
+          <w:tcPr>
+            <w:tcW w:type="dxa" w:w="895"/>
+          </w:tcPr>
+          <w:p>
+            <w:pPr>
+              <w:keepNext/>
+              <w:keepLines/>
+              <w:spacing w:before="0" w:after="0"/>
+              <w:jc w:val="center"/>
+            </w:pPr>
+            <w:r>
+              <w:rPr>
+                <w:b/>
+                <w:i w:val="0"/>
+                <w:smallCaps w:val="0"/>
+                <w:sz w:val="16"/>
+              </w:rPr>
+              <w:t>75.5</w:t>
+            </w:r>
+          </w:p>
+        </w:tc>
+        <w:tc>
+          <w:tcPr>
+            <w:tcW w:type="dxa" w:w="600"/>
+          </w:tcPr>
+          <w:p>
+            <w:pPr>
+              <w:keepNext/>
+              <w:keepLines/>
+              <w:spacing w:before="0" w:after="0"/>
+              <w:jc w:val="center"/>
+            </w:pPr>
+            <w:r>
+              <w:rPr>
+                <w:b/>
+                <w:i w:val="0"/>
+                <w:smallCaps w:val="0"/>
+                <w:sz w:val="16"/>
+              </w:rPr>
+              <w:t>86.9</w:t>
+            </w:r>
+          </w:p>
+        </w:tc>
+        <w:tc>
+          <w:tcPr>
+            <w:tcW w:type="dxa" w:w="600"/>
+          </w:tcPr>
+          <w:p>
+            <w:pPr>
+              <w:keepNext/>
+              <w:keepLines/>
+              <w:spacing w:before="0" w:after="0"/>
+              <w:jc w:val="center"/>
+            </w:pPr>
+            <w:r>
+              <w:rPr>
+                <w:b/>
+                <w:i w:val="0"/>
+                <w:smallCaps w:val="0"/>
+                <w:sz w:val="16"/>
+              </w:rPr>
+              <w:t>96.8</w:t>
+            </w:r>
+          </w:p>
+        </w:tc>
+        <w:tc>
+          <w:tcPr>
+            <w:tcW w:type="dxa" w:w="1049"/>
+          </w:tcPr>
+          <w:p>
+            <w:pPr>
+              <w:keepNext/>
+              <w:keepLines/>
+              <w:spacing w:before="0" w:after="0"/>
+              <w:jc w:val="center"/>
+            </w:pPr>
+            <w:r>
+              <w:rPr>
+                <w:b w:val="0"/>
+                <w:i w:val="0"/>
+                <w:smallCaps w:val="0"/>
+                <w:sz w:val="16"/>
+              </w:rPr>
+              <w:t>56.7 (72%)</w:t>
+            </w:r>
+          </w:p>
+        </w:tc>
+        <w:tc>
+          <w:tcPr>
+            <w:tcW w:type="dxa" w:w="895"/>
+          </w:tcPr>
+          <w:p>
+            <w:pPr>
+              <w:keepNext/>
+              <w:keepLines/>
+              <w:spacing w:before="0" w:after="0"/>
+              <w:jc w:val="center"/>
+            </w:pPr>
+            <w:r>
+              <w:rPr>
+                <w:b w:val="0"/>
+                <w:i w:val="0"/>
+                <w:smallCaps w:val="0"/>
+                <w:sz w:val="16"/>
+              </w:rPr>
+              <w:t>0.28</w:t>
+            </w:r>
+          </w:p>
+        </w:tc>
+        <w:tc>
+          <w:tcPr>
+            <w:tcW w:type="dxa" w:w="895"/>
+          </w:tcPr>
+          <w:p>
+            <w:pPr>
+              <w:keepNext/>
+              <w:keepLines/>
+              <w:spacing w:before="0" w:after="0"/>
+              <w:jc w:val="center"/>
+            </w:pPr>
+            <w:r>
+              <w:rPr>
+                <w:b/>
+                <w:i w:val="0"/>
+                <w:smallCaps w:val="0"/>
+                <w:sz w:val="16"/>
+              </w:rPr>
+              <w:t>78.7</w:t>
+            </w:r>
+          </w:p>
+        </w:tc>
+        <w:tc>
+          <w:tcPr>
+            <w:tcW w:type="dxa" w:w="895"/>
+          </w:tcPr>
+          <w:p>
+            <w:pPr>
+              <w:keepNext/>
+              <w:keepLines/>
+              <w:spacing w:before="0" w:after="0"/>
+              <w:jc w:val="center"/>
+            </w:pPr>
+            <w:r>
+              <w:rPr>
+                <w:b w:val="0"/>
+                <w:i w:val="0"/>
+                <w:smallCaps w:val="0"/>
+                <w:sz w:val="16"/>
+              </w:rPr>
+              <w:t>49.4</w:t>
+            </w:r>
+          </w:p>
+        </w:tc>
+      </w:tr>
+      <w:tr>
+        <w:trPr>
+          <w:cantSplit/>
+        </w:trPr>
+        <w:tc>
+          <w:tcPr>
+            <w:tcW w:type="dxa" w:w="797"/>
+          </w:tcPr>
+          <w:p>
+            <w:pPr>
+              <w:keepNext/>
+              <w:keepLines/>
+              <w:spacing w:before="0" w:after="0"/>
+              <w:jc w:val="left"/>
+            </w:pPr>
+            <w:r>
+              <w:rPr>
+                <w:b w:val="0"/>
+                <w:i w:val="0"/>
+                <w:smallCaps w:val="0"/>
+                <w:sz w:val="16"/>
+              </w:rPr>
+              <w:t>t+3</w:t>
+            </w:r>
+          </w:p>
+        </w:tc>
+        <w:tc>
+          <w:tcPr>
+            <w:tcW w:type="dxa" w:w="2757"/>
+          </w:tcPr>
+          <w:p>
+            <w:pPr>
+              <w:keepNext/>
+              <w:keepLines/>
+              <w:spacing w:before="0" w:after="0"/>
+              <w:jc w:val="left"/>
+            </w:pPr>
+            <w:r>
+              <w:rPr>
+                <w:b w:val="0"/>
+                <w:i w:val="0"/>
+                <w:smallCaps w:val="0"/>
+                <w:sz w:val="16"/>
+              </w:rPr>
+              <w:t>GRU ens. + sweep, fused</w:t>
+            </w:r>
+          </w:p>
+        </w:tc>
+        <w:tc>
+          <w:tcPr>
+            <w:tcW w:type="dxa" w:w="698"/>
+          </w:tcPr>
+          <w:p>
+            <w:pPr>
+              <w:keepNext/>
+              <w:keepLines/>
+              <w:spacing w:before="0" w:after="0"/>
+              <w:jc w:val="center"/>
+            </w:pPr>
+            <w:r>
+              <w:rPr>
+                <w:b w:val="0"/>
+                <w:i w:val="0"/>
+                <w:smallCaps w:val="0"/>
+                <w:sz w:val="16"/>
+              </w:rPr>
+              <w:t>85.2</w:t>
+            </w:r>
+          </w:p>
+        </w:tc>
+        <w:tc>
+          <w:tcPr>
+            <w:tcW w:type="dxa" w:w="895"/>
+          </w:tcPr>
+          <w:p>
+            <w:pPr>
+              <w:keepNext/>
+              <w:keepLines/>
+              <w:spacing w:before="0" w:after="0"/>
+              <w:jc w:val="center"/>
+            </w:pPr>
+            <w:r>
+              <w:rPr>
+                <w:b w:val="0"/>
+                <w:i w:val="0"/>
+                <w:smallCaps w:val="0"/>
+                <w:sz w:val="16"/>
+              </w:rPr>
+              <w:t>74.7</w:t>
+            </w:r>
+          </w:p>
+        </w:tc>
+        <w:tc>
+          <w:tcPr>
+            <w:tcW w:type="dxa" w:w="600"/>
+          </w:tcPr>
+          <w:p>
+            <w:pPr>
+              <w:keepNext/>
+              <w:keepLines/>
+              <w:spacing w:before="0" w:after="0"/>
+              <w:jc w:val="center"/>
+            </w:pPr>
+            <w:r>
+              <w:rPr>
+                <w:b w:val="0"/>
+                <w:i w:val="0"/>
+                <w:smallCaps w:val="0"/>
+                <w:sz w:val="16"/>
+              </w:rPr>
+              <w:t>86.5</w:t>
+            </w:r>
+          </w:p>
+        </w:tc>
+        <w:tc>
+          <w:tcPr>
+            <w:tcW w:type="dxa" w:w="600"/>
+          </w:tcPr>
+          <w:p>
+            <w:pPr>
+              <w:keepNext/>
+              <w:keepLines/>
+              <w:spacing w:before="0" w:after="0"/>
+              <w:jc w:val="center"/>
+            </w:pPr>
+            <w:r>
+              <w:rPr>
+                <w:b w:val="0"/>
+                <w:i w:val="0"/>
+                <w:smallCaps w:val="0"/>
+                <w:sz w:val="16"/>
+              </w:rPr>
+              <w:t>96.5</w:t>
+            </w:r>
+          </w:p>
+        </w:tc>
+        <w:tc>
+          <w:tcPr>
+            <w:tcW w:type="dxa" w:w="1049"/>
+          </w:tcPr>
+          <w:p>
+            <w:pPr>
+              <w:keepNext/>
+              <w:keepLines/>
+              <w:spacing w:before="0" w:after="0"/>
+              <w:jc w:val="center"/>
+            </w:pPr>
+            <w:r>
+              <w:rPr>
+                <w:b/>
+                <w:i w:val="0"/>
+                <w:smallCaps w:val="0"/>
+                <w:sz w:val="16"/>
+              </w:rPr>
+              <w:t>57.3 (73%)</w:t>
+            </w:r>
+          </w:p>
+        </w:tc>
+        <w:tc>
+          <w:tcPr>
+            <w:tcW w:type="dxa" w:w="895"/>
+          </w:tcPr>
+          <w:p>
+            <w:pPr>
+              <w:keepNext/>
+              <w:keepLines/>
+              <w:spacing w:before="0" w:after="0"/>
+              <w:jc w:val="center"/>
+            </w:pPr>
+            <w:r>
+              <w:rPr>
+                <w:b/>
+                <w:i w:val="0"/>
+                <w:smallCaps w:val="0"/>
+                <w:sz w:val="16"/>
+              </w:rPr>
+              <w:t>0.29</w:t>
+            </w:r>
+          </w:p>
+        </w:tc>
+        <w:tc>
+          <w:tcPr>
+            <w:tcW w:type="dxa" w:w="895"/>
+          </w:tcPr>
+          <w:p>
+            <w:pPr>
+              <w:keepNext/>
+              <w:keepLines/>
+              <w:spacing w:before="0" w:after="0"/>
+              <w:jc w:val="center"/>
+            </w:pPr>
+            <w:r>
+              <w:rPr>
+                <w:b w:val="0"/>
+                <w:i w:val="0"/>
+                <w:smallCaps w:val="0"/>
+                <w:sz w:val="16"/>
+              </w:rPr>
+              <w:t>76.6</w:t>
+            </w:r>
+          </w:p>
+        </w:tc>
+        <w:tc>
+          <w:tcPr>
+            <w:tcW w:type="dxa" w:w="895"/>
+          </w:tcPr>
+          <w:p>
+            <w:pPr>
+              <w:keepNext/>
+              <w:keepLines/>
+              <w:spacing w:before="0" w:after="0"/>
+              <w:jc w:val="center"/>
+            </w:pPr>
+            <w:r>
+              <w:rPr>
+                <w:b/>
+                <w:i w:val="0"/>
+                <w:smallCaps w:val="0"/>
+                <w:sz w:val="16"/>
+              </w:rPr>
+              <w:t>50.9</w:t>
+            </w:r>
+          </w:p>
+        </w:tc>
+      </w:tr>
+      <w:tr>
+        <w:trPr>
+          <w:cantSplit/>
+        </w:trPr>
+        <w:tc>
+          <w:tcPr>
+            <w:tcW w:type="dxa" w:w="797"/>
           </w:tcPr>
           <w:p>
             <w:pPr>
@@ -8468,7 +9366,7 @@
         </w:tc>
         <w:tc>
           <w:tcPr>
-            <w:tcW w:type="dxa" w:w="4305"/>
+            <w:tcW w:type="dxa" w:w="2757"/>
           </w:tcPr>
           <w:p>
             <w:pPr>
@@ -8484,13 +9382,13 @@
                 <w:smallCaps w:val="0"/>
                 <w:sz w:val="16"/>
               </w:rPr>
-              <w:t>Noise bound: oracle with sweeps t − 1 and t + 1</w:t>
-            </w:r>
-          </w:p>
-        </w:tc>
-        <w:tc>
-          <w:tcPr>
-            <w:tcW w:type="dxa" w:w="729"/>
+              <w:t>Noise bound (non-causal oracle)</w:t>
+            </w:r>
+          </w:p>
+        </w:tc>
+        <w:tc>
+          <w:tcPr>
+            <w:tcW w:type="dxa" w:w="698"/>
           </w:tcPr>
           <w:p>
             <w:pPr>
@@ -8512,7 +9410,7 @@
         </w:tc>
         <w:tc>
           <w:tcPr>
-            <w:tcW w:type="dxa" w:w="934"/>
+            <w:tcW w:type="dxa" w:w="895"/>
           </w:tcPr>
           <w:p>
             <w:pPr>
@@ -8534,7 +9432,7 @@
         </w:tc>
         <w:tc>
           <w:tcPr>
-            <w:tcW w:type="dxa" w:w="626"/>
+            <w:tcW w:type="dxa" w:w="600"/>
           </w:tcPr>
           <w:p>
             <w:pPr>
@@ -8556,7 +9454,7 @@
         </w:tc>
         <w:tc>
           <w:tcPr>
-            <w:tcW w:type="dxa" w:w="626"/>
+            <w:tcW w:type="dxa" w:w="600"/>
           </w:tcPr>
           <w:p>
             <w:pPr>
@@ -8578,7 +9476,7 @@
         </w:tc>
         <w:tc>
           <w:tcPr>
-            <w:tcW w:type="dxa" w:w="1094"/>
+            <w:tcW w:type="dxa" w:w="1049"/>
           </w:tcPr>
           <w:p>
             <w:pPr>
@@ -8600,7 +9498,7 @@
         </w:tc>
         <w:tc>
           <w:tcPr>
-            <w:tcW w:type="dxa" w:w="934"/>
+            <w:tcW w:type="dxa" w:w="895"/>
           </w:tcPr>
           <w:p>
             <w:pPr>
@@ -8617,6 +9515,50 @@
                 <w:sz w:val="16"/>
               </w:rPr>
               <w:t>0.59</w:t>
+            </w:r>
+          </w:p>
+        </w:tc>
+        <w:tc>
+          <w:tcPr>
+            <w:tcW w:type="dxa" w:w="895"/>
+          </w:tcPr>
+          <w:p>
+            <w:pPr>
+              <w:keepNext w:val="0"/>
+              <w:keepLines w:val="0"/>
+              <w:spacing w:before="0" w:after="0"/>
+              <w:jc w:val="center"/>
+            </w:pPr>
+            <w:r>
+              <w:rPr>
+                <w:b w:val="0"/>
+                <w:i w:val="0"/>
+                <w:smallCaps w:val="0"/>
+                <w:sz w:val="16"/>
+              </w:rPr>
+              <w:t>–</w:t>
+            </w:r>
+          </w:p>
+        </w:tc>
+        <w:tc>
+          <w:tcPr>
+            <w:tcW w:type="dxa" w:w="895"/>
+          </w:tcPr>
+          <w:p>
+            <w:pPr>
+              <w:keepNext w:val="0"/>
+              <w:keepLines w:val="0"/>
+              <w:spacing w:before="0" w:after="0"/>
+              <w:jc w:val="center"/>
+            </w:pPr>
+            <w:r>
+              <w:rPr>
+                <w:b w:val="0"/>
+                <w:i w:val="0"/>
+                <w:smallCaps w:val="0"/>
+                <w:sz w:val="16"/>
+              </w:rPr>
+              <w:t>–</w:t>
             </w:r>
           </w:p>
         </w:tc>
@@ -8640,6 +9582,52 @@
           <w:docGrid w:linePitch="360"/>
         </w:sectPr>
       </w:pPr>
+    </w:p>
+    <w:p>
+      <w:pPr>
+        <w:keepNext w:val="0"/>
+        <w:keepLines w:val="0"/>
+        <w:spacing w:before="0" w:after="0"/>
+        <w:ind w:firstLine="288"/>
+        <w:jc w:val="both"/>
+      </w:pPr>
+      <w:r>
+        <w:rPr>
+          <w:b/>
+          <w:i w:val="0"/>
+          <w:smallCaps w:val="0"/>
+          <w:sz w:val="20"/>
+        </w:rPr>
+        <w:t>Where blind exact prediction fails</w:t>
+      </w:r>
+      <w:r>
+        <w:rPr>
+          <w:b w:val="0"/>
+          <w:i w:val="0"/>
+          <w:smallCaps w:val="0"/>
+          <w:sz w:val="20"/>
+        </w:rPr>
+        <w:t xml:space="preserve"> (Table VII, </w:t>
+      </w:r>
+      <w:r>
+        <w:rPr>
+          <w:rFonts w:ascii="Consolas" w:hAnsi="Consolas"/>
+          <w:b w:val="0"/>
+          <w:i w:val="0"/>
+          <w:smallCaps w:val="0"/>
+          <w:sz w:val="20"/>
+        </w:rPr>
+        <w:t>blind_prediction_analysis.py</w:t>
+      </w:r>
+      <w:r>
+        <w:rPr>
+          <w:b w:val="0"/>
+          <w:i w:val="0"/>
+          <w:smallCaps w:val="0"/>
+          <w:sz w:val="20"/>
+        </w:rPr>
+        <w:t>). Exact top-1 depends almost entirely on whether the label is decided by the channel or by noise. On the 25% of samples whose best beam leads by more than the 0.25 dB noise floor, the GRU ensemble predicts the exact beam 94.1% of the time at t + 1 (95% flight-bootstrap CI 91.7–95.9%) and 78.7% at t + 3 (71.4–84.9%). On the other 75%, two or more beams are equal within the noise, the label is a coin toss among them, and every model, including persistence, is near 62–65% at t + 1. Blind exact top-1 therefore cannot approach 95% on this data, while the measured schemes below can. Fusing the GRU ensemble with the last sweep, with the weight chosen on the other folds' flights, adds 0.3 points of exact top-1 at t + 1 (72.4%) and 0.6 at t + 3 (57.3%), and macro-F1 by 0.004 and 0.012, at the cost of 0.1–0.8 points of within-noise accuracy: the remaining gap to the 79% bound is the information in future sweeps that no causal predictor has.</w:t>
+      </w:r>
     </w:p>
     <w:p>
       <w:pPr>

</xml_diff>

<commit_message>
Paper: height in feet (9.6-119 m, elevation 46-90 deg), gated locator, Table XII and GPS beam training rerun; stacking script
- Table XII and locator text from the rerun with the causal gate (jumps >100 px 1.8% -> 0.95%).
- GPS-aided beam training paragraph from the rerun with heights in metres.
- blind_stacking.py: nested stack of GRU runs, shifted-template tracker, trees (results to follow).
- closed_loop_side_tracking.py: camera + GPS top-6 and 6-partner policies for all-class macro-F1.

Co-Authored-By: Claude Opus 5.5 <noreply@anthropic.com>
</commit_message>
<xml_diff>
--- a/paper/revised_paper_ieee.docx
+++ b/paper/revised_paper_ieee.docx
@@ -14490,7 +14490,7 @@
           <w:smallCaps w:val="0"/>
           <w:sz w:val="20"/>
         </w:rPr>
-        <w:t xml:space="preserve"> (Tables XI–XII, Fig. 8). The full Scenario 23 release adds, for every sample, the UAV's GPS position, speed, velocity components, height, pitch and roll. We convert the GPS fix to east/north offsets from the base station and its bearing, append these and the raw kinematic channels to every step of each model's input window, and repeat the blind-prediction study with the same folds. All other tables use power sweeps only, so that they can be reproduced from the beam CSV shipped with the repository. The height channel ranges from 31 to 391 while the UAV–BS distance is at most 120 m, so its unit or reference is not documented consistently; the models standardise it, but we do not interpret it physically.</w:t>
+        <w:t xml:space="preserve"> (Tables XI–XII, Fig. 8). The full Scenario 23 release adds, for every sample, the UAV's GPS position, speed, velocity components, height, pitch and roll. We convert the GPS fix to east/north offsets from the base station and its bearing, append these and the raw kinematic channels to every step of each model's input window, and repeat the blind-prediction study with the same folds. All other tables use power sweeps only, so that they can be reproduced from the beam CSV shipped with the repository. The altitude and height channels are in feet, not metres: altitude minus height is the same 1175.8 ft for every sample, the ground elevation at the base station (West Chandler, AZ), so we convert both to metres. The UAV then flies 9.6–119 m above its take-off point, consistent with the 120 m range of the dataset, and its elevation seen from the base station is 46–90° (median 77°).</w:t>
       </w:r>
     </w:p>
     <w:p>
@@ -14508,7 +14508,7 @@
           <w:smallCaps w:val="0"/>
           <w:sz w:val="20"/>
         </w:rPr>
-        <w:t>The base station also records one 960 × 540 camera frame per sweep, looking up at the sky; the UAV appears as a dark blob of a few pixels, often next to a sun-glare streak. We use the frames in two ways. (i) Generic features: every frame is encoded by a ResNet-18 pretrained on ImageNet and kept frozen (input 224 × 398, 512-d global-pooled embedding), classified with a logistic regression or a one-hidden-layer MLP, or appended to every step as a 16-component PCA (fitted on all frames without labels, 79% of the variance). (ii) UAV localisation without labels: the frame minus a Gaussian-blurred copy of itself (σ = 12 px) removes the smooth sky, and the most negative 3 × 3 mean of the residual is the UAV. Its pixel (x, y) and contrast form a three-number feature. In 95% of frames the UAV is at least 29 grey levels darker than the surrounding sky; inspected frames show the detection on the UAV body, also next to the glare and when the UAV is close. We also check the locator against GPS, without labels: a quadratic map from pixel to the UAV's east/north offset, fitted on other flights, explains 67% of the east and 12% of the north variance (median error 4.4 m). The UAV is nearly overhead (elevation 71–90°) and its height is not recorded consistently, so a pixel fixes the direction but not the distance; in the frames with the largest disagreement the detection is visibly on the UAV. The pixel jumps by more than 100 px between consecutive frames in 1.8% of frame pairs, while the GPS moves at most 2.2 m (99th percentile), so about 1% of frames are misdetected. The locator takes 54 ms per frame on one CPU process, most of it JPEG decoding; the ResNet-18 encoder takes 108 ms on one thread.</w:t>
+        <w:t>The base station also records one 960 × 540 camera frame per sweep, looking up at the sky; the UAV appears as a dark blob of a few pixels, often next to a sun-glare streak. We use the frames in two ways. (i) Generic features: every frame is encoded by a ResNet-18 pretrained on ImageNet and kept frozen (input 224 × 398, 512-d global-pooled embedding), classified with a logistic regression or a one-hidden-layer MLP, or appended to every step as a 16-component PCA (fitted on all frames without labels, 79% of the variance). (ii) UAV localisation without labels: the frame minus a Gaussian-blurred copy of itself (σ = 12 px) removes the smooth sky, and the most negative 3 × 3 mean of the residual is the UAV. Its pixel (x, y) and contrast form a three-number feature. In 95% of frames the UAV is at least 29 grey levels darker than the surrounding sky; inspected frames show the detection on the UAV body, also next to the glare and when the UAV is close. We also check the locator against GPS, without labels: a quadratic map from pixel to the UAV's east/north offset, fitted on other flights, explains 67% of the east and 12% of the north variance (median error 4.5 m). The UAV is high above the camera (elevation 46–90°), so a pixel fixes the direction but not the distance, which also depends on the 9.6–119 m height; in the frames with the largest disagreement the detection is visibly on the UAV. The raw pixel jumps by more than 100 px between consecutive frames in 1.8% of frame pairs, while the GPS moves at most 2.2 m (99th percentile), so about 1% of frames are misdetected. A causal gate removes half of these jumps: a detection more than 100 px from the last accepted one is replaced by that position until two consecutive detections agree on the new place. The gate holds 1.4% of frames and leaves 0.95% of frame pairs with a jump above 100 px; all results below use the gated pixel. The locator takes 54 ms per frame on one CPU process, most of it JPEG decoding; the ResNet-18 encoder takes 108 ms on one thread.</w:t>
       </w:r>
     </w:p>
     <w:p>
@@ -14526,7 +14526,7 @@
           <w:smallCaps w:val="0"/>
           <w:sz w:val="20"/>
         </w:rPr>
-        <w:t>Alone, the UAV pixel identifies the current beam within noise 81.1% of the time (59.0% exact), against 67.4% for the generic embedding and 14.9% for the most frequent beam (Table XII), so localising the UAV is what turns the image into beam information. For blind prediction from power sweeps, however, no side information gives a significant gain (Table XI, Table XIII). Position helps most further ahead: at t + 3, pooled within-noise accuracy rises by 4.2 points for the random forest (78.5 → 82.7%) and by 1.1 for the GRU ensemble (86.0 → 87.2%), and by 1.3 with GPS and the UAV pixel together (87.3%), but per flight these gains are not significant (16 flights better, 11 worse; Wilcoxon p = 0.34 and 0.40, Holm 0.68). At t + 1 every change is below one point: the last sweep already encodes where the UAV is. The generic embedding hurts: it lowers every model at both horizons, the GRU ensemble at t + 3 by 5.6 points (worse on 23 of 33 flights, Holm p &lt; 10⁻⁴), because with 35 flights 16 scene features let the models fit flight-specific appearance that does not transfer. Exact top-1 changes by −5.0 to +3.7 points across configurations and stays far below the 79% noise ceiling in all of them, as it must.</w:t>
+        <w:t>Alone, the UAV pixel identifies the current beam within noise 80.4% of the time (58.5% exact), against 67.4% for the generic embedding and 14.9% for the most frequent beam (Table XII), so localising the UAV is what turns the image into beam information. For blind prediction from power sweeps, however, no side information gives a significant gain (Table XI, Table XIII). Position helps most further ahead: at t + 3, pooled within-noise accuracy rises by 4.2 points for the random forest (78.5 → 82.7%) and by 1.1 for the GRU ensemble (86.0 → 87.2%), and by 1.3 with GPS and the UAV pixel together (87.3%), but per flight these gains are not significant (16 flights better, 11 worse; Wilcoxon p = 0.34 and 0.40, Holm 0.68). At t + 1 every change is below one point: the last sweep already encodes where the UAV is. The generic embedding hurts: it lowers every model at both horizons, the GRU ensemble at t + 3 by 5.6 points (worse on 23 of 33 flights, Holm p &lt; 10⁻⁴), because with 35 flights 16 scene features let the models fit flight-specific appearance that does not transfer. Exact top-1 changes by −5.0 to +3.7 points across configurations and stays far below the 79% noise ceiling in all of them, as it must.</w:t>
       </w:r>
     </w:p>
     <w:p>
@@ -16918,7 +16918,7 @@
                 <w:smallCaps w:val="0"/>
                 <w:sz w:val="16"/>
               </w:rPr>
-              <w:t>81.1</w:t>
+              <w:t>80.4</w:t>
             </w:r>
           </w:p>
         </w:tc>
@@ -16940,7 +16940,7 @@
                 <w:smallCaps w:val="0"/>
                 <w:sz w:val="16"/>
               </w:rPr>
-              <w:t>65.7</w:t>
+              <w:t>65.1</w:t>
             </w:r>
           </w:p>
         </w:tc>
@@ -16962,7 +16962,7 @@
                 <w:smallCaps w:val="0"/>
                 <w:sz w:val="16"/>
               </w:rPr>
-              <w:t>82.7</w:t>
+              <w:t>82.8</w:t>
             </w:r>
           </w:p>
         </w:tc>
@@ -16984,7 +16984,7 @@
                 <w:smallCaps w:val="0"/>
                 <w:sz w:val="16"/>
               </w:rPr>
-              <w:t>59.0</w:t>
+              <w:t>58.5</w:t>
             </w:r>
           </w:p>
         </w:tc>
@@ -17236,7 +17236,7 @@
                 <w:smallCaps w:val="0"/>
                 <w:sz w:val="16"/>
               </w:rPr>
-              <w:t>71.9</w:t>
+              <w:t>72.4</w:t>
             </w:r>
           </w:p>
         </w:tc>
@@ -17258,7 +17258,7 @@
                 <w:smallCaps w:val="0"/>
                 <w:sz w:val="16"/>
               </w:rPr>
-              <w:t>56.7</w:t>
+              <w:t>57.4</w:t>
             </w:r>
           </w:p>
         </w:tc>
@@ -17280,7 +17280,7 @@
                 <w:smallCaps w:val="0"/>
                 <w:sz w:val="16"/>
               </w:rPr>
-              <w:t>78.2</w:t>
+              <w:t>77.8</w:t>
             </w:r>
           </w:p>
         </w:tc>
@@ -17302,7 +17302,7 @@
                 <w:smallCaps w:val="0"/>
                 <w:sz w:val="16"/>
               </w:rPr>
-              <w:t>49.9</w:t>
+              <w:t>50.7</w:t>
             </w:r>
           </w:p>
         </w:tc>
@@ -17554,7 +17554,7 @@
                 <w:smallCaps w:val="0"/>
                 <w:sz w:val="16"/>
               </w:rPr>
-              <w:t>56.5</w:t>
+              <w:t>56.9</w:t>
             </w:r>
           </w:p>
         </w:tc>
@@ -17576,7 +17576,7 @@
                 <w:smallCaps w:val="0"/>
                 <w:sz w:val="16"/>
               </w:rPr>
-              <w:t>42.0</w:t>
+              <w:t>43.1</w:t>
             </w:r>
           </w:p>
         </w:tc>
@@ -17598,7 +17598,7 @@
                 <w:smallCaps w:val="0"/>
                 <w:sz w:val="16"/>
               </w:rPr>
-              <w:t>65.4</w:t>
+              <w:t>65.9</w:t>
             </w:r>
           </w:p>
         </w:tc>
@@ -17620,7 +17620,7 @@
                 <w:smallCaps w:val="0"/>
                 <w:sz w:val="16"/>
               </w:rPr>
-              <w:t>36.9</w:t>
+              <w:t>37.2</w:t>
             </w:r>
           </w:p>
         </w:tc>
@@ -17809,7 +17809,7 @@
           <w:smallCaps w:val="0"/>
           <w:sz w:val="20"/>
         </w:rPr>
-        <w:t xml:space="preserve"> Rerunning the reduced beam training and conformal studies on the GPS-aided GRU ensemble changes little. At t + 3 the two-round scheme reaches 99.3% exact top-1 [98.7, 99.8] and all-class macro-F1 0.946 [0.923, 0.978] (power only: 99.1% and 0.929), but measures 14.5 instead of 11.7 beams (2.15 vs 1.93 ms); the intervals overlap. At t + 1 every operating point stays within 0.3 points. The 95% conformal shortlist at t + 3 uses 5.2 instead of 5.4 beams and its worst fold rises from 92.7 to 94.1% coverage. Position therefore does not remove the singleton-class limit on all-class macro-F1 at t + 3.</w:t>
+        <w:t xml:space="preserve"> Rerunning the reduced beam training and conformal studies on the GPS-aided GRU ensemble changes little. At t + 3 the two-round scheme reaches 99.2% exact top-1 [98.5, 99.7] and all-class macro-F1 0.931 [0.896, 0.962] (power only: 99.1% and 0.929), but measures 15.5 instead of 11.7 beams (2.23 vs 1.93 ms); fused with the last sweep it reaches 99.4% [98.9, 99.7] and 0.955 [0.936, 0.981] with 13.8 beams (power only: 99.3% and 0.913 with 13.3). All intervals overlap. At t + 1 every operating point stays within 0.3 points. The 95% conformal shortlist at t + 3 uses 5.2 instead of 5.4 beams and its worst fold rises from 92.7 to 94.3% coverage. Position raises all-class macro-F1 at t + 3, but its lower confidence bound stays below 0.95: the singleton classes remain.</w:t>
       </w:r>
     </w:p>
     <w:p>

</xml_diff>

<commit_message>
Proofread paper; per-flight test that sensing adds inside the stack; Table XI refresh; LightGBM ref
- significance_tests.py: stacking family. All-sensing vs power-only stack: +1.09 / +3.35 points
  exact top-1 at t+1 / t+3 (Holm p = 0.006 / 0.045); stacks vs GRU ensemble Holm p <= 0.003.
- Camera-embedding runs tried in the stack (<= 0.1 point change); stack keeps four runs.
- Paper: Table XI from the metre/gated rerun, Table XIII stacking rows, Sec. V-B stacked
  predictor, reference [25] (LightGBM, NeurIPS 2017, checked), wording fixes; Word rebuilt.
- New test for per-flight blind scoring (29 pass); README, CHANGELOG update 18.

Co-Authored-By: Claude Opus 5.5 <noreply@anthropic.com>
</commit_message>
<xml_diff>
--- a/paper/revised_paper_ieee.docx
+++ b/paper/revised_paper_ieee.docx
@@ -121,7 +121,7 @@
           <w:smallCaps w:val="0"/>
           <w:sz w:val="18"/>
         </w:rPr>
-        <w:t>Millimetre-wave (mmWave) and sub-terahertz links can give unmanned aerial vehicles (UAVs) multi-gigabit connectivity, but narrow beams, high path loss and UAV mobility make beam management costly, and practical hardware departs from the ideal models most reconfigurable intelligent surface (RIS) studies assume. We present a hardware-aware framework for an RIS-assisted 60 GHz UAV link that models transmitter power-amplifier (PA) distortion through the Bussgang decomposition, RIS phase quantization, phase noise, amplitude–phase coupling and antenna mismatch, together with ITU-R P.676-13 gaseous absorption. On this model we show that (i) impairments cost 7.8 dB of SNDR, dominated by amplitude–phase coupling, so a realistic RIS needs about 2.25× more elements than an ideal one for full coverage of a 300 m flight; (ii) a position-parametric channel estimator reaches within 0.15 dB of perfect channel knowledge with 64× fewer pilots than per-element LMMSE, and needs no pilots when a 100 ms Kalman prediction is available; and (iii) predictive tracking delivers 99.3% of the ideal array gain at 500 ms latency, whereas persistence delivers 63%. On real 60 GHz measurements (DeepSense 6G Scenario 23) we show that exact blind beam prediction is bounded at 79% top-1 by measurement noise, and propose an AI-assisted reduced beam training scheme with a learned beam-tie graph. Given full-sweep history it selects the exact optimal beam 99.3% of the time at a 140 ms horizon (macro-F1 0.961 over all 56 beam classes) and 99.1% at 0.4 s. Replayed in closed loop, where the system knows only the beams it measured, tie-graph tracking selects the exact optimal beam 97.2–99.3% of the time with 1.05–1.31 ms of beam training per decision instead of 5 ms, and per-flight tests confirm its spectral-efficiency gain over full sweeps on 32 of 33 flights. Adding candidate beams from the UAV's GPS and from its position in the base station's camera image, located without labels, lets the tracker drop periodic full sweeps: with six candidates it selects the exact optimal beam 99.5% of the time with macro-F1 0.97 over all 56 beam classes and 0.66 ms per decision, better than the tie-graph tracker on 26 of 33 flights, and it degrades gracefully when the GPS report is up to 1.1 s old. Ten deep sequence models trained on measured-only data do not beat the tie graph at equal measurement budget. For blind prediction, no single model gains significantly from position or camera features, but a nested stack of all models raises exact top-1 from 72.1 to 75.6% at 140 ms, 96% of the noise bound, and from 56.7 to 64.3% at 0.4 s, on most flights (Holm p ≤ 0.0014). All results use sequence-level cross-validation.</w:t>
+        <w:t>Millimetre-wave (mmWave) and sub-terahertz links can give unmanned aerial vehicles (UAVs) multi-gigabit connectivity, but narrow beams, high path loss and UAV mobility make beam management costly, and practical hardware departs from the ideal models most reconfigurable intelligent surface (RIS) studies assume. We present a hardware-aware framework for an RIS-assisted 60 GHz UAV link that models transmitter power-amplifier (PA) distortion through the Bussgang decomposition, RIS phase quantization, phase noise, amplitude–phase coupling and antenna mismatch, together with ITU-R P.676-13 gaseous absorption. On this model we show that (i) impairments cost 7.8 dB of SNDR, dominated by amplitude–phase coupling, so a realistic RIS needs about 2.25× more elements than an ideal one for full coverage of a 300 m flight; (ii) a position-parametric channel estimator reaches within 0.15 dB of perfect channel knowledge with 64× fewer pilots than per-element LMMSE, and needs no pilots when a 100 ms Kalman prediction is available; and (iii) predictive tracking delivers 99.3% of the ideal array gain at 500 ms latency, whereas persistence delivers 63%. On real 60 GHz measurements (DeepSense 6G Scenario 23) we show that exact blind beam prediction is bounded at 79% top-1 by measurement noise, and propose an AI-assisted reduced beam training scheme with a learned beam-tie graph. Given full-sweep history it selects the exact optimal beam 99.3% of the time at a 140 ms horizon (macro-F1 0.961 over all 56 beam classes) and 99.1% at 0.4 s. Replayed in closed loop, where the system knows only the beams it measured, tie-graph tracking selects the exact optimal beam 97.2–99.3% of the time with 1.05–1.31 ms of beam training per decision instead of 5 ms, and per-flight tests confirm its spectral-efficiency gain over full sweeps on 32 of 33 flights. Adding candidate beams from the UAV's GPS and from its position in the base station's camera image, located without labels, lets the tracker drop periodic full sweeps: with six candidates it selects the exact optimal beam 99.5% of the time with macro-F1 0.97 over all 56 beam classes and 0.66 ms per decision, better than the tie-graph tracker on 26 of 33 flights, and it degrades gracefully when the GPS report is up to 1.1 s old. Ten deep sequence models trained on measured-only data do not beat the tie graph at equal measurement budget. For blind prediction, no single model gains significantly from position or camera features, but a nested stack of all models raises exact top-1 from 72.1 to 75.6% at 140 ms, 96% of the noise bound, and from 56.7 to 64.3% at 0.4 s, on most flights (Holm p ≤ 0.003). All results use sequence-level cross-validation.</w:t>
       </w:r>
     </w:p>
     <w:p>
@@ -2047,6 +2047,33 @@
           <w:smallCaps w:val="0"/>
           <w:sz w:val="20"/>
         </w:rPr>
+        <w:t>Stacked predictor.</w:t>
+      </w:r>
+      <w:r>
+        <w:rPr>
+          <w:b w:val="0"/>
+          <w:i w:val="0"/>
+          <w:smallCaps w:val="0"/>
+          <w:sz w:val="20"/>
+        </w:rPr>
+        <w:t xml:space="preserve"> Different predictors make different errors, so our strongest blind predictor combines them. Each component's scores are standardised per sample and summed with weights chosen on the training folds by coordinate ascent (objective: within-noise accuracy plus half the exact top-1) and applied unchanged to the held-out fold. The components are the GRU variants trained with each set of side information (Sec. VI-D), extra trees and LightGBM [25] on long-history features, the last sweep, and a shifted-template tracker that follows the UAV's sub-beam peak position across sweeps.</w:t>
+      </w:r>
+    </w:p>
+    <w:p>
+      <w:pPr>
+        <w:keepNext w:val="0"/>
+        <w:keepLines w:val="0"/>
+        <w:spacing w:before="0" w:after="0"/>
+        <w:ind w:firstLine="288"/>
+        <w:jc w:val="both"/>
+      </w:pPr>
+      <w:r>
+        <w:rPr>
+          <w:b/>
+          <w:i w:val="0"/>
+          <w:smallCaps w:val="0"/>
+          <w:sz w:val="20"/>
+        </w:rPr>
         <w:t>Noise ceiling.</w:t>
       </w:r>
       <w:r>
@@ -10526,7 +10553,7 @@
           <w:smallCaps w:val="0"/>
           <w:sz w:val="20"/>
         </w:rPr>
-        <w:t>). Exact top-1 depends almost entirely on whether the label is decided by the channel or by noise. On the 25% of samples whose best beam leads by more than the 0.25 dB noise floor, the GRU ensemble predicts the exact beam 94.1% of the time at t + 1 (95% flight-bootstrap CI 91.7–95.9%) and 78.7% at t + 3 (71.4–84.9%). On the other 75%, two or more beams are equal within the noise, the label is a coin toss among them, and every model, including persistence, is near 62–65% at t + 1. Blind exact top-1 therefore cannot approach 95% on this data, while the measured schemes below can. Fusing the GRU ensemble with the last sweep, with the weight chosen on the other folds' flights, adds 0.3 points of exact top-1 at t + 1 (72.4%) and 0.6 at t + 3 (57.3%), and macro-F1 by 0.004 and 0.012, at the cost of 0.1–0.8 points of within-noise accuracy: the remaining gap to the 79% bound is the information in future sweeps that no causal predictor has.</w:t>
+        <w:t>). Exact top-1 depends almost entirely on whether the label is decided by the channel or by noise. On the 25% of samples whose best beam leads by more than the 0.25 dB noise floor, the GRU ensemble predicts the exact beam 94.1% of the time at t + 1 (95% flight-bootstrap CI 91.7–95.9%) and 78.7% at t + 3 (71.4–84.9%). On the other 75%, two or more beams are equal within the noise, the label is a coin toss among them, and every single model, including persistence, is near 62–65% at t + 1. Blind exact top-1 therefore cannot approach 95% on this data, while the measured schemes below can. Fusing the GRU ensemble with the last sweep, with the weight chosen on the other folds' flights, adds 0.3 points of exact top-1 at t + 1 (72.4%) and 0.6 at t + 3 (57.3%), and macro-F1 by 0.004 and 0.012, at the cost of 0.1–0.8 points of within-noise accuracy: the remaining gap to the 79% bound is the information in future sweeps that no causal predictor has.</w:t>
       </w:r>
     </w:p>
     <w:p>
@@ -10572,7 +10599,7 @@
           <w:smallCaps w:val="0"/>
           <w:sz w:val="20"/>
         </w:rPr>
-        <w:t>). No single model closes that gap, but the models make different errors, so we combine them. The components are the GRU variants of every side-information run (power only, GPS, UAV pixel, both), extra trees and LightGBM on long-history features (eight sub-beam peak positions and their steps, four sweeps, the lobe around the peak, side information), the last sweep, and a shifted template: the UAV's sub-beam peak (parabolic fit around the argmax) is tracked over the recent sweeps, the last sweeps are aligned on it and averaged, and the average is shifted by the predicted peak motion. Each component's scores are standardised per sample and summed with weights found by coordinate ascent on the four training folds (within-noise accuracy plus half the exact top-1), together with the template's three settings, and applied unchanged to the held-out fold. With power sweeps alone the stack raises exact top-1 from 72.1 to 74.6% at t + 1 and from 56.7 to 60.9% at t + 3. With all sensing it reaches 75.6% [72.4, 78.4] at t + 1, 96% of the noise bound, and 64.3% [59.5, 68.8] at t + 3, with 97.2% and 89.6% within noise. On decisive labels it predicts the exact beam 96.0% of the time at t + 1 and 86.3% at t + 3. Over the 30 flights long enough for an eight-sweep window, the all-sensing stack beats the GRU ensemble by 3.6 points at t + 1 [1.9, 5.0] (24 flights better, 4 worse) and 7.6 points at t + 3 [5.5, 10.0] (23 better, 6 worse); the power-only stack by 2.5 [0.9, 3.9] and 4.2 [2.7, 6.2] points (Wilcoxon, Holm p ≤ 0.0014 for all four). The largest weights go to the augmented ensembles of the power-only, GPS and GPS + UAV pixel runs, so position information that is not significant in one model (Table XIII) becomes useful once it is combined with the others. Exact top-1 is still below 95%: in 75% of sweeps the label is decided by noise (above).</w:t>
+        <w:t>). No single model closes that gap, but the models make different errors, so we combine them. The components are the GRU variants of every side-information run (power only, GPS, UAV pixel, both), extra trees and LightGBM on long-history features (eight sub-beam peak positions and their steps, four sweeps, the lobe around the peak, side information), the last sweep, and a shifted template: the UAV's sub-beam peak (parabolic fit around the argmax) is tracked over the recent sweeps, the last sweeps are aligned on it and averaged, and the average is shifted by the predicted peak motion. Each component's scores are standardised per sample and summed with weights found by coordinate ascent on the four training folds (within-noise accuracy plus half the exact top-1), together with the template's three settings, and applied unchanged to the held-out fold. With power sweeps alone the stack raises exact top-1 from 72.1 to 74.6% at t + 1 and from 56.7 to 60.9% at t + 3. With all sensing it reaches 75.6% [72.4, 78.4] at t + 1, 96% of the noise bound, and 64.3% [59.5, 68.8] at t + 3, with 97.2% and 89.6% within noise. On decisive labels it predicts the exact beam 96.0% of the time at t + 1 and 86.3% at t + 3. Over the 30 flights long enough for an eight-sweep window, the all-sensing stack beats the GRU ensemble by 3.6 points at t + 1 [1.9, 5.1] (24 flights better, 4 worse) and 7.6 points at t + 3 [5.6, 9.9] (23 better, 6 worse); the power-only stack by 2.5 [0.9, 3.8] and 4.2 [2.7, 6.2] points (Wilcoxon, Holm p ≤ 0.003 for all four; Table XIII). The largest weights go to the augmented ensembles of the power-only, GPS and GPS + UAV pixel runs, and sensing adds significantly inside the stack: the all-sensing stack beats the power-only stack by 1.1 points at t + 1 [0.6, 1.7] (21 better, 4 worse; Holm p = 0.006) and 3.4 at t + 3 [1.7, 5.1] (19 better, 8 worse; p = 0.045). Position information that is not significant in any single model (Table XIII) therefore becomes useful once it is combined with the others. Adding the two camera-embedding runs of Table XI to the stack changes exact top-1 by at most 0.1 points, and they receive small weights, so the stack uses the four runs above. Exact top-1 is still below 95%: in 75% of sweeps the label is decided by noise (above).</w:t>
       </w:r>
     </w:p>
     <w:p>
@@ -13247,7 +13274,7 @@
           <w:smallCaps/>
           <w:sz w:val="16"/>
         </w:rPr>
-        <w:t>Closed-loop replay of the 33 flights with more than one sweep (flights 22 and 30 hold a single sweep) (each policy knows only what it measured). Latency: mean beam-training time per decision. SE: effective spectral efficiency as % of a genie that always uses the best beam with no training time, at nominal best-beam SNR of 0 / 10 / 20 dB</w:t>
+        <w:t>Closed-loop replay of the 33 flights with more than one sweep (flights 22 and 30 hold a single sweep); each policy knows only what it measured. Latency: mean beam-training time per decision. SE: effective spectral efficiency as % of a genie that always uses the best beam with no training time, at nominal best-beam SNR of 0 / 10 / 20 dB</w:t>
       </w:r>
     </w:p>
     <w:tbl>
@@ -16067,7 +16094,7 @@
           <w:smallCaps w:val="0"/>
           <w:sz w:val="20"/>
         </w:rPr>
-        <w:t>Alone, the UAV pixel identifies the current beam within noise 80.4% of the time (58.5% exact), against 67.4% for the generic embedding and 14.9% for the most frequent beam (Table XII), so localising the UAV is what turns the image into beam information. For blind prediction from power sweeps, however, no side information gives a significant gain (Table XI, Table XIII). Position helps most further ahead: at t + 3, pooled within-noise accuracy rises by 4.2 points for the random forest (78.5 → 82.7%) and by 1.4 for the GRU ensemble (86.0 → 87.4%), and by 1.3 with GPS and the UAV pixel together (87.3%), but per flight these gains are not significant on their own (16 flights better, 13 worse; Holm p = 0.64). Combined with the power-only models in the stack of Table VII, the same runs do add significantly. At t + 1 every change is below one point: the last sweep already encodes where the UAV is. The generic embedding hurts: it lowers every model at both horizons, the GRU ensemble at t + 3 by 5.6 points (worse on 23 of 30 flights, Holm p &lt; 10⁻⁴), because with 35 flights 16 scene features let the models fit flight-specific appearance that does not transfer. Exact top-1 changes by −5.0 to +3.7 points across configurations and stays far below the 79% noise ceiling in all of them, as it must.</w:t>
+        <w:t>Alone, the UAV pixel identifies the current beam within noise 80.4% of the time (58.5% exact), against 67.4% for the generic embedding and 14.9% for the most frequent beam (Table XII), so localising the UAV is what turns the image into beam information. For blind prediction from power sweeps, however, no side information gives a significant gain (Table XI, Table XIII). Position helps most further ahead: at t + 3, pooled within-noise accuracy rises by 4.2 points for the random forest (78.5 → 82.7%) and by 1.4 for the GRU ensemble (86.0 → 87.4%), and by 1.3 with GPS and the UAV pixel together (87.3%), but per flight these gains are not significant on their own (16 flights better, 13 worse; Holm p = 0.64). Combined with the power-only models in the stack of Table VII, the same runs do add significantly. At t + 1 every change is below one point: the last sweep already encodes where the UAV is. The generic embedding hurts: it lowers every model at both horizons, the GRU ensemble at t + 3 by 5.6 points (worse on 23 of 30 flights, Holm p &lt; 10⁻⁴), because with 35 flights 16 scene features let the models fit flight-specific appearance that does not transfer. Exact top-1 changes by −5.0 to +3.6 points across configurations and stays far below the 79% noise ceiling in all of them, as it must.</w:t>
       </w:r>
     </w:p>
     <w:p>
@@ -16448,7 +16475,7 @@
                 <w:smallCaps w:val="0"/>
                 <w:sz w:val="16"/>
               </w:rPr>
-              <w:t>94.0 / 85.9 / 71.0</w:t>
+              <w:t>93.9 / 85.5 / 71.0</w:t>
             </w:r>
           </w:p>
         </w:tc>
@@ -16470,7 +16497,7 @@
                 <w:smallCaps w:val="0"/>
                 <w:sz w:val="16"/>
               </w:rPr>
-              <w:t>94.8 / 88.0 / 70.0</w:t>
+              <w:t>94.9 / 86.9 / 70.0</w:t>
             </w:r>
           </w:p>
         </w:tc>
@@ -16487,12 +16514,12 @@
             </w:pPr>
             <w:r>
               <w:rPr>
-                <w:b w:val="0"/>
-                <w:i w:val="0"/>
-                <w:smallCaps w:val="0"/>
-                <w:sz w:val="16"/>
-              </w:rPr>
-              <w:t>96.5 / 91.6 / 72.2</w:t>
+                <w:b/>
+                <w:i w:val="0"/>
+                <w:smallCaps w:val="0"/>
+                <w:sz w:val="16"/>
+              </w:rPr>
+              <w:t>96.5 / 91.9 / 71.8</w:t>
             </w:r>
           </w:p>
         </w:tc>
@@ -16678,7 +16705,7 @@
                 <w:smallCaps w:val="0"/>
                 <w:sz w:val="16"/>
               </w:rPr>
-              <w:t>93.7 / 85.4 / 70.1</w:t>
+              <w:t>93.7 / 85.5 / 70.1</w:t>
             </w:r>
           </w:p>
         </w:tc>
@@ -16700,7 +16727,7 @@
                 <w:smallCaps w:val="0"/>
                 <w:sz w:val="16"/>
               </w:rPr>
-              <w:t>94.8 / 86.5 / 68.8</w:t>
+              <w:t>94.8 / 86.1 / 69.1</w:t>
             </w:r>
           </w:p>
         </w:tc>
@@ -16722,7 +16749,7 @@
                 <w:smallCaps w:val="0"/>
                 <w:sz w:val="16"/>
               </w:rPr>
-              <w:t>96.0 / 90.4 / 70.7</w:t>
+              <w:t>96.2 / 90.1 / 70.7</w:t>
             </w:r>
           </w:p>
         </w:tc>
@@ -16793,7 +16820,7 @@
                 <w:smallCaps w:val="0"/>
                 <w:sz w:val="16"/>
               </w:rPr>
-              <w:t>93.7 / 85.2 / 70.7</w:t>
+              <w:t>93.7 / 85.5 / 70.4</w:t>
             </w:r>
           </w:p>
         </w:tc>
@@ -16815,7 +16842,7 @@
                 <w:smallCaps w:val="0"/>
                 <w:sz w:val="16"/>
               </w:rPr>
-              <w:t>94.5 / 87.3 / 70.0</w:t>
+              <w:t>94.2 / 87.1 / 69.3</w:t>
             </w:r>
           </w:p>
         </w:tc>
@@ -16837,7 +16864,7 @@
                 <w:smallCaps w:val="0"/>
                 <w:sz w:val="16"/>
               </w:rPr>
-              <w:t>96.5 / 91.4 / 71.5</w:t>
+              <w:t>96.4 / 90.8 / 71.8</w:t>
             </w:r>
           </w:p>
         </w:tc>
@@ -16908,7 +16935,7 @@
                 <w:smallCaps w:val="0"/>
                 <w:sz w:val="16"/>
               </w:rPr>
-              <w:t>94.2 / 85.7 / 71.3</w:t>
+              <w:t>94.0 / 85.0 / 71.1</w:t>
             </w:r>
           </w:p>
         </w:tc>
@@ -16930,7 +16957,7 @@
                 <w:smallCaps w:val="0"/>
                 <w:sz w:val="16"/>
               </w:rPr>
-              <w:t>95.3 / 87.6 / 71.1</w:t>
+              <w:t>94.8 / 87.6 / 69.9</w:t>
             </w:r>
           </w:p>
         </w:tc>
@@ -16947,12 +16974,12 @@
             </w:pPr>
             <w:r>
               <w:rPr>
-                <w:b/>
-                <w:i w:val="0"/>
-                <w:smallCaps w:val="0"/>
-                <w:sz w:val="16"/>
-              </w:rPr>
-              <w:t>96.6 / 91.4 / 71.1</w:t>
+                <w:b w:val="0"/>
+                <w:i w:val="0"/>
+                <w:smallCaps w:val="0"/>
+                <w:sz w:val="16"/>
+              </w:rPr>
+              <w:t>96.5 / 92.1 / 71.0</w:t>
             </w:r>
           </w:p>
         </w:tc>
@@ -17138,7 +17165,7 @@
                 <w:smallCaps w:val="0"/>
                 <w:sz w:val="16"/>
               </w:rPr>
-              <w:t>82.7 / 65.3 / 57.6</w:t>
+              <w:t>82.7 / 65.3 / 57.5</w:t>
             </w:r>
           </w:p>
         </w:tc>
@@ -17155,34 +17182,34 @@
             </w:pPr>
             <w:r>
               <w:rPr>
+                <w:b w:val="0"/>
+                <w:i w:val="0"/>
+                <w:smallCaps w:val="0"/>
+                <w:sz w:val="16"/>
+              </w:rPr>
+              <w:t>83.5 / 70.0 / 56.9</w:t>
+            </w:r>
+          </w:p>
+        </w:tc>
+        <w:tc>
+          <w:tcPr>
+            <w:tcW w:type="dxa" w:w="2130"/>
+          </w:tcPr>
+          <w:p>
+            <w:pPr>
+              <w:keepNext/>
+              <w:keepLines/>
+              <w:spacing w:before="0" w:after="0"/>
+              <w:jc w:val="center"/>
+            </w:pPr>
+            <w:r>
+              <w:rPr>
                 <w:b/>
                 <w:i w:val="0"/>
                 <w:smallCaps w:val="0"/>
                 <w:sz w:val="16"/>
               </w:rPr>
-              <w:t>83.2 / 69.7 / 56.4</w:t>
-            </w:r>
-          </w:p>
-        </w:tc>
-        <w:tc>
-          <w:tcPr>
-            <w:tcW w:type="dxa" w:w="2130"/>
-          </w:tcPr>
-          <w:p>
-            <w:pPr>
-              <w:keepNext/>
-              <w:keepLines/>
-              <w:spacing w:before="0" w:after="0"/>
-              <w:jc w:val="center"/>
-            </w:pPr>
-            <w:r>
-              <w:rPr>
-                <w:b w:val="0"/>
-                <w:i w:val="0"/>
-                <w:smallCaps w:val="0"/>
-                <w:sz w:val="16"/>
-              </w:rPr>
-              <w:t>87.2 / 79.3 / 57.8</w:t>
+              <w:t>87.4 / 78.4 / 58.3</w:t>
             </w:r>
           </w:p>
         </w:tc>
@@ -17368,7 +17395,7 @@
                 <w:smallCaps w:val="0"/>
                 <w:sz w:val="16"/>
               </w:rPr>
-              <w:t>81.3 / 63.9 / 56.8</w:t>
+              <w:t>81.4 / 63.9 / 57.0</w:t>
             </w:r>
           </w:p>
         </w:tc>
@@ -17390,7 +17417,7 @@
                 <w:smallCaps w:val="0"/>
                 <w:sz w:val="16"/>
               </w:rPr>
-              <w:t>78.1 / 64.6 / 51.9</w:t>
+              <w:t>78.5 / 64.6 / 52.2</w:t>
             </w:r>
           </w:p>
         </w:tc>
@@ -17412,7 +17439,7 @@
                 <w:smallCaps w:val="0"/>
                 <w:sz w:val="16"/>
               </w:rPr>
-              <w:t>85.0 / 75.7 / 56.3</w:t>
+              <w:t>85.6 / 76.4 / 56.7</w:t>
             </w:r>
           </w:p>
         </w:tc>
@@ -17483,7 +17510,7 @@
                 <w:smallCaps w:val="0"/>
                 <w:sz w:val="16"/>
               </w:rPr>
-              <w:t>78.1 / 62.8 / 53.2</w:t>
+              <w:t>78.4 / 63.1 / 53.5</w:t>
             </w:r>
           </w:p>
         </w:tc>
@@ -17505,7 +17532,7 @@
                 <w:smallCaps w:val="0"/>
                 <w:sz w:val="16"/>
               </w:rPr>
-              <w:t>79.0 / 64.1 / 53.6</w:t>
+              <w:t>78.7 / 62.4 / 52.9</w:t>
             </w:r>
           </w:p>
         </w:tc>
@@ -17527,7 +17554,7 @@
                 <w:smallCaps w:val="0"/>
                 <w:sz w:val="16"/>
               </w:rPr>
-              <w:t>84.5 / 73.9 / 55.4</w:t>
+              <w:t>84.6 / 74.8 / 55.7</w:t>
             </w:r>
           </w:p>
         </w:tc>
@@ -17598,7 +17625,7 @@
                 <w:smallCaps w:val="0"/>
                 <w:sz w:val="16"/>
               </w:rPr>
-              <w:t>81.4 / 65.3 / 56.8</w:t>
+              <w:t>81.5 / 64.9 / 56.8</w:t>
             </w:r>
           </w:p>
         </w:tc>
@@ -17615,12 +17642,12 @@
             </w:pPr>
             <w:r>
               <w:rPr>
-                <w:b w:val="0"/>
-                <w:i w:val="0"/>
-                <w:smallCaps w:val="0"/>
-                <w:sz w:val="16"/>
-              </w:rPr>
-              <w:t>82.8 / 67.9 / 55.2</w:t>
+                <w:b/>
+                <w:i w:val="0"/>
+                <w:smallCaps w:val="0"/>
+                <w:sz w:val="16"/>
+              </w:rPr>
+              <w:t>84.1 / 69.8 / 55.3</w:t>
             </w:r>
           </w:p>
         </w:tc>
@@ -17637,12 +17664,12 @@
             </w:pPr>
             <w:r>
               <w:rPr>
-                <w:b/>
-                <w:i w:val="0"/>
-                <w:smallCaps w:val="0"/>
-                <w:sz w:val="16"/>
-              </w:rPr>
-              <w:t>87.3 / 77.4 / 58.5</w:t>
+                <w:b w:val="0"/>
+                <w:i w:val="0"/>
+                <w:smallCaps w:val="0"/>
+                <w:sz w:val="16"/>
+              </w:rPr>
+              <w:t>87.3 / 78.5 / 58.7</w:t>
             </w:r>
           </w:p>
         </w:tc>
@@ -22302,7 +22329,7 @@
                 <w:smallCaps w:val="0"/>
                 <w:sz w:val="16"/>
               </w:rPr>
-              <w:t>+3.59 [+1.85, +5.05]</w:t>
+              <w:t>+3.59 [+1.89, +5.07]</w:t>
             </w:r>
           </w:p>
         </w:tc>
@@ -22361,6 +22388,324 @@
           </w:tcPr>
           <w:p>
             <w:pPr>
+              <w:keepNext/>
+              <w:keepLines/>
+              <w:spacing w:before="0" w:after="0"/>
+              <w:jc w:val="left"/>
+            </w:pPr>
+            <w:r>
+              <w:rPr>
+                <w:b w:val="0"/>
+                <w:i w:val="0"/>
+                <w:smallCaps w:val="0"/>
+                <w:sz w:val="16"/>
+              </w:rPr>
+              <w:t>Stacking t+1</w:t>
+            </w:r>
+          </w:p>
+        </w:tc>
+        <w:tc>
+          <w:tcPr>
+            <w:tcW w:type="dxa" w:w="2440"/>
+          </w:tcPr>
+          <w:p>
+            <w:pPr>
+              <w:keepNext/>
+              <w:keepLines/>
+              <w:spacing w:before="0" w:after="0"/>
+              <w:jc w:val="left"/>
+            </w:pPr>
+            <w:r>
+              <w:rPr>
+                <w:b w:val="0"/>
+                <w:i w:val="0"/>
+                <w:smallCaps w:val="0"/>
+                <w:sz w:val="16"/>
+              </w:rPr>
+              <w:t>Stacked, all sensing</w:t>
+            </w:r>
+          </w:p>
+        </w:tc>
+        <w:tc>
+          <w:tcPr>
+            <w:tcW w:type="dxa" w:w="1857"/>
+          </w:tcPr>
+          <w:p>
+            <w:pPr>
+              <w:keepNext/>
+              <w:keepLines/>
+              <w:spacing w:before="0" w:after="0"/>
+              <w:jc w:val="left"/>
+            </w:pPr>
+            <w:r>
+              <w:rPr>
+                <w:b w:val="0"/>
+                <w:i w:val="0"/>
+                <w:smallCaps w:val="0"/>
+                <w:sz w:val="16"/>
+              </w:rPr>
+              <w:t>Stacked, power only</w:t>
+            </w:r>
+          </w:p>
+        </w:tc>
+        <w:tc>
+          <w:tcPr>
+            <w:tcW w:type="dxa" w:w="1107"/>
+          </w:tcPr>
+          <w:p>
+            <w:pPr>
+              <w:keepNext/>
+              <w:keepLines/>
+              <w:spacing w:before="0" w:after="0"/>
+              <w:jc w:val="left"/>
+            </w:pPr>
+            <w:r>
+              <w:rPr>
+                <w:b w:val="0"/>
+                <w:i w:val="0"/>
+                <w:smallCaps w:val="0"/>
+                <w:sz w:val="16"/>
+              </w:rPr>
+              <w:t>Exact top-1</w:t>
+            </w:r>
+          </w:p>
+        </w:tc>
+        <w:tc>
+          <w:tcPr>
+            <w:tcW w:type="dxa" w:w="1773"/>
+          </w:tcPr>
+          <w:p>
+            <w:pPr>
+              <w:keepNext/>
+              <w:keepLines/>
+              <w:spacing w:before="0" w:after="0"/>
+              <w:jc w:val="center"/>
+            </w:pPr>
+            <w:r>
+              <w:rPr>
+                <w:b w:val="0"/>
+                <w:i w:val="0"/>
+                <w:smallCaps w:val="0"/>
+                <w:sz w:val="16"/>
+              </w:rPr>
+              <w:t>+1.09 [+0.56, +1.67]</w:t>
+            </w:r>
+          </w:p>
+        </w:tc>
+        <w:tc>
+          <w:tcPr>
+            <w:tcW w:type="dxa" w:w="690"/>
+          </w:tcPr>
+          <w:p>
+            <w:pPr>
+              <w:keepNext/>
+              <w:keepLines/>
+              <w:spacing w:before="0" w:after="0"/>
+              <w:jc w:val="center"/>
+            </w:pPr>
+            <w:r>
+              <w:rPr>
+                <w:b w:val="0"/>
+                <w:i w:val="0"/>
+                <w:smallCaps w:val="0"/>
+                <w:sz w:val="16"/>
+              </w:rPr>
+              <w:t>0.006</w:t>
+            </w:r>
+          </w:p>
+        </w:tc>
+        <w:tc>
+          <w:tcPr>
+            <w:tcW w:type="dxa" w:w="1107"/>
+          </w:tcPr>
+          <w:p>
+            <w:pPr>
+              <w:keepNext/>
+              <w:keepLines/>
+              <w:spacing w:before="0" w:after="0"/>
+              <w:jc w:val="center"/>
+            </w:pPr>
+            <w:r>
+              <w:rPr>
+                <w:b w:val="0"/>
+                <w:i w:val="0"/>
+                <w:smallCaps w:val="0"/>
+                <w:sz w:val="16"/>
+              </w:rPr>
+              <w:t>21 / 5 / 4</w:t>
+            </w:r>
+          </w:p>
+        </w:tc>
+      </w:tr>
+      <w:tr>
+        <w:trPr>
+          <w:cantSplit/>
+        </w:trPr>
+        <w:tc>
+          <w:tcPr>
+            <w:tcW w:type="dxa" w:w="1107"/>
+          </w:tcPr>
+          <w:p>
+            <w:pPr>
+              <w:keepNext/>
+              <w:keepLines/>
+              <w:spacing w:before="0" w:after="0"/>
+              <w:jc w:val="left"/>
+            </w:pPr>
+            <w:r>
+              <w:rPr>
+                <w:b w:val="0"/>
+                <w:i w:val="0"/>
+                <w:smallCaps w:val="0"/>
+                <w:sz w:val="16"/>
+              </w:rPr>
+              <w:t>Stacking t+3</w:t>
+            </w:r>
+          </w:p>
+        </w:tc>
+        <w:tc>
+          <w:tcPr>
+            <w:tcW w:type="dxa" w:w="2440"/>
+          </w:tcPr>
+          <w:p>
+            <w:pPr>
+              <w:keepNext/>
+              <w:keepLines/>
+              <w:spacing w:before="0" w:after="0"/>
+              <w:jc w:val="left"/>
+            </w:pPr>
+            <w:r>
+              <w:rPr>
+                <w:b w:val="0"/>
+                <w:i w:val="0"/>
+                <w:smallCaps w:val="0"/>
+                <w:sz w:val="16"/>
+              </w:rPr>
+              <w:t>Stacked, all sensing</w:t>
+            </w:r>
+          </w:p>
+        </w:tc>
+        <w:tc>
+          <w:tcPr>
+            <w:tcW w:type="dxa" w:w="1857"/>
+          </w:tcPr>
+          <w:p>
+            <w:pPr>
+              <w:keepNext/>
+              <w:keepLines/>
+              <w:spacing w:before="0" w:after="0"/>
+              <w:jc w:val="left"/>
+            </w:pPr>
+            <w:r>
+              <w:rPr>
+                <w:b w:val="0"/>
+                <w:i w:val="0"/>
+                <w:smallCaps w:val="0"/>
+                <w:sz w:val="16"/>
+              </w:rPr>
+              <w:t>GRU ens., power</w:t>
+            </w:r>
+          </w:p>
+        </w:tc>
+        <w:tc>
+          <w:tcPr>
+            <w:tcW w:type="dxa" w:w="1107"/>
+          </w:tcPr>
+          <w:p>
+            <w:pPr>
+              <w:keepNext/>
+              <w:keepLines/>
+              <w:spacing w:before="0" w:after="0"/>
+              <w:jc w:val="left"/>
+            </w:pPr>
+            <w:r>
+              <w:rPr>
+                <w:b w:val="0"/>
+                <w:i w:val="0"/>
+                <w:smallCaps w:val="0"/>
+                <w:sz w:val="16"/>
+              </w:rPr>
+              <w:t>Exact top-1</w:t>
+            </w:r>
+          </w:p>
+        </w:tc>
+        <w:tc>
+          <w:tcPr>
+            <w:tcW w:type="dxa" w:w="1773"/>
+          </w:tcPr>
+          <w:p>
+            <w:pPr>
+              <w:keepNext/>
+              <w:keepLines/>
+              <w:spacing w:before="0" w:after="0"/>
+              <w:jc w:val="center"/>
+            </w:pPr>
+            <w:r>
+              <w:rPr>
+                <w:b w:val="0"/>
+                <w:i w:val="0"/>
+                <w:smallCaps w:val="0"/>
+                <w:sz w:val="16"/>
+              </w:rPr>
+              <w:t>+7.58 [+5.61, +9.89]</w:t>
+            </w:r>
+          </w:p>
+        </w:tc>
+        <w:tc>
+          <w:tcPr>
+            <w:tcW w:type="dxa" w:w="690"/>
+          </w:tcPr>
+          <w:p>
+            <w:pPr>
+              <w:keepNext/>
+              <w:keepLines/>
+              <w:spacing w:before="0" w:after="0"/>
+              <w:jc w:val="center"/>
+            </w:pPr>
+            <w:r>
+              <w:rPr>
+                <w:b w:val="0"/>
+                <w:i w:val="0"/>
+                <w:smallCaps w:val="0"/>
+                <w:sz w:val="16"/>
+              </w:rPr>
+              <w:t>0.002</w:t>
+            </w:r>
+          </w:p>
+        </w:tc>
+        <w:tc>
+          <w:tcPr>
+            <w:tcW w:type="dxa" w:w="1107"/>
+          </w:tcPr>
+          <w:p>
+            <w:pPr>
+              <w:keepNext/>
+              <w:keepLines/>
+              <w:spacing w:before="0" w:after="0"/>
+              <w:jc w:val="center"/>
+            </w:pPr>
+            <w:r>
+              <w:rPr>
+                <w:b w:val="0"/>
+                <w:i w:val="0"/>
+                <w:smallCaps w:val="0"/>
+                <w:sz w:val="16"/>
+              </w:rPr>
+              <w:t>23 / 1 / 6</w:t>
+            </w:r>
+          </w:p>
+        </w:tc>
+      </w:tr>
+      <w:tr>
+        <w:trPr>
+          <w:cantSplit/>
+        </w:trPr>
+        <w:tc>
+          <w:tcPr>
+            <w:tcW w:type="dxa" w:w="1107"/>
+          </w:tcPr>
+          <w:p>
+            <w:pPr>
               <w:keepNext w:val="0"/>
               <w:keepLines w:val="0"/>
               <w:spacing w:before="0" w:after="0"/>
@@ -22417,7 +22762,7 @@
                 <w:smallCaps w:val="0"/>
                 <w:sz w:val="16"/>
               </w:rPr>
-              <w:t>GRU ens., power</w:t>
+              <w:t>Stacked, power only</w:t>
             </w:r>
           </w:p>
         </w:tc>
@@ -22461,7 +22806,7 @@
                 <w:smallCaps w:val="0"/>
                 <w:sz w:val="16"/>
               </w:rPr>
-              <w:t>+7.58 [+5.49, +9.99]</w:t>
+              <w:t>+3.35 [+1.73, +5.09]</w:t>
             </w:r>
           </w:p>
         </w:tc>
@@ -22483,7 +22828,7 @@
                 <w:smallCaps w:val="0"/>
                 <w:sz w:val="16"/>
               </w:rPr>
-              <w:t>0.001</w:t>
+              <w:t>0.045</w:t>
             </w:r>
           </w:p>
         </w:tc>
@@ -22505,7 +22850,7 @@
                 <w:smallCaps w:val="0"/>
                 <w:sz w:val="16"/>
               </w:rPr>
-              <w:t>23 / 1 / 6</w:t>
+              <w:t>19 / 3 / 8</w:t>
             </w:r>
           </w:p>
         </w:tc>
@@ -25708,7 +26053,7 @@
           <w:smallCaps w:val="0"/>
           <w:sz w:val="20"/>
         </w:rPr>
-        <w:t xml:space="preserve"> On power sweeps alone the learned gain over persistence is modest at t + 1 and clear at t + 3 (86.0% vs 78.1% within noise). In reduced beam training, the largest single gain comes from a simple learned structure, the beam-tie graph, rather than from the sequence model. The GRU then reduces the beams measured at t + 3. In closed loop, where only measured beams are known, ten deep sequence models trained on those measurements did not beat the tie graph at equal budget (Table X). On this dataset, the useful structure is which beams tie, and a co-occurrence count captures it; we report this negative result because it bounds what learning adds once measurement is cheap. The soft target and beam-axis augmentation matter more than the architecture. Logit adjustment for the class imbalance [19] lowered every metric because the beam distribution differs between flights. Side information follows the same pattern for blind prediction: in any single model UAV position gives a small, not significant gain at 0.4 s, and generic camera features hurt, because 35 flights are too few to learn which parts of a scene matter. Combining models helps more than any one of them: the nested stack gains 3.6 points of exact top-1 at t + 1 and 7.6 at t + 3, and it is there that position becomes useful. The same sensing pays off as soon as its output is measured rather than trusted: as candidates in the tracker, the located UAV and its GPS halve the training latency and raise exact top-1 on 25 of 33 flights, with one worse, and two more candidates bring the rarely seen beams above 0.95 macro-F1 (Table XIV). Making the camera useful took a hand-built locator, not a larger model.</w:t>
+        <w:t xml:space="preserve"> On power sweeps alone the learned gain over persistence is modest at t + 1 and clear at t + 3 (86.0% vs 78.1% within noise). In reduced beam training, the largest single gain comes from a simple learned structure, the beam-tie graph, rather than from the sequence model. The GRU then reduces the beams measured at t + 3. In closed loop, where only measured beams are known, ten deep sequence models trained on those measurements did not beat the tie graph at equal budget (Table X). On this dataset, the useful structure is which beams tie, and a co-occurrence count captures it; we report this negative result because it bounds what learning adds once measurement is cheap. The soft target and beam-axis augmentation matter more than the architecture. Logit adjustment for the class imbalance [19] lowered every metric because the beam distribution differs between flights. Side information follows the same pattern for blind prediction: in any single model UAV position gives a small, not significant gain at 0.4 s, and generic camera features hurt, because 35 flights are too few to learn which parts of a scene matter. Combining models helps more than any one of them: the nested stack gains 3.6 points of exact top-1 at t + 1 and 7.6 at t + 3, and inside it position and the located UAV add a significant 1.1 and 3.4 points. The same sensing pays off as soon as its output is measured rather than trusted: as candidates in the tracker, the located UAV and its GPS halve the training latency and raise exact top-1 on 25 of 33 flights, with one worse, and two more candidates bring the rarely seen beams above 0.95 macro-F1 (Table XIV). Making the camera useful took a hand-built locator, not a larger model.</w:t>
       </w:r>
     </w:p>
     <w:p>
@@ -27010,6 +27355,47 @@
     </w:p>
     <w:p>
       <w:pPr>
+        <w:keepNext w:val="0"/>
+        <w:keepLines w:val="0"/>
+        <w:tabs>
+          <w:tab w:pos="432" w:val="left"/>
+        </w:tabs>
+        <w:spacing w:before="0" w:after="0"/>
+        <w:ind w:left="432" w:hanging="432"/>
+        <w:jc w:val="both"/>
+      </w:pPr>
+      <w:r>
+        <w:rPr>
+          <w:b w:val="0"/>
+          <w:i w:val="0"/>
+          <w:smallCaps w:val="0"/>
+          <w:sz w:val="16"/>
+        </w:rPr>
+        <w:t>[25]</w:t>
+        <w:tab/>
+        <w:t xml:space="preserve">G. Ke, Q. Meng, T. Finley, T. Wang, W. Chen, W. Ma, Q. Ye, and T.-Y. Liu, "LightGBM: A highly efficient gradient boosting decision tree," in </w:t>
+      </w:r>
+      <w:r>
+        <w:rPr>
+          <w:b w:val="0"/>
+          <w:i/>
+          <w:smallCaps w:val="0"/>
+          <w:sz w:val="16"/>
+        </w:rPr>
+        <w:t>Proc. NeurIPS</w:t>
+      </w:r>
+      <w:r>
+        <w:rPr>
+          <w:b w:val="0"/>
+          <w:i w:val="0"/>
+          <w:smallCaps w:val="0"/>
+          <w:sz w:val="16"/>
+        </w:rPr>
+        <w:t>, vol. 30, 2017, pp. 3146–3154.</w:t>
+      </w:r>
+    </w:p>
+    <w:p>
+      <w:pPr>
         <w:sectPr>
           <w:type w:val="continuous"/>
           <w:pgSz w:w="12240" w:h="15840"/>

</xml_diff>